<commit_message>
Deploying to gh-pages from @ Morrison-Lab/pds@cb742445cb21e5719f4931f7a905a8945db92b2b 🚀
</commit_message>
<xml_diff>
--- a/distributions.docx
+++ b/distributions.docx
@@ -15,7 +15,7 @@
         <w:pStyle w:val="Date"/>
       </w:pPr>
       <w:r>
-        <w:t xml:space="preserve">Last modified: 2026-09-28 11:43:57 (PDT)</w:t>
+        <w:t xml:space="preserve">Last modified: 2026-09-28 14:24:58 (PDT)</w:t>
       </w:r>
     </w:p>
     <w:p>
@@ -9639,30 +9639,13 @@
         <w:t xml:space="preserve"> </w:t>
       </w:r>
       <w:r>
-        <w:rPr>
-          <w:b/>
-          <w:bCs/>
-        </w:rPr>
-        <w:t xml:space="preserve">population size</w:t>
-      </w:r>
-      <w:r>
-        <w:t xml:space="preserve"> </w:t>
-      </w:r>
-      <w:r>
-        <w:t xml:space="preserve">or</w:t>
-      </w:r>
-      <w:r>
-        <w:t xml:space="preserve"> </w:t>
-      </w:r>
-      <w:r>
-        <w:rPr>
-          <w:b/>
-          <w:bCs/>
-        </w:rPr>
-        <w:t xml:space="preserve">duration of observation</w:t>
-      </w:r>
-      <w:r>
-        <w:t xml:space="preserve">,</w:t>
+        <w:t xml:space="preserve">population size or</w:t>
+      </w:r>
+      <w:r>
+        <w:t xml:space="preserve"> </w:t>
+      </w:r>
+      <w:r>
+        <w:t xml:space="preserve">duration of observation,</w:t>
       </w:r>
       <w:r>
         <w:t xml:space="preserve"> </w:t>

</xml_diff>

<commit_message>
Deploying to gh-pages from @ Morrison-Lab/pds@69ba89a556876d9a1a5436b7b7d28930e6b79791 🚀
</commit_message>
<xml_diff>
--- a/distributions.docx
+++ b/distributions.docx
@@ -15,7 +15,7 @@
         <w:pStyle w:val="Date"/>
       </w:pPr>
       <w:r>
-        <w:t xml:space="preserve">Last modified: 2026-10-06 10:41:36 (PDT)</w:t>
+        <w:t xml:space="preserve">Last modified: 2026-10-06 11:12:46 (PDT)</w:t>
       </w:r>
     </w:p>
     <w:p>
@@ -40158,15 +40158,41 @@
         <w:t xml:space="preserve"> </w:t>
       </w:r>
       <m:oMath>
-        <m:r>
-          <m:rPr>
-            <m:sty m:val="p"/>
-          </m:rPr>
-          <m:t>∫</m:t>
-        </m:r>
-        <m:r>
-          <m:t>​</m:t>
-        </m:r>
+        <m:nary>
+          <m:naryPr>
+            <m:chr m:val="∫"/>
+            <m:limLoc m:val="subSup"/>
+            <m:subHide m:val="off"/>
+            <m:supHide m:val="off"/>
+          </m:naryPr>
+          <m:sub>
+            <m:r>
+              <m:rPr>
+                <m:sty m:val="p"/>
+              </m:rPr>
+              <m:t>−</m:t>
+            </m:r>
+            <m:r>
+              <m:rPr>
+                <m:sty m:val="p"/>
+              </m:rPr>
+              <m:t>∞</m:t>
+            </m:r>
+          </m:sub>
+          <m:sup>
+            <m:r>
+              <m:rPr>
+                <m:sty m:val="p"/>
+              </m:rPr>
+              <m:t>∞</m:t>
+            </m:r>
+          </m:sup>
+          <m:e>
+            <m:r>
+              <m:t>​</m:t>
+            </m:r>
+          </m:e>
+        </m:nary>
         <m:d>
           <m:dPr>
             <m:begChr m:val="|"/>
@@ -40240,16 +40266,25 @@
             <m:chr m:val="∑"/>
             <m:limLoc m:val="undOvr"/>
             <m:subHide m:val="off"/>
-            <m:supHide m:val="on"/>
+            <m:supHide m:val="off"/>
           </m:naryPr>
           <m:sub>
             <m:r>
               <m:t>c</m:t>
             </m:r>
+            <m:r>
+              <m:rPr>
+                <m:sty m:val="p"/>
+              </m:rPr>
+              <m:t>=</m:t>
+            </m:r>
+            <m:r>
+              <m:t>1</m:t>
+            </m:r>
           </m:sub>
           <m:sup>
             <m:r>
-              <m:t>​</m:t>
+              <m:t>K</m:t>
             </m:r>
           </m:sup>
           <m:e>
@@ -40267,15 +40302,41 @@
             </m:sSub>
           </m:e>
         </m:nary>
-        <m:r>
-          <m:rPr>
-            <m:sty m:val="p"/>
-          </m:rPr>
-          <m:t>∫</m:t>
-        </m:r>
-        <m:r>
-          <m:t>​</m:t>
-        </m:r>
+        <m:nary>
+          <m:naryPr>
+            <m:chr m:val="∫"/>
+            <m:limLoc m:val="subSup"/>
+            <m:subHide m:val="off"/>
+            <m:supHide m:val="off"/>
+          </m:naryPr>
+          <m:sub>
+            <m:r>
+              <m:rPr>
+                <m:sty m:val="p"/>
+              </m:rPr>
+              <m:t>−</m:t>
+            </m:r>
+            <m:r>
+              <m:rPr>
+                <m:sty m:val="p"/>
+              </m:rPr>
+              <m:t>∞</m:t>
+            </m:r>
+          </m:sub>
+          <m:sup>
+            <m:r>
+              <m:rPr>
+                <m:sty m:val="p"/>
+              </m:rPr>
+              <m:t>∞</m:t>
+            </m:r>
+          </m:sup>
+          <m:e>
+            <m:r>
+              <m:t>​</m:t>
+            </m:r>
+          </m:e>
+        </m:nary>
         <m:d>
           <m:dPr>
             <m:begChr m:val="|"/>

</xml_diff>

<commit_message>
Deploying to gh-pages from @ Morrison-Lab/pds@cabefb28f6366dd0a9f4a06ccc290cd2b4135445 🚀
</commit_message>
<xml_diff>
--- a/distributions.docx
+++ b/distributions.docx
@@ -15,7 +15,7 @@
         <w:pStyle w:val="Date"/>
       </w:pPr>
       <w:r>
-        <w:t xml:space="preserve">Last modified: 2026-10-09 00:30:33 (UTC)</w:t>
+        <w:t xml:space="preserve">Last modified: 2026-10-08 22:59:46 (PDT)</w:t>
       </w:r>
     </w:p>
     <w:p>
@@ -1327,96 +1327,108 @@
           <m:jc m:val="center"/>
         </m:oMathParaPr>
         <m:oMath>
-          <m:r>
-            <m:rPr>
-              <m:scr m:val="script"/>
-              <m:sty m:val="p"/>
-            </m:rPr>
-            <m:t>R</m:t>
-          </m:r>
-          <m:r>
-            <m:rPr>
-              <m:sty m:val="p"/>
-            </m:rPr>
-            <m:t>(</m:t>
-          </m:r>
-          <m:r>
-            <m:t>Y</m:t>
-          </m:r>
-          <m:r>
-            <m:rPr>
-              <m:sty m:val="p"/>
-            </m:rPr>
-            <m:t>)</m:t>
-          </m:r>
-          <m:r>
-            <m:rPr>
-              <m:sty m:val="p"/>
-            </m:rPr>
-            <m:t>=</m:t>
-          </m:r>
-          <m:r>
-            <m:t>​</m:t>
-          </m:r>
-          <m:d>
-            <m:dPr>
-              <m:begChr m:val="{"/>
-              <m:sepChr m:val=""/>
-              <m:endChr m:val="}"/>
-              <m:grow/>
-            </m:dPr>
+          <m:eqArr>
             <m:e>
               <m:r>
-                <m:t>0</m:t>
-              </m:r>
-              <m:r>
-                <m:rPr>
-                  <m:sty m:val="p"/>
-                </m:rPr>
-                <m:t>,</m:t>
-              </m:r>
-              <m:r>
-                <m:t>1</m:t>
-              </m:r>
-              <m:r>
-                <m:rPr>
-                  <m:sty m:val="p"/>
-                </m:rPr>
-                <m:t>,</m:t>
-              </m:r>
-              <m:r>
-                <m:t>2</m:t>
-              </m:r>
-              <m:r>
-                <m:rPr>
-                  <m:sty m:val="p"/>
-                </m:rPr>
-                <m:t>,</m:t>
-              </m:r>
-              <m:r>
-                <m:rPr>
-                  <m:sty m:val="p"/>
-                </m:rPr>
-                <m:t>…</m:t>
+                <m:rPr>
+                  <m:scr m:val="script"/>
+                  <m:sty m:val="p"/>
+                </m:rPr>
+                <m:t>R</m:t>
+              </m:r>
+              <m:r>
+                <m:rPr>
+                  <m:sty m:val="p"/>
+                </m:rPr>
+                <m:t>(</m:t>
+              </m:r>
+              <m:r>
+                <m:t>Y</m:t>
+              </m:r>
+              <m:r>
+                <m:rPr>
+                  <m:sty m:val="p"/>
+                </m:rPr>
+                <m:t>)</m:t>
+              </m:r>
+              <m:r>
+                <m:t>&amp;</m:t>
+              </m:r>
+              <m:r>
+                <m:rPr>
+                  <m:sty m:val="p"/>
+                </m:rPr>
+                <m:t>=</m:t>
+              </m:r>
+              <m:r>
+                <m:t>​</m:t>
+              </m:r>
+              <m:d>
+                <m:dPr>
+                  <m:begChr m:val="{"/>
+                  <m:sepChr m:val=""/>
+                  <m:endChr m:val="}"/>
+                  <m:grow/>
+                </m:dPr>
+                <m:e>
+                  <m:r>
+                    <m:t>0</m:t>
+                  </m:r>
+                  <m:r>
+                    <m:rPr>
+                      <m:sty m:val="p"/>
+                    </m:rPr>
+                    <m:t>,</m:t>
+                  </m:r>
+                  <m:r>
+                    <m:t>1</m:t>
+                  </m:r>
+                  <m:r>
+                    <m:rPr>
+                      <m:sty m:val="p"/>
+                    </m:rPr>
+                    <m:t>,</m:t>
+                  </m:r>
+                  <m:r>
+                    <m:t>2</m:t>
+                  </m:r>
+                  <m:r>
+                    <m:rPr>
+                      <m:sty m:val="p"/>
+                    </m:rPr>
+                    <m:t>,</m:t>
+                  </m:r>
+                  <m:r>
+                    <m:rPr>
+                      <m:sty m:val="p"/>
+                    </m:rPr>
+                    <m:t>…</m:t>
+                  </m:r>
+                </m:e>
+              </m:d>
+              <m:r>
+                <m:t>​</m:t>
               </m:r>
             </m:e>
-          </m:d>
-          <m:r>
-            <m:t>​</m:t>
-          </m:r>
-          <m:r>
-            <m:rPr>
-              <m:sty m:val="p"/>
-            </m:rPr>
-            <m:t>=</m:t>
-          </m:r>
-          <m:r>
-            <m:rPr>
-              <m:scr m:val="double-struck"/>
-              <m:sty m:val="p"/>
-            </m:rPr>
-            <m:t>N</m:t>
-          </m:r>
+            <m:e>
+              <m:r>
+                <m:t>&amp;</m:t>
+              </m:r>
+              <m:r>
+                <m:rPr>
+                  <m:sty m:val="p"/>
+                </m:rPr>
+                <m:t>=</m:t>
+              </m:r>
+              <m:r>
+                <m:rPr>
+                  <m:scr m:val="double-struck"/>
+                  <m:sty m:val="p"/>
+                </m:rPr>
+                <m:t>N</m:t>
+              </m:r>
+            </m:e>
+          </m:eqArr>
         </m:oMath>
       </m:oMathPara>
     </w:p>
@@ -21623,6 +21635,19 @@
                 <m:rPr>
                   <m:sty m:val="p"/>
                 </m:rPr>
+                <m:t>Λ</m:t>
+              </m:r>
+              <m:r>
+                <m:rPr>
+                  <m:nor/>
+                  <m:sty m:val="p"/>
+                </m:rPr>
+                <m:t> and </m:t>
+              </m:r>
+              <m:r>
+                <m:rPr>
+                  <m:sty m:val="p"/>
+                </m:rPr>
                 <m:t>E</m:t>
               </m:r>
               <m:r>
@@ -47114,228 +47139,245 @@
           <m:jc m:val="center"/>
         </m:oMathParaPr>
         <m:oMath>
-          <m:r>
-            <m:rPr>
-              <m:sty m:val="p"/>
-            </m:rPr>
-            <m:t>P</m:t>
-          </m:r>
-          <m:r>
-            <m:rPr>
-              <m:sty m:val="p"/>
-            </m:rPr>
-            <m:t>(</m:t>
-          </m:r>
-          <m:r>
-            <m:t>C</m:t>
-          </m:r>
-          <m:r>
-            <m:rPr>
-              <m:sty m:val="p"/>
-            </m:rPr>
-            <m:t>=</m:t>
-          </m:r>
-          <m:r>
-            <m:t>2</m:t>
-          </m:r>
-          <m:r>
-            <m:rPr>
-              <m:sty m:val="p"/>
-            </m:rPr>
-            <m:t>∣</m:t>
-          </m:r>
-          <m:r>
-            <m:t>X</m:t>
-          </m:r>
-          <m:r>
-            <m:rPr>
-              <m:sty m:val="p"/>
-            </m:rPr>
-            <m:t>=</m:t>
-          </m:r>
-          <m:r>
-            <m:t>3</m:t>
-          </m:r>
-          <m:r>
-            <m:rPr>
-              <m:sty m:val="p"/>
-            </m:rPr>
-            <m:t>)</m:t>
-          </m:r>
-          <m:r>
-            <m:rPr>
-              <m:sty m:val="p"/>
-            </m:rPr>
-            <m:t>=</m:t>
-          </m:r>
-          <m:f>
-            <m:fPr>
-              <m:type m:val="bar"/>
-            </m:fPr>
-            <m:num>
-              <m:r>
-                <m:t>0.7</m:t>
-              </m:r>
-              <m:r>
-                <m:t> </m:t>
-              </m:r>
-              <m:sSub>
-                <m:e>
+          <m:eqArr>
+            <m:e>
+              <m:r>
+                <m:rPr>
+                  <m:sty m:val="p"/>
+                </m:rPr>
+                <m:t>P</m:t>
+              </m:r>
+              <m:r>
+                <m:rPr>
+                  <m:sty m:val="p"/>
+                </m:rPr>
+                <m:t>(</m:t>
+              </m:r>
+              <m:r>
+                <m:t>C</m:t>
+              </m:r>
+              <m:r>
+                <m:rPr>
+                  <m:sty m:val="p"/>
+                </m:rPr>
+                <m:t>=</m:t>
+              </m:r>
+              <m:r>
+                <m:t>2</m:t>
+              </m:r>
+              <m:r>
+                <m:rPr>
+                  <m:sty m:val="p"/>
+                </m:rPr>
+                <m:t>∣</m:t>
+              </m:r>
+              <m:r>
+                <m:t>X</m:t>
+              </m:r>
+              <m:r>
+                <m:rPr>
+                  <m:sty m:val="p"/>
+                </m:rPr>
+                <m:t>=</m:t>
+              </m:r>
+              <m:r>
+                <m:t>3</m:t>
+              </m:r>
+              <m:r>
+                <m:rPr>
+                  <m:sty m:val="p"/>
+                </m:rPr>
+                <m:t>)</m:t>
+              </m:r>
+              <m:r>
+                <m:t>&amp;</m:t>
+              </m:r>
+              <m:r>
+                <m:rPr>
+                  <m:sty m:val="p"/>
+                </m:rPr>
+                <m:t>=</m:t>
+              </m:r>
+              <m:f>
+                <m:fPr>
+                  <m:type m:val="bar"/>
+                </m:fPr>
+                <m:num>
+                  <m:r>
+                    <m:t>0.7</m:t>
+                  </m:r>
+                  <m:r>
+                    <m:t> </m:t>
+                  </m:r>
+                  <m:sSub>
+                    <m:e>
+                      <m:r>
+                        <m:rPr>
+                          <m:sty m:val="p"/>
+                        </m:rPr>
+                        <m:t>p</m:t>
+                      </m:r>
+                    </m:e>
+                    <m:sub>
+                      <m:r>
+                        <m:t>2</m:t>
+                      </m:r>
+                    </m:sub>
+                  </m:sSub>
                   <m:r>
                     <m:rPr>
                       <m:sty m:val="p"/>
                     </m:rPr>
-                    <m:t>p</m:t>
-                  </m:r>
-                </m:e>
-                <m:sub>
-                  <m:r>
-                    <m:t>2</m:t>
-                  </m:r>
-                </m:sub>
-              </m:sSub>
-              <m:r>
-                <m:rPr>
-                  <m:sty m:val="p"/>
-                </m:rPr>
-                <m:t>(</m:t>
-              </m:r>
-              <m:r>
-                <m:t>3</m:t>
-              </m:r>
-              <m:r>
-                <m:rPr>
-                  <m:sty m:val="p"/>
-                </m:rPr>
-                <m:t>)</m:t>
-              </m:r>
-            </m:num>
-            <m:den>
-              <m:r>
-                <m:t>0.3</m:t>
-              </m:r>
-              <m:r>
-                <m:t> </m:t>
-              </m:r>
-              <m:sSub>
-                <m:e>
+                    <m:t>(</m:t>
+                  </m:r>
+                  <m:r>
+                    <m:t>3</m:t>
+                  </m:r>
                   <m:r>
                     <m:rPr>
                       <m:sty m:val="p"/>
                     </m:rPr>
-                    <m:t>p</m:t>
-                  </m:r>
-                </m:e>
-                <m:sub>
-                  <m:r>
-                    <m:t>1</m:t>
-                  </m:r>
-                </m:sub>
-              </m:sSub>
-              <m:r>
-                <m:rPr>
-                  <m:sty m:val="p"/>
-                </m:rPr>
-                <m:t>(</m:t>
-              </m:r>
-              <m:r>
-                <m:t>3</m:t>
-              </m:r>
-              <m:r>
-                <m:rPr>
-                  <m:sty m:val="p"/>
-                </m:rPr>
-                <m:t>)</m:t>
-              </m:r>
-              <m:r>
-                <m:rPr>
-                  <m:sty m:val="p"/>
-                </m:rPr>
-                <m:t>+</m:t>
-              </m:r>
-              <m:r>
-                <m:t>0.7</m:t>
-              </m:r>
-              <m:r>
-                <m:t> </m:t>
-              </m:r>
-              <m:sSub>
-                <m:e>
+                    <m:t>)</m:t>
+                  </m:r>
+                </m:num>
+                <m:den>
+                  <m:r>
+                    <m:t>0.3</m:t>
+                  </m:r>
+                  <m:r>
+                    <m:t> </m:t>
+                  </m:r>
+                  <m:sSub>
+                    <m:e>
+                      <m:r>
+                        <m:rPr>
+                          <m:sty m:val="p"/>
+                        </m:rPr>
+                        <m:t>p</m:t>
+                      </m:r>
+                    </m:e>
+                    <m:sub>
+                      <m:r>
+                        <m:t>1</m:t>
+                      </m:r>
+                    </m:sub>
+                  </m:sSub>
                   <m:r>
                     <m:rPr>
                       <m:sty m:val="p"/>
                     </m:rPr>
-                    <m:t>p</m:t>
-                  </m:r>
-                </m:e>
-                <m:sub>
-                  <m:r>
-                    <m:t>2</m:t>
-                  </m:r>
-                </m:sub>
-              </m:sSub>
-              <m:r>
-                <m:rPr>
-                  <m:sty m:val="p"/>
-                </m:rPr>
-                <m:t>(</m:t>
-              </m:r>
-              <m:r>
-                <m:t>3</m:t>
-              </m:r>
-              <m:r>
-                <m:rPr>
-                  <m:sty m:val="p"/>
-                </m:rPr>
-                <m:t>)</m:t>
-              </m:r>
-            </m:den>
-          </m:f>
-          <m:r>
-            <m:rPr>
-              <m:sty m:val="p"/>
-            </m:rPr>
-            <m:t>=</m:t>
-          </m:r>
-          <m:f>
-            <m:fPr>
-              <m:type m:val="bar"/>
-            </m:fPr>
-            <m:num>
+                    <m:t>(</m:t>
+                  </m:r>
+                  <m:r>
+                    <m:t>3</m:t>
+                  </m:r>
+                  <m:r>
+                    <m:rPr>
+                      <m:sty m:val="p"/>
+                    </m:rPr>
+                    <m:t>)</m:t>
+                  </m:r>
+                  <m:r>
+                    <m:rPr>
+                      <m:sty m:val="p"/>
+                    </m:rPr>
+                    <m:t>+</m:t>
+                  </m:r>
+                  <m:r>
+                    <m:t>0.7</m:t>
+                  </m:r>
+                  <m:r>
+                    <m:t> </m:t>
+                  </m:r>
+                  <m:sSub>
+                    <m:e>
+                      <m:r>
+                        <m:rPr>
+                          <m:sty m:val="p"/>
+                        </m:rPr>
+                        <m:t>p</m:t>
+                      </m:r>
+                    </m:e>
+                    <m:sub>
+                      <m:r>
+                        <m:t>2</m:t>
+                      </m:r>
+                    </m:sub>
+                  </m:sSub>
+                  <m:r>
+                    <m:rPr>
+                      <m:sty m:val="p"/>
+                    </m:rPr>
+                    <m:t>(</m:t>
+                  </m:r>
+                  <m:r>
+                    <m:t>3</m:t>
+                  </m:r>
+                  <m:r>
+                    <m:rPr>
+                      <m:sty m:val="p"/>
+                    </m:rPr>
+                    <m:t>)</m:t>
+                  </m:r>
+                </m:den>
+              </m:f>
+            </m:e>
+            <m:e>
+              <m:r>
+                <m:t>&amp;</m:t>
+              </m:r>
+              <m:r>
+                <m:rPr>
+                  <m:sty m:val="p"/>
+                </m:rPr>
+                <m:t>=</m:t>
+              </m:r>
+              <m:f>
+                <m:fPr>
+                  <m:type m:val="bar"/>
+                </m:fPr>
+                <m:num>
+                  <m:r>
+                    <m:t>0.7</m:t>
+                  </m:r>
+                </m:num>
+                <m:den>
+                  <m:r>
+                    <m:t>0.3</m:t>
+                  </m:r>
+                  <m:r>
+                    <m:rPr>
+                      <m:sty m:val="p"/>
+                    </m:rPr>
+                    <m:t>+</m:t>
+                  </m:r>
+                  <m:r>
+                    <m:t>0.7</m:t>
+                  </m:r>
+                </m:den>
+              </m:f>
+            </m:e>
+            <m:e>
+              <m:r>
+                <m:t>&amp;</m:t>
+              </m:r>
+              <m:r>
+                <m:rPr>
+                  <m:sty m:val="p"/>
+                </m:rPr>
+                <m:t>=</m:t>
+              </m:r>
               <m:r>
                 <m:t>0.7</m:t>
               </m:r>
-            </m:num>
-            <m:den>
-              <m:r>
-                <m:t>0.3</m:t>
-              </m:r>
-              <m:r>
-                <m:rPr>
-                  <m:sty m:val="p"/>
-                </m:rPr>
-                <m:t>+</m:t>
-              </m:r>
-              <m:r>
-                <m:t>0.7</m:t>
-              </m:r>
-            </m:den>
-          </m:f>
-          <m:r>
-            <m:rPr>
-              <m:sty m:val="p"/>
-            </m:rPr>
-            <m:t>=</m:t>
-          </m:r>
-          <m:r>
-            <m:t>0.7</m:t>
-          </m:r>
-          <m:r>
-            <m:rPr>
-              <m:sty m:val="p"/>
-            </m:rPr>
-            <m:t>,</m:t>
-          </m:r>
+              <m:r>
+                <m:rPr>
+                  <m:sty m:val="p"/>
+                </m:rPr>
+                <m:t>,</m:t>
+              </m:r>
+            </m:e>
+          </m:eqArr>
         </m:oMath>
       </m:oMathPara>
     </w:p>

</xml_diff>

<commit_message>
Deploying to gh-pages from @ Morrison-Lab/pds@1bf63957537ae5560c20b9f617e7e6f76f2e2731 🚀
</commit_message>
<xml_diff>
--- a/distributions.docx
+++ b/distributions.docx
@@ -15,7 +15,7 @@
         <w:pStyle w:val="Date"/>
       </w:pPr>
       <w:r>
-        <w:t xml:space="preserve">Last modified: 2026-10-09 10:13:34 (PDT)</w:t>
+        <w:t xml:space="preserve">Last modified: 2026-10-09 10:20:25 (PDT)</w:t>
       </w:r>
     </w:p>
     <w:p>
@@ -20937,102 +20937,123 @@
       <w:r>
         <w:t xml:space="preserve">using</w:t>
       </w:r>
-      <w:r>
-        <w:t xml:space="preserve"> </w:t>
-      </w:r>
-      <m:oMath>
-        <m:r>
-          <m:rPr>
-            <m:sty m:val="p"/>
-          </m:rPr>
-          <m:t>E</m:t>
-        </m:r>
-        <m:r>
-          <m:t>​</m:t>
-        </m:r>
-        <m:d>
-          <m:dPr>
-            <m:begChr m:val="["/>
-            <m:sepChr m:val=""/>
-            <m:endChr m:val="]"/>
-            <m:grow/>
-          </m:dPr>
-          <m:e>
-            <m:r>
-              <m:t>Y</m:t>
-            </m:r>
-            <m:r>
-              <m:rPr>
-                <m:sty m:val="p"/>
-              </m:rPr>
-              <m:t>∣</m:t>
-            </m:r>
-            <m:r>
-              <m:rPr>
-                <m:sty m:val="p"/>
-              </m:rPr>
-              <m:t>Λ</m:t>
-            </m:r>
-          </m:e>
-        </m:d>
-        <m:r>
-          <m:t>​</m:t>
-        </m:r>
-        <m:r>
-          <m:rPr>
-            <m:sty m:val="p"/>
-          </m:rPr>
-          <m:t>=</m:t>
-        </m:r>
-        <m:r>
-          <m:rPr>
-            <m:sty m:val="p"/>
-          </m:rPr>
-          <m:t>Var</m:t>
-        </m:r>
-        <m:r>
-          <m:rPr>
-            <m:sty m:val="p"/>
-          </m:rPr>
-          <m:t>(</m:t>
-        </m:r>
-        <m:r>
-          <m:t>Y</m:t>
-        </m:r>
-        <m:r>
-          <m:rPr>
-            <m:sty m:val="p"/>
-          </m:rPr>
-          <m:t>∣</m:t>
-        </m:r>
-        <m:r>
-          <m:rPr>
-            <m:sty m:val="p"/>
-          </m:rPr>
-          <m:t>Λ</m:t>
-        </m:r>
-        <m:r>
-          <m:rPr>
-            <m:sty m:val="p"/>
-          </m:rPr>
-          <m:t>)</m:t>
-        </m:r>
-        <m:r>
-          <m:rPr>
-            <m:sty m:val="p"/>
-          </m:rPr>
-          <m:t>=</m:t>
-        </m:r>
-        <m:r>
-          <m:rPr>
-            <m:sty m:val="p"/>
-          </m:rPr>
-          <m:t>Λ</m:t>
-        </m:r>
-      </m:oMath>
-      <w:r>
-        <w:t xml:space="preserve"> </w:t>
-      </w:r>
+    </w:p>
+    <w:p>
+      <w:pPr>
+        <w:pStyle w:val="BodyText"/>
+      </w:pPr>
+      <m:oMathPara>
+        <m:oMathParaPr>
+          <m:jc m:val="center"/>
+        </m:oMathParaPr>
+        <m:oMath>
+          <m:eqArr>
+            <m:e>
+              <m:r>
+                <m:rPr>
+                  <m:sty m:val="p"/>
+                </m:rPr>
+                <m:t>E</m:t>
+              </m:r>
+              <m:r>
+                <m:t>​</m:t>
+              </m:r>
+              <m:d>
+                <m:dPr>
+                  <m:begChr m:val="["/>
+                  <m:sepChr m:val=""/>
+                  <m:endChr m:val="]"/>
+                  <m:grow/>
+                </m:dPr>
+                <m:e>
+                  <m:r>
+                    <m:t>Y</m:t>
+                  </m:r>
+                  <m:r>
+                    <m:rPr>
+                      <m:sty m:val="p"/>
+                    </m:rPr>
+                    <m:t>∣</m:t>
+                  </m:r>
+                  <m:r>
+                    <m:rPr>
+                      <m:sty m:val="p"/>
+                    </m:rPr>
+                    <m:t>Λ</m:t>
+                  </m:r>
+                </m:e>
+              </m:d>
+              <m:r>
+                <m:t>​</m:t>
+              </m:r>
+              <m:r>
+                <m:t>&amp;</m:t>
+              </m:r>
+              <m:r>
+                <m:rPr>
+                  <m:sty m:val="p"/>
+                </m:rPr>
+                <m:t>=</m:t>
+              </m:r>
+              <m:r>
+                <m:rPr>
+                  <m:sty m:val="p"/>
+                </m:rPr>
+                <m:t>Var</m:t>
+              </m:r>
+              <m:r>
+                <m:rPr>
+                  <m:sty m:val="p"/>
+                </m:rPr>
+                <m:t>(</m:t>
+              </m:r>
+              <m:r>
+                <m:t>Y</m:t>
+              </m:r>
+              <m:r>
+                <m:rPr>
+                  <m:sty m:val="p"/>
+                </m:rPr>
+                <m:t>∣</m:t>
+              </m:r>
+              <m:r>
+                <m:rPr>
+                  <m:sty m:val="p"/>
+                </m:rPr>
+                <m:t>Λ</m:t>
+              </m:r>
+              <m:r>
+                <m:rPr>
+                  <m:sty m:val="p"/>
+                </m:rPr>
+                <m:t>)</m:t>
+              </m:r>
+            </m:e>
+            <m:e>
+              <m:r>
+                <m:t>&amp;</m:t>
+              </m:r>
+              <m:r>
+                <m:rPr>
+                  <m:sty m:val="p"/>
+                </m:rPr>
+                <m:t>=</m:t>
+              </m:r>
+              <m:r>
+                <m:rPr>
+                  <m:sty m:val="p"/>
+                </m:rPr>
+                <m:t>Λ</m:t>
+              </m:r>
+            </m:e>
+          </m:eqArr>
+        </m:oMath>
+      </m:oMathPara>
+    </w:p>
+    <w:p>
+      <w:pPr>
+        <w:pStyle w:val="FirstParagraph"/>
+      </w:pPr>
       <w:r>
         <w:t xml:space="preserve">(</w:t>
       </w:r>
@@ -21925,78 +21946,102 @@
       <w:r>
         <w:t xml:space="preserve">,</w:t>
       </w:r>
-      <w:r>
-        <w:t xml:space="preserve"> </w:t>
-      </w:r>
-      <m:oMath>
-        <m:r>
-          <m:rPr>
-            <m:sty m:val="p"/>
-          </m:rPr>
-          <m:t>Var</m:t>
-        </m:r>
-        <m:r>
-          <m:t>​</m:t>
-        </m:r>
-        <m:d>
-          <m:dPr>
-            <m:begChr m:val="("/>
-            <m:sepChr m:val=""/>
-            <m:endChr m:val=")"/>
-            <m:grow/>
-          </m:dPr>
-          <m:e>
-            <m:r>
-              <m:t>Y</m:t>
-            </m:r>
-          </m:e>
-        </m:d>
-        <m:r>
-          <m:t>​</m:t>
-        </m:r>
-        <m:r>
-          <m:rPr>
-            <m:sty m:val="p"/>
-          </m:rPr>
-          <m:t>=</m:t>
-        </m:r>
-        <m:r>
-          <m:t>4</m:t>
-        </m:r>
-        <m:r>
-          <m:rPr>
-            <m:sty m:val="p"/>
-          </m:rPr>
-          <m:t>+</m:t>
-        </m:r>
-        <m:r>
-          <m:t>16</m:t>
-        </m:r>
-        <m:r>
-          <m:rPr>
-            <m:sty m:val="p"/>
-          </m:rPr>
-          <m:t>/</m:t>
-        </m:r>
-        <m:r>
-          <m:t>2</m:t>
-        </m:r>
-        <m:r>
-          <m:rPr>
-            <m:sty m:val="p"/>
-          </m:rPr>
-          <m:t>=</m:t>
-        </m:r>
-        <m:r>
-          <m:t>12</m:t>
-        </m:r>
-      </m:oMath>
-      <w:r>
-        <w:t xml:space="preserve">,</w:t>
-      </w:r>
-      <w:r>
-        <w:t xml:space="preserve"> </w:t>
-      </w:r>
+    </w:p>
+    <w:p>
+      <w:pPr>
+        <w:pStyle w:val="BodyText"/>
+      </w:pPr>
+      <m:oMathPara>
+        <m:oMathParaPr>
+          <m:jc m:val="center"/>
+        </m:oMathParaPr>
+        <m:oMath>
+          <m:eqArr>
+            <m:e>
+              <m:r>
+                <m:rPr>
+                  <m:sty m:val="p"/>
+                </m:rPr>
+                <m:t>Var</m:t>
+              </m:r>
+              <m:r>
+                <m:t>​</m:t>
+              </m:r>
+              <m:d>
+                <m:dPr>
+                  <m:begChr m:val="("/>
+                  <m:sepChr m:val=""/>
+                  <m:endChr m:val=")"/>
+                  <m:grow/>
+                </m:dPr>
+                <m:e>
+                  <m:r>
+                    <m:t>Y</m:t>
+                  </m:r>
+                </m:e>
+              </m:d>
+              <m:r>
+                <m:t>​</m:t>
+              </m:r>
+              <m:r>
+                <m:t>&amp;</m:t>
+              </m:r>
+              <m:r>
+                <m:rPr>
+                  <m:sty m:val="p"/>
+                </m:rPr>
+                <m:t>=</m:t>
+              </m:r>
+              <m:r>
+                <m:t>4</m:t>
+              </m:r>
+              <m:r>
+                <m:rPr>
+                  <m:sty m:val="p"/>
+                </m:rPr>
+                <m:t>+</m:t>
+              </m:r>
+              <m:r>
+                <m:t>16</m:t>
+              </m:r>
+              <m:r>
+                <m:rPr>
+                  <m:sty m:val="p"/>
+                </m:rPr>
+                <m:t>/</m:t>
+              </m:r>
+              <m:r>
+                <m:t>2</m:t>
+              </m:r>
+            </m:e>
+            <m:e>
+              <m:r>
+                <m:t>&amp;</m:t>
+              </m:r>
+              <m:r>
+                <m:rPr>
+                  <m:sty m:val="p"/>
+                </m:rPr>
+                <m:t>=</m:t>
+              </m:r>
+              <m:r>
+                <m:t>12</m:t>
+              </m:r>
+              <m:r>
+                <m:rPr>
+                  <m:sty m:val="p"/>
+                </m:rPr>
+                <m:t>,</m:t>
+              </m:r>
+            </m:e>
+          </m:eqArr>
+        </m:oMath>
+      </m:oMathPara>
+    </w:p>
+    <w:p>
+      <w:pPr>
+        <w:pStyle w:val="FirstParagraph"/>
+      </w:pPr>
       <w:r>
         <w:t xml:space="preserve">three times the variance of a</w:t>
       </w:r>
@@ -22805,59 +22850,89 @@
       <w:r>
         <w:t xml:space="preserve">, the distance is</w:t>
       </w:r>
-      <w:r>
-        <w:t xml:space="preserve"> </w:t>
-      </w:r>
-      <m:oMath>
-        <m:r>
-          <m:t>​</m:t>
-        </m:r>
-        <m:d>
-          <m:dPr>
-            <m:begChr m:val="|"/>
-            <m:sepChr m:val=""/>
-            <m:endChr m:val="|"/>
-            <m:grow/>
-          </m:dPr>
-          <m:e>
-            <m:r>
-              <m:t>5</m:t>
-            </m:r>
-            <m:r>
-              <m:rPr>
-                <m:sty m:val="p"/>
-              </m:rPr>
-              <m:t>−</m:t>
-            </m:r>
-            <m:r>
-              <m:t>3</m:t>
-            </m:r>
-          </m:e>
-        </m:d>
-        <m:r>
-          <m:t>​</m:t>
-        </m:r>
-        <m:r>
-          <m:rPr>
-            <m:sty m:val="p"/>
-          </m:rPr>
-          <m:t>=</m:t>
-        </m:r>
-        <m:r>
-          <m:t>2</m:t>
-        </m:r>
-        <m:r>
-          <m:rPr>
-            <m:sty m:val="p"/>
-          </m:rPr>
-          <m:t>=</m:t>
-        </m:r>
-        <m:r>
-          <m:t>b</m:t>
-        </m:r>
-      </m:oMath>
-      <w:r>
-        <w:t xml:space="preserve">, so the density is</w:t>
+    </w:p>
+    <w:p>
+      <w:pPr>
+        <w:pStyle w:val="BodyText"/>
+      </w:pPr>
+      <m:oMathPara>
+        <m:oMathParaPr>
+          <m:jc m:val="center"/>
+        </m:oMathParaPr>
+        <m:oMath>
+          <m:eqArr>
+            <m:e>
+              <m:r>
+                <m:t>​</m:t>
+              </m:r>
+              <m:d>
+                <m:dPr>
+                  <m:begChr m:val="|"/>
+                  <m:sepChr m:val=""/>
+                  <m:endChr m:val="|"/>
+                  <m:grow/>
+                </m:dPr>
+                <m:e>
+                  <m:r>
+                    <m:t>5</m:t>
+                  </m:r>
+                  <m:r>
+                    <m:rPr>
+                      <m:sty m:val="p"/>
+                    </m:rPr>
+                    <m:t>−</m:t>
+                  </m:r>
+                  <m:r>
+                    <m:t>3</m:t>
+                  </m:r>
+                </m:e>
+              </m:d>
+              <m:r>
+                <m:t>​</m:t>
+              </m:r>
+              <m:r>
+                <m:t>&amp;</m:t>
+              </m:r>
+              <m:r>
+                <m:rPr>
+                  <m:sty m:val="p"/>
+                </m:rPr>
+                <m:t>=</m:t>
+              </m:r>
+              <m:r>
+                <m:t>2</m:t>
+              </m:r>
+            </m:e>
+            <m:e>
+              <m:r>
+                <m:t>&amp;</m:t>
+              </m:r>
+              <m:r>
+                <m:rPr>
+                  <m:sty m:val="p"/>
+                </m:rPr>
+                <m:t>=</m:t>
+              </m:r>
+              <m:r>
+                <m:t>b</m:t>
+              </m:r>
+              <m:r>
+                <m:rPr>
+                  <m:sty m:val="p"/>
+                </m:rPr>
+                <m:t>,</m:t>
+              </m:r>
+            </m:e>
+          </m:eqArr>
+        </m:oMath>
+      </m:oMathPara>
+    </w:p>
+    <w:p>
+      <w:pPr>
+        <w:pStyle w:val="FirstParagraph"/>
+      </w:pPr>
+      <w:r>
+        <w:t xml:space="preserve">so the density is</w:t>
       </w:r>
       <w:r>
         <w:t xml:space="preserve"> </w:t>
@@ -23855,200 +23930,243 @@
       <w:r>
         <w:t xml:space="preserve">, and</w:t>
       </w:r>
-      <w:r>
-        <w:t xml:space="preserve"> </w:t>
-      </w:r>
-      <m:oMath>
-        <m:r>
-          <m:rPr>
-            <m:sty m:val="p"/>
-          </m:rPr>
-          <m:t>E</m:t>
-        </m:r>
-        <m:r>
-          <m:t>​</m:t>
-        </m:r>
-        <m:d>
-          <m:dPr>
-            <m:begChr m:val="["/>
-            <m:sepChr m:val=""/>
-            <m:endChr m:val="]"/>
-            <m:grow/>
-          </m:dPr>
-          <m:e>
-            <m:r>
-              <m:t>Y</m:t>
-            </m:r>
-          </m:e>
-        </m:d>
-        <m:r>
-          <m:t>​</m:t>
-        </m:r>
-        <m:r>
-          <m:rPr>
-            <m:sty m:val="p"/>
-          </m:rPr>
-          <m:t>=</m:t>
-        </m:r>
-        <m:r>
-          <m:t>μ</m:t>
-        </m:r>
-        <m:r>
-          <m:rPr>
-            <m:sty m:val="p"/>
-          </m:rPr>
-          <m:t>+</m:t>
-        </m:r>
-        <m:r>
-          <m:rPr>
-            <m:sty m:val="p"/>
-          </m:rPr>
-          <m:t>E</m:t>
-        </m:r>
-        <m:r>
-          <m:t>​</m:t>
-        </m:r>
-        <m:d>
-          <m:dPr>
-            <m:begChr m:val="["/>
-            <m:sepChr m:val=""/>
-            <m:endChr m:val="]"/>
-            <m:grow/>
-          </m:dPr>
-          <m:e>
-            <m:r>
-              <m:t>U</m:t>
-            </m:r>
-          </m:e>
-        </m:d>
-        <m:r>
-          <m:t>​</m:t>
-        </m:r>
-        <m:r>
-          <m:rPr>
-            <m:sty m:val="p"/>
-          </m:rPr>
-          <m:t>=</m:t>
-        </m:r>
-        <m:r>
-          <m:t>μ</m:t>
-        </m:r>
-      </m:oMath>
-      <w:r>
-        <w:t xml:space="preserve">.</w:t>
-      </w:r>
     </w:p>
     <w:p>
       <w:pPr>
         <w:pStyle w:val="BodyText"/>
       </w:pPr>
+      <m:oMathPara>
+        <m:oMathParaPr>
+          <m:jc m:val="center"/>
+        </m:oMathParaPr>
+        <m:oMath>
+          <m:eqArr>
+            <m:e>
+              <m:r>
+                <m:rPr>
+                  <m:sty m:val="p"/>
+                </m:rPr>
+                <m:t>E</m:t>
+              </m:r>
+              <m:r>
+                <m:t>​</m:t>
+              </m:r>
+              <m:d>
+                <m:dPr>
+                  <m:begChr m:val="["/>
+                  <m:sepChr m:val=""/>
+                  <m:endChr m:val="]"/>
+                  <m:grow/>
+                </m:dPr>
+                <m:e>
+                  <m:r>
+                    <m:t>Y</m:t>
+                  </m:r>
+                </m:e>
+              </m:d>
+              <m:r>
+                <m:t>​</m:t>
+              </m:r>
+              <m:r>
+                <m:t>&amp;</m:t>
+              </m:r>
+              <m:r>
+                <m:rPr>
+                  <m:sty m:val="p"/>
+                </m:rPr>
+                <m:t>=</m:t>
+              </m:r>
+              <m:r>
+                <m:t>μ</m:t>
+              </m:r>
+              <m:r>
+                <m:rPr>
+                  <m:sty m:val="p"/>
+                </m:rPr>
+                <m:t>+</m:t>
+              </m:r>
+              <m:r>
+                <m:rPr>
+                  <m:sty m:val="p"/>
+                </m:rPr>
+                <m:t>E</m:t>
+              </m:r>
+              <m:r>
+                <m:t>​</m:t>
+              </m:r>
+              <m:d>
+                <m:dPr>
+                  <m:begChr m:val="["/>
+                  <m:sepChr m:val=""/>
+                  <m:endChr m:val="]"/>
+                  <m:grow/>
+                </m:dPr>
+                <m:e>
+                  <m:r>
+                    <m:t>U</m:t>
+                  </m:r>
+                </m:e>
+              </m:d>
+              <m:r>
+                <m:t>​</m:t>
+              </m:r>
+            </m:e>
+            <m:e>
+              <m:r>
+                <m:t>&amp;</m:t>
+              </m:r>
+              <m:r>
+                <m:rPr>
+                  <m:sty m:val="p"/>
+                </m:rPr>
+                <m:t>=</m:t>
+              </m:r>
+              <m:r>
+                <m:t>μ</m:t>
+              </m:r>
+              <m:r>
+                <m:rPr>
+                  <m:sty m:val="p"/>
+                </m:rPr>
+                <m:t>.</m:t>
+              </m:r>
+            </m:e>
+          </m:eqArr>
+        </m:oMath>
+      </m:oMathPara>
+    </w:p>
+    <w:p>
+      <w:pPr>
+        <w:pStyle w:val="FirstParagraph"/>
+      </w:pPr>
       <w:r>
         <w:t xml:space="preserve">For the variance,</w:t>
       </w:r>
-      <w:r>
-        <w:t xml:space="preserve"> </w:t>
-      </w:r>
-      <m:oMath>
-        <m:r>
-          <m:rPr>
-            <m:sty m:val="p"/>
-          </m:rPr>
-          <m:t>Var</m:t>
-        </m:r>
-        <m:r>
-          <m:t>​</m:t>
-        </m:r>
-        <m:d>
-          <m:dPr>
-            <m:begChr m:val="("/>
-            <m:sepChr m:val=""/>
-            <m:endChr m:val=")"/>
-            <m:grow/>
-          </m:dPr>
-          <m:e>
-            <m:r>
-              <m:t>Y</m:t>
-            </m:r>
-          </m:e>
-        </m:d>
-        <m:r>
-          <m:t>​</m:t>
-        </m:r>
-        <m:r>
-          <m:rPr>
-            <m:sty m:val="p"/>
-          </m:rPr>
-          <m:t>=</m:t>
-        </m:r>
-        <m:r>
-          <m:rPr>
-            <m:sty m:val="p"/>
-          </m:rPr>
-          <m:t>Var</m:t>
-        </m:r>
-        <m:r>
-          <m:t>​</m:t>
-        </m:r>
-        <m:d>
-          <m:dPr>
-            <m:begChr m:val="("/>
-            <m:sepChr m:val=""/>
-            <m:endChr m:val=")"/>
-            <m:grow/>
-          </m:dPr>
-          <m:e>
-            <m:r>
-              <m:t>U</m:t>
-            </m:r>
-          </m:e>
-        </m:d>
-        <m:r>
-          <m:t>​</m:t>
-        </m:r>
-        <m:r>
-          <m:rPr>
-            <m:sty m:val="p"/>
-          </m:rPr>
-          <m:t>=</m:t>
-        </m:r>
-        <m:r>
-          <m:rPr>
-            <m:sty m:val="p"/>
-          </m:rPr>
-          <m:t>E</m:t>
-        </m:r>
-        <m:r>
-          <m:t>​</m:t>
-        </m:r>
-        <m:d>
-          <m:dPr>
-            <m:begChr m:val="["/>
-            <m:sepChr m:val=""/>
-            <m:endChr m:val="]"/>
-            <m:grow/>
-          </m:dPr>
-          <m:e>
-            <m:sSup>
-              <m:e>
-                <m:r>
-                  <m:t>U</m:t>
-                </m:r>
-              </m:e>
-              <m:sup>
-                <m:r>
-                  <m:t>2</m:t>
-                </m:r>
-              </m:sup>
-            </m:sSup>
-          </m:e>
-        </m:d>
-        <m:r>
-          <m:t>​</m:t>
-        </m:r>
-      </m:oMath>
-      <w:r>
-        <w:t xml:space="preserve"> </w:t>
-      </w:r>
+    </w:p>
+    <w:p>
+      <w:pPr>
+        <w:pStyle w:val="BodyText"/>
+      </w:pPr>
+      <m:oMathPara>
+        <m:oMathParaPr>
+          <m:jc m:val="center"/>
+        </m:oMathParaPr>
+        <m:oMath>
+          <m:eqArr>
+            <m:e>
+              <m:r>
+                <m:rPr>
+                  <m:sty m:val="p"/>
+                </m:rPr>
+                <m:t>Var</m:t>
+              </m:r>
+              <m:r>
+                <m:t>​</m:t>
+              </m:r>
+              <m:d>
+                <m:dPr>
+                  <m:begChr m:val="("/>
+                  <m:sepChr m:val=""/>
+                  <m:endChr m:val=")"/>
+                  <m:grow/>
+                </m:dPr>
+                <m:e>
+                  <m:r>
+                    <m:t>Y</m:t>
+                  </m:r>
+                </m:e>
+              </m:d>
+              <m:r>
+                <m:t>​</m:t>
+              </m:r>
+              <m:r>
+                <m:t>&amp;</m:t>
+              </m:r>
+              <m:r>
+                <m:rPr>
+                  <m:sty m:val="p"/>
+                </m:rPr>
+                <m:t>=</m:t>
+              </m:r>
+              <m:r>
+                <m:rPr>
+                  <m:sty m:val="p"/>
+                </m:rPr>
+                <m:t>Var</m:t>
+              </m:r>
+              <m:r>
+                <m:t>​</m:t>
+              </m:r>
+              <m:d>
+                <m:dPr>
+                  <m:begChr m:val="("/>
+                  <m:sepChr m:val=""/>
+                  <m:endChr m:val=")"/>
+                  <m:grow/>
+                </m:dPr>
+                <m:e>
+                  <m:r>
+                    <m:t>U</m:t>
+                  </m:r>
+                </m:e>
+              </m:d>
+              <m:r>
+                <m:t>​</m:t>
+              </m:r>
+            </m:e>
+            <m:e>
+              <m:r>
+                <m:t>&amp;</m:t>
+              </m:r>
+              <m:r>
+                <m:rPr>
+                  <m:sty m:val="p"/>
+                </m:rPr>
+                <m:t>=</m:t>
+              </m:r>
+              <m:r>
+                <m:rPr>
+                  <m:sty m:val="p"/>
+                </m:rPr>
+                <m:t>E</m:t>
+              </m:r>
+              <m:r>
+                <m:t>​</m:t>
+              </m:r>
+              <m:d>
+                <m:dPr>
+                  <m:begChr m:val="["/>
+                  <m:sepChr m:val=""/>
+                  <m:endChr m:val="]"/>
+                  <m:grow/>
+                </m:dPr>
+                <m:e>
+                  <m:sSup>
+                    <m:e>
+                      <m:r>
+                        <m:t>U</m:t>
+                      </m:r>
+                    </m:e>
+                    <m:sup>
+                      <m:r>
+                        <m:t>2</m:t>
+                      </m:r>
+                    </m:sup>
+                  </m:sSup>
+                </m:e>
+              </m:d>
+              <m:r>
+                <m:t>​</m:t>
+              </m:r>
+            </m:e>
+          </m:eqArr>
+        </m:oMath>
+      </m:oMathPara>
+    </w:p>
+    <w:p>
+      <w:pPr>
+        <w:pStyle w:val="FirstParagraph"/>
+      </w:pPr>
       <w:r>
         <w:t xml:space="preserve">because</w:t>
       </w:r>
@@ -27089,68 +27207,89 @@
       <w:r>
         <w:t xml:space="preserve">so</w:t>
       </w:r>
-      <w:r>
-        <w:t xml:space="preserve"> </w:t>
-      </w:r>
-      <m:oMath>
-        <m:r>
-          <m:t>f</m:t>
-        </m:r>
-        <m:r>
-          <m:rPr>
-            <m:sty m:val="p"/>
-          </m:rPr>
-          <m:t>=</m:t>
-        </m:r>
-        <m:sSup>
-          <m:e>
-            <m:r>
-              <m:t>F</m:t>
-            </m:r>
-          </m:e>
-          <m:sup>
-            <m:r>
-              <m:rPr>
-                <m:sty m:val="p"/>
-              </m:rPr>
-              <m:t>′</m:t>
-            </m:r>
-          </m:sup>
-        </m:sSup>
-        <m:r>
-          <m:rPr>
-            <m:sty m:val="p"/>
-          </m:rPr>
-          <m:t>=</m:t>
-        </m:r>
-        <m:r>
-          <m:rPr>
-            <m:sty m:val="p"/>
-          </m:rPr>
-          <m:t>−</m:t>
-        </m:r>
-        <m:sSup>
-          <m:e>
-            <m:r>
-              <m:rPr>
-                <m:sty m:val="p"/>
-              </m:rPr>
-              <m:t>S</m:t>
-            </m:r>
-          </m:e>
-          <m:sup>
-            <m:r>
-              <m:rPr>
-                <m:sty m:val="p"/>
-              </m:rPr>
-              <m:t>′</m:t>
-            </m:r>
-          </m:sup>
-        </m:sSup>
-      </m:oMath>
-      <w:r>
-        <w:t xml:space="preserve"> </w:t>
-      </w:r>
+    </w:p>
+    <w:p>
+      <w:pPr>
+        <w:pStyle w:val="BodyText"/>
+      </w:pPr>
+      <m:oMathPara>
+        <m:oMathParaPr>
+          <m:jc m:val="center"/>
+        </m:oMathParaPr>
+        <m:oMath>
+          <m:eqArr>
+            <m:e>
+              <m:r>
+                <m:t>f</m:t>
+              </m:r>
+              <m:r>
+                <m:t>&amp;</m:t>
+              </m:r>
+              <m:r>
+                <m:rPr>
+                  <m:sty m:val="p"/>
+                </m:rPr>
+                <m:t>=</m:t>
+              </m:r>
+              <m:sSup>
+                <m:e>
+                  <m:r>
+                    <m:t>F</m:t>
+                  </m:r>
+                </m:e>
+                <m:sup>
+                  <m:r>
+                    <m:rPr>
+                      <m:sty m:val="p"/>
+                    </m:rPr>
+                    <m:t>′</m:t>
+                  </m:r>
+                </m:sup>
+              </m:sSup>
+            </m:e>
+            <m:e>
+              <m:r>
+                <m:t>&amp;</m:t>
+              </m:r>
+              <m:r>
+                <m:rPr>
+                  <m:sty m:val="p"/>
+                </m:rPr>
+                <m:t>=</m:t>
+              </m:r>
+              <m:r>
+                <m:rPr>
+                  <m:sty m:val="p"/>
+                </m:rPr>
+                <m:t>−</m:t>
+              </m:r>
+              <m:sSup>
+                <m:e>
+                  <m:r>
+                    <m:rPr>
+                      <m:sty m:val="p"/>
+                    </m:rPr>
+                    <m:t>S</m:t>
+                  </m:r>
+                </m:e>
+                <m:sup>
+                  <m:r>
+                    <m:rPr>
+                      <m:sty m:val="p"/>
+                    </m:rPr>
+                    <m:t>′</m:t>
+                  </m:r>
+                </m:sup>
+              </m:sSup>
+            </m:e>
+          </m:eqArr>
+        </m:oMath>
+      </m:oMathPara>
+    </w:p>
+    <w:p>
+      <w:pPr>
+        <w:pStyle w:val="FirstParagraph"/>
+      </w:pPr>
       <w:r>
         <w:t xml:space="preserve">is a density of</w:t>
       </w:r>
@@ -30332,34 +30471,150 @@
       <w:r>
         <w:t xml:space="preserve">and</w:t>
       </w:r>
+    </w:p>
+    <w:p>
+      <w:pPr>
+        <w:pStyle w:val="BodyText"/>
+      </w:pPr>
+      <m:oMathPara>
+        <m:oMathParaPr>
+          <m:jc m:val="center"/>
+        </m:oMathParaPr>
+        <m:oMath>
+          <m:eqArr>
+            <m:e>
+              <m:r>
+                <m:rPr>
+                  <m:sty m:val="p"/>
+                </m:rPr>
+                <m:t>E</m:t>
+              </m:r>
+              <m:r>
+                <m:t>​</m:t>
+              </m:r>
+              <m:d>
+                <m:dPr>
+                  <m:begChr m:val="["/>
+                  <m:sepChr m:val=""/>
+                  <m:endChr m:val="]"/>
+                  <m:grow/>
+                </m:dPr>
+                <m:e>
+                  <m:r>
+                    <m:t>T</m:t>
+                  </m:r>
+                </m:e>
+              </m:d>
+              <m:r>
+                <m:t>​</m:t>
+              </m:r>
+              <m:r>
+                <m:t>&amp;</m:t>
+              </m:r>
+              <m:r>
+                <m:rPr>
+                  <m:sty m:val="p"/>
+                </m:rPr>
+                <m:t>=</m:t>
+              </m:r>
+              <m:r>
+                <m:rPr>
+                  <m:sty m:val="p"/>
+                </m:rPr>
+                <m:t>Γ</m:t>
+              </m:r>
+              <m:r>
+                <m:rPr>
+                  <m:sty m:val="p"/>
+                </m:rPr>
+                <m:t>(</m:t>
+              </m:r>
+              <m:r>
+                <m:t>2</m:t>
+              </m:r>
+              <m:r>
+                <m:rPr>
+                  <m:sty m:val="p"/>
+                </m:rPr>
+                <m:t>)</m:t>
+              </m:r>
+              <m:sSup>
+                <m:e>
+                  <m:r>
+                    <m:t>λ</m:t>
+                  </m:r>
+                </m:e>
+                <m:sup>
+                  <m:r>
+                    <m:rPr>
+                      <m:sty m:val="p"/>
+                    </m:rPr>
+                    <m:t>−</m:t>
+                  </m:r>
+                  <m:r>
+                    <m:t>1</m:t>
+                  </m:r>
+                </m:sup>
+              </m:sSup>
+            </m:e>
+            <m:e>
+              <m:r>
+                <m:t>&amp;</m:t>
+              </m:r>
+              <m:r>
+                <m:rPr>
+                  <m:sty m:val="p"/>
+                </m:rPr>
+                <m:t>=</m:t>
+              </m:r>
+              <m:r>
+                <m:t>1</m:t>
+              </m:r>
+              <m:r>
+                <m:rPr>
+                  <m:sty m:val="p"/>
+                </m:rPr>
+                <m:t>/</m:t>
+              </m:r>
+              <m:r>
+                <m:t>λ</m:t>
+              </m:r>
+              <m:r>
+                <m:rPr>
+                  <m:sty m:val="p"/>
+                </m:rPr>
+                <m:t>,</m:t>
+              </m:r>
+            </m:e>
+          </m:eqArr>
+        </m:oMath>
+      </m:oMathPara>
+    </w:p>
+    <w:p>
+      <w:pPr>
+        <w:pStyle w:val="FirstParagraph"/>
+      </w:pPr>
+      <w:r>
+        <w:t xml:space="preserve">matching the exponential distribution’s constant hazard</w:t>
+      </w:r>
+      <w:r>
+        <w:t xml:space="preserve"> </w:t>
+      </w:r>
+      <w:r>
+        <w:t xml:space="preserve">and mean.</w:t>
+      </w:r>
+      <w:r>
+        <w:t xml:space="preserve"> </w:t>
+      </w:r>
+      <w:r>
+        <w:t xml:space="preserve">With</w:t>
+      </w:r>
       <w:r>
         <w:t xml:space="preserve"> </w:t>
       </w:r>
       <m:oMath>
         <m:r>
-          <m:rPr>
-            <m:sty m:val="p"/>
-          </m:rPr>
-          <m:t>E</m:t>
-        </m:r>
-        <m:r>
-          <m:t>​</m:t>
-        </m:r>
-        <m:d>
-          <m:dPr>
-            <m:begChr m:val="["/>
-            <m:sepChr m:val=""/>
-            <m:endChr m:val="]"/>
-            <m:grow/>
-          </m:dPr>
-          <m:e>
-            <m:r>
-              <m:t>T</m:t>
-            </m:r>
-          </m:e>
-        </m:d>
-        <m:r>
-          <m:t>​</m:t>
+          <m:t>α</m:t>
         </m:r>
         <m:r>
           <m:rPr>
@@ -30368,10 +30623,44 @@
           <m:t>=</m:t>
         </m:r>
         <m:r>
-          <m:rPr>
-            <m:sty m:val="p"/>
-          </m:rPr>
-          <m:t>Γ</m:t>
+          <m:t>2</m:t>
+        </m:r>
+      </m:oMath>
+      <w:r>
+        <w:t xml:space="preserve"> </w:t>
+      </w:r>
+      <w:r>
+        <w:t xml:space="preserve">and</w:t>
+      </w:r>
+      <w:r>
+        <w:t xml:space="preserve"> </w:t>
+      </w:r>
+      <m:oMath>
+        <m:r>
+          <m:t>λ</m:t>
+        </m:r>
+        <m:r>
+          <m:rPr>
+            <m:sty m:val="p"/>
+          </m:rPr>
+          <m:t>=</m:t>
+        </m:r>
+        <m:r>
+          <m:t>1</m:t>
+        </m:r>
+      </m:oMath>
+      <w:r>
+        <w:t xml:space="preserve">,</w:t>
+      </w:r>
+      <w:r>
+        <w:t xml:space="preserve"> </w:t>
+      </w:r>
+      <m:oMath>
+        <m:r>
+          <m:rPr>
+            <m:sty m:val="p"/>
+          </m:rPr>
+          <m:t>h</m:t>
         </m:r>
         <m:r>
           <m:rPr>
@@ -30380,280 +30669,181 @@
           <m:t>(</m:t>
         </m:r>
         <m:r>
+          <m:t>t</m:t>
+        </m:r>
+        <m:r>
+          <m:rPr>
+            <m:sty m:val="p"/>
+          </m:rPr>
+          <m:t>)</m:t>
+        </m:r>
+        <m:r>
+          <m:rPr>
+            <m:sty m:val="p"/>
+          </m:rPr>
+          <m:t>=</m:t>
+        </m:r>
+        <m:r>
           <m:t>2</m:t>
         </m:r>
         <m:r>
-          <m:rPr>
-            <m:sty m:val="p"/>
-          </m:rPr>
-          <m:t>)</m:t>
-        </m:r>
-        <m:sSup>
-          <m:e>
-            <m:r>
-              <m:t>λ</m:t>
-            </m:r>
-          </m:e>
-          <m:sup>
-            <m:r>
-              <m:rPr>
-                <m:sty m:val="p"/>
-              </m:rPr>
-              <m:t>−</m:t>
-            </m:r>
-            <m:r>
-              <m:t>1</m:t>
-            </m:r>
-          </m:sup>
-        </m:sSup>
-        <m:r>
-          <m:rPr>
-            <m:sty m:val="p"/>
-          </m:rPr>
-          <m:t>=</m:t>
-        </m:r>
-        <m:r>
-          <m:t>1</m:t>
-        </m:r>
-        <m:r>
-          <m:rPr>
-            <m:sty m:val="p"/>
-          </m:rPr>
-          <m:t>/</m:t>
-        </m:r>
-        <m:r>
-          <m:t>λ</m:t>
+          <m:t>t</m:t>
         </m:r>
       </m:oMath>
       <w:r>
+        <w:t xml:space="preserve"> </w:t>
+      </w:r>
+      <w:r>
+        <w:t xml:space="preserve">increases with</w:t>
+      </w:r>
+      <w:r>
+        <w:t xml:space="preserve"> </w:t>
+      </w:r>
+      <m:oMath>
+        <m:r>
+          <m:t>t</m:t>
+        </m:r>
+      </m:oMath>
+      <w:r>
         <w:t xml:space="preserve">,</w:t>
       </w:r>
       <w:r>
         <w:t xml:space="preserve"> </w:t>
       </w:r>
       <w:r>
-        <w:t xml:space="preserve">matching the exponential distribution’s constant hazard</w:t>
-      </w:r>
-      <w:r>
-        <w:t xml:space="preserve"> </w:t>
-      </w:r>
-      <w:r>
-        <w:t xml:space="preserve">and mean.</w:t>
-      </w:r>
-      <w:r>
-        <w:t xml:space="preserve"> </w:t>
-      </w:r>
-      <w:r>
-        <w:t xml:space="preserve">With</w:t>
-      </w:r>
-      <w:r>
-        <w:t xml:space="preserve"> </w:t>
-      </w:r>
-      <m:oMath>
-        <m:r>
-          <m:t>α</m:t>
-        </m:r>
-        <m:r>
-          <m:rPr>
-            <m:sty m:val="p"/>
-          </m:rPr>
-          <m:t>=</m:t>
-        </m:r>
-        <m:r>
-          <m:t>2</m:t>
-        </m:r>
-      </m:oMath>
-      <w:r>
-        <w:t xml:space="preserve"> </w:t>
-      </w:r>
-      <w:r>
         <w:t xml:space="preserve">and</w:t>
       </w:r>
-      <w:r>
-        <w:t xml:space="preserve"> </w:t>
-      </w:r>
-      <m:oMath>
-        <m:r>
-          <m:t>λ</m:t>
-        </m:r>
-        <m:r>
-          <m:rPr>
-            <m:sty m:val="p"/>
-          </m:rPr>
-          <m:t>=</m:t>
-        </m:r>
-        <m:r>
-          <m:t>1</m:t>
-        </m:r>
-      </m:oMath>
-      <w:r>
-        <w:t xml:space="preserve">,</w:t>
-      </w:r>
-      <w:r>
-        <w:t xml:space="preserve"> </w:t>
-      </w:r>
-      <m:oMath>
-        <m:r>
-          <m:rPr>
-            <m:sty m:val="p"/>
-          </m:rPr>
-          <m:t>h</m:t>
-        </m:r>
-        <m:r>
-          <m:rPr>
-            <m:sty m:val="p"/>
-          </m:rPr>
-          <m:t>(</m:t>
-        </m:r>
-        <m:r>
-          <m:t>t</m:t>
-        </m:r>
-        <m:r>
-          <m:rPr>
-            <m:sty m:val="p"/>
-          </m:rPr>
-          <m:t>)</m:t>
-        </m:r>
-        <m:r>
-          <m:rPr>
-            <m:sty m:val="p"/>
-          </m:rPr>
-          <m:t>=</m:t>
-        </m:r>
-        <m:r>
-          <m:t>2</m:t>
-        </m:r>
-        <m:r>
-          <m:t>t</m:t>
-        </m:r>
-      </m:oMath>
-      <w:r>
-        <w:t xml:space="preserve"> </w:t>
-      </w:r>
-      <w:r>
-        <w:t xml:space="preserve">increases with</w:t>
-      </w:r>
-      <w:r>
-        <w:t xml:space="preserve"> </w:t>
-      </w:r>
-      <m:oMath>
-        <m:r>
-          <m:t>t</m:t>
-        </m:r>
-      </m:oMath>
-      <w:r>
-        <w:t xml:space="preserve">,</w:t>
-      </w:r>
-      <w:r>
-        <w:t xml:space="preserve"> </w:t>
-      </w:r>
-      <w:r>
-        <w:t xml:space="preserve">and</w:t>
-      </w:r>
-      <w:r>
-        <w:t xml:space="preserve"> </w:t>
-      </w:r>
-      <m:oMath>
-        <m:r>
-          <m:rPr>
-            <m:sty m:val="p"/>
-          </m:rPr>
-          <m:t>E</m:t>
-        </m:r>
-        <m:r>
-          <m:t>​</m:t>
-        </m:r>
-        <m:d>
-          <m:dPr>
-            <m:begChr m:val="["/>
-            <m:sepChr m:val=""/>
-            <m:endChr m:val="]"/>
-            <m:grow/>
-          </m:dPr>
-          <m:e>
-            <m:r>
-              <m:t>T</m:t>
-            </m:r>
-          </m:e>
-        </m:d>
-        <m:r>
-          <m:t>​</m:t>
-        </m:r>
-        <m:r>
-          <m:rPr>
-            <m:sty m:val="p"/>
-          </m:rPr>
-          <m:t>=</m:t>
-        </m:r>
-        <m:r>
-          <m:rPr>
-            <m:sty m:val="p"/>
-          </m:rPr>
-          <m:t>Γ</m:t>
-        </m:r>
-        <m:r>
-          <m:rPr>
-            <m:sty m:val="p"/>
-          </m:rPr>
-          <m:t>(</m:t>
-        </m:r>
-        <m:r>
-          <m:t>3</m:t>
-        </m:r>
-        <m:r>
-          <m:rPr>
-            <m:sty m:val="p"/>
-          </m:rPr>
-          <m:t>/</m:t>
-        </m:r>
-        <m:r>
-          <m:t>2</m:t>
-        </m:r>
-        <m:r>
-          <m:rPr>
-            <m:sty m:val="p"/>
-          </m:rPr>
-          <m:t>)</m:t>
-        </m:r>
-        <m:r>
-          <m:rPr>
-            <m:sty m:val="p"/>
-          </m:rPr>
-          <m:t>=</m:t>
-        </m:r>
-        <m:rad>
-          <m:radPr>
-            <m:degHide m:val="on"/>
-          </m:radPr>
-          <m:deg/>
-          <m:e>
-            <m:r>
-              <m:t>π</m:t>
-            </m:r>
-          </m:e>
-        </m:rad>
-        <m:r>
-          <m:rPr>
-            <m:sty m:val="p"/>
-          </m:rPr>
-          <m:t>/</m:t>
-        </m:r>
-        <m:r>
-          <m:t>2</m:t>
-        </m:r>
-        <m:r>
-          <m:rPr>
-            <m:sty m:val="p"/>
-          </m:rPr>
-          <m:t>≈</m:t>
-        </m:r>
-        <m:r>
-          <m:t>0.886</m:t>
-        </m:r>
-      </m:oMath>
-      <w:r>
-        <w:t xml:space="preserve">.</w:t>
-      </w:r>
+    </w:p>
+    <w:p>
+      <w:pPr>
+        <w:pStyle w:val="BodyText"/>
+      </w:pPr>
+      <m:oMathPara>
+        <m:oMathParaPr>
+          <m:jc m:val="center"/>
+        </m:oMathParaPr>
+        <m:oMath>
+          <m:eqArr>
+            <m:e>
+              <m:r>
+                <m:rPr>
+                  <m:sty m:val="p"/>
+                </m:rPr>
+                <m:t>E</m:t>
+              </m:r>
+              <m:r>
+                <m:t>​</m:t>
+              </m:r>
+              <m:d>
+                <m:dPr>
+                  <m:begChr m:val="["/>
+                  <m:sepChr m:val=""/>
+                  <m:endChr m:val="]"/>
+                  <m:grow/>
+                </m:dPr>
+                <m:e>
+                  <m:r>
+                    <m:t>T</m:t>
+                  </m:r>
+                </m:e>
+              </m:d>
+              <m:r>
+                <m:t>​</m:t>
+              </m:r>
+              <m:r>
+                <m:t>&amp;</m:t>
+              </m:r>
+              <m:r>
+                <m:rPr>
+                  <m:sty m:val="p"/>
+                </m:rPr>
+                <m:t>=</m:t>
+              </m:r>
+              <m:r>
+                <m:rPr>
+                  <m:sty m:val="p"/>
+                </m:rPr>
+                <m:t>Γ</m:t>
+              </m:r>
+              <m:r>
+                <m:rPr>
+                  <m:sty m:val="p"/>
+                </m:rPr>
+                <m:t>(</m:t>
+              </m:r>
+              <m:r>
+                <m:t>3</m:t>
+              </m:r>
+              <m:r>
+                <m:rPr>
+                  <m:sty m:val="p"/>
+                </m:rPr>
+                <m:t>/</m:t>
+              </m:r>
+              <m:r>
+                <m:t>2</m:t>
+              </m:r>
+              <m:r>
+                <m:rPr>
+                  <m:sty m:val="p"/>
+                </m:rPr>
+                <m:t>)</m:t>
+              </m:r>
+            </m:e>
+            <m:e>
+              <m:r>
+                <m:t>&amp;</m:t>
+              </m:r>
+              <m:r>
+                <m:rPr>
+                  <m:sty m:val="p"/>
+                </m:rPr>
+                <m:t>=</m:t>
+              </m:r>
+              <m:rad>
+                <m:radPr>
+                  <m:degHide m:val="on"/>
+                </m:radPr>
+                <m:deg/>
+                <m:e>
+                  <m:r>
+                    <m:t>π</m:t>
+                  </m:r>
+                </m:e>
+              </m:rad>
+              <m:r>
+                <m:rPr>
+                  <m:sty m:val="p"/>
+                </m:rPr>
+                <m:t>/</m:t>
+              </m:r>
+              <m:r>
+                <m:t>2</m:t>
+              </m:r>
+            </m:e>
+            <m:e>
+              <m:r>
+                <m:t>&amp;</m:t>
+              </m:r>
+              <m:r>
+                <m:rPr>
+                  <m:sty m:val="p"/>
+                </m:rPr>
+                <m:t>≈</m:t>
+              </m:r>
+              <m:r>
+                <m:t>0.886</m:t>
+              </m:r>
+              <m:r>
+                <m:rPr>
+                  <m:sty m:val="p"/>
+                </m:rPr>
+                <m:t>.</m:t>
+              </m:r>
+            </m:e>
+          </m:eqArr>
+        </m:oMath>
+      </m:oMathPara>
     </w:p>
     <w:bookmarkEnd w:id="92"/>
     <w:bookmarkEnd w:id="93"/>
@@ -40556,6 +40746,359 @@
       <w:r>
         <w:t xml:space="preserve">The point</w:t>
       </w:r>
+    </w:p>
+    <w:p>
+      <w:pPr>
+        <w:pStyle w:val="BodyText"/>
+      </w:pPr>
+      <m:oMathPara>
+        <m:oMathParaPr>
+          <m:jc m:val="center"/>
+        </m:oMathParaPr>
+        <m:oMath>
+          <m:eqArr>
+            <m:e>
+              <m:acc>
+                <m:accPr>
+                  <m:chr m:val="̃"/>
+                </m:accPr>
+                <m:e>
+                  <m:r>
+                    <m:t>x</m:t>
+                  </m:r>
+                </m:e>
+              </m:acc>
+              <m:r>
+                <m:t>&amp;</m:t>
+              </m:r>
+              <m:r>
+                <m:rPr>
+                  <m:sty m:val="p"/>
+                </m:rPr>
+                <m:t>=</m:t>
+              </m:r>
+              <m:rad>
+                <m:radPr>
+                  <m:degHide m:val="on"/>
+                </m:radPr>
+                <m:deg/>
+                <m:e>
+                  <m:r>
+                    <m:t>3</m:t>
+                  </m:r>
+                </m:e>
+              </m:rad>
+              <m:r>
+                <m:t> </m:t>
+              </m:r>
+              <m:sSub>
+                <m:e>
+                  <m:acc>
+                    <m:accPr>
+                      <m:chr m:val="̃"/>
+                    </m:accPr>
+                    <m:e>
+                      <m:r>
+                        <m:t>q</m:t>
+                      </m:r>
+                    </m:e>
+                  </m:acc>
+                </m:e>
+                <m:sub>
+                  <m:r>
+                    <m:t>1</m:t>
+                  </m:r>
+                </m:sub>
+              </m:sSub>
+            </m:e>
+            <m:e>
+              <m:r>
+                <m:t>&amp;</m:t>
+              </m:r>
+              <m:r>
+                <m:rPr>
+                  <m:sty m:val="p"/>
+                </m:rPr>
+                <m:t>=</m:t>
+              </m:r>
+              <m:rad>
+                <m:radPr>
+                  <m:degHide m:val="on"/>
+                </m:radPr>
+                <m:deg/>
+                <m:e>
+                  <m:r>
+                    <m:t>3</m:t>
+                  </m:r>
+                  <m:r>
+                    <m:rPr>
+                      <m:sty m:val="p"/>
+                    </m:rPr>
+                    <m:t>/</m:t>
+                  </m:r>
+                  <m:r>
+                    <m:t>2</m:t>
+                  </m:r>
+                </m:e>
+              </m:rad>
+              <m:r>
+                <m:t> </m:t>
+              </m:r>
+              <m:sSup>
+                <m:e>
+                  <m:r>
+                    <m:rPr>
+                      <m:sty m:val="p"/>
+                    </m:rPr>
+                    <m:t>(</m:t>
+                  </m:r>
+                  <m:r>
+                    <m:t>1</m:t>
+                  </m:r>
+                  <m:r>
+                    <m:rPr>
+                      <m:sty m:val="p"/>
+                    </m:rPr>
+                    <m:t>,</m:t>
+                  </m:r>
+                  <m:r>
+                    <m:t>1</m:t>
+                  </m:r>
+                  <m:r>
+                    <m:rPr>
+                      <m:sty m:val="p"/>
+                    </m:rPr>
+                    <m:t>)</m:t>
+                  </m:r>
+                </m:e>
+                <m:sup>
+                  <m:r>
+                    <m:rPr>
+                      <m:sty m:val="p"/>
+                    </m:rPr>
+                    <m:t>⊤</m:t>
+                  </m:r>
+                </m:sup>
+              </m:sSup>
+            </m:e>
+          </m:eqArr>
+        </m:oMath>
+      </m:oMathPara>
+    </w:p>
+    <w:p>
+      <w:pPr>
+        <w:pStyle w:val="FirstParagraph"/>
+      </w:pPr>
+      <w:r>
+        <w:t xml:space="preserve">has</w:t>
+      </w:r>
+      <w:r>
+        <w:t xml:space="preserve"> </w:t>
+      </w:r>
+      <m:oMath>
+        <m:sSub>
+          <m:e>
+            <m:r>
+              <m:t>x</m:t>
+            </m:r>
+          </m:e>
+          <m:sub>
+            <m:r>
+              <m:t>1</m:t>
+            </m:r>
+          </m:sub>
+        </m:sSub>
+        <m:r>
+          <m:rPr>
+            <m:sty m:val="p"/>
+          </m:rPr>
+          <m:t>+</m:t>
+        </m:r>
+        <m:sSub>
+          <m:e>
+            <m:r>
+              <m:t>x</m:t>
+            </m:r>
+          </m:e>
+          <m:sub>
+            <m:r>
+              <m:t>2</m:t>
+            </m:r>
+          </m:sub>
+        </m:sSub>
+        <m:r>
+          <m:rPr>
+            <m:sty m:val="p"/>
+          </m:rPr>
+          <m:t>=</m:t>
+        </m:r>
+        <m:rad>
+          <m:radPr>
+            <m:degHide m:val="on"/>
+          </m:radPr>
+          <m:deg/>
+          <m:e>
+            <m:r>
+              <m:t>6</m:t>
+            </m:r>
+          </m:e>
+        </m:rad>
+      </m:oMath>
+      <w:r>
+        <w:t xml:space="preserve"> </w:t>
+      </w:r>
+      <w:r>
+        <w:t xml:space="preserve">and</w:t>
+      </w:r>
+      <w:r>
+        <w:t xml:space="preserve"> </w:t>
+      </w:r>
+      <m:oMath>
+        <m:sSub>
+          <m:e>
+            <m:r>
+              <m:t>x</m:t>
+            </m:r>
+          </m:e>
+          <m:sub>
+            <m:r>
+              <m:t>1</m:t>
+            </m:r>
+          </m:sub>
+        </m:sSub>
+        <m:r>
+          <m:rPr>
+            <m:sty m:val="p"/>
+          </m:rPr>
+          <m:t>−</m:t>
+        </m:r>
+        <m:sSub>
+          <m:e>
+            <m:r>
+              <m:t>x</m:t>
+            </m:r>
+          </m:e>
+          <m:sub>
+            <m:r>
+              <m:t>2</m:t>
+            </m:r>
+          </m:sub>
+        </m:sSub>
+        <m:r>
+          <m:rPr>
+            <m:sty m:val="p"/>
+          </m:rPr>
+          <m:t>=</m:t>
+        </m:r>
+        <m:r>
+          <m:t>0</m:t>
+        </m:r>
+      </m:oMath>
+      <w:r>
+        <w:t xml:space="preserve">, so</w:t>
+      </w:r>
+    </w:p>
+    <w:p>
+      <w:pPr>
+        <w:pStyle w:val="BodyText"/>
+      </w:pPr>
+      <m:oMathPara>
+        <m:oMathParaPr>
+          <m:jc m:val="center"/>
+        </m:oMathParaPr>
+        <m:oMath>
+          <m:eqArr>
+            <m:e>
+              <m:r>
+                <m:rPr>
+                  <m:sty m:val="p"/>
+                </m:rPr>
+                <m:t>Δ</m:t>
+              </m:r>
+              <m:r>
+                <m:rPr>
+                  <m:sty m:val="p"/>
+                </m:rPr>
+                <m:t>(</m:t>
+              </m:r>
+              <m:acc>
+                <m:accPr>
+                  <m:chr m:val="̃"/>
+                </m:accPr>
+                <m:e>
+                  <m:r>
+                    <m:t>x</m:t>
+                  </m:r>
+                </m:e>
+              </m:acc>
+              <m:sSup>
+                <m:e>
+                  <m:r>
+                    <m:rPr>
+                      <m:sty m:val="p"/>
+                    </m:rPr>
+                    <m:t>)</m:t>
+                  </m:r>
+                </m:e>
+                <m:sup>
+                  <m:r>
+                    <m:t>2</m:t>
+                  </m:r>
+                </m:sup>
+              </m:sSup>
+              <m:r>
+                <m:t>&amp;</m:t>
+              </m:r>
+              <m:r>
+                <m:rPr>
+                  <m:sty m:val="p"/>
+                </m:rPr>
+                <m:t>=</m:t>
+              </m:r>
+              <m:r>
+                <m:t>6</m:t>
+              </m:r>
+              <m:r>
+                <m:rPr>
+                  <m:sty m:val="p"/>
+                </m:rPr>
+                <m:t>/</m:t>
+              </m:r>
+              <m:r>
+                <m:t>6</m:t>
+              </m:r>
+            </m:e>
+            <m:e>
+              <m:r>
+                <m:t>&amp;</m:t>
+              </m:r>
+              <m:r>
+                <m:rPr>
+                  <m:sty m:val="p"/>
+                </m:rPr>
+                <m:t>=</m:t>
+              </m:r>
+              <m:r>
+                <m:t>1</m:t>
+              </m:r>
+              <m:r>
+                <m:rPr>
+                  <m:sty m:val="p"/>
+                </m:rPr>
+                <m:t>;</m:t>
+              </m:r>
+            </m:e>
+          </m:eqArr>
+        </m:oMath>
+      </m:oMathPara>
+    </w:p>
+    <w:p>
+      <w:pPr>
+        <w:pStyle w:val="FirstParagraph"/>
+      </w:pPr>
+      <w:r>
+        <w:t xml:space="preserve">the point</w:t>
+      </w:r>
       <w:r>
         <w:t xml:space="preserve"> </w:t>
       </w:r>
@@ -40575,20 +41118,6 @@
             <m:sty m:val="p"/>
           </m:rPr>
           <m:t>=</m:t>
-        </m:r>
-        <m:rad>
-          <m:radPr>
-            <m:degHide m:val="on"/>
-          </m:radPr>
-          <m:deg/>
-          <m:e>
-            <m:r>
-              <m:t>3</m:t>
-            </m:r>
-          </m:e>
-        </m:rad>
-        <m:r>
-          <m:t> </m:t>
         </m:r>
         <m:sSub>
           <m:e>
@@ -40605,7 +41134,98 @@
           </m:e>
           <m:sub>
             <m:r>
+              <m:t>2</m:t>
+            </m:r>
+          </m:sub>
+        </m:sSub>
+      </m:oMath>
+      <w:r>
+        <w:t xml:space="preserve"> </w:t>
+      </w:r>
+      <w:r>
+        <w:t xml:space="preserve">has</w:t>
+      </w:r>
+      <w:r>
+        <w:t xml:space="preserve"> </w:t>
+      </w:r>
+      <m:oMath>
+        <m:sSub>
+          <m:e>
+            <m:r>
+              <m:t>x</m:t>
+            </m:r>
+          </m:e>
+          <m:sub>
+            <m:r>
               <m:t>1</m:t>
+            </m:r>
+          </m:sub>
+        </m:sSub>
+        <m:r>
+          <m:rPr>
+            <m:sty m:val="p"/>
+          </m:rPr>
+          <m:t>+</m:t>
+        </m:r>
+        <m:sSub>
+          <m:e>
+            <m:r>
+              <m:t>x</m:t>
+            </m:r>
+          </m:e>
+          <m:sub>
+            <m:r>
+              <m:t>2</m:t>
+            </m:r>
+          </m:sub>
+        </m:sSub>
+        <m:r>
+          <m:rPr>
+            <m:sty m:val="p"/>
+          </m:rPr>
+          <m:t>=</m:t>
+        </m:r>
+        <m:r>
+          <m:t>0</m:t>
+        </m:r>
+      </m:oMath>
+      <w:r>
+        <w:t xml:space="preserve"> </w:t>
+      </w:r>
+      <w:r>
+        <w:t xml:space="preserve">and</w:t>
+      </w:r>
+      <w:r>
+        <w:t xml:space="preserve"> </w:t>
+      </w:r>
+      <m:oMath>
+        <m:sSub>
+          <m:e>
+            <m:r>
+              <m:t>x</m:t>
+            </m:r>
+          </m:e>
+          <m:sub>
+            <m:r>
+              <m:t>1</m:t>
+            </m:r>
+          </m:sub>
+        </m:sSub>
+        <m:r>
+          <m:rPr>
+            <m:sty m:val="p"/>
+          </m:rPr>
+          <m:t>−</m:t>
+        </m:r>
+        <m:sSub>
+          <m:e>
+            <m:r>
+              <m:t>x</m:t>
+            </m:r>
+          </m:e>
+          <m:sub>
+            <m:r>
+              <m:t>2</m:t>
             </m:r>
           </m:sub>
         </m:sSub>
@@ -40622,474 +41242,113 @@
           <m:deg/>
           <m:e>
             <m:r>
-              <m:t>3</m:t>
-            </m:r>
-            <m:r>
-              <m:rPr>
-                <m:sty m:val="p"/>
-              </m:rPr>
-              <m:t>/</m:t>
-            </m:r>
-            <m:r>
               <m:t>2</m:t>
-            </m:r>
-          </m:e>
-        </m:rad>
-        <m:r>
-          <m:t> </m:t>
-        </m:r>
-        <m:sSup>
-          <m:e>
-            <m:r>
-              <m:rPr>
-                <m:sty m:val="p"/>
-              </m:rPr>
-              <m:t>(</m:t>
-            </m:r>
-            <m:r>
-              <m:t>1</m:t>
-            </m:r>
-            <m:r>
-              <m:rPr>
-                <m:sty m:val="p"/>
-              </m:rPr>
-              <m:t>,</m:t>
-            </m:r>
-            <m:r>
-              <m:t>1</m:t>
-            </m:r>
-            <m:r>
-              <m:rPr>
-                <m:sty m:val="p"/>
-              </m:rPr>
-              <m:t>)</m:t>
-            </m:r>
-          </m:e>
-          <m:sup>
-            <m:r>
-              <m:rPr>
-                <m:sty m:val="p"/>
-              </m:rPr>
-              <m:t>⊤</m:t>
-            </m:r>
-          </m:sup>
-        </m:sSup>
-      </m:oMath>
-      <w:r>
-        <w:t xml:space="preserve"> </w:t>
-      </w:r>
-      <w:r>
-        <w:t xml:space="preserve">has</w:t>
-      </w:r>
-      <w:r>
-        <w:t xml:space="preserve"> </w:t>
-      </w:r>
-      <m:oMath>
-        <m:sSub>
-          <m:e>
-            <m:r>
-              <m:t>x</m:t>
-            </m:r>
-          </m:e>
-          <m:sub>
-            <m:r>
-              <m:t>1</m:t>
-            </m:r>
-          </m:sub>
-        </m:sSub>
-        <m:r>
-          <m:rPr>
-            <m:sty m:val="p"/>
-          </m:rPr>
-          <m:t>+</m:t>
-        </m:r>
-        <m:sSub>
-          <m:e>
-            <m:r>
-              <m:t>x</m:t>
-            </m:r>
-          </m:e>
-          <m:sub>
-            <m:r>
-              <m:t>2</m:t>
-            </m:r>
-          </m:sub>
-        </m:sSub>
-        <m:r>
-          <m:rPr>
-            <m:sty m:val="p"/>
-          </m:rPr>
-          <m:t>=</m:t>
-        </m:r>
-        <m:rad>
-          <m:radPr>
-            <m:degHide m:val="on"/>
-          </m:radPr>
-          <m:deg/>
-          <m:e>
-            <m:r>
-              <m:t>6</m:t>
             </m:r>
           </m:e>
         </m:rad>
       </m:oMath>
       <w:r>
-        <w:t xml:space="preserve"> </w:t>
-      </w:r>
-      <w:r>
-        <w:t xml:space="preserve">and</w:t>
-      </w:r>
-      <w:r>
-        <w:t xml:space="preserve"> </w:t>
-      </w:r>
-      <m:oMath>
-        <m:sSub>
-          <m:e>
-            <m:r>
-              <m:t>x</m:t>
-            </m:r>
-          </m:e>
-          <m:sub>
-            <m:r>
-              <m:t>1</m:t>
-            </m:r>
-          </m:sub>
-        </m:sSub>
-        <m:r>
-          <m:rPr>
-            <m:sty m:val="p"/>
-          </m:rPr>
-          <m:t>−</m:t>
-        </m:r>
-        <m:sSub>
-          <m:e>
-            <m:r>
-              <m:t>x</m:t>
-            </m:r>
-          </m:e>
-          <m:sub>
-            <m:r>
-              <m:t>2</m:t>
-            </m:r>
-          </m:sub>
-        </m:sSub>
-        <m:r>
-          <m:rPr>
-            <m:sty m:val="p"/>
-          </m:rPr>
-          <m:t>=</m:t>
-        </m:r>
-        <m:r>
-          <m:t>0</m:t>
-        </m:r>
-      </m:oMath>
-      <w:r>
         <w:t xml:space="preserve">, so</w:t>
       </w:r>
-      <w:r>
-        <w:t xml:space="preserve"> </w:t>
-      </w:r>
-      <m:oMath>
-        <m:r>
-          <m:rPr>
-            <m:sty m:val="p"/>
-          </m:rPr>
-          <m:t>Δ</m:t>
-        </m:r>
-        <m:r>
-          <m:rPr>
-            <m:sty m:val="p"/>
-          </m:rPr>
-          <m:t>(</m:t>
-        </m:r>
-        <m:acc>
-          <m:accPr>
-            <m:chr m:val="̃"/>
-          </m:accPr>
-          <m:e>
-            <m:r>
-              <m:t>x</m:t>
-            </m:r>
-          </m:e>
-        </m:acc>
-        <m:sSup>
-          <m:e>
-            <m:r>
-              <m:rPr>
-                <m:sty m:val="p"/>
-              </m:rPr>
-              <m:t>)</m:t>
-            </m:r>
-          </m:e>
-          <m:sup>
-            <m:r>
-              <m:t>2</m:t>
-            </m:r>
-          </m:sup>
-        </m:sSup>
-        <m:r>
-          <m:rPr>
-            <m:sty m:val="p"/>
-          </m:rPr>
-          <m:t>=</m:t>
-        </m:r>
-        <m:r>
-          <m:t>6</m:t>
-        </m:r>
-        <m:r>
-          <m:rPr>
-            <m:sty m:val="p"/>
-          </m:rPr>
-          <m:t>/</m:t>
-        </m:r>
-        <m:r>
-          <m:t>6</m:t>
-        </m:r>
-        <m:r>
-          <m:rPr>
-            <m:sty m:val="p"/>
-          </m:rPr>
-          <m:t>=</m:t>
-        </m:r>
-        <m:r>
-          <m:t>1</m:t>
-        </m:r>
-      </m:oMath>
-      <w:r>
-        <w:t xml:space="preserve">;</w:t>
-      </w:r>
-      <w:r>
-        <w:t xml:space="preserve"> </w:t>
-      </w:r>
-      <w:r>
-        <w:t xml:space="preserve">the point</w:t>
-      </w:r>
-      <w:r>
-        <w:t xml:space="preserve"> </w:t>
-      </w:r>
-      <m:oMath>
-        <m:acc>
-          <m:accPr>
-            <m:chr m:val="̃"/>
-          </m:accPr>
-          <m:e>
-            <m:r>
-              <m:t>x</m:t>
-            </m:r>
-          </m:e>
-        </m:acc>
-        <m:r>
-          <m:rPr>
-            <m:sty m:val="p"/>
-          </m:rPr>
-          <m:t>=</m:t>
-        </m:r>
-        <m:sSub>
-          <m:e>
-            <m:acc>
-              <m:accPr>
-                <m:chr m:val="̃"/>
-              </m:accPr>
-              <m:e>
-                <m:r>
-                  <m:t>q</m:t>
-                </m:r>
-              </m:e>
-            </m:acc>
-          </m:e>
-          <m:sub>
-            <m:r>
-              <m:t>2</m:t>
-            </m:r>
-          </m:sub>
-        </m:sSub>
-      </m:oMath>
-      <w:r>
-        <w:t xml:space="preserve"> </w:t>
-      </w:r>
-      <w:r>
-        <w:t xml:space="preserve">has</w:t>
-      </w:r>
-      <w:r>
-        <w:t xml:space="preserve"> </w:t>
-      </w:r>
-      <m:oMath>
-        <m:sSub>
-          <m:e>
-            <m:r>
-              <m:t>x</m:t>
-            </m:r>
-          </m:e>
-          <m:sub>
-            <m:r>
-              <m:t>1</m:t>
-            </m:r>
-          </m:sub>
-        </m:sSub>
-        <m:r>
-          <m:rPr>
-            <m:sty m:val="p"/>
-          </m:rPr>
-          <m:t>+</m:t>
-        </m:r>
-        <m:sSub>
-          <m:e>
-            <m:r>
-              <m:t>x</m:t>
-            </m:r>
-          </m:e>
-          <m:sub>
-            <m:r>
-              <m:t>2</m:t>
-            </m:r>
-          </m:sub>
-        </m:sSub>
-        <m:r>
-          <m:rPr>
-            <m:sty m:val="p"/>
-          </m:rPr>
-          <m:t>=</m:t>
-        </m:r>
-        <m:r>
-          <m:t>0</m:t>
-        </m:r>
-      </m:oMath>
-      <w:r>
-        <w:t xml:space="preserve"> </w:t>
-      </w:r>
-      <w:r>
-        <w:t xml:space="preserve">and</w:t>
-      </w:r>
-      <w:r>
-        <w:t xml:space="preserve"> </w:t>
-      </w:r>
-      <m:oMath>
-        <m:sSub>
-          <m:e>
-            <m:r>
-              <m:t>x</m:t>
-            </m:r>
-          </m:e>
-          <m:sub>
-            <m:r>
-              <m:t>1</m:t>
-            </m:r>
-          </m:sub>
-        </m:sSub>
-        <m:r>
-          <m:rPr>
-            <m:sty m:val="p"/>
-          </m:rPr>
-          <m:t>−</m:t>
-        </m:r>
-        <m:sSub>
-          <m:e>
-            <m:r>
-              <m:t>x</m:t>
-            </m:r>
-          </m:e>
-          <m:sub>
-            <m:r>
-              <m:t>2</m:t>
-            </m:r>
-          </m:sub>
-        </m:sSub>
-        <m:r>
-          <m:rPr>
-            <m:sty m:val="p"/>
-          </m:rPr>
-          <m:t>=</m:t>
-        </m:r>
-        <m:rad>
-          <m:radPr>
-            <m:degHide m:val="on"/>
-          </m:radPr>
-          <m:deg/>
-          <m:e>
-            <m:r>
-              <m:t>2</m:t>
-            </m:r>
-          </m:e>
-        </m:rad>
-      </m:oMath>
-      <w:r>
-        <w:t xml:space="preserve">, so</w:t>
-      </w:r>
-      <w:r>
-        <w:t xml:space="preserve"> </w:t>
-      </w:r>
-      <m:oMath>
-        <m:r>
-          <m:rPr>
-            <m:sty m:val="p"/>
-          </m:rPr>
-          <m:t>Δ</m:t>
-        </m:r>
-        <m:r>
-          <m:rPr>
-            <m:sty m:val="p"/>
-          </m:rPr>
-          <m:t>(</m:t>
-        </m:r>
-        <m:acc>
-          <m:accPr>
-            <m:chr m:val="̃"/>
-          </m:accPr>
-          <m:e>
-            <m:r>
-              <m:t>x</m:t>
-            </m:r>
-          </m:e>
-        </m:acc>
-        <m:sSup>
-          <m:e>
-            <m:r>
-              <m:rPr>
-                <m:sty m:val="p"/>
-              </m:rPr>
-              <m:t>)</m:t>
-            </m:r>
-          </m:e>
-          <m:sup>
-            <m:r>
-              <m:t>2</m:t>
-            </m:r>
-          </m:sup>
-        </m:sSup>
-        <m:r>
-          <m:rPr>
-            <m:sty m:val="p"/>
-          </m:rPr>
-          <m:t>=</m:t>
-        </m:r>
-        <m:r>
-          <m:t>2</m:t>
-        </m:r>
-        <m:r>
-          <m:rPr>
-            <m:sty m:val="p"/>
-          </m:rPr>
-          <m:t>/</m:t>
-        </m:r>
-        <m:r>
-          <m:t>2</m:t>
-        </m:r>
-        <m:r>
-          <m:rPr>
-            <m:sty m:val="p"/>
-          </m:rPr>
-          <m:t>=</m:t>
-        </m:r>
-        <m:r>
-          <m:t>1</m:t>
-        </m:r>
-      </m:oMath>
-      <w:r>
-        <w:t xml:space="preserve">.</w:t>
-      </w:r>
-      <w:r>
-        <w:t xml:space="preserve"> </w:t>
-      </w:r>
+    </w:p>
+    <w:p>
+      <w:pPr>
+        <w:pStyle w:val="BodyText"/>
+      </w:pPr>
+      <m:oMathPara>
+        <m:oMathParaPr>
+          <m:jc m:val="center"/>
+        </m:oMathParaPr>
+        <m:oMath>
+          <m:eqArr>
+            <m:e>
+              <m:r>
+                <m:rPr>
+                  <m:sty m:val="p"/>
+                </m:rPr>
+                <m:t>Δ</m:t>
+              </m:r>
+              <m:r>
+                <m:rPr>
+                  <m:sty m:val="p"/>
+                </m:rPr>
+                <m:t>(</m:t>
+              </m:r>
+              <m:acc>
+                <m:accPr>
+                  <m:chr m:val="̃"/>
+                </m:accPr>
+                <m:e>
+                  <m:r>
+                    <m:t>x</m:t>
+                  </m:r>
+                </m:e>
+              </m:acc>
+              <m:sSup>
+                <m:e>
+                  <m:r>
+                    <m:rPr>
+                      <m:sty m:val="p"/>
+                    </m:rPr>
+                    <m:t>)</m:t>
+                  </m:r>
+                </m:e>
+                <m:sup>
+                  <m:r>
+                    <m:t>2</m:t>
+                  </m:r>
+                </m:sup>
+              </m:sSup>
+              <m:r>
+                <m:t>&amp;</m:t>
+              </m:r>
+              <m:r>
+                <m:rPr>
+                  <m:sty m:val="p"/>
+                </m:rPr>
+                <m:t>=</m:t>
+              </m:r>
+              <m:r>
+                <m:t>2</m:t>
+              </m:r>
+              <m:r>
+                <m:rPr>
+                  <m:sty m:val="p"/>
+                </m:rPr>
+                <m:t>/</m:t>
+              </m:r>
+              <m:r>
+                <m:t>2</m:t>
+              </m:r>
+            </m:e>
+            <m:e>
+              <m:r>
+                <m:t>&amp;</m:t>
+              </m:r>
+              <m:r>
+                <m:rPr>
+                  <m:sty m:val="p"/>
+                </m:rPr>
+                <m:t>=</m:t>
+              </m:r>
+              <m:r>
+                <m:t>1</m:t>
+              </m:r>
+              <m:r>
+                <m:rPr>
+                  <m:sty m:val="p"/>
+                </m:rPr>
+                <m:t>.</m:t>
+              </m:r>
+            </m:e>
+          </m:eqArr>
+        </m:oMath>
+      </m:oMathPara>
+    </w:p>
+    <w:p>
+      <w:pPr>
+        <w:pStyle w:val="FirstParagraph"/>
+      </w:pPr>
       <w:r>
         <w:t xml:space="preserve">So the contour</w:t>
       </w:r>
@@ -42665,157 +42924,181 @@
       <w:r>
         <w:t xml:space="preserve">,</w:t>
       </w:r>
-      <w:r>
-        <w:t xml:space="preserve"> </w:t>
-      </w:r>
-      <m:oMath>
-        <m:r>
-          <m:rPr>
-            <m:sty m:val="p"/>
-          </m:rPr>
-          <m:t>P</m:t>
-        </m:r>
-        <m:r>
-          <m:rPr>
-            <m:sty m:val="p"/>
-          </m:rPr>
-          <m:t>(</m:t>
-        </m:r>
-        <m:r>
-          <m:t>C</m:t>
-        </m:r>
-        <m:r>
-          <m:rPr>
-            <m:sty m:val="p"/>
-          </m:rPr>
-          <m:t>=</m:t>
-        </m:r>
-        <m:r>
-          <m:t>c</m:t>
-        </m:r>
-        <m:r>
-          <m:rPr>
-            <m:sty m:val="p"/>
-          </m:rPr>
-          <m:t>)</m:t>
-        </m:r>
-        <m:r>
-          <m:rPr>
-            <m:sty m:val="p"/>
-          </m:rPr>
-          <m:t>=</m:t>
-        </m:r>
-        <m:nary>
-          <m:naryPr>
-            <m:chr m:val="∫"/>
-            <m:limLoc m:val="subSup"/>
-            <m:subHide m:val="off"/>
-            <m:supHide m:val="off"/>
-          </m:naryPr>
-          <m:sub>
-            <m:r>
-              <m:rPr>
-                <m:sty m:val="p"/>
-              </m:rPr>
-              <m:t>−</m:t>
-            </m:r>
-            <m:r>
-              <m:rPr>
-                <m:sty m:val="p"/>
-              </m:rPr>
-              <m:t>∞</m:t>
-            </m:r>
-          </m:sub>
-          <m:sup>
-            <m:r>
-              <m:rPr>
-                <m:sty m:val="p"/>
-              </m:rPr>
-              <m:t>∞</m:t>
-            </m:r>
-          </m:sup>
-          <m:e>
-            <m:sSub>
-              <m:e>
-                <m:r>
-                  <m:t>w</m:t>
-                </m:r>
-              </m:e>
-              <m:sub>
-                <m:r>
-                  <m:t>c</m:t>
-                </m:r>
-              </m:sub>
-            </m:sSub>
-          </m:e>
-        </m:nary>
-        <m:r>
-          <m:t> </m:t>
-        </m:r>
-        <m:sSub>
-          <m:e>
-            <m:r>
-              <m:rPr>
-                <m:sty m:val="p"/>
-              </m:rPr>
-              <m:t>p</m:t>
-            </m:r>
-          </m:e>
-          <m:sub>
-            <m:r>
-              <m:t>c</m:t>
-            </m:r>
-          </m:sub>
-        </m:sSub>
-        <m:r>
-          <m:rPr>
-            <m:sty m:val="p"/>
-          </m:rPr>
-          <m:t>(</m:t>
-        </m:r>
-        <m:r>
-          <m:t>x</m:t>
-        </m:r>
-        <m:r>
-          <m:rPr>
-            <m:sty m:val="p"/>
-          </m:rPr>
-          <m:t>)</m:t>
-        </m:r>
-        <m:r>
-          <m:t> </m:t>
-        </m:r>
-        <m:r>
-          <m:t>d</m:t>
-        </m:r>
-        <m:r>
-          <m:t>x</m:t>
-        </m:r>
-        <m:r>
-          <m:rPr>
-            <m:sty m:val="p"/>
-          </m:rPr>
-          <m:t>=</m:t>
-        </m:r>
-        <m:sSub>
-          <m:e>
-            <m:r>
-              <m:t>w</m:t>
-            </m:r>
-          </m:e>
-          <m:sub>
-            <m:r>
-              <m:t>c</m:t>
-            </m:r>
-          </m:sub>
-        </m:sSub>
-      </m:oMath>
-      <w:r>
-        <w:t xml:space="preserve">,</w:t>
-      </w:r>
-      <w:r>
-        <w:t xml:space="preserve"> </w:t>
-      </w:r>
+    </w:p>
+    <w:p>
+      <w:pPr>
+        <w:pStyle w:val="BodyText"/>
+      </w:pPr>
+      <m:oMathPara>
+        <m:oMathParaPr>
+          <m:jc m:val="center"/>
+        </m:oMathParaPr>
+        <m:oMath>
+          <m:eqArr>
+            <m:e>
+              <m:r>
+                <m:rPr>
+                  <m:sty m:val="p"/>
+                </m:rPr>
+                <m:t>P</m:t>
+              </m:r>
+              <m:r>
+                <m:rPr>
+                  <m:sty m:val="p"/>
+                </m:rPr>
+                <m:t>(</m:t>
+              </m:r>
+              <m:r>
+                <m:t>C</m:t>
+              </m:r>
+              <m:r>
+                <m:rPr>
+                  <m:sty m:val="p"/>
+                </m:rPr>
+                <m:t>=</m:t>
+              </m:r>
+              <m:r>
+                <m:t>c</m:t>
+              </m:r>
+              <m:r>
+                <m:rPr>
+                  <m:sty m:val="p"/>
+                </m:rPr>
+                <m:t>)</m:t>
+              </m:r>
+              <m:r>
+                <m:t>&amp;</m:t>
+              </m:r>
+              <m:r>
+                <m:rPr>
+                  <m:sty m:val="p"/>
+                </m:rPr>
+                <m:t>=</m:t>
+              </m:r>
+              <m:nary>
+                <m:naryPr>
+                  <m:chr m:val="∫"/>
+                  <m:limLoc m:val="subSup"/>
+                  <m:subHide m:val="off"/>
+                  <m:supHide m:val="off"/>
+                </m:naryPr>
+                <m:sub>
+                  <m:r>
+                    <m:rPr>
+                      <m:sty m:val="p"/>
+                    </m:rPr>
+                    <m:t>−</m:t>
+                  </m:r>
+                  <m:r>
+                    <m:rPr>
+                      <m:sty m:val="p"/>
+                    </m:rPr>
+                    <m:t>∞</m:t>
+                  </m:r>
+                </m:sub>
+                <m:sup>
+                  <m:r>
+                    <m:rPr>
+                      <m:sty m:val="p"/>
+                    </m:rPr>
+                    <m:t>∞</m:t>
+                  </m:r>
+                </m:sup>
+                <m:e>
+                  <m:sSub>
+                    <m:e>
+                      <m:r>
+                        <m:t>w</m:t>
+                      </m:r>
+                    </m:e>
+                    <m:sub>
+                      <m:r>
+                        <m:t>c</m:t>
+                      </m:r>
+                    </m:sub>
+                  </m:sSub>
+                </m:e>
+              </m:nary>
+              <m:r>
+                <m:t> </m:t>
+              </m:r>
+              <m:sSub>
+                <m:e>
+                  <m:r>
+                    <m:rPr>
+                      <m:sty m:val="p"/>
+                    </m:rPr>
+                    <m:t>p</m:t>
+                  </m:r>
+                </m:e>
+                <m:sub>
+                  <m:r>
+                    <m:t>c</m:t>
+                  </m:r>
+                </m:sub>
+              </m:sSub>
+              <m:r>
+                <m:rPr>
+                  <m:sty m:val="p"/>
+                </m:rPr>
+                <m:t>(</m:t>
+              </m:r>
+              <m:r>
+                <m:t>x</m:t>
+              </m:r>
+              <m:r>
+                <m:rPr>
+                  <m:sty m:val="p"/>
+                </m:rPr>
+                <m:t>)</m:t>
+              </m:r>
+              <m:r>
+                <m:t> </m:t>
+              </m:r>
+              <m:r>
+                <m:t>d</m:t>
+              </m:r>
+              <m:r>
+                <m:t>x</m:t>
+              </m:r>
+            </m:e>
+            <m:e>
+              <m:r>
+                <m:t>&amp;</m:t>
+              </m:r>
+              <m:r>
+                <m:rPr>
+                  <m:sty m:val="p"/>
+                </m:rPr>
+                <m:t>=</m:t>
+              </m:r>
+              <m:sSub>
+                <m:e>
+                  <m:r>
+                    <m:t>w</m:t>
+                  </m:r>
+                </m:e>
+                <m:sub>
+                  <m:r>
+                    <m:t>c</m:t>
+                  </m:r>
+                </m:sub>
+              </m:sSub>
+              <m:r>
+                <m:rPr>
+                  <m:sty m:val="p"/>
+                </m:rPr>
+                <m:t>,</m:t>
+              </m:r>
+            </m:e>
+          </m:eqArr>
+        </m:oMath>
+      </m:oMathPara>
+    </w:p>
+    <w:p>
+      <w:pPr>
+        <w:pStyle w:val="FirstParagraph"/>
+      </w:pPr>
       <w:r>
         <w:t xml:space="preserve">because</w:t>
       </w:r>
@@ -42865,171 +43148,193 @@
       <w:r>
         <w:t xml:space="preserve">,</w:t>
       </w:r>
-      <w:r>
-        <w:t xml:space="preserve"> </w:t>
-      </w:r>
-      <m:oMath>
-        <m:r>
-          <m:rPr>
-            <m:sty m:val="p"/>
-          </m:rPr>
-          <m:t>p</m:t>
-        </m:r>
-        <m:r>
-          <m:rPr>
-            <m:sty m:val="p"/>
-          </m:rPr>
-          <m:t>(</m:t>
-        </m:r>
-        <m:r>
-          <m:t>X</m:t>
-        </m:r>
-        <m:r>
-          <m:rPr>
-            <m:sty m:val="p"/>
-          </m:rPr>
-          <m:t>=</m:t>
-        </m:r>
-        <m:r>
-          <m:t>x</m:t>
-        </m:r>
-        <m:r>
-          <m:rPr>
-            <m:sty m:val="p"/>
-          </m:rPr>
-          <m:t>∣</m:t>
-        </m:r>
-        <m:r>
-          <m:t>C</m:t>
-        </m:r>
-        <m:r>
-          <m:rPr>
-            <m:sty m:val="p"/>
-          </m:rPr>
-          <m:t>=</m:t>
-        </m:r>
-        <m:r>
-          <m:t>c</m:t>
-        </m:r>
-        <m:r>
-          <m:rPr>
-            <m:sty m:val="p"/>
-          </m:rPr>
-          <m:t>)</m:t>
-        </m:r>
-        <m:r>
-          <m:rPr>
-            <m:sty m:val="p"/>
-          </m:rPr>
-          <m:t>=</m:t>
-        </m:r>
-        <m:sSub>
-          <m:e>
-            <m:r>
-              <m:t>w</m:t>
-            </m:r>
-          </m:e>
-          <m:sub>
-            <m:r>
-              <m:t>c</m:t>
-            </m:r>
-          </m:sub>
-        </m:sSub>
-        <m:r>
-          <m:t> </m:t>
-        </m:r>
-        <m:sSub>
-          <m:e>
-            <m:r>
-              <m:rPr>
-                <m:sty m:val="p"/>
-              </m:rPr>
-              <m:t>p</m:t>
-            </m:r>
-          </m:e>
-          <m:sub>
-            <m:r>
-              <m:t>c</m:t>
-            </m:r>
-          </m:sub>
-        </m:sSub>
-        <m:r>
-          <m:rPr>
-            <m:sty m:val="p"/>
-          </m:rPr>
-          <m:t>(</m:t>
-        </m:r>
-        <m:r>
-          <m:t>x</m:t>
-        </m:r>
-        <m:r>
-          <m:rPr>
-            <m:sty m:val="p"/>
-          </m:rPr>
-          <m:t>)</m:t>
-        </m:r>
-        <m:r>
-          <m:rPr>
-            <m:sty m:val="p"/>
-          </m:rPr>
-          <m:t>/</m:t>
-        </m:r>
-        <m:sSub>
-          <m:e>
-            <m:r>
-              <m:t>w</m:t>
-            </m:r>
-          </m:e>
-          <m:sub>
-            <m:r>
-              <m:t>c</m:t>
-            </m:r>
-          </m:sub>
-        </m:sSub>
-        <m:r>
-          <m:rPr>
-            <m:sty m:val="p"/>
-          </m:rPr>
-          <m:t>=</m:t>
-        </m:r>
-        <m:sSub>
-          <m:e>
-            <m:r>
-              <m:rPr>
-                <m:sty m:val="p"/>
-              </m:rPr>
-              <m:t>p</m:t>
-            </m:r>
-          </m:e>
-          <m:sub>
-            <m:r>
-              <m:t>c</m:t>
-            </m:r>
-          </m:sub>
-        </m:sSub>
-        <m:r>
-          <m:rPr>
-            <m:sty m:val="p"/>
-          </m:rPr>
-          <m:t>(</m:t>
-        </m:r>
-        <m:r>
-          <m:t>x</m:t>
-        </m:r>
-        <m:r>
-          <m:rPr>
-            <m:sty m:val="p"/>
-          </m:rPr>
-          <m:t>)</m:t>
-        </m:r>
-      </m:oMath>
-      <w:r>
-        <w:t xml:space="preserve">.</w:t>
-      </w:r>
     </w:p>
     <w:p>
       <w:pPr>
         <w:pStyle w:val="BodyText"/>
+      </w:pPr>
+      <m:oMathPara>
+        <m:oMathParaPr>
+          <m:jc m:val="center"/>
+        </m:oMathParaPr>
+        <m:oMath>
+          <m:eqArr>
+            <m:e>
+              <m:r>
+                <m:rPr>
+                  <m:sty m:val="p"/>
+                </m:rPr>
+                <m:t>p</m:t>
+              </m:r>
+              <m:r>
+                <m:rPr>
+                  <m:sty m:val="p"/>
+                </m:rPr>
+                <m:t>(</m:t>
+              </m:r>
+              <m:r>
+                <m:t>X</m:t>
+              </m:r>
+              <m:r>
+                <m:rPr>
+                  <m:sty m:val="p"/>
+                </m:rPr>
+                <m:t>=</m:t>
+              </m:r>
+              <m:r>
+                <m:t>x</m:t>
+              </m:r>
+              <m:r>
+                <m:rPr>
+                  <m:sty m:val="p"/>
+                </m:rPr>
+                <m:t>∣</m:t>
+              </m:r>
+              <m:r>
+                <m:t>C</m:t>
+              </m:r>
+              <m:r>
+                <m:rPr>
+                  <m:sty m:val="p"/>
+                </m:rPr>
+                <m:t>=</m:t>
+              </m:r>
+              <m:r>
+                <m:t>c</m:t>
+              </m:r>
+              <m:r>
+                <m:rPr>
+                  <m:sty m:val="p"/>
+                </m:rPr>
+                <m:t>)</m:t>
+              </m:r>
+              <m:r>
+                <m:t>&amp;</m:t>
+              </m:r>
+              <m:r>
+                <m:rPr>
+                  <m:sty m:val="p"/>
+                </m:rPr>
+                <m:t>=</m:t>
+              </m:r>
+              <m:sSub>
+                <m:e>
+                  <m:r>
+                    <m:t>w</m:t>
+                  </m:r>
+                </m:e>
+                <m:sub>
+                  <m:r>
+                    <m:t>c</m:t>
+                  </m:r>
+                </m:sub>
+              </m:sSub>
+              <m:r>
+                <m:t> </m:t>
+              </m:r>
+              <m:sSub>
+                <m:e>
+                  <m:r>
+                    <m:rPr>
+                      <m:sty m:val="p"/>
+                    </m:rPr>
+                    <m:t>p</m:t>
+                  </m:r>
+                </m:e>
+                <m:sub>
+                  <m:r>
+                    <m:t>c</m:t>
+                  </m:r>
+                </m:sub>
+              </m:sSub>
+              <m:r>
+                <m:rPr>
+                  <m:sty m:val="p"/>
+                </m:rPr>
+                <m:t>(</m:t>
+              </m:r>
+              <m:r>
+                <m:t>x</m:t>
+              </m:r>
+              <m:r>
+                <m:rPr>
+                  <m:sty m:val="p"/>
+                </m:rPr>
+                <m:t>)</m:t>
+              </m:r>
+              <m:r>
+                <m:rPr>
+                  <m:sty m:val="p"/>
+                </m:rPr>
+                <m:t>/</m:t>
+              </m:r>
+              <m:sSub>
+                <m:e>
+                  <m:r>
+                    <m:t>w</m:t>
+                  </m:r>
+                </m:e>
+                <m:sub>
+                  <m:r>
+                    <m:t>c</m:t>
+                  </m:r>
+                </m:sub>
+              </m:sSub>
+            </m:e>
+            <m:e>
+              <m:r>
+                <m:t>&amp;</m:t>
+              </m:r>
+              <m:r>
+                <m:rPr>
+                  <m:sty m:val="p"/>
+                </m:rPr>
+                <m:t>=</m:t>
+              </m:r>
+              <m:sSub>
+                <m:e>
+                  <m:r>
+                    <m:rPr>
+                      <m:sty m:val="p"/>
+                    </m:rPr>
+                    <m:t>p</m:t>
+                  </m:r>
+                </m:e>
+                <m:sub>
+                  <m:r>
+                    <m:t>c</m:t>
+                  </m:r>
+                </m:sub>
+              </m:sSub>
+              <m:r>
+                <m:rPr>
+                  <m:sty m:val="p"/>
+                </m:rPr>
+                <m:t>(</m:t>
+              </m:r>
+              <m:r>
+                <m:t>x</m:t>
+              </m:r>
+              <m:r>
+                <m:rPr>
+                  <m:sty m:val="p"/>
+                </m:rPr>
+                <m:t>)</m:t>
+              </m:r>
+              <m:r>
+                <m:rPr>
+                  <m:sty m:val="p"/>
+                </m:rPr>
+                <m:t>.</m:t>
+              </m:r>
+            </m:e>
+          </m:eqArr>
+        </m:oMath>
+      </m:oMathPara>
+    </w:p>
+    <w:p>
+      <w:pPr>
+        <w:pStyle w:val="FirstParagraph"/>
       </w:pPr>
       <w:r>
         <w:t xml:space="preserve">For the last claim, the events</w:t>
@@ -46643,84 +46948,106 @@
       <w:r>
         <w:t xml:space="preserve">,</w:t>
       </w:r>
-      <w:r>
-        <w:t xml:space="preserve"> </w:t>
-      </w:r>
-      <m:oMath>
-        <m:r>
-          <m:rPr>
-            <m:sty m:val="p"/>
-          </m:rPr>
-          <m:t>E</m:t>
-        </m:r>
-        <m:r>
-          <m:t>​</m:t>
-        </m:r>
-        <m:d>
-          <m:dPr>
-            <m:begChr m:val="["/>
-            <m:sepChr m:val=""/>
-            <m:endChr m:val="]"/>
-            <m:grow/>
-          </m:dPr>
-          <m:e>
-            <m:r>
-              <m:t>X</m:t>
-            </m:r>
-          </m:e>
-        </m:d>
-        <m:r>
-          <m:t>​</m:t>
-        </m:r>
-        <m:r>
-          <m:rPr>
-            <m:sty m:val="p"/>
-          </m:rPr>
-          <m:t>=</m:t>
-        </m:r>
-        <m:r>
-          <m:t>0.3</m:t>
-        </m:r>
-        <m:r>
-          <m:rPr>
-            <m:sty m:val="p"/>
-          </m:rPr>
-          <m:t>⋅</m:t>
-        </m:r>
-        <m:r>
-          <m:t>0</m:t>
-        </m:r>
-        <m:r>
-          <m:rPr>
-            <m:sty m:val="p"/>
-          </m:rPr>
-          <m:t>+</m:t>
-        </m:r>
-        <m:r>
-          <m:t>0.7</m:t>
-        </m:r>
-        <m:r>
-          <m:rPr>
-            <m:sty m:val="p"/>
-          </m:rPr>
-          <m:t>⋅</m:t>
-        </m:r>
-        <m:r>
-          <m:t>6</m:t>
-        </m:r>
-        <m:r>
-          <m:rPr>
-            <m:sty m:val="p"/>
-          </m:rPr>
-          <m:t>=</m:t>
-        </m:r>
-        <m:r>
-          <m:t>4.2</m:t>
-        </m:r>
-      </m:oMath>
-      <w:r>
-        <w:t xml:space="preserve">.</w:t>
-      </w:r>
+    </w:p>
+    <w:p>
+      <w:pPr>
+        <w:pStyle w:val="BodyText"/>
+      </w:pPr>
+      <m:oMathPara>
+        <m:oMathParaPr>
+          <m:jc m:val="center"/>
+        </m:oMathParaPr>
+        <m:oMath>
+          <m:eqArr>
+            <m:e>
+              <m:r>
+                <m:rPr>
+                  <m:sty m:val="p"/>
+                </m:rPr>
+                <m:t>E</m:t>
+              </m:r>
+              <m:r>
+                <m:t>​</m:t>
+              </m:r>
+              <m:d>
+                <m:dPr>
+                  <m:begChr m:val="["/>
+                  <m:sepChr m:val=""/>
+                  <m:endChr m:val="]"/>
+                  <m:grow/>
+                </m:dPr>
+                <m:e>
+                  <m:r>
+                    <m:t>X</m:t>
+                  </m:r>
+                </m:e>
+              </m:d>
+              <m:r>
+                <m:t>​</m:t>
+              </m:r>
+              <m:r>
+                <m:t>&amp;</m:t>
+              </m:r>
+              <m:r>
+                <m:rPr>
+                  <m:sty m:val="p"/>
+                </m:rPr>
+                <m:t>=</m:t>
+              </m:r>
+              <m:r>
+                <m:t>0.3</m:t>
+              </m:r>
+              <m:r>
+                <m:rPr>
+                  <m:sty m:val="p"/>
+                </m:rPr>
+                <m:t>⋅</m:t>
+              </m:r>
+              <m:r>
+                <m:t>0</m:t>
+              </m:r>
+              <m:r>
+                <m:rPr>
+                  <m:sty m:val="p"/>
+                </m:rPr>
+                <m:t>+</m:t>
+              </m:r>
+              <m:r>
+                <m:t>0.7</m:t>
+              </m:r>
+              <m:r>
+                <m:rPr>
+                  <m:sty m:val="p"/>
+                </m:rPr>
+                <m:t>⋅</m:t>
+              </m:r>
+              <m:r>
+                <m:t>6</m:t>
+              </m:r>
+            </m:e>
+            <m:e>
+              <m:r>
+                <m:t>&amp;</m:t>
+              </m:r>
+              <m:r>
+                <m:rPr>
+                  <m:sty m:val="p"/>
+                </m:rPr>
+                <m:t>=</m:t>
+              </m:r>
+              <m:r>
+                <m:t>4.2</m:t>
+              </m:r>
+              <m:r>
+                <m:rPr>
+                  <m:sty m:val="p"/>
+                </m:rPr>
+                <m:t>.</m:t>
+              </m:r>
+            </m:e>
+          </m:eqArr>
+        </m:oMath>
+      </m:oMathPara>
     </w:p>
     <w:p>
       <w:pPr>

</xml_diff>

<commit_message>
Deploying to gh-pages from @ Morrison-Lab/pds@62cc1d5086a0ddbc8068bfe0efe8e631291ac970 🚀
</commit_message>
<xml_diff>
--- a/distributions.docx
+++ b/distributions.docx
@@ -15,7 +15,7 @@
         <w:pStyle w:val="Date"/>
       </w:pPr>
       <w:r>
-        <w:t xml:space="preserve">Last modified: 2026-10-09 11:53:46 (PDT)</w:t>
+        <w:t xml:space="preserve">Last modified: 2026-10-09 12:00:39 (PDT)</w:t>
       </w:r>
     </w:p>
     <w:p>
@@ -15944,42 +15944,48 @@
             </m:rPr>
             <m:t>⋅</m:t>
           </m:r>
+          <m:r>
+            <m:t>​</m:t>
+          </m:r>
+          <m:d>
+            <m:dPr>
+              <m:begChr m:val="("/>
+              <m:sepChr m:val=""/>
+              <m:endChr m:val=")"/>
+              <m:grow/>
+            </m:dPr>
+            <m:e>
+              <m:r>
+                <m:t>1</m:t>
+              </m:r>
+              <m:r>
+                <m:rPr>
+                  <m:sty m:val="p"/>
+                </m:rPr>
+                <m:t>+</m:t>
+              </m:r>
+              <m:f>
+                <m:fPr>
+                  <m:type m:val="bar"/>
+                </m:fPr>
+                <m:num>
+                  <m:r>
+                    <m:t>μ</m:t>
+                  </m:r>
+                </m:num>
+                <m:den>
+                  <m:r>
+                    <m:t>ρ</m:t>
+                  </m:r>
+                </m:den>
+              </m:f>
+            </m:e>
+          </m:d>
           <m:sSup>
             <m:e>
-              <m:d>
-                <m:dPr>
-                  <m:begChr m:val="("/>
-                  <m:sepChr m:val=""/>
-                  <m:endChr m:val=")"/>
-                  <m:grow/>
-                </m:dPr>
-                <m:e>
-                  <m:r>
-                    <m:t>1</m:t>
-                  </m:r>
-                  <m:r>
-                    <m:rPr>
-                      <m:sty m:val="p"/>
-                    </m:rPr>
-                    <m:t>+</m:t>
-                  </m:r>
-                  <m:f>
-                    <m:fPr>
-                      <m:type m:val="bar"/>
-                    </m:fPr>
-                    <m:num>
-                      <m:r>
-                        <m:t>μ</m:t>
-                      </m:r>
-                    </m:num>
-                    <m:den>
-                      <m:r>
-                        <m:t>ρ</m:t>
-                      </m:r>
-                    </m:den>
-                  </m:f>
-                </m:e>
-              </m:d>
+              <m:r>
+                <m:t>​</m:t>
+              </m:r>
             </m:e>
             <m:sup>
               <m:r>

</xml_diff>

<commit_message>
Deploying to gh-pages from @ Morrison-Lab/pds@46cba95b60ed5a230027b87ea3de1a0b6d3438dc 🚀
</commit_message>
<xml_diff>
--- a/distributions.docx
+++ b/distributions.docx
@@ -15,7 +15,7 @@
         <w:pStyle w:val="Date"/>
       </w:pPr>
       <w:r>
-        <w:t xml:space="preserve">Last modified: 2026-10-13 22:20:35 (PDT)</w:t>
+        <w:t xml:space="preserve">Last modified: 2026-10-13 22:27:16 (PDT)</w:t>
       </w:r>
     </w:p>
     <w:p>
@@ -918,7 +918,7 @@
     </w:p>
     <w:bookmarkEnd w:id="17"/>
     <w:bookmarkEnd w:id="18"/>
-    <w:bookmarkStart w:id="63" w:name="sec-poisson-dist"/>
+    <w:bookmarkStart w:id="64" w:name="sec-poisson-dist"/>
     <w:p>
       <w:pPr>
         <w:pStyle w:val="Heading2"/>
@@ -4932,7 +4932,7 @@
           <w:b/>
           <w:bCs/>
         </w:rPr>
-        <w:t xml:space="preserve">Theorem 2 (Properties of the Poisson distribution)</w:t>
+        <w:t xml:space="preserve">Theorem 2 (Mean and variance of the Poisson distribution)</w:t>
       </w:r>
       <w:r>
         <w:t xml:space="preserve"> </w:t>
@@ -5066,819 +5066,6 @@
       <w:r>
         <w:t xml:space="preserve">​</w:t>
       </w:r>
-    </w:p>
-    <w:p>
-      <w:pPr>
-        <w:pStyle w:val="Compact"/>
-        <w:numPr>
-          <w:ilvl w:val="0"/>
-          <w:numId w:val="1003"/>
-        </w:numPr>
-      </w:pPr>
-      <m:oMath>
-        <m:r>
-          <m:rPr>
-            <m:sty m:val="p"/>
-          </m:rPr>
-          <m:t>P</m:t>
-        </m:r>
-        <m:r>
-          <m:rPr>
-            <m:sty m:val="p"/>
-          </m:rPr>
-          <m:t>(</m:t>
-        </m:r>
-        <m:r>
-          <m:t>X</m:t>
-        </m:r>
-        <m:r>
-          <m:rPr>
-            <m:sty m:val="p"/>
-          </m:rPr>
-          <m:t>=</m:t>
-        </m:r>
-        <m:r>
-          <m:t>x</m:t>
-        </m:r>
-        <m:r>
-          <m:rPr>
-            <m:sty m:val="p"/>
-          </m:rPr>
-          <m:t>)</m:t>
-        </m:r>
-        <m:r>
-          <m:rPr>
-            <m:sty m:val="p"/>
-          </m:rPr>
-          <m:t>=</m:t>
-        </m:r>
-        <m:f>
-          <m:fPr>
-            <m:type m:val="bar"/>
-          </m:fPr>
-          <m:num>
-            <m:r>
-              <m:t>μ</m:t>
-            </m:r>
-          </m:num>
-          <m:den>
-            <m:r>
-              <m:t>x</m:t>
-            </m:r>
-          </m:den>
-        </m:f>
-        <m:r>
-          <m:rPr>
-            <m:sty m:val="p"/>
-          </m:rPr>
-          <m:t>P</m:t>
-        </m:r>
-        <m:r>
-          <m:rPr>
-            <m:sty m:val="p"/>
-          </m:rPr>
-          <m:t>(</m:t>
-        </m:r>
-        <m:r>
-          <m:t>X</m:t>
-        </m:r>
-        <m:r>
-          <m:rPr>
-            <m:sty m:val="p"/>
-          </m:rPr>
-          <m:t>=</m:t>
-        </m:r>
-        <m:r>
-          <m:t>x</m:t>
-        </m:r>
-        <m:r>
-          <m:rPr>
-            <m:sty m:val="p"/>
-          </m:rPr>
-          <m:t>−</m:t>
-        </m:r>
-        <m:r>
-          <m:t>1</m:t>
-        </m:r>
-        <m:r>
-          <m:rPr>
-            <m:sty m:val="p"/>
-          </m:rPr>
-          <m:t>)</m:t>
-        </m:r>
-      </m:oMath>
-      <w:r>
-        <w:t xml:space="preserve"> </w:t>
-      </w:r>
-      <w:r>
-        <w:t xml:space="preserve">for</w:t>
-      </w:r>
-      <w:r>
-        <w:t xml:space="preserve"> </w:t>
-      </w:r>
-      <m:oMath>
-        <m:r>
-          <m:t>x</m:t>
-        </m:r>
-        <m:r>
-          <m:rPr>
-            <m:sty m:val="p"/>
-          </m:rPr>
-          <m:t>∈</m:t>
-        </m:r>
-        <m:r>
-          <m:t>​</m:t>
-        </m:r>
-        <m:d>
-          <m:dPr>
-            <m:begChr m:val="{"/>
-            <m:sepChr m:val=""/>
-            <m:endChr m:val="}"/>
-            <m:grow/>
-          </m:dPr>
-          <m:e>
-            <m:r>
-              <m:t>1</m:t>
-            </m:r>
-            <m:r>
-              <m:rPr>
-                <m:sty m:val="p"/>
-              </m:rPr>
-              <m:t>,</m:t>
-            </m:r>
-            <m:r>
-              <m:t>2</m:t>
-            </m:r>
-            <m:r>
-              <m:rPr>
-                <m:sty m:val="p"/>
-              </m:rPr>
-              <m:t>,</m:t>
-            </m:r>
-            <m:r>
-              <m:rPr>
-                <m:sty m:val="p"/>
-              </m:rPr>
-              <m:t>…</m:t>
-            </m:r>
-          </m:e>
-        </m:d>
-        <m:r>
-          <m:t>​</m:t>
-        </m:r>
-      </m:oMath>
-    </w:p>
-    <w:p>
-      <w:pPr>
-        <w:pStyle w:val="Compact"/>
-        <w:numPr>
-          <w:ilvl w:val="0"/>
-          <w:numId w:val="1003"/>
-        </w:numPr>
-      </w:pPr>
-      <w:r>
-        <w:t xml:space="preserve">For</w:t>
-      </w:r>
-      <w:r>
-        <w:t xml:space="preserve"> </w:t>
-      </w:r>
-      <m:oMath>
-        <m:r>
-          <m:t>x</m:t>
-        </m:r>
-        <m:r>
-          <m:rPr>
-            <m:sty m:val="p"/>
-          </m:rPr>
-          <m:t>∈</m:t>
-        </m:r>
-        <m:r>
-          <m:t>​</m:t>
-        </m:r>
-        <m:d>
-          <m:dPr>
-            <m:begChr m:val="{"/>
-            <m:sepChr m:val=""/>
-            <m:endChr m:val="}"/>
-            <m:grow/>
-          </m:dPr>
-          <m:e>
-            <m:r>
-              <m:t>1</m:t>
-            </m:r>
-            <m:r>
-              <m:rPr>
-                <m:sty m:val="p"/>
-              </m:rPr>
-              <m:t>,</m:t>
-            </m:r>
-            <m:r>
-              <m:t>2</m:t>
-            </m:r>
-            <m:r>
-              <m:rPr>
-                <m:sty m:val="p"/>
-              </m:rPr>
-              <m:t>,</m:t>
-            </m:r>
-            <m:r>
-              <m:rPr>
-                <m:sty m:val="p"/>
-              </m:rPr>
-              <m:t>…</m:t>
-            </m:r>
-          </m:e>
-        </m:d>
-        <m:r>
-          <m:t>​</m:t>
-        </m:r>
-      </m:oMath>
-      <w:r>
-        <w:t xml:space="preserve"> </w:t>
-      </w:r>
-      <w:r>
-        <w:t xml:space="preserve">with</w:t>
-      </w:r>
-      <w:r>
-        <w:t xml:space="preserve"> </w:t>
-      </w:r>
-      <m:oMath>
-        <m:r>
-          <m:t>x</m:t>
-        </m:r>
-        <m:r>
-          <m:rPr>
-            <m:sty m:val="p"/>
-          </m:rPr>
-          <m:t>&lt;</m:t>
-        </m:r>
-        <m:r>
-          <m:t>μ</m:t>
-        </m:r>
-      </m:oMath>
-      <w:r>
-        <w:t xml:space="preserve">,</w:t>
-      </w:r>
-      <w:r>
-        <w:t xml:space="preserve"> </w:t>
-      </w:r>
-      <m:oMath>
-        <m:r>
-          <m:rPr>
-            <m:sty m:val="p"/>
-          </m:rPr>
-          <m:t>P</m:t>
-        </m:r>
-        <m:r>
-          <m:rPr>
-            <m:sty m:val="p"/>
-          </m:rPr>
-          <m:t>(</m:t>
-        </m:r>
-        <m:r>
-          <m:t>X</m:t>
-        </m:r>
-        <m:r>
-          <m:rPr>
-            <m:sty m:val="p"/>
-          </m:rPr>
-          <m:t>=</m:t>
-        </m:r>
-        <m:r>
-          <m:t>x</m:t>
-        </m:r>
-        <m:r>
-          <m:rPr>
-            <m:sty m:val="p"/>
-          </m:rPr>
-          <m:t>)</m:t>
-        </m:r>
-        <m:r>
-          <m:rPr>
-            <m:sty m:val="p"/>
-          </m:rPr>
-          <m:t>&gt;</m:t>
-        </m:r>
-        <m:r>
-          <m:rPr>
-            <m:sty m:val="p"/>
-          </m:rPr>
-          <m:t>P</m:t>
-        </m:r>
-        <m:r>
-          <m:rPr>
-            <m:sty m:val="p"/>
-          </m:rPr>
-          <m:t>(</m:t>
-        </m:r>
-        <m:r>
-          <m:t>X</m:t>
-        </m:r>
-        <m:r>
-          <m:rPr>
-            <m:sty m:val="p"/>
-          </m:rPr>
-          <m:t>=</m:t>
-        </m:r>
-        <m:r>
-          <m:t>x</m:t>
-        </m:r>
-        <m:r>
-          <m:rPr>
-            <m:sty m:val="p"/>
-          </m:rPr>
-          <m:t>−</m:t>
-        </m:r>
-        <m:r>
-          <m:t>1</m:t>
-        </m:r>
-        <m:r>
-          <m:rPr>
-            <m:sty m:val="p"/>
-          </m:rPr>
-          <m:t>)</m:t>
-        </m:r>
-      </m:oMath>
-    </w:p>
-    <w:p>
-      <w:pPr>
-        <w:pStyle w:val="Compact"/>
-        <w:numPr>
-          <w:ilvl w:val="0"/>
-          <w:numId w:val="1003"/>
-        </w:numPr>
-      </w:pPr>
-      <w:r>
-        <w:t xml:space="preserve">For</w:t>
-      </w:r>
-      <w:r>
-        <w:t xml:space="preserve"> </w:t>
-      </w:r>
-      <m:oMath>
-        <m:r>
-          <m:t>x</m:t>
-        </m:r>
-        <m:r>
-          <m:rPr>
-            <m:sty m:val="p"/>
-          </m:rPr>
-          <m:t>=</m:t>
-        </m:r>
-        <m:r>
-          <m:t>μ</m:t>
-        </m:r>
-      </m:oMath>
-      <w:r>
-        <w:t xml:space="preserve"> </w:t>
-      </w:r>
-      <w:r>
-        <w:t xml:space="preserve">(possible only when</w:t>
-      </w:r>
-      <w:r>
-        <w:t xml:space="preserve"> </w:t>
-      </w:r>
-      <m:oMath>
-        <m:r>
-          <m:t>μ</m:t>
-        </m:r>
-      </m:oMath>
-      <w:r>
-        <w:t xml:space="preserve"> </w:t>
-      </w:r>
-      <w:r>
-        <w:t xml:space="preserve">is an integer),</w:t>
-      </w:r>
-      <w:r>
-        <w:t xml:space="preserve"> </w:t>
-      </w:r>
-      <m:oMath>
-        <m:r>
-          <m:rPr>
-            <m:sty m:val="p"/>
-          </m:rPr>
-          <m:t>P</m:t>
-        </m:r>
-        <m:r>
-          <m:rPr>
-            <m:sty m:val="p"/>
-          </m:rPr>
-          <m:t>(</m:t>
-        </m:r>
-        <m:r>
-          <m:t>X</m:t>
-        </m:r>
-        <m:r>
-          <m:rPr>
-            <m:sty m:val="p"/>
-          </m:rPr>
-          <m:t>=</m:t>
-        </m:r>
-        <m:r>
-          <m:t>x</m:t>
-        </m:r>
-        <m:r>
-          <m:rPr>
-            <m:sty m:val="p"/>
-          </m:rPr>
-          <m:t>)</m:t>
-        </m:r>
-        <m:r>
-          <m:rPr>
-            <m:sty m:val="p"/>
-          </m:rPr>
-          <m:t>=</m:t>
-        </m:r>
-        <m:r>
-          <m:rPr>
-            <m:sty m:val="p"/>
-          </m:rPr>
-          <m:t>P</m:t>
-        </m:r>
-        <m:r>
-          <m:rPr>
-            <m:sty m:val="p"/>
-          </m:rPr>
-          <m:t>(</m:t>
-        </m:r>
-        <m:r>
-          <m:t>X</m:t>
-        </m:r>
-        <m:r>
-          <m:rPr>
-            <m:sty m:val="p"/>
-          </m:rPr>
-          <m:t>=</m:t>
-        </m:r>
-        <m:r>
-          <m:t>x</m:t>
-        </m:r>
-        <m:r>
-          <m:rPr>
-            <m:sty m:val="p"/>
-          </m:rPr>
-          <m:t>−</m:t>
-        </m:r>
-        <m:r>
-          <m:t>1</m:t>
-        </m:r>
-        <m:r>
-          <m:rPr>
-            <m:sty m:val="p"/>
-          </m:rPr>
-          <m:t>)</m:t>
-        </m:r>
-      </m:oMath>
-    </w:p>
-    <w:p>
-      <w:pPr>
-        <w:pStyle w:val="Compact"/>
-        <w:numPr>
-          <w:ilvl w:val="0"/>
-          <w:numId w:val="1003"/>
-        </w:numPr>
-      </w:pPr>
-      <w:r>
-        <w:t xml:space="preserve">For</w:t>
-      </w:r>
-      <w:r>
-        <w:t xml:space="preserve"> </w:t>
-      </w:r>
-      <m:oMath>
-        <m:r>
-          <m:t>x</m:t>
-        </m:r>
-        <m:r>
-          <m:rPr>
-            <m:sty m:val="p"/>
-          </m:rPr>
-          <m:t>∈</m:t>
-        </m:r>
-        <m:r>
-          <m:t>​</m:t>
-        </m:r>
-        <m:d>
-          <m:dPr>
-            <m:begChr m:val="{"/>
-            <m:sepChr m:val=""/>
-            <m:endChr m:val="}"/>
-            <m:grow/>
-          </m:dPr>
-          <m:e>
-            <m:r>
-              <m:t>1</m:t>
-            </m:r>
-            <m:r>
-              <m:rPr>
-                <m:sty m:val="p"/>
-              </m:rPr>
-              <m:t>,</m:t>
-            </m:r>
-            <m:r>
-              <m:t>2</m:t>
-            </m:r>
-            <m:r>
-              <m:rPr>
-                <m:sty m:val="p"/>
-              </m:rPr>
-              <m:t>,</m:t>
-            </m:r>
-            <m:r>
-              <m:rPr>
-                <m:sty m:val="p"/>
-              </m:rPr>
-              <m:t>…</m:t>
-            </m:r>
-          </m:e>
-        </m:d>
-        <m:r>
-          <m:t>​</m:t>
-        </m:r>
-      </m:oMath>
-      <w:r>
-        <w:t xml:space="preserve"> </w:t>
-      </w:r>
-      <w:r>
-        <w:t xml:space="preserve">with</w:t>
-      </w:r>
-      <w:r>
-        <w:t xml:space="preserve"> </w:t>
-      </w:r>
-      <m:oMath>
-        <m:r>
-          <m:t>x</m:t>
-        </m:r>
-        <m:r>
-          <m:rPr>
-            <m:sty m:val="p"/>
-          </m:rPr>
-          <m:t>&gt;</m:t>
-        </m:r>
-        <m:r>
-          <m:t>μ</m:t>
-        </m:r>
-      </m:oMath>
-      <w:r>
-        <w:t xml:space="preserve">,</w:t>
-      </w:r>
-      <w:r>
-        <w:t xml:space="preserve"> </w:t>
-      </w:r>
-      <m:oMath>
-        <m:r>
-          <m:rPr>
-            <m:sty m:val="p"/>
-          </m:rPr>
-          <m:t>P</m:t>
-        </m:r>
-        <m:r>
-          <m:rPr>
-            <m:sty m:val="p"/>
-          </m:rPr>
-          <m:t>(</m:t>
-        </m:r>
-        <m:r>
-          <m:t>X</m:t>
-        </m:r>
-        <m:r>
-          <m:rPr>
-            <m:sty m:val="p"/>
-          </m:rPr>
-          <m:t>=</m:t>
-        </m:r>
-        <m:r>
-          <m:t>x</m:t>
-        </m:r>
-        <m:r>
-          <m:rPr>
-            <m:sty m:val="p"/>
-          </m:rPr>
-          <m:t>)</m:t>
-        </m:r>
-        <m:r>
-          <m:rPr>
-            <m:sty m:val="p"/>
-          </m:rPr>
-          <m:t>&lt;</m:t>
-        </m:r>
-        <m:r>
-          <m:rPr>
-            <m:sty m:val="p"/>
-          </m:rPr>
-          <m:t>P</m:t>
-        </m:r>
-        <m:r>
-          <m:rPr>
-            <m:sty m:val="p"/>
-          </m:rPr>
-          <m:t>(</m:t>
-        </m:r>
-        <m:r>
-          <m:t>X</m:t>
-        </m:r>
-        <m:r>
-          <m:rPr>
-            <m:sty m:val="p"/>
-          </m:rPr>
-          <m:t>=</m:t>
-        </m:r>
-        <m:r>
-          <m:t>x</m:t>
-        </m:r>
-        <m:r>
-          <m:rPr>
-            <m:sty m:val="p"/>
-          </m:rPr>
-          <m:t>−</m:t>
-        </m:r>
-        <m:r>
-          <m:t>1</m:t>
-        </m:r>
-        <m:r>
-          <m:rPr>
-            <m:sty m:val="p"/>
-          </m:rPr>
-          <m:t>)</m:t>
-        </m:r>
-      </m:oMath>
-    </w:p>
-    <w:p>
-      <w:pPr>
-        <w:pStyle w:val="Compact"/>
-        <w:numPr>
-          <w:ilvl w:val="0"/>
-          <w:numId w:val="1003"/>
-        </w:numPr>
-      </w:pPr>
-      <w:r>
-        <w:t xml:space="preserve">If</w:t>
-      </w:r>
-      <w:r>
-        <w:t xml:space="preserve"> </w:t>
-      </w:r>
-      <m:oMath>
-        <m:r>
-          <m:t>μ</m:t>
-        </m:r>
-      </m:oMath>
-      <w:r>
-        <w:t xml:space="preserve"> </w:t>
-      </w:r>
-      <w:r>
-        <w:t xml:space="preserve">is not an integer,</w:t>
-      </w:r>
-      <w:r>
-        <w:t xml:space="preserve"> </w:t>
-      </w:r>
-      <m:oMath>
-        <m:r>
-          <m:rPr>
-            <m:sty m:val="p"/>
-          </m:rPr>
-          <m:t>arg</m:t>
-        </m:r>
-        <m:sSub>
-          <m:e>
-            <m:r>
-              <m:rPr>
-                <m:sty m:val="p"/>
-              </m:rPr>
-              <m:t>max</m:t>
-            </m:r>
-          </m:e>
-          <m:sub>
-            <m:r>
-              <m:t>x</m:t>
-            </m:r>
-          </m:sub>
-        </m:sSub>
-        <m:r>
-          <m:rPr>
-            <m:sty m:val="p"/>
-          </m:rPr>
-          <m:t>P</m:t>
-        </m:r>
-        <m:r>
-          <m:rPr>
-            <m:sty m:val="p"/>
-          </m:rPr>
-          <m:t>(</m:t>
-        </m:r>
-        <m:r>
-          <m:t>X</m:t>
-        </m:r>
-        <m:r>
-          <m:rPr>
-            <m:sty m:val="p"/>
-          </m:rPr>
-          <m:t>=</m:t>
-        </m:r>
-        <m:r>
-          <m:t>x</m:t>
-        </m:r>
-        <m:r>
-          <m:rPr>
-            <m:sty m:val="p"/>
-          </m:rPr>
-          <m:t>)</m:t>
-        </m:r>
-        <m:r>
-          <m:rPr>
-            <m:sty m:val="p"/>
-          </m:rPr>
-          <m:t>=</m:t>
-        </m:r>
-        <m:r>
-          <m:t>​</m:t>
-        </m:r>
-        <m:d>
-          <m:dPr>
-            <m:begChr m:val="⌊"/>
-            <m:sepChr m:val=""/>
-            <m:endChr m:val="⌋"/>
-            <m:grow/>
-          </m:dPr>
-          <m:e>
-            <m:r>
-              <m:t>μ</m:t>
-            </m:r>
-          </m:e>
-        </m:d>
-        <m:r>
-          <m:t>​</m:t>
-        </m:r>
-      </m:oMath>
-      <w:r>
-        <w:t xml:space="preserve">;</w:t>
-      </w:r>
-      <w:r>
-        <w:t xml:space="preserve"> </w:t>
-      </w:r>
-      <w:r>
-        <w:t xml:space="preserve">if</w:t>
-      </w:r>
-      <w:r>
-        <w:t xml:space="preserve"> </w:t>
-      </w:r>
-      <m:oMath>
-        <m:r>
-          <m:t>μ</m:t>
-        </m:r>
-      </m:oMath>
-      <w:r>
-        <w:t xml:space="preserve"> </w:t>
-      </w:r>
-      <w:r>
-        <w:t xml:space="preserve">is an integer, the maximum is attained at both</w:t>
-      </w:r>
-      <w:r>
-        <w:t xml:space="preserve"> </w:t>
-      </w:r>
-      <m:oMath>
-        <m:r>
-          <m:t>x</m:t>
-        </m:r>
-        <m:r>
-          <m:rPr>
-            <m:sty m:val="p"/>
-          </m:rPr>
-          <m:t>=</m:t>
-        </m:r>
-        <m:r>
-          <m:t>μ</m:t>
-        </m:r>
-        <m:r>
-          <m:rPr>
-            <m:sty m:val="p"/>
-          </m:rPr>
-          <m:t>−</m:t>
-        </m:r>
-        <m:r>
-          <m:t>1</m:t>
-        </m:r>
-      </m:oMath>
-      <w:r>
-        <w:t xml:space="preserve"> </w:t>
-      </w:r>
-      <w:r>
-        <w:t xml:space="preserve">and</w:t>
-      </w:r>
-      <w:r>
-        <w:t xml:space="preserve"> </w:t>
-      </w:r>
-      <m:oMath>
-        <m:r>
-          <m:t>x</m:t>
-        </m:r>
-        <m:r>
-          <m:rPr>
-            <m:sty m:val="p"/>
-          </m:rPr>
-          <m:t>=</m:t>
-        </m:r>
-        <m:r>
-          <m:t>μ</m:t>
-        </m:r>
-      </m:oMath>
     </w:p>
     <w:bookmarkEnd w:id="35"/>
     <w:p>
@@ -8327,6 +7514,926 @@
         <w:pStyle w:val="FirstParagraph"/>
       </w:pPr>
       <w:r>
+        <w:t xml:space="preserve">See also</w:t>
+      </w:r>
+      <w:r>
+        <w:t xml:space="preserve"> </w:t>
+      </w:r>
+      <w:hyperlink r:id="rId38">
+        <w:r>
+          <w:rPr>
+            <w:rStyle w:val="Hyperlink"/>
+          </w:rPr>
+          <w:t xml:space="preserve">https://statproofbook.github.io/P/poiss-mean</w:t>
+        </w:r>
+      </w:hyperlink>
+      <w:r>
+        <w:t xml:space="preserve"> </w:t>
+      </w:r>
+      <w:r>
+        <w:t xml:space="preserve">and</w:t>
+      </w:r>
+      <w:r>
+        <w:t xml:space="preserve"> </w:t>
+      </w:r>
+      <w:hyperlink r:id="rId39">
+        <w:r>
+          <w:rPr>
+            <w:rStyle w:val="Hyperlink"/>
+          </w:rPr>
+          <w:t xml:space="preserve">https://statproofbook.github.io/P/poiss-var</w:t>
+        </w:r>
+      </w:hyperlink>
+      <w:r>
+        <w:t xml:space="preserve">.</w:t>
+      </w:r>
+    </w:p>
+    <w:bookmarkStart w:id="40" w:name="thm-poisson-mode"/>
+    <w:p>
+      <w:pPr>
+        <w:pStyle w:val="BodyText"/>
+      </w:pPr>
+      <w:r>
+        <w:rPr>
+          <w:b/>
+          <w:bCs/>
+        </w:rPr>
+        <w:t xml:space="preserve">Theorem 3 (Ratio of consecutive Poisson probabilities, and the mode)</w:t>
+      </w:r>
+      <w:r>
+        <w:t xml:space="preserve"> </w:t>
+      </w:r>
+      <w:r>
+        <w:t xml:space="preserve">If</w:t>
+      </w:r>
+      <w:r>
+        <w:t xml:space="preserve"> </w:t>
+      </w:r>
+      <m:oMath>
+        <m:r>
+          <m:t>X</m:t>
+        </m:r>
+        <m:r>
+          <m:rPr>
+            <m:sty m:val="p"/>
+          </m:rPr>
+          <m:t>∼</m:t>
+        </m:r>
+        <m:r>
+          <m:rPr>
+            <m:sty m:val="p"/>
+          </m:rPr>
+          <m:t>Pois</m:t>
+        </m:r>
+        <m:r>
+          <m:rPr>
+            <m:sty m:val="p"/>
+          </m:rPr>
+          <m:t>(</m:t>
+        </m:r>
+        <m:r>
+          <m:t>μ</m:t>
+        </m:r>
+        <m:r>
+          <m:rPr>
+            <m:sty m:val="p"/>
+          </m:rPr>
+          <m:t>)</m:t>
+        </m:r>
+      </m:oMath>
+      <w:r>
+        <w:t xml:space="preserve">, then:</w:t>
+      </w:r>
+    </w:p>
+    <w:p>
+      <w:pPr>
+        <w:pStyle w:val="Compact"/>
+        <w:numPr>
+          <w:ilvl w:val="0"/>
+          <w:numId w:val="1004"/>
+        </w:numPr>
+      </w:pPr>
+      <m:oMath>
+        <m:r>
+          <m:rPr>
+            <m:sty m:val="p"/>
+          </m:rPr>
+          <m:t>P</m:t>
+        </m:r>
+        <m:r>
+          <m:rPr>
+            <m:sty m:val="p"/>
+          </m:rPr>
+          <m:t>(</m:t>
+        </m:r>
+        <m:r>
+          <m:t>X</m:t>
+        </m:r>
+        <m:r>
+          <m:rPr>
+            <m:sty m:val="p"/>
+          </m:rPr>
+          <m:t>=</m:t>
+        </m:r>
+        <m:r>
+          <m:t>x</m:t>
+        </m:r>
+        <m:r>
+          <m:rPr>
+            <m:sty m:val="p"/>
+          </m:rPr>
+          <m:t>)</m:t>
+        </m:r>
+        <m:r>
+          <m:rPr>
+            <m:sty m:val="p"/>
+          </m:rPr>
+          <m:t>=</m:t>
+        </m:r>
+        <m:f>
+          <m:fPr>
+            <m:type m:val="bar"/>
+          </m:fPr>
+          <m:num>
+            <m:r>
+              <m:t>μ</m:t>
+            </m:r>
+          </m:num>
+          <m:den>
+            <m:r>
+              <m:t>x</m:t>
+            </m:r>
+          </m:den>
+        </m:f>
+        <m:r>
+          <m:rPr>
+            <m:sty m:val="p"/>
+          </m:rPr>
+          <m:t>P</m:t>
+        </m:r>
+        <m:r>
+          <m:rPr>
+            <m:sty m:val="p"/>
+          </m:rPr>
+          <m:t>(</m:t>
+        </m:r>
+        <m:r>
+          <m:t>X</m:t>
+        </m:r>
+        <m:r>
+          <m:rPr>
+            <m:sty m:val="p"/>
+          </m:rPr>
+          <m:t>=</m:t>
+        </m:r>
+        <m:r>
+          <m:t>x</m:t>
+        </m:r>
+        <m:r>
+          <m:rPr>
+            <m:sty m:val="p"/>
+          </m:rPr>
+          <m:t>−</m:t>
+        </m:r>
+        <m:r>
+          <m:t>1</m:t>
+        </m:r>
+        <m:r>
+          <m:rPr>
+            <m:sty m:val="p"/>
+          </m:rPr>
+          <m:t>)</m:t>
+        </m:r>
+      </m:oMath>
+      <w:r>
+        <w:t xml:space="preserve"> </w:t>
+      </w:r>
+      <w:r>
+        <w:t xml:space="preserve">for</w:t>
+      </w:r>
+      <w:r>
+        <w:t xml:space="preserve"> </w:t>
+      </w:r>
+      <m:oMath>
+        <m:r>
+          <m:t>x</m:t>
+        </m:r>
+        <m:r>
+          <m:rPr>
+            <m:sty m:val="p"/>
+          </m:rPr>
+          <m:t>∈</m:t>
+        </m:r>
+        <m:r>
+          <m:t>​</m:t>
+        </m:r>
+        <m:d>
+          <m:dPr>
+            <m:begChr m:val="{"/>
+            <m:sepChr m:val=""/>
+            <m:endChr m:val="}"/>
+            <m:grow/>
+          </m:dPr>
+          <m:e>
+            <m:r>
+              <m:t>1</m:t>
+            </m:r>
+            <m:r>
+              <m:rPr>
+                <m:sty m:val="p"/>
+              </m:rPr>
+              <m:t>,</m:t>
+            </m:r>
+            <m:r>
+              <m:t>2</m:t>
+            </m:r>
+            <m:r>
+              <m:rPr>
+                <m:sty m:val="p"/>
+              </m:rPr>
+              <m:t>,</m:t>
+            </m:r>
+            <m:r>
+              <m:rPr>
+                <m:sty m:val="p"/>
+              </m:rPr>
+              <m:t>…</m:t>
+            </m:r>
+          </m:e>
+        </m:d>
+        <m:r>
+          <m:t>​</m:t>
+        </m:r>
+      </m:oMath>
+    </w:p>
+    <w:p>
+      <w:pPr>
+        <w:pStyle w:val="Compact"/>
+        <w:numPr>
+          <w:ilvl w:val="0"/>
+          <w:numId w:val="1004"/>
+        </w:numPr>
+      </w:pPr>
+      <w:r>
+        <w:t xml:space="preserve">For</w:t>
+      </w:r>
+      <w:r>
+        <w:t xml:space="preserve"> </w:t>
+      </w:r>
+      <m:oMath>
+        <m:r>
+          <m:t>x</m:t>
+        </m:r>
+        <m:r>
+          <m:rPr>
+            <m:sty m:val="p"/>
+          </m:rPr>
+          <m:t>∈</m:t>
+        </m:r>
+        <m:r>
+          <m:t>​</m:t>
+        </m:r>
+        <m:d>
+          <m:dPr>
+            <m:begChr m:val="{"/>
+            <m:sepChr m:val=""/>
+            <m:endChr m:val="}"/>
+            <m:grow/>
+          </m:dPr>
+          <m:e>
+            <m:r>
+              <m:t>1</m:t>
+            </m:r>
+            <m:r>
+              <m:rPr>
+                <m:sty m:val="p"/>
+              </m:rPr>
+              <m:t>,</m:t>
+            </m:r>
+            <m:r>
+              <m:t>2</m:t>
+            </m:r>
+            <m:r>
+              <m:rPr>
+                <m:sty m:val="p"/>
+              </m:rPr>
+              <m:t>,</m:t>
+            </m:r>
+            <m:r>
+              <m:rPr>
+                <m:sty m:val="p"/>
+              </m:rPr>
+              <m:t>…</m:t>
+            </m:r>
+          </m:e>
+        </m:d>
+        <m:r>
+          <m:t>​</m:t>
+        </m:r>
+      </m:oMath>
+      <w:r>
+        <w:t xml:space="preserve"> </w:t>
+      </w:r>
+      <w:r>
+        <w:t xml:space="preserve">with</w:t>
+      </w:r>
+      <w:r>
+        <w:t xml:space="preserve"> </w:t>
+      </w:r>
+      <m:oMath>
+        <m:r>
+          <m:t>x</m:t>
+        </m:r>
+        <m:r>
+          <m:rPr>
+            <m:sty m:val="p"/>
+          </m:rPr>
+          <m:t>&lt;</m:t>
+        </m:r>
+        <m:r>
+          <m:t>μ</m:t>
+        </m:r>
+      </m:oMath>
+      <w:r>
+        <w:t xml:space="preserve">,</w:t>
+      </w:r>
+      <w:r>
+        <w:t xml:space="preserve"> </w:t>
+      </w:r>
+      <m:oMath>
+        <m:r>
+          <m:rPr>
+            <m:sty m:val="p"/>
+          </m:rPr>
+          <m:t>P</m:t>
+        </m:r>
+        <m:r>
+          <m:rPr>
+            <m:sty m:val="p"/>
+          </m:rPr>
+          <m:t>(</m:t>
+        </m:r>
+        <m:r>
+          <m:t>X</m:t>
+        </m:r>
+        <m:r>
+          <m:rPr>
+            <m:sty m:val="p"/>
+          </m:rPr>
+          <m:t>=</m:t>
+        </m:r>
+        <m:r>
+          <m:t>x</m:t>
+        </m:r>
+        <m:r>
+          <m:rPr>
+            <m:sty m:val="p"/>
+          </m:rPr>
+          <m:t>)</m:t>
+        </m:r>
+        <m:r>
+          <m:rPr>
+            <m:sty m:val="p"/>
+          </m:rPr>
+          <m:t>&gt;</m:t>
+        </m:r>
+        <m:r>
+          <m:rPr>
+            <m:sty m:val="p"/>
+          </m:rPr>
+          <m:t>P</m:t>
+        </m:r>
+        <m:r>
+          <m:rPr>
+            <m:sty m:val="p"/>
+          </m:rPr>
+          <m:t>(</m:t>
+        </m:r>
+        <m:r>
+          <m:t>X</m:t>
+        </m:r>
+        <m:r>
+          <m:rPr>
+            <m:sty m:val="p"/>
+          </m:rPr>
+          <m:t>=</m:t>
+        </m:r>
+        <m:r>
+          <m:t>x</m:t>
+        </m:r>
+        <m:r>
+          <m:rPr>
+            <m:sty m:val="p"/>
+          </m:rPr>
+          <m:t>−</m:t>
+        </m:r>
+        <m:r>
+          <m:t>1</m:t>
+        </m:r>
+        <m:r>
+          <m:rPr>
+            <m:sty m:val="p"/>
+          </m:rPr>
+          <m:t>)</m:t>
+        </m:r>
+      </m:oMath>
+    </w:p>
+    <w:p>
+      <w:pPr>
+        <w:pStyle w:val="Compact"/>
+        <w:numPr>
+          <w:ilvl w:val="0"/>
+          <w:numId w:val="1004"/>
+        </w:numPr>
+      </w:pPr>
+      <w:r>
+        <w:t xml:space="preserve">For</w:t>
+      </w:r>
+      <w:r>
+        <w:t xml:space="preserve"> </w:t>
+      </w:r>
+      <m:oMath>
+        <m:r>
+          <m:t>x</m:t>
+        </m:r>
+        <m:r>
+          <m:rPr>
+            <m:sty m:val="p"/>
+          </m:rPr>
+          <m:t>=</m:t>
+        </m:r>
+        <m:r>
+          <m:t>μ</m:t>
+        </m:r>
+      </m:oMath>
+      <w:r>
+        <w:t xml:space="preserve"> </w:t>
+      </w:r>
+      <w:r>
+        <w:t xml:space="preserve">(possible only when</w:t>
+      </w:r>
+      <w:r>
+        <w:t xml:space="preserve"> </w:t>
+      </w:r>
+      <m:oMath>
+        <m:r>
+          <m:t>μ</m:t>
+        </m:r>
+      </m:oMath>
+      <w:r>
+        <w:t xml:space="preserve"> </w:t>
+      </w:r>
+      <w:r>
+        <w:t xml:space="preserve">is an integer),</w:t>
+      </w:r>
+      <w:r>
+        <w:t xml:space="preserve"> </w:t>
+      </w:r>
+      <m:oMath>
+        <m:r>
+          <m:rPr>
+            <m:sty m:val="p"/>
+          </m:rPr>
+          <m:t>P</m:t>
+        </m:r>
+        <m:r>
+          <m:rPr>
+            <m:sty m:val="p"/>
+          </m:rPr>
+          <m:t>(</m:t>
+        </m:r>
+        <m:r>
+          <m:t>X</m:t>
+        </m:r>
+        <m:r>
+          <m:rPr>
+            <m:sty m:val="p"/>
+          </m:rPr>
+          <m:t>=</m:t>
+        </m:r>
+        <m:r>
+          <m:t>x</m:t>
+        </m:r>
+        <m:r>
+          <m:rPr>
+            <m:sty m:val="p"/>
+          </m:rPr>
+          <m:t>)</m:t>
+        </m:r>
+        <m:r>
+          <m:rPr>
+            <m:sty m:val="p"/>
+          </m:rPr>
+          <m:t>=</m:t>
+        </m:r>
+        <m:r>
+          <m:rPr>
+            <m:sty m:val="p"/>
+          </m:rPr>
+          <m:t>P</m:t>
+        </m:r>
+        <m:r>
+          <m:rPr>
+            <m:sty m:val="p"/>
+          </m:rPr>
+          <m:t>(</m:t>
+        </m:r>
+        <m:r>
+          <m:t>X</m:t>
+        </m:r>
+        <m:r>
+          <m:rPr>
+            <m:sty m:val="p"/>
+          </m:rPr>
+          <m:t>=</m:t>
+        </m:r>
+        <m:r>
+          <m:t>x</m:t>
+        </m:r>
+        <m:r>
+          <m:rPr>
+            <m:sty m:val="p"/>
+          </m:rPr>
+          <m:t>−</m:t>
+        </m:r>
+        <m:r>
+          <m:t>1</m:t>
+        </m:r>
+        <m:r>
+          <m:rPr>
+            <m:sty m:val="p"/>
+          </m:rPr>
+          <m:t>)</m:t>
+        </m:r>
+      </m:oMath>
+    </w:p>
+    <w:p>
+      <w:pPr>
+        <w:pStyle w:val="Compact"/>
+        <w:numPr>
+          <w:ilvl w:val="0"/>
+          <w:numId w:val="1004"/>
+        </w:numPr>
+      </w:pPr>
+      <w:r>
+        <w:t xml:space="preserve">For</w:t>
+      </w:r>
+      <w:r>
+        <w:t xml:space="preserve"> </w:t>
+      </w:r>
+      <m:oMath>
+        <m:r>
+          <m:t>x</m:t>
+        </m:r>
+        <m:r>
+          <m:rPr>
+            <m:sty m:val="p"/>
+          </m:rPr>
+          <m:t>∈</m:t>
+        </m:r>
+        <m:r>
+          <m:t>​</m:t>
+        </m:r>
+        <m:d>
+          <m:dPr>
+            <m:begChr m:val="{"/>
+            <m:sepChr m:val=""/>
+            <m:endChr m:val="}"/>
+            <m:grow/>
+          </m:dPr>
+          <m:e>
+            <m:r>
+              <m:t>1</m:t>
+            </m:r>
+            <m:r>
+              <m:rPr>
+                <m:sty m:val="p"/>
+              </m:rPr>
+              <m:t>,</m:t>
+            </m:r>
+            <m:r>
+              <m:t>2</m:t>
+            </m:r>
+            <m:r>
+              <m:rPr>
+                <m:sty m:val="p"/>
+              </m:rPr>
+              <m:t>,</m:t>
+            </m:r>
+            <m:r>
+              <m:rPr>
+                <m:sty m:val="p"/>
+              </m:rPr>
+              <m:t>…</m:t>
+            </m:r>
+          </m:e>
+        </m:d>
+        <m:r>
+          <m:t>​</m:t>
+        </m:r>
+      </m:oMath>
+      <w:r>
+        <w:t xml:space="preserve"> </w:t>
+      </w:r>
+      <w:r>
+        <w:t xml:space="preserve">with</w:t>
+      </w:r>
+      <w:r>
+        <w:t xml:space="preserve"> </w:t>
+      </w:r>
+      <m:oMath>
+        <m:r>
+          <m:t>x</m:t>
+        </m:r>
+        <m:r>
+          <m:rPr>
+            <m:sty m:val="p"/>
+          </m:rPr>
+          <m:t>&gt;</m:t>
+        </m:r>
+        <m:r>
+          <m:t>μ</m:t>
+        </m:r>
+      </m:oMath>
+      <w:r>
+        <w:t xml:space="preserve">,</w:t>
+      </w:r>
+      <w:r>
+        <w:t xml:space="preserve"> </w:t>
+      </w:r>
+      <m:oMath>
+        <m:r>
+          <m:rPr>
+            <m:sty m:val="p"/>
+          </m:rPr>
+          <m:t>P</m:t>
+        </m:r>
+        <m:r>
+          <m:rPr>
+            <m:sty m:val="p"/>
+          </m:rPr>
+          <m:t>(</m:t>
+        </m:r>
+        <m:r>
+          <m:t>X</m:t>
+        </m:r>
+        <m:r>
+          <m:rPr>
+            <m:sty m:val="p"/>
+          </m:rPr>
+          <m:t>=</m:t>
+        </m:r>
+        <m:r>
+          <m:t>x</m:t>
+        </m:r>
+        <m:r>
+          <m:rPr>
+            <m:sty m:val="p"/>
+          </m:rPr>
+          <m:t>)</m:t>
+        </m:r>
+        <m:r>
+          <m:rPr>
+            <m:sty m:val="p"/>
+          </m:rPr>
+          <m:t>&lt;</m:t>
+        </m:r>
+        <m:r>
+          <m:rPr>
+            <m:sty m:val="p"/>
+          </m:rPr>
+          <m:t>P</m:t>
+        </m:r>
+        <m:r>
+          <m:rPr>
+            <m:sty m:val="p"/>
+          </m:rPr>
+          <m:t>(</m:t>
+        </m:r>
+        <m:r>
+          <m:t>X</m:t>
+        </m:r>
+        <m:r>
+          <m:rPr>
+            <m:sty m:val="p"/>
+          </m:rPr>
+          <m:t>=</m:t>
+        </m:r>
+        <m:r>
+          <m:t>x</m:t>
+        </m:r>
+        <m:r>
+          <m:rPr>
+            <m:sty m:val="p"/>
+          </m:rPr>
+          <m:t>−</m:t>
+        </m:r>
+        <m:r>
+          <m:t>1</m:t>
+        </m:r>
+        <m:r>
+          <m:rPr>
+            <m:sty m:val="p"/>
+          </m:rPr>
+          <m:t>)</m:t>
+        </m:r>
+      </m:oMath>
+    </w:p>
+    <w:p>
+      <w:pPr>
+        <w:pStyle w:val="Compact"/>
+        <w:numPr>
+          <w:ilvl w:val="0"/>
+          <w:numId w:val="1004"/>
+        </w:numPr>
+      </w:pPr>
+      <w:r>
+        <w:t xml:space="preserve">If</w:t>
+      </w:r>
+      <w:r>
+        <w:t xml:space="preserve"> </w:t>
+      </w:r>
+      <m:oMath>
+        <m:r>
+          <m:t>μ</m:t>
+        </m:r>
+      </m:oMath>
+      <w:r>
+        <w:t xml:space="preserve"> </w:t>
+      </w:r>
+      <w:r>
+        <w:t xml:space="preserve">is not an integer,</w:t>
+      </w:r>
+      <w:r>
+        <w:t xml:space="preserve"> </w:t>
+      </w:r>
+      <m:oMath>
+        <m:r>
+          <m:rPr>
+            <m:sty m:val="p"/>
+          </m:rPr>
+          <m:t>arg</m:t>
+        </m:r>
+        <m:sSub>
+          <m:e>
+            <m:r>
+              <m:rPr>
+                <m:sty m:val="p"/>
+              </m:rPr>
+              <m:t>max</m:t>
+            </m:r>
+          </m:e>
+          <m:sub>
+            <m:r>
+              <m:t>x</m:t>
+            </m:r>
+          </m:sub>
+        </m:sSub>
+        <m:r>
+          <m:rPr>
+            <m:sty m:val="p"/>
+          </m:rPr>
+          <m:t>P</m:t>
+        </m:r>
+        <m:r>
+          <m:rPr>
+            <m:sty m:val="p"/>
+          </m:rPr>
+          <m:t>(</m:t>
+        </m:r>
+        <m:r>
+          <m:t>X</m:t>
+        </m:r>
+        <m:r>
+          <m:rPr>
+            <m:sty m:val="p"/>
+          </m:rPr>
+          <m:t>=</m:t>
+        </m:r>
+        <m:r>
+          <m:t>x</m:t>
+        </m:r>
+        <m:r>
+          <m:rPr>
+            <m:sty m:val="p"/>
+          </m:rPr>
+          <m:t>)</m:t>
+        </m:r>
+        <m:r>
+          <m:rPr>
+            <m:sty m:val="p"/>
+          </m:rPr>
+          <m:t>=</m:t>
+        </m:r>
+        <m:r>
+          <m:t>​</m:t>
+        </m:r>
+        <m:d>
+          <m:dPr>
+            <m:begChr m:val="⌊"/>
+            <m:sepChr m:val=""/>
+            <m:endChr m:val="⌋"/>
+            <m:grow/>
+          </m:dPr>
+          <m:e>
+            <m:r>
+              <m:t>μ</m:t>
+            </m:r>
+          </m:e>
+        </m:d>
+        <m:r>
+          <m:t>​</m:t>
+        </m:r>
+      </m:oMath>
+      <w:r>
+        <w:t xml:space="preserve">;</w:t>
+      </w:r>
+      <w:r>
+        <w:t xml:space="preserve"> </w:t>
+      </w:r>
+      <w:r>
+        <w:t xml:space="preserve">if</w:t>
+      </w:r>
+      <w:r>
+        <w:t xml:space="preserve"> </w:t>
+      </w:r>
+      <m:oMath>
+        <m:r>
+          <m:t>μ</m:t>
+        </m:r>
+      </m:oMath>
+      <w:r>
+        <w:t xml:space="preserve"> </w:t>
+      </w:r>
+      <w:r>
+        <w:t xml:space="preserve">is an integer, the maximum is attained at both</w:t>
+      </w:r>
+      <w:r>
+        <w:t xml:space="preserve"> </w:t>
+      </w:r>
+      <m:oMath>
+        <m:r>
+          <m:t>x</m:t>
+        </m:r>
+        <m:r>
+          <m:rPr>
+            <m:sty m:val="p"/>
+          </m:rPr>
+          <m:t>=</m:t>
+        </m:r>
+        <m:r>
+          <m:t>μ</m:t>
+        </m:r>
+        <m:r>
+          <m:rPr>
+            <m:sty m:val="p"/>
+          </m:rPr>
+          <m:t>−</m:t>
+        </m:r>
+        <m:r>
+          <m:t>1</m:t>
+        </m:r>
+      </m:oMath>
+      <w:r>
+        <w:t xml:space="preserve"> </w:t>
+      </w:r>
+      <w:r>
+        <w:t xml:space="preserve">and</w:t>
+      </w:r>
+      <w:r>
+        <w:t xml:space="preserve"> </w:t>
+      </w:r>
+      <m:oMath>
+        <m:r>
+          <m:t>x</m:t>
+        </m:r>
+        <m:r>
+          <m:rPr>
+            <m:sty m:val="p"/>
+          </m:rPr>
+          <m:t>=</m:t>
+        </m:r>
+        <m:r>
+          <m:t>μ</m:t>
+        </m:r>
+      </m:oMath>
+    </w:p>
+    <w:bookmarkEnd w:id="40"/>
+    <w:p>
+      <w:pPr>
+        <w:pStyle w:val="FirstParagraph"/>
+      </w:pPr>
+      <w:r>
+        <w:rPr>
+          <w:i/>
+          <w:iCs/>
+        </w:rPr>
+        <w:t xml:space="preserve">Proof</w:t>
+      </w:r>
+      <w:r>
+        <w:t xml:space="preserve">. </w:t>
+      </w:r>
+      <w:r>
         <w:rPr>
           <w:b/>
           <w:bCs/>
@@ -9087,46 +9194,7 @@
         <w:t xml:space="preserve">and both are modes.</w:t>
       </w:r>
     </w:p>
-    <w:p>
-      <w:pPr>
-        <w:pStyle w:val="BodyText"/>
-      </w:pPr>
-      <w:r>
-        <w:t xml:space="preserve">See also</w:t>
-      </w:r>
-      <w:r>
-        <w:t xml:space="preserve"> </w:t>
-      </w:r>
-      <w:hyperlink r:id="rId38">
-        <w:r>
-          <w:rPr>
-            <w:rStyle w:val="Hyperlink"/>
-          </w:rPr>
-          <w:t xml:space="preserve">https://statproofbook.github.io/P/poiss-mean</w:t>
-        </w:r>
-      </w:hyperlink>
-      <w:r>
-        <w:t xml:space="preserve"> </w:t>
-      </w:r>
-      <w:r>
-        <w:t xml:space="preserve">and</w:t>
-      </w:r>
-      <w:r>
-        <w:t xml:space="preserve"> </w:t>
-      </w:r>
-      <w:hyperlink r:id="rId39">
-        <w:r>
-          <w:rPr>
-            <w:rStyle w:val="Hyperlink"/>
-          </w:rPr>
-          <w:t xml:space="preserve">https://statproofbook.github.io/P/poiss-var</w:t>
-        </w:r>
-      </w:hyperlink>
-      <w:r>
-        <w:t xml:space="preserve">.</w:t>
-      </w:r>
-    </w:p>
-    <w:bookmarkStart w:id="40" w:name="exm-poisson-properties"/>
+    <w:bookmarkStart w:id="41" w:name="exm-poisson-properties"/>
     <w:p>
       <w:pPr>
         <w:pStyle w:val="BodyText"/>
@@ -9689,8 +9757,8 @@
         <w:t xml:space="preserve">.</w:t>
       </w:r>
     </w:p>
-    <w:bookmarkEnd w:id="40"/>
-    <w:bookmarkStart w:id="41" w:name="def-exposure"/>
+    <w:bookmarkEnd w:id="41"/>
+    <w:bookmarkStart w:id="42" w:name="def-exposure"/>
     <w:p>
       <w:pPr>
         <w:pStyle w:val="BodyText"/>
@@ -9764,8 +9832,8 @@
         <w:t xml:space="preserve">the expected (mean) count.</w:t>
       </w:r>
     </w:p>
-    <w:bookmarkEnd w:id="41"/>
-    <w:bookmarkStart w:id="42" w:name="exr-exposure-magnitude"/>
+    <w:bookmarkEnd w:id="42"/>
+    <w:bookmarkStart w:id="43" w:name="exr-exposure-magnitude"/>
     <w:p>
       <w:pPr>
         <w:pStyle w:val="BodyText"/>
@@ -9784,7 +9852,7 @@
         <w:t xml:space="preserve">What are some examples of exposure magnitudes?</w:t>
       </w:r>
     </w:p>
-    <w:bookmarkEnd w:id="42"/>
+    <w:bookmarkEnd w:id="43"/>
     <w:p>
       <w:pPr>
         <w:pStyle w:val="BodyText"/>
@@ -9813,7 +9881,7 @@
       <w:tr>
         <w:tc>
           <w:tcPr/>
-          <w:bookmarkStart w:id="43" w:name="tbl-exposure-units"/>
+          <w:bookmarkStart w:id="44" w:name="tbl-exposure-units"/>
           <w:p>
             <w:pPr>
               <w:jc w:val="center"/>
@@ -9972,7 +10040,7 @@
               </w:tc>
             </w:tr>
           </w:tbl>
-          <w:bookmarkEnd w:id="43"/>
+          <w:bookmarkEnd w:id="44"/>
           <w:p/>
         </w:tc>
       </w:tr>
@@ -10062,7 +10130,7 @@
         <w:t xml:space="preserve">to represent discrete-valued exposures.</w:t>
       </w:r>
     </w:p>
-    <w:bookmarkStart w:id="45" w:name="def-event-rate"/>
+    <w:bookmarkStart w:id="46" w:name="def-event-rate"/>
     <w:p>
       <w:pPr>
         <w:pStyle w:val="BodyText"/>
@@ -10180,7 +10248,7 @@
       <w:pPr>
         <w:pStyle w:val="BodyText"/>
       </w:pPr>
-      <w:bookmarkStart w:id="44" w:name="eq-def-event-rate"/>
+      <w:bookmarkStart w:id="45" w:name="eq-def-event-rate"/>
       <m:oMathPara>
         <m:oMathParaPr>
           <m:jc m:val="center"/>
@@ -10265,9 +10333,9 @@
           </m:r>
         </m:oMath>
       </m:oMathPara>
-      <w:bookmarkEnd w:id="44"/>
+      <w:bookmarkEnd w:id="45"/>
     </w:p>
-    <w:bookmarkEnd w:id="45"/>
+    <w:bookmarkEnd w:id="46"/>
     <w:p>
       <w:pPr>
         <w:pStyle w:val="FirstParagraph"/>
@@ -10318,7 +10386,7 @@
       <w:r>
         <w:t xml:space="preserve"> </w:t>
       </w:r>
-      <w:hyperlink r:id="rId46">
+      <w:hyperlink r:id="rId47">
         <w:r>
           <w:rPr>
             <w:rStyle w:val="Hyperlink"/>
@@ -10330,7 +10398,7 @@
         <w:t xml:space="preserve">).</w:t>
       </w:r>
     </w:p>
-    <w:bookmarkStart w:id="48" w:name="thm-mean-vs-event-rate"/>
+    <w:bookmarkStart w:id="49" w:name="thm-mean-vs-event-rate"/>
     <w:p>
       <w:pPr>
         <w:pStyle w:val="BodyText"/>
@@ -10340,7 +10408,7 @@
           <w:b/>
           <w:bCs/>
         </w:rPr>
-        <w:t xml:space="preserve">Theorem 3 (Transformation function from event rate to mean)</w:t>
+        <w:t xml:space="preserve">Theorem 4 (Transformation function from event rate to mean)</w:t>
       </w:r>
       <w:r>
         <w:t xml:space="preserve"> </w:t>
@@ -10465,7 +10533,7 @@
       <w:pPr>
         <w:pStyle w:val="BodyText"/>
       </w:pPr>
-      <w:bookmarkStart w:id="47" w:name="eq-lambda-to-mu"/>
+      <w:bookmarkStart w:id="48" w:name="eq-lambda-to-mu"/>
       <m:oMathPara>
         <m:oMathParaPr>
           <m:jc m:val="center"/>
@@ -10512,9 +10580,9 @@
           </m:r>
         </m:oMath>
       </m:oMathPara>
-      <w:bookmarkEnd w:id="47"/>
+      <w:bookmarkEnd w:id="48"/>
     </w:p>
-    <w:bookmarkEnd w:id="48"/>
+    <w:bookmarkEnd w:id="49"/>
     <w:p>
       <w:pPr>
         <w:pStyle w:val="FirstParagraph"/>
@@ -10826,7 +10894,7 @@
         </m:oMath>
       </m:oMathPara>
     </w:p>
-    <w:bookmarkStart w:id="49" w:name="exm-mean-vs-event-rate"/>
+    <w:bookmarkStart w:id="50" w:name="exm-mean-vs-event-rate"/>
     <w:p>
       <w:pPr>
         <w:pStyle w:val="FirstParagraph"/>
@@ -10910,7 +10978,7 @@
           <w:rPr>
             <w:rStyle w:val="Hyperlink"/>
           </w:rPr>
-          <w:t xml:space="preserve">Theorem 3</w:t>
+          <w:t xml:space="preserve">Theorem 4</w:t>
         </w:r>
       </w:hyperlink>
       <w:r>
@@ -11107,8 +11175,8 @@
         </m:oMath>
       </m:oMathPara>
     </w:p>
-    <w:bookmarkEnd w:id="49"/>
-    <w:bookmarkStart w:id="50" w:name="thm-non-exposed"/>
+    <w:bookmarkEnd w:id="50"/>
+    <w:bookmarkStart w:id="51" w:name="thm-non-exposed"/>
     <w:p>
       <w:pPr>
         <w:pStyle w:val="FirstParagraph"/>
@@ -11118,7 +11186,7 @@
           <w:b/>
           <w:bCs/>
         </w:rPr>
-        <w:t xml:space="preserve">Theorem 4 (No exposure means no expected events)</w:t>
+        <w:t xml:space="preserve">Theorem 5 (No exposure means no expected events)</w:t>
       </w:r>
       <w:r>
         <w:t xml:space="preserve"> </w:t>
@@ -11351,7 +11419,7 @@
         </m:oMath>
       </m:oMathPara>
     </w:p>
-    <w:bookmarkEnd w:id="50"/>
+    <w:bookmarkEnd w:id="51"/>
     <w:p>
       <w:pPr>
         <w:pStyle w:val="FirstParagraph"/>
@@ -11783,7 +11851,7 @@
         <w:t xml:space="preserve">.</w:t>
       </w:r>
     </w:p>
-    <w:bookmarkStart w:id="51" w:name="exm-non-exposed"/>
+    <w:bookmarkStart w:id="52" w:name="exm-non-exposed"/>
     <w:p>
       <w:pPr>
         <w:pStyle w:val="BodyText"/>
@@ -11894,7 +11962,7 @@
         <w:t xml:space="preserve">.</w:t>
       </w:r>
     </w:p>
-    <w:bookmarkEnd w:id="51"/>
+    <w:bookmarkEnd w:id="52"/>
     <w:tbl>
       <w:tblPr>
         <w:tblStyle w:val="Table"/>
@@ -11936,18 +12004,18 @@
                 <wp:inline>
                   <wp:extent cx="152400" cy="152400"/>
                   <wp:effectExtent b="0" l="0" r="0" t="0"/>
-                  <wp:docPr descr="" title="" id="53" name="Picture"/>
+                  <wp:docPr descr="" title="" id="54" name="Picture"/>
                   <a:graphic>
                     <a:graphicData uri="http://schemas.openxmlformats.org/drawingml/2006/picture">
                       <pic:pic>
                         <pic:nvPicPr>
-                          <pic:cNvPr descr="/opt/quarto/share/formats/docx/important.png" id="54" name="Picture"/>
+                          <pic:cNvPr descr="/opt/quarto/share/formats/docx/important.png" id="55" name="Picture"/>
                           <pic:cNvPicPr>
                             <a:picLocks noChangeArrowheads="1" noChangeAspect="1"/>
                           </pic:cNvPicPr>
                         </pic:nvPicPr>
                         <pic:blipFill>
-                          <a:blip r:embed="rId52"/>
+                          <a:blip r:embed="rId53"/>
                           <a:stretch>
                             <a:fillRect/>
                           </a:stretch>
@@ -12219,7 +12287,7 @@
             <w:r>
               <w:t xml:space="preserve"> </w:t>
             </w:r>
-            <w:hyperlink r:id="rId46">
+            <w:hyperlink r:id="rId47">
               <w:r>
                 <w:rPr>
                   <w:rStyle w:val="Hyperlink"/>
@@ -12235,7 +12303,7 @@
         </w:tc>
       </w:tr>
     </w:tbl>
-    <w:bookmarkStart w:id="55" w:name="thm-exposure-log-scale"/>
+    <w:bookmarkStart w:id="56" w:name="thm-exposure-log-scale"/>
     <w:p>
       <w:pPr>
         <w:pStyle w:val="BodyText"/>
@@ -12245,7 +12313,7 @@
           <w:b/>
           <w:bCs/>
         </w:rPr>
-        <w:t xml:space="preserve">Theorem 5 (Exposure is additive on the log scale)</w:t>
+        <w:t xml:space="preserve">Theorem 6 (Exposure is additive on the log scale)</w:t>
       </w:r>
       <w:r>
         <w:t xml:space="preserve"> </w:t>
@@ -12380,7 +12448,7 @@
         </m:oMath>
       </m:oMathPara>
     </w:p>
-    <w:bookmarkEnd w:id="55"/>
+    <w:bookmarkEnd w:id="56"/>
     <w:p>
       <w:pPr>
         <w:pStyle w:val="FirstParagraph"/>
@@ -12566,7 +12634,7 @@
         </m:oMath>
       </m:oMathPara>
     </w:p>
-    <w:bookmarkStart w:id="56" w:name="exm-exposure-log-scale"/>
+    <w:bookmarkStart w:id="57" w:name="exm-exposure-log-scale"/>
     <w:p>
       <w:pPr>
         <w:pStyle w:val="FirstParagraph"/>
@@ -12905,8 +12973,8 @@
         <w:t xml:space="preserve">expected events.</w:t>
       </w:r>
     </w:p>
-    <w:bookmarkEnd w:id="56"/>
-    <w:bookmarkStart w:id="57" w:name="def-offset"/>
+    <w:bookmarkEnd w:id="57"/>
+    <w:bookmarkStart w:id="58" w:name="def-offset"/>
     <w:p>
       <w:pPr>
         <w:pStyle w:val="BodyText"/>
@@ -12972,7 +13040,7 @@
           <w:rPr>
             <w:rStyle w:val="Hyperlink"/>
           </w:rPr>
-          <w:t xml:space="preserve">Theorem 5</w:t>
+          <w:t xml:space="preserve">Theorem 6</w:t>
         </w:r>
       </w:hyperlink>
       <w:r>
@@ -13089,7 +13157,7 @@
         <w:t xml:space="preserve">with no unknown coefficient to estimate.</w:t>
       </w:r>
     </w:p>
-    <w:bookmarkEnd w:id="57"/>
+    <w:bookmarkEnd w:id="58"/>
     <w:p>
       <w:pPr>
         <w:pStyle w:val="BodyText"/>
@@ -13179,7 +13247,7 @@
       <w:r>
         <w:t xml:space="preserve"> </w:t>
       </w:r>
-      <w:hyperlink r:id="rId46">
+      <w:hyperlink r:id="rId47">
         <w:r>
           <w:rPr>
             <w:rStyle w:val="Hyperlink"/>
@@ -13191,7 +13259,7 @@
         <w:t xml:space="preserve">).</w:t>
       </w:r>
     </w:p>
-    <w:bookmarkStart w:id="58" w:name="exm-offset"/>
+    <w:bookmarkStart w:id="59" w:name="exm-offset"/>
     <w:p>
       <w:pPr>
         <w:pStyle w:val="BodyText"/>
@@ -13427,8 +13495,8 @@
         <w:t xml:space="preserve">at the same event rate.</w:t>
       </w:r>
     </w:p>
-    <w:bookmarkEnd w:id="58"/>
-    <w:bookmarkStart w:id="60" w:name="thm-sum-pois"/>
+    <w:bookmarkEnd w:id="59"/>
+    <w:bookmarkStart w:id="61" w:name="thm-sum-pois"/>
     <w:p>
       <w:pPr>
         <w:pStyle w:val="BodyText"/>
@@ -13438,7 +13506,7 @@
           <w:b/>
           <w:bCs/>
         </w:rPr>
-        <w:t xml:space="preserve">Theorem 6 (Sum of independent Poisson random variables)</w:t>
+        <w:t xml:space="preserve">Theorem 7 (Sum of independent Poisson random variables)</w:t>
       </w:r>
       <w:r>
         <w:t xml:space="preserve"> </w:t>
@@ -13477,7 +13545,7 @@
       <w:r>
         <w:t xml:space="preserve"> </w:t>
       </w:r>
-      <w:hyperlink r:id="rId59">
+      <w:hyperlink r:id="rId60">
         <w:r>
           <w:rPr>
             <w:rStyle w:val="Hyperlink"/>
@@ -13620,7 +13688,7 @@
         <w:t xml:space="preserve">.</w:t>
       </w:r>
     </w:p>
-    <w:bookmarkEnd w:id="60"/>
+    <w:bookmarkEnd w:id="61"/>
     <w:p>
       <w:pPr>
         <w:pStyle w:val="BodyText"/>
@@ -15092,7 +15160,7 @@
       <w:r>
         <w:t xml:space="preserve"> </w:t>
       </w:r>
-      <w:hyperlink r:id="rId61">
+      <w:hyperlink r:id="rId62">
         <w:r>
           <w:rPr>
             <w:rStyle w:val="Hyperlink"/>
@@ -15104,7 +15172,7 @@
         <w:t xml:space="preserve">, Example 3).</w:t>
       </w:r>
     </w:p>
-    <w:bookmarkStart w:id="62" w:name="exm-sum-pois"/>
+    <w:bookmarkStart w:id="63" w:name="exm-sum-pois"/>
     <w:p>
       <w:pPr>
         <w:pStyle w:val="BodyText"/>
@@ -15260,7 +15328,7 @@
           <w:rPr>
             <w:rStyle w:val="Hyperlink"/>
           </w:rPr>
-          <w:t xml:space="preserve">Theorem 6</w:t>
+          <w:t xml:space="preserve">Theorem 7</w:t>
         </w:r>
       </w:hyperlink>
       <w:r>
@@ -15523,9 +15591,9 @@
         </m:oMath>
       </m:oMathPara>
     </w:p>
-    <w:bookmarkEnd w:id="62"/>
     <w:bookmarkEnd w:id="63"/>
-    <w:bookmarkStart w:id="70" w:name="sec-nb-dist"/>
+    <w:bookmarkEnd w:id="64"/>
+    <w:bookmarkStart w:id="71" w:name="sec-nb-dist"/>
     <w:p>
       <w:pPr>
         <w:pStyle w:val="Heading2"/>
@@ -15534,7 +15602,7 @@
         <w:t xml:space="preserve">3 The Negative-Binomial distribution</w:t>
       </w:r>
     </w:p>
-    <w:bookmarkStart w:id="64" w:name="def-nb"/>
+    <w:bookmarkStart w:id="65" w:name="def-nb"/>
     <w:p>
       <w:pPr>
         <w:pStyle w:val="FirstParagraph"/>
@@ -16112,8 +16180,8 @@
         <w:t xml:space="preserve">.</w:t>
       </w:r>
     </w:p>
-    <w:bookmarkEnd w:id="64"/>
-    <w:bookmarkStart w:id="65" w:name="thm-nb-poisson-limit"/>
+    <w:bookmarkEnd w:id="65"/>
+    <w:bookmarkStart w:id="66" w:name="thm-nb-poisson-limit"/>
     <w:p>
       <w:pPr>
         <w:pStyle w:val="BodyText"/>
@@ -16123,7 +16191,7 @@
           <w:b/>
           <w:bCs/>
         </w:rPr>
-        <w:t xml:space="preserve">Theorem 7 (The negative binomial converges to the Poisson)</w:t>
+        <w:t xml:space="preserve">Theorem 8 (The negative binomial converges to the Poisson)</w:t>
       </w:r>
       <w:r>
         <w:t xml:space="preserve"> </w:t>
@@ -16475,7 +16543,7 @@
         </m:oMath>
       </m:oMathPara>
     </w:p>
-    <w:bookmarkEnd w:id="65"/>
+    <w:bookmarkEnd w:id="66"/>
     <w:p>
       <w:pPr>
         <w:pStyle w:val="FirstParagraph"/>
@@ -18749,7 +18817,7 @@
         <w:t xml:space="preserve">PMF.</w:t>
       </w:r>
     </w:p>
-    <w:bookmarkStart w:id="66" w:name="thm-nb"/>
+    <w:bookmarkStart w:id="67" w:name="thm-nb"/>
     <w:p>
       <w:pPr>
         <w:pStyle w:val="BodyText"/>
@@ -18759,7 +18827,7 @@
           <w:b/>
           <w:bCs/>
         </w:rPr>
-        <w:t xml:space="preserve">Theorem 8 (Mean and variance of the negative binomial distribution)</w:t>
+        <w:t xml:space="preserve">Theorem 9 (Mean and variance of the negative binomial distribution)</w:t>
       </w:r>
       <w:r>
         <w:t xml:space="preserve"> </w:t>
@@ -18820,7 +18888,7 @@
         <w:pStyle w:val="Compact"/>
         <w:numPr>
           <w:ilvl w:val="0"/>
-          <w:numId w:val="1004"/>
+          <w:numId w:val="1005"/>
         </w:numPr>
       </w:pPr>
       <m:oMath>
@@ -18864,7 +18932,7 @@
         <w:pStyle w:val="Compact"/>
         <w:numPr>
           <w:ilvl w:val="0"/>
-          <w:numId w:val="1004"/>
+          <w:numId w:val="1005"/>
         </w:numPr>
       </w:pPr>
       <m:oMath>
@@ -18946,7 +19014,7 @@
         <w:t xml:space="preserve">​</w:t>
       </w:r>
     </w:p>
-    <w:bookmarkEnd w:id="66"/>
+    <w:bookmarkEnd w:id="67"/>
     <w:p>
       <w:pPr>
         <w:pStyle w:val="FirstParagraph"/>
@@ -20909,7 +20977,7 @@
       <w:r>
         <w:t xml:space="preserve"> </w:t>
       </w:r>
-      <w:hyperlink r:id="rId67">
+      <w:hyperlink r:id="rId68">
         <w:r>
           <w:rPr>
             <w:rStyle w:val="Hyperlink"/>
@@ -20926,7 +20994,7 @@
       <w:r>
         <w:t xml:space="preserve"> </w:t>
       </w:r>
-      <w:hyperlink r:id="rId68">
+      <w:hyperlink r:id="rId69">
         <w:r>
           <w:rPr>
             <w:rStyle w:val="Hyperlink"/>
@@ -21891,7 +21959,7 @@
         <w:t xml:space="preserve">.</w:t>
       </w:r>
     </w:p>
-    <w:bookmarkStart w:id="69" w:name="exm-nb"/>
+    <w:bookmarkStart w:id="70" w:name="exm-nb"/>
     <w:p>
       <w:pPr>
         <w:pStyle w:val="BodyText"/>
@@ -22084,9 +22152,9 @@
         <w:t xml:space="preserve">count with the same mean.</w:t>
       </w:r>
     </w:p>
-    <w:bookmarkEnd w:id="69"/>
     <w:bookmarkEnd w:id="70"/>
-    <w:bookmarkStart w:id="82" w:name="sec-laplace"/>
+    <w:bookmarkEnd w:id="71"/>
+    <w:bookmarkStart w:id="83" w:name="sec-laplace"/>
     <w:p>
       <w:pPr>
         <w:pStyle w:val="Heading2"/>
@@ -22095,7 +22163,7 @@
         <w:t xml:space="preserve">4 The Laplace distribution</w:t>
       </w:r>
     </w:p>
-    <w:bookmarkStart w:id="73" w:name="def-laplace"/>
+    <w:bookmarkStart w:id="74" w:name="def-laplace"/>
     <w:p>
       <w:pPr>
         <w:pStyle w:val="FirstParagraph"/>
@@ -22270,7 +22338,7 @@
       <w:r>
         <w:t xml:space="preserve"> </w:t>
       </w:r>
-      <w:hyperlink r:id="rId71">
+      <w:hyperlink r:id="rId72">
         <w:r>
           <w:rPr>
             <w:rStyle w:val="Hyperlink"/>
@@ -22286,7 +22354,7 @@
       <w:pPr>
         <w:pStyle w:val="BodyText"/>
       </w:pPr>
-      <w:bookmarkStart w:id="72" w:name="eq-laplace-pdf"/>
+      <w:bookmarkStart w:id="73" w:name="eq-laplace-pdf"/>
       <m:oMathPara>
         <m:oMathParaPr>
           <m:jc m:val="center"/>
@@ -22463,9 +22531,9 @@
           </m:r>
         </m:oMath>
       </m:oMathPara>
-      <w:bookmarkEnd w:id="72"/>
+      <w:bookmarkEnd w:id="73"/>
     </w:p>
-    <w:bookmarkEnd w:id="73"/>
+    <w:bookmarkEnd w:id="74"/>
     <w:p>
       <w:pPr>
         <w:pStyle w:val="FirstParagraph"/>
@@ -22627,7 +22695,7 @@
         <w:t xml:space="preserve">and decays more slowly in the tails.</w:t>
       </w:r>
     </w:p>
-    <w:bookmarkStart w:id="74" w:name="exm-laplace-density"/>
+    <w:bookmarkStart w:id="75" w:name="exm-laplace-density"/>
     <w:p>
       <w:pPr>
         <w:pStyle w:val="BodyText"/>
@@ -23373,8 +23441,8 @@
         <w:t xml:space="preserve">.</w:t>
       </w:r>
     </w:p>
-    <w:bookmarkEnd w:id="74"/>
-    <w:bookmarkStart w:id="76" w:name="thm-laplace-moments"/>
+    <w:bookmarkEnd w:id="75"/>
+    <w:bookmarkStart w:id="77" w:name="thm-laplace-moments"/>
     <w:p>
       <w:pPr>
         <w:pStyle w:val="BodyText"/>
@@ -23384,7 +23452,7 @@
           <w:b/>
           <w:bCs/>
         </w:rPr>
-        <w:t xml:space="preserve">Theorem 9 (Mean and variance of the Laplace distribution)</w:t>
+        <w:t xml:space="preserve">Theorem 10 (Mean and variance of the Laplace distribution)</w:t>
       </w:r>
       <w:r>
         <w:t xml:space="preserve"> </w:t>
@@ -23462,7 +23530,7 @@
       <w:pPr>
         <w:pStyle w:val="BodyText"/>
       </w:pPr>
-      <w:bookmarkStart w:id="75" w:name="eq-laplace-moments"/>
+      <w:bookmarkStart w:id="76" w:name="eq-laplace-moments"/>
       <m:oMathPara>
         <m:oMathParaPr>
           <m:jc m:val="center"/>
@@ -23587,9 +23655,9 @@
           </m:r>
         </m:oMath>
       </m:oMathPara>
-      <w:bookmarkEnd w:id="75"/>
+      <w:bookmarkEnd w:id="76"/>
     </w:p>
-    <w:bookmarkEnd w:id="76"/>
+    <w:bookmarkEnd w:id="77"/>
     <w:p>
       <w:pPr>
         <w:pStyle w:val="FirstParagraph"/>
@@ -24878,7 +24946,7 @@
         </m:oMath>
       </m:oMathPara>
     </w:p>
-    <w:bookmarkStart w:id="81" w:name="exm-laplace-vs-normal"/>
+    <w:bookmarkStart w:id="82" w:name="exm-laplace-vs-normal"/>
     <w:p>
       <w:pPr>
         <w:pStyle w:val="FirstParagraph"/>
@@ -24981,7 +25049,7 @@
           <w:rPr>
             <w:rStyle w:val="Hyperlink"/>
           </w:rPr>
-          <w:t xml:space="preserve">Theorem 9</w:t>
+          <w:t xml:space="preserve">Theorem 10</w:t>
         </w:r>
       </w:hyperlink>
       <w:r>
@@ -25875,7 +25943,7 @@
       <w:tr>
         <w:tc>
           <w:tcPr/>
-          <w:bookmarkStart w:id="80" w:name="fig-laplace-vs-normal"/>
+          <w:bookmarkStart w:id="81" w:name="fig-laplace-vs-normal"/>
           <w:p>
             <w:pPr>
               <w:pStyle w:val="Compact"/>
@@ -25886,18 +25954,18 @@
                 <wp:inline>
                   <wp:extent cx="4620126" cy="3696101"/>
                   <wp:effectExtent b="0" l="0" r="0" t="0"/>
-                  <wp:docPr descr="" title="" id="78" name="Picture"/>
+                  <wp:docPr descr="" title="" id="79" name="Picture"/>
                   <a:graphic>
                     <a:graphicData uri="http://schemas.openxmlformats.org/drawingml/2006/picture">
                       <pic:pic>
                         <pic:nvPicPr>
-                          <pic:cNvPr descr="distributions_files/figure-docx/fig-laplace-vs-normal-1.png" id="79" name="Picture"/>
+                          <pic:cNvPr descr="distributions_files/figure-docx/fig-laplace-vs-normal-1.png" id="80" name="Picture"/>
                           <pic:cNvPicPr>
                             <a:picLocks noChangeArrowheads="1" noChangeAspect="1"/>
                           </pic:cNvPicPr>
                         </pic:nvPicPr>
                         <pic:blipFill>
-                          <a:blip r:embed="rId77"/>
+                          <a:blip r:embed="rId78"/>
                           <a:stretch>
                             <a:fillRect/>
                           </a:stretch>
@@ -25937,7 +26005,7 @@
               <w:t xml:space="preserve">Figure 3: Laplace and standard normal densities with the same mean (0) and variance (1)</w:t>
             </w:r>
           </w:p>
-          <w:bookmarkEnd w:id="80"/>
+          <w:bookmarkEnd w:id="81"/>
         </w:tc>
       </w:tr>
     </w:tbl>
@@ -26356,9 +26424,9 @@
         <w:t xml:space="preserve">standard deviations as the normal distribution does.</w:t>
       </w:r>
     </w:p>
-    <w:bookmarkEnd w:id="81"/>
     <w:bookmarkEnd w:id="82"/>
-    <w:bookmarkStart w:id="93" w:name="sec-weibull"/>
+    <w:bookmarkEnd w:id="83"/>
+    <w:bookmarkStart w:id="95" w:name="sec-weibull"/>
     <w:p>
       <w:pPr>
         <w:pStyle w:val="Heading2"/>
@@ -26367,7 +26435,7 @@
         <w:t xml:space="preserve">5 Weibull distribution</w:t>
       </w:r>
     </w:p>
-    <w:bookmarkStart w:id="84" w:name="def-weibull"/>
+    <w:bookmarkStart w:id="85" w:name="def-weibull"/>
     <w:p>
       <w:pPr>
         <w:pStyle w:val="FirstParagraph"/>
@@ -26464,7 +26532,7 @@
       <w:r>
         <w:t xml:space="preserve"> </w:t>
       </w:r>
-      <w:hyperlink r:id="rId83">
+      <w:hyperlink r:id="rId84">
         <w:r>
           <w:rPr>
             <w:rStyle w:val="Hyperlink"/>
@@ -26586,8 +26654,8 @@
         </m:oMath>
       </m:oMathPara>
     </w:p>
-    <w:bookmarkEnd w:id="84"/>
-    <w:bookmarkStart w:id="85" w:name="thm-weibull"/>
+    <w:bookmarkEnd w:id="85"/>
+    <w:bookmarkStart w:id="86" w:name="thm-weibull"/>
     <w:p>
       <w:pPr>
         <w:pStyle w:val="FirstParagraph"/>
@@ -26597,7 +26665,7 @@
           <w:b/>
           <w:bCs/>
         </w:rPr>
-        <w:t xml:space="preserve">Theorem 10 (Weibull density, hazard, and mean)</w:t>
+        <w:t xml:space="preserve">Theorem 11 (Weibull density and hazard)</w:t>
       </w:r>
       <w:r>
         <w:t xml:space="preserve"> </w:t>
@@ -26824,119 +26892,11 @@
                 </m:sup>
               </m:sSup>
             </m:e>
-            <m:e>
-              <m:r>
-                <m:rPr>
-                  <m:sty m:val="p"/>
-                </m:rPr>
-                <m:t>E</m:t>
-              </m:r>
-              <m:r>
-                <m:t>​</m:t>
-              </m:r>
-              <m:d>
-                <m:dPr>
-                  <m:begChr m:val="["/>
-                  <m:sepChr m:val=""/>
-                  <m:endChr m:val="]"/>
-                  <m:grow/>
-                </m:dPr>
-                <m:e>
-                  <m:r>
-                    <m:t>T</m:t>
-                  </m:r>
-                </m:e>
-              </m:d>
-              <m:r>
-                <m:t>​</m:t>
-              </m:r>
-              <m:r>
-                <m:t>&amp;</m:t>
-              </m:r>
-              <m:r>
-                <m:rPr>
-                  <m:sty m:val="p"/>
-                </m:rPr>
-                <m:t>=</m:t>
-              </m:r>
-              <m:r>
-                <m:rPr>
-                  <m:sty m:val="p"/>
-                </m:rPr>
-                <m:t>Γ</m:t>
-              </m:r>
-              <m:r>
-                <m:rPr>
-                  <m:sty m:val="p"/>
-                </m:rPr>
-                <m:t>(</m:t>
-              </m:r>
-              <m:r>
-                <m:t>1</m:t>
-              </m:r>
-              <m:r>
-                <m:rPr>
-                  <m:sty m:val="p"/>
-                </m:rPr>
-                <m:t>+</m:t>
-              </m:r>
-              <m:r>
-                <m:t>1</m:t>
-              </m:r>
-              <m:r>
-                <m:rPr>
-                  <m:sty m:val="p"/>
-                </m:rPr>
-                <m:t>/</m:t>
-              </m:r>
-              <m:r>
-                <m:t>α</m:t>
-              </m:r>
-              <m:r>
-                <m:rPr>
-                  <m:sty m:val="p"/>
-                </m:rPr>
-                <m:t>)</m:t>
-              </m:r>
-              <m:r>
-                <m:rPr>
-                  <m:sty m:val="p"/>
-                </m:rPr>
-                <m:t>⋅</m:t>
-              </m:r>
-              <m:sSup>
-                <m:e>
-                  <m:r>
-                    <m:t>λ</m:t>
-                  </m:r>
-                </m:e>
-                <m:sup>
-                  <m:r>
-                    <m:rPr>
-                      <m:sty m:val="p"/>
-                    </m:rPr>
-                    <m:t>−</m:t>
-                  </m:r>
-                  <m:r>
-                    <m:t>1</m:t>
-                  </m:r>
-                  <m:r>
-                    <m:rPr>
-                      <m:sty m:val="p"/>
-                    </m:rPr>
-                    <m:t>/</m:t>
-                  </m:r>
-                  <m:r>
-                    <m:t>α</m:t>
-                  </m:r>
-                </m:sup>
-              </m:sSup>
-            </m:e>
           </m:eqArr>
         </m:oMath>
       </m:oMathPara>
     </w:p>
-    <w:bookmarkEnd w:id="85"/>
+    <w:bookmarkEnd w:id="86"/>
     <w:p>
       <w:pPr>
         <w:pStyle w:val="FirstParagraph"/>
@@ -27033,7 +26993,7 @@
       <w:r>
         <w:t xml:space="preserve">(</w:t>
       </w:r>
-      <w:hyperlink r:id="rId86">
+      <w:hyperlink r:id="rId87">
         <w:r>
           <w:rPr>
             <w:rStyle w:val="Hyperlink"/>
@@ -27313,7 +27273,7 @@
       <w:r>
         <w:t xml:space="preserve">(</w:t>
       </w:r>
-      <w:hyperlink r:id="rId87">
+      <w:hyperlink r:id="rId88">
         <w:r>
           <w:rPr>
             <w:rStyle w:val="Hyperlink"/>
@@ -27412,7 +27372,7 @@
       <w:r>
         <w:t xml:space="preserve">(</w:t>
       </w:r>
-      <w:hyperlink r:id="rId88">
+      <w:hyperlink r:id="rId89">
         <w:r>
           <w:rPr>
             <w:rStyle w:val="Hyperlink"/>
@@ -27902,12 +27862,289 @@
         <w:pStyle w:val="FirstParagraph"/>
       </w:pPr>
       <w:r>
+        <w:rPr>
+          <w:i/>
+          <w:iCs/>
+        </w:rPr>
+        <w:t xml:space="preserve">Remark</w:t>
+      </w:r>
+      <w:r>
+        <w:t xml:space="preserve">. </w:t>
+      </w:r>
+      <w:r>
+        <w:t xml:space="preserve">The hazard is written</w:t>
+      </w:r>
+      <w:r>
+        <w:t xml:space="preserve"> </w:t>
+      </w:r>
+      <m:oMath>
+        <m:r>
+          <m:rPr>
+            <m:sty m:val="p"/>
+          </m:rPr>
+          <m:t>h</m:t>
+        </m:r>
+        <m:r>
+          <m:rPr>
+            <m:sty m:val="p"/>
+          </m:rPr>
+          <m:t>(</m:t>
+        </m:r>
+        <m:r>
+          <m:t>t</m:t>
+        </m:r>
+        <m:r>
+          <m:rPr>
+            <m:sty m:val="p"/>
+          </m:rPr>
+          <m:t>)</m:t>
+        </m:r>
+      </m:oMath>
+      <w:r>
+        <w:t xml:space="preserve"> </w:t>
+      </w:r>
+      <w:r>
+        <w:t xml:space="preserve">here, rather than</w:t>
+      </w:r>
+      <w:r>
+        <w:t xml:space="preserve"> </w:t>
+      </w:r>
+      <m:oMath>
+        <m:r>
+          <m:t>λ</m:t>
+        </m:r>
+        <m:r>
+          <m:rPr>
+            <m:sty m:val="p"/>
+          </m:rPr>
+          <m:t>(</m:t>
+        </m:r>
+        <m:r>
+          <m:t>t</m:t>
+        </m:r>
+        <m:r>
+          <m:rPr>
+            <m:sty m:val="p"/>
+          </m:rPr>
+          <m:t>)</m:t>
+        </m:r>
+      </m:oMath>
+      <w:r>
+        <w:t xml:space="preserve">,</w:t>
+      </w:r>
+      <w:r>
+        <w:t xml:space="preserve"> </w:t>
+      </w:r>
+      <w:r>
+        <w:t xml:space="preserve">because the Weibull rate parameter is also called</w:t>
+      </w:r>
+      <w:r>
+        <w:t xml:space="preserve"> </w:t>
+      </w:r>
+      <m:oMath>
+        <m:r>
+          <m:t>λ</m:t>
+        </m:r>
+      </m:oMath>
+      <w:r>
+        <w:t xml:space="preserve">.</w:t>
+      </w:r>
+    </w:p>
+    <w:bookmarkStart w:id="90" w:name="thm-weibull-mean"/>
+    <w:p>
+      <w:pPr>
+        <w:pStyle w:val="BodyText"/>
+      </w:pPr>
+      <w:r>
+        <w:rPr>
+          <w:b/>
+          <w:bCs/>
+        </w:rPr>
+        <w:t xml:space="preserve">Theorem 12 (Weibull mean)</w:t>
+      </w:r>
+      <w:r>
+        <w:t xml:space="preserve"> </w:t>
+      </w:r>
+      <w:r>
+        <w:t xml:space="preserve">If</w:t>
+      </w:r>
+      <w:r>
+        <w:t xml:space="preserve"> </w:t>
+      </w:r>
+      <m:oMath>
+        <m:r>
+          <m:t>T</m:t>
+        </m:r>
+      </m:oMath>
+      <w:r>
+        <w:t xml:space="preserve"> </w:t>
+      </w:r>
+      <w:r>
+        <w:t xml:space="preserve">has the Weibull distribution with shape</w:t>
+      </w:r>
+      <w:r>
+        <w:t xml:space="preserve"> </w:t>
+      </w:r>
+      <m:oMath>
+        <m:r>
+          <m:t>α</m:t>
+        </m:r>
+      </m:oMath>
+      <w:r>
+        <w:t xml:space="preserve"> </w:t>
+      </w:r>
+      <w:r>
+        <w:t xml:space="preserve">and rate</w:t>
+      </w:r>
+      <w:r>
+        <w:t xml:space="preserve"> </w:t>
+      </w:r>
+      <m:oMath>
+        <m:r>
+          <m:t>λ</m:t>
+        </m:r>
+      </m:oMath>
+      <w:r>
+        <w:t xml:space="preserve">, then:</w:t>
+      </w:r>
+    </w:p>
+    <w:p>
+      <w:pPr>
+        <w:pStyle w:val="BodyText"/>
+      </w:pPr>
+      <m:oMathPara>
+        <m:oMathParaPr>
+          <m:jc m:val="center"/>
+        </m:oMathParaPr>
+        <m:oMath>
+          <m:r>
+            <m:rPr>
+              <m:sty m:val="p"/>
+            </m:rPr>
+            <m:t>E</m:t>
+          </m:r>
+          <m:r>
+            <m:t>​</m:t>
+          </m:r>
+          <m:d>
+            <m:dPr>
+              <m:begChr m:val="["/>
+              <m:sepChr m:val=""/>
+              <m:endChr m:val="]"/>
+              <m:grow/>
+            </m:dPr>
+            <m:e>
+              <m:r>
+                <m:t>T</m:t>
+              </m:r>
+            </m:e>
+          </m:d>
+          <m:r>
+            <m:t>​</m:t>
+          </m:r>
+          <m:r>
+            <m:rPr>
+              <m:sty m:val="p"/>
+            </m:rPr>
+            <m:t>=</m:t>
+          </m:r>
+          <m:r>
+            <m:rPr>
+              <m:sty m:val="p"/>
+            </m:rPr>
+            <m:t>Γ</m:t>
+          </m:r>
+          <m:r>
+            <m:rPr>
+              <m:sty m:val="p"/>
+            </m:rPr>
+            <m:t>(</m:t>
+          </m:r>
+          <m:r>
+            <m:t>1</m:t>
+          </m:r>
+          <m:r>
+            <m:rPr>
+              <m:sty m:val="p"/>
+            </m:rPr>
+            <m:t>+</m:t>
+          </m:r>
+          <m:r>
+            <m:t>1</m:t>
+          </m:r>
+          <m:r>
+            <m:rPr>
+              <m:sty m:val="p"/>
+            </m:rPr>
+            <m:t>/</m:t>
+          </m:r>
+          <m:r>
+            <m:t>α</m:t>
+          </m:r>
+          <m:r>
+            <m:rPr>
+              <m:sty m:val="p"/>
+            </m:rPr>
+            <m:t>)</m:t>
+          </m:r>
+          <m:r>
+            <m:rPr>
+              <m:sty m:val="p"/>
+            </m:rPr>
+            <m:t>⋅</m:t>
+          </m:r>
+          <m:sSup>
+            <m:e>
+              <m:r>
+                <m:t>λ</m:t>
+              </m:r>
+            </m:e>
+            <m:sup>
+              <m:r>
+                <m:rPr>
+                  <m:sty m:val="p"/>
+                </m:rPr>
+                <m:t>−</m:t>
+              </m:r>
+              <m:r>
+                <m:t>1</m:t>
+              </m:r>
+              <m:r>
+                <m:rPr>
+                  <m:sty m:val="p"/>
+                </m:rPr>
+                <m:t>/</m:t>
+              </m:r>
+              <m:r>
+                <m:t>α</m:t>
+              </m:r>
+            </m:sup>
+          </m:sSup>
+        </m:oMath>
+      </m:oMathPara>
+    </w:p>
+    <w:bookmarkEnd w:id="90"/>
+    <w:p>
+      <w:pPr>
+        <w:pStyle w:val="FirstParagraph"/>
+      </w:pPr>
+      <w:r>
+        <w:rPr>
+          <w:i/>
+          <w:iCs/>
+        </w:rPr>
+        <w:t xml:space="preserve">Proof</w:t>
+      </w:r>
+      <w:r>
+        <w:t xml:space="preserve">. </w:t>
+      </w:r>
+      <w:r>
         <w:t xml:space="preserve">For the mean, use the</w:t>
       </w:r>
       <w:r>
         <w:t xml:space="preserve"> </w:t>
       </w:r>
-      <w:hyperlink r:id="rId89">
+      <w:hyperlink r:id="rId91">
         <w:r>
           <w:rPr>
             <w:rStyle w:val="Hyperlink"/>
@@ -28722,103 +28959,10 @@
         </m:oMath>
       </m:oMathPara>
     </w:p>
+    <w:bookmarkStart w:id="92" w:name="cor-weibull-exponential"/>
     <w:p>
       <w:pPr>
         <w:pStyle w:val="FirstParagraph"/>
-      </w:pPr>
-      <w:r>
-        <w:rPr>
-          <w:i/>
-          <w:iCs/>
-        </w:rPr>
-        <w:t xml:space="preserve">Remark</w:t>
-      </w:r>
-      <w:r>
-        <w:t xml:space="preserve">. </w:t>
-      </w:r>
-      <w:r>
-        <w:t xml:space="preserve">The hazard is written</w:t>
-      </w:r>
-      <w:r>
-        <w:t xml:space="preserve"> </w:t>
-      </w:r>
-      <m:oMath>
-        <m:r>
-          <m:rPr>
-            <m:sty m:val="p"/>
-          </m:rPr>
-          <m:t>h</m:t>
-        </m:r>
-        <m:r>
-          <m:rPr>
-            <m:sty m:val="p"/>
-          </m:rPr>
-          <m:t>(</m:t>
-        </m:r>
-        <m:r>
-          <m:t>t</m:t>
-        </m:r>
-        <m:r>
-          <m:rPr>
-            <m:sty m:val="p"/>
-          </m:rPr>
-          <m:t>)</m:t>
-        </m:r>
-      </m:oMath>
-      <w:r>
-        <w:t xml:space="preserve"> </w:t>
-      </w:r>
-      <w:r>
-        <w:t xml:space="preserve">here, rather than</w:t>
-      </w:r>
-      <w:r>
-        <w:t xml:space="preserve"> </w:t>
-      </w:r>
-      <m:oMath>
-        <m:r>
-          <m:t>λ</m:t>
-        </m:r>
-        <m:r>
-          <m:rPr>
-            <m:sty m:val="p"/>
-          </m:rPr>
-          <m:t>(</m:t>
-        </m:r>
-        <m:r>
-          <m:t>t</m:t>
-        </m:r>
-        <m:r>
-          <m:rPr>
-            <m:sty m:val="p"/>
-          </m:rPr>
-          <m:t>)</m:t>
-        </m:r>
-      </m:oMath>
-      <w:r>
-        <w:t xml:space="preserve">,</w:t>
-      </w:r>
-      <w:r>
-        <w:t xml:space="preserve"> </w:t>
-      </w:r>
-      <w:r>
-        <w:t xml:space="preserve">because the Weibull rate parameter is also called</w:t>
-      </w:r>
-      <w:r>
-        <w:t xml:space="preserve"> </w:t>
-      </w:r>
-      <m:oMath>
-        <m:r>
-          <m:t>λ</m:t>
-        </m:r>
-      </m:oMath>
-      <w:r>
-        <w:t xml:space="preserve">.</w:t>
-      </w:r>
-    </w:p>
-    <w:bookmarkStart w:id="90" w:name="cor-weibull-exponential"/>
-    <w:p>
-      <w:pPr>
-        <w:pStyle w:val="BodyText"/>
       </w:pPr>
       <w:r>
         <w:rPr>
@@ -28947,7 +29091,7 @@
         <w:t xml:space="preserve">.</w:t>
       </w:r>
     </w:p>
-    <w:bookmarkEnd w:id="90"/>
+    <w:bookmarkEnd w:id="92"/>
     <w:p>
       <w:pPr>
         <w:pStyle w:val="BodyText"/>
@@ -28973,7 +29117,7 @@
           <w:rPr>
             <w:rStyle w:val="Hyperlink"/>
           </w:rPr>
-          <w:t xml:space="preserve">Theorem 10</w:t>
+          <w:t xml:space="preserve">Theorem 11</w:t>
         </w:r>
       </w:hyperlink>
       <w:r>
@@ -29530,7 +29674,7 @@
         <w:t xml:space="preserve">.</w:t>
       </w:r>
     </w:p>
-    <w:bookmarkStart w:id="91" w:name="cor-weibull-hazard-monotone"/>
+    <w:bookmarkStart w:id="93" w:name="cor-weibull-hazard-monotone"/>
     <w:p>
       <w:pPr>
         <w:pStyle w:val="BodyText"/>
@@ -29671,7 +29815,7 @@
         <w:pStyle w:val="Compact"/>
         <w:numPr>
           <w:ilvl w:val="0"/>
-          <w:numId w:val="1005"/>
+          <w:numId w:val="1006"/>
         </w:numPr>
       </w:pPr>
       <w:r>
@@ -29700,7 +29844,7 @@
         <w:pStyle w:val="Compact"/>
         <w:numPr>
           <w:ilvl w:val="0"/>
-          <w:numId w:val="1005"/>
+          <w:numId w:val="1006"/>
         </w:numPr>
       </w:pPr>
       <w:r>
@@ -29729,7 +29873,7 @@
         <w:pStyle w:val="Compact"/>
         <w:numPr>
           <w:ilvl w:val="0"/>
-          <w:numId w:val="1005"/>
+          <w:numId w:val="1006"/>
         </w:numPr>
       </w:pPr>
       <w:r>
@@ -29753,7 +29897,7 @@
         </m:r>
       </m:oMath>
     </w:p>
-    <w:bookmarkEnd w:id="91"/>
+    <w:bookmarkEnd w:id="93"/>
     <w:p>
       <w:pPr>
         <w:pStyle w:val="FirstParagraph"/>
@@ -29779,7 +29923,7 @@
           <w:rPr>
             <w:rStyle w:val="Hyperlink"/>
           </w:rPr>
-          <w:t xml:space="preserve">Theorem 10</w:t>
+          <w:t xml:space="preserve">Theorem 11</w:t>
         </w:r>
       </w:hyperlink>
       <w:r>
@@ -30381,7 +30525,7 @@
         <w:t xml:space="preserve">provides more flexibility than the exponential.</w:t>
       </w:r>
     </w:p>
-    <w:bookmarkStart w:id="92" w:name="exm-weibull"/>
+    <w:bookmarkStart w:id="94" w:name="exm-weibull"/>
     <w:p>
       <w:pPr>
         <w:pStyle w:val="BodyText"/>
@@ -30427,7 +30571,7 @@
           <w:rPr>
             <w:rStyle w:val="Hyperlink"/>
           </w:rPr>
-          <w:t xml:space="preserve">Theorem 10</w:t>
+          <w:t xml:space="preserve">Theorem 11</w:t>
         </w:r>
       </w:hyperlink>
       <w:r>
@@ -30851,9 +30995,9 @@
         </m:oMath>
       </m:oMathPara>
     </w:p>
-    <w:bookmarkEnd w:id="92"/>
-    <w:bookmarkEnd w:id="93"/>
-    <w:bookmarkStart w:id="129" w:name="sec-mvn"/>
+    <w:bookmarkEnd w:id="94"/>
+    <w:bookmarkEnd w:id="95"/>
+    <w:bookmarkStart w:id="133" w:name="sec-mvn"/>
     <w:p>
       <w:pPr>
         <w:pStyle w:val="Heading2"/>
@@ -30862,7 +31006,7 @@
         <w:t xml:space="preserve">6 The multivariate normal distribution</w:t>
       </w:r>
     </w:p>
-    <w:bookmarkStart w:id="97" w:name="def-mvn"/>
+    <w:bookmarkStart w:id="99" w:name="def-mvn"/>
     <w:p>
       <w:pPr>
         <w:pStyle w:val="FirstParagraph"/>
@@ -31114,7 +31258,7 @@
       <w:r>
         <w:t xml:space="preserve"> </w:t>
       </w:r>
-      <w:hyperlink r:id="rId94">
+      <w:hyperlink r:id="rId96">
         <w:r>
           <w:rPr>
             <w:rStyle w:val="Hyperlink"/>
@@ -31633,7 +31777,7 @@
       <w:r>
         <w:t xml:space="preserve"> </w:t>
       </w:r>
-      <w:hyperlink r:id="rId95">
+      <w:hyperlink r:id="rId97">
         <w:r>
           <w:rPr>
             <w:rStyle w:val="Hyperlink"/>
@@ -31699,7 +31843,7 @@
       <w:r>
         <w:t xml:space="preserve"> </w:t>
       </w:r>
-      <w:hyperlink r:id="rId96">
+      <w:hyperlink r:id="rId98">
         <w:r>
           <w:rPr>
             <w:rStyle w:val="Hyperlink"/>
@@ -31711,7 +31855,7 @@
         <w:t xml:space="preserve">.</w:t>
       </w:r>
     </w:p>
-    <w:bookmarkEnd w:id="97"/>
+    <w:bookmarkEnd w:id="99"/>
     <w:p>
       <w:pPr>
         <w:pStyle w:val="BodyText"/>
@@ -31757,7 +31901,7 @@
       <w:r>
         <w:t xml:space="preserve"> </w:t>
       </w:r>
-      <w:hyperlink r:id="rId98">
+      <w:hyperlink r:id="rId100">
         <w:r>
           <w:rPr>
             <w:rStyle w:val="Hyperlink"/>
@@ -31916,7 +32060,7 @@
         <w:pStyle w:val="Compact"/>
         <w:numPr>
           <w:ilvl w:val="0"/>
-          <w:numId w:val="1006"/>
+          <w:numId w:val="1007"/>
         </w:numPr>
       </w:pPr>
       <m:oMath>
@@ -31954,7 +32098,7 @@
       <w:r>
         <w:t xml:space="preserve">(</w:t>
       </w:r>
-      <w:hyperlink r:id="rId99">
+      <w:hyperlink r:id="rId101">
         <w:r>
           <w:rPr>
             <w:rStyle w:val="Hyperlink"/>
@@ -31971,7 +32115,7 @@
         <w:pStyle w:val="Compact"/>
         <w:numPr>
           <w:ilvl w:val="0"/>
-          <w:numId w:val="1006"/>
+          <w:numId w:val="1007"/>
         </w:numPr>
       </w:pPr>
       <m:oMath>
@@ -32015,7 +32159,7 @@
       <w:r>
         <w:t xml:space="preserve">(</w:t>
       </w:r>
-      <w:hyperlink r:id="rId100">
+      <w:hyperlink r:id="rId102">
         <w:r>
           <w:rPr>
             <w:rStyle w:val="Hyperlink"/>
@@ -32033,7 +32177,7 @@
         <w:t xml:space="preserve">so its square root is a positive number.</w:t>
       </w:r>
     </w:p>
-    <w:bookmarkStart w:id="103" w:name="thm-mvn-moments"/>
+    <w:bookmarkStart w:id="103" w:name="thm-mvn-density-integral"/>
     <w:p>
       <w:pPr>
         <w:pStyle w:val="FirstParagraph"/>
@@ -32043,62 +32187,7 @@
           <w:b/>
           <w:bCs/>
         </w:rPr>
-        <w:t xml:space="preserve">Theorem 11 (The multivariate normal density integrates to 1, with mean</w:t>
-      </w:r>
-      <w:r>
-        <w:rPr>
-          <w:b/>
-          <w:bCs/>
-        </w:rPr>
-        <w:t xml:space="preserve"> </w:t>
-      </w:r>
-      <m:oMath>
-        <m:acc>
-          <m:accPr>
-            <m:chr m:val="̃"/>
-          </m:accPr>
-          <m:e>
-            <m:r>
-              <m:t>μ</m:t>
-            </m:r>
-          </m:e>
-        </m:acc>
-      </m:oMath>
-      <w:r>
-        <w:rPr>
-          <w:b/>
-          <w:bCs/>
-        </w:rPr>
-        <w:t xml:space="preserve"> </w:t>
-      </w:r>
-      <w:r>
-        <w:rPr>
-          <w:b/>
-          <w:bCs/>
-        </w:rPr>
-        <w:t xml:space="preserve">and variance</w:t>
-      </w:r>
-      <w:r>
-        <w:rPr>
-          <w:b/>
-          <w:bCs/>
-        </w:rPr>
-        <w:t xml:space="preserve"> </w:t>
-      </w:r>
-      <m:oMath>
-        <m:r>
-          <m:rPr>
-            <m:sty m:val="b"/>
-          </m:rPr>
-          <m:t>Σ</m:t>
-        </m:r>
-      </m:oMath>
-      <w:r>
-        <w:rPr>
-          <w:b/>
-          <w:bCs/>
-        </w:rPr>
-        <w:t xml:space="preserve">)</w:t>
+        <w:t xml:space="preserve">Theorem 13 (The multivariate normal density integrates to 1)</w:t>
       </w:r>
       <w:r>
         <w:t xml:space="preserve"> </w:t>
@@ -32242,18 +32331,32 @@
         </m:sSup>
       </m:oMath>
       <w:r>
-        <w:t xml:space="preserve">,</w:t>
+        <w:t xml:space="preserve">.</w:t>
+      </w:r>
+    </w:p>
+    <w:bookmarkEnd w:id="103"/>
+    <w:bookmarkStart w:id="106" w:name="thm-mvn-moments"/>
+    <w:p>
+      <w:pPr>
+        <w:pStyle w:val="BodyText"/>
+      </w:pPr>
+      <w:r>
+        <w:rPr>
+          <w:b/>
+          <w:bCs/>
+        </w:rPr>
+        <w:t xml:space="preserve">Theorem 14 (The mean and variance of the multivariate normal distribution)</w:t>
+      </w:r>
+      <w:r>
+        <w:t xml:space="preserve"> </w:t>
+      </w:r>
+      <w:r>
+        <w:t xml:space="preserve">If</w:t>
       </w:r>
       <w:r>
         <w:t xml:space="preserve"> </w:t>
       </w:r>
       <m:oMath>
-        <m:r>
-          <m:rPr>
-            <m:sty m:val="p"/>
-          </m:rPr>
-          <m:t>E</m:t>
-        </m:r>
         <m:acc>
           <m:accPr>
             <m:chr m:val="̃"/>
@@ -32268,7 +32371,94 @@
           <m:rPr>
             <m:sty m:val="p"/>
           </m:rPr>
-          <m:t>=</m:t>
+          <m:t>∼</m:t>
+        </m:r>
+        <m:sSub>
+          <m:e>
+            <m:r>
+              <m:rPr>
+                <m:sty m:val="p"/>
+              </m:rPr>
+              <m:t>N</m:t>
+            </m:r>
+          </m:e>
+          <m:sub>
+            <m:r>
+              <m:t>p</m:t>
+            </m:r>
+          </m:sub>
+        </m:sSub>
+        <m:r>
+          <m:t>​</m:t>
+        </m:r>
+        <m:d>
+          <m:dPr>
+            <m:begChr m:val="("/>
+            <m:sepChr m:val=""/>
+            <m:endChr m:val=")"/>
+            <m:grow/>
+          </m:dPr>
+          <m:e>
+            <m:acc>
+              <m:accPr>
+                <m:chr m:val="̃"/>
+              </m:accPr>
+              <m:e>
+                <m:r>
+                  <m:t>μ</m:t>
+                </m:r>
+              </m:e>
+            </m:acc>
+            <m:r>
+              <m:rPr>
+                <m:sty m:val="p"/>
+              </m:rPr>
+              <m:t>,</m:t>
+            </m:r>
+            <m:r>
+              <m:rPr>
+                <m:sty m:val="b"/>
+              </m:rPr>
+              <m:t>Σ</m:t>
+            </m:r>
+          </m:e>
+        </m:d>
+        <m:r>
+          <m:t>​</m:t>
+        </m:r>
+      </m:oMath>
+      <w:r>
+        <w:t xml:space="preserve"> </w:t>
+      </w:r>
+      <w:r>
+        <w:t xml:space="preserve">(</w:t>
+      </w:r>
+      <w:hyperlink w:anchor="def-mvn">
+        <w:r>
+          <w:rPr>
+            <w:rStyle w:val="Hyperlink"/>
+          </w:rPr>
+          <w:t xml:space="preserve">Definition 8</w:t>
+        </w:r>
+      </w:hyperlink>
+      <w:r>
+        <w:t xml:space="preserve">),</w:t>
+      </w:r>
+      <w:r>
+        <w:t xml:space="preserve"> </w:t>
+      </w:r>
+      <w:r>
+        <w:t xml:space="preserve">then</w:t>
+      </w:r>
+      <w:r>
+        <w:t xml:space="preserve"> </w:t>
+      </w:r>
+      <m:oMath>
+        <m:r>
+          <m:rPr>
+            <m:sty m:val="p"/>
+          </m:rPr>
+          <m:t>E</m:t>
         </m:r>
         <m:acc>
           <m:accPr>
@@ -32276,6 +32466,22 @@
           </m:accPr>
           <m:e>
             <m:r>
+              <m:t>X</m:t>
+            </m:r>
+          </m:e>
+        </m:acc>
+        <m:r>
+          <m:rPr>
+            <m:sty m:val="p"/>
+          </m:rPr>
+          <m:t>=</m:t>
+        </m:r>
+        <m:acc>
+          <m:accPr>
+            <m:chr m:val="̃"/>
+          </m:accPr>
+          <m:e>
+            <m:r>
               <m:t>μ</m:t>
             </m:r>
           </m:e>
@@ -32290,7 +32496,7 @@
       <w:r>
         <w:t xml:space="preserve"> </w:t>
       </w:r>
-      <w:hyperlink r:id="rId101">
+      <w:hyperlink r:id="rId104">
         <w:r>
           <w:rPr>
             <w:rStyle w:val="Hyperlink"/>
@@ -32365,7 +32571,7 @@
       <w:r>
         <w:t xml:space="preserve"> </w:t>
       </w:r>
-      <w:hyperlink r:id="rId102">
+      <w:hyperlink r:id="rId105">
         <w:r>
           <w:rPr>
             <w:rStyle w:val="Hyperlink"/>
@@ -32377,7 +32583,7 @@
         <w:t xml:space="preserve">).</w:t>
       </w:r>
     </w:p>
-    <w:bookmarkEnd w:id="103"/>
+    <w:bookmarkEnd w:id="106"/>
     <w:p>
       <w:pPr>
         <w:pStyle w:val="BodyText"/>
@@ -32421,7 +32627,7 @@
       <w:r>
         <w:t xml:space="preserve"> </w:t>
       </w:r>
-      <w:hyperlink r:id="rId104">
+      <w:hyperlink r:id="rId107">
         <w:r>
           <w:rPr>
             <w:rStyle w:val="Hyperlink"/>
@@ -32441,7 +32647,7 @@
       <w:r>
         <w:t xml:space="preserve"> </w:t>
       </w:r>
-      <w:hyperlink r:id="rId105">
+      <w:hyperlink r:id="rId108">
         <w:r>
           <w:rPr>
             <w:rStyle w:val="Hyperlink"/>
@@ -32484,7 +32690,7 @@
       <w:r>
         <w:t xml:space="preserve"> </w:t>
       </w:r>
-      <w:hyperlink r:id="rId106">
+      <w:hyperlink r:id="rId109">
         <w:r>
           <w:rPr>
             <w:rStyle w:val="Hyperlink"/>
@@ -32504,7 +32710,7 @@
       <w:r>
         <w:t xml:space="preserve"> </w:t>
       </w:r>
-      <w:hyperlink r:id="rId107">
+      <w:hyperlink r:id="rId110">
         <w:r>
           <w:rPr>
             <w:rStyle w:val="Hyperlink"/>
@@ -32522,7 +32728,7 @@
         <w:t xml:space="preserve">which has no joint density.</w:t>
       </w:r>
     </w:p>
-    <w:bookmarkStart w:id="108" w:name="exm-mvn-univariate"/>
+    <w:bookmarkStart w:id="111" w:name="exm-mvn-univariate"/>
     <w:p>
       <w:pPr>
         <w:pStyle w:val="BodyText"/>
@@ -32756,7 +32962,7 @@
       <w:r>
         <w:t xml:space="preserve">(</w:t>
       </w:r>
-      <w:hyperlink r:id="rId95">
+      <w:hyperlink r:id="rId97">
         <w:r>
           <w:rPr>
             <w:rStyle w:val="Hyperlink"/>
@@ -33339,8 +33545,8 @@
         <w:t xml:space="preserve">.</w:t>
       </w:r>
     </w:p>
-    <w:bookmarkEnd w:id="108"/>
-    <w:bookmarkStart w:id="109" w:name="lem-mahalanobis-nonneg"/>
+    <w:bookmarkEnd w:id="111"/>
+    <w:bookmarkStart w:id="112" w:name="lem-mahalanobis-nonneg"/>
     <w:p>
       <w:pPr>
         <w:pStyle w:val="BodyText"/>
@@ -33639,7 +33845,7 @@
         <w:t xml:space="preserve">.</w:t>
       </w:r>
     </w:p>
-    <w:bookmarkEnd w:id="109"/>
+    <w:bookmarkEnd w:id="112"/>
     <w:p>
       <w:pPr>
         <w:pStyle w:val="BodyText"/>
@@ -33689,7 +33895,7 @@
       <w:r>
         <w:t xml:space="preserve">(</w:t>
       </w:r>
-      <w:hyperlink r:id="rId99">
+      <w:hyperlink r:id="rId101">
         <w:r>
           <w:rPr>
             <w:rStyle w:val="Hyperlink"/>
@@ -33799,7 +34005,7 @@
       <w:r>
         <w:t xml:space="preserve"> </w:t>
       </w:r>
-      <w:hyperlink r:id="rId94">
+      <w:hyperlink r:id="rId96">
         <w:r>
           <w:rPr>
             <w:rStyle w:val="Hyperlink"/>
@@ -33918,7 +34124,7 @@
         <w:t xml:space="preserve">.</w:t>
       </w:r>
     </w:p>
-    <w:bookmarkStart w:id="110" w:name="def-mahalanobis"/>
+    <w:bookmarkStart w:id="113" w:name="def-mahalanobis"/>
     <w:p>
       <w:pPr>
         <w:pStyle w:val="BodyText"/>
@@ -34290,7 +34496,7 @@
         </m:oMath>
       </m:oMathPara>
     </w:p>
-    <w:bookmarkEnd w:id="110"/>
+    <w:bookmarkEnd w:id="113"/>
     <w:p>
       <w:pPr>
         <w:pStyle w:val="FirstParagraph"/>
@@ -34331,7 +34537,7 @@
       <w:r>
         <w:t xml:space="preserve"> </w:t>
       </w:r>
-      <w:hyperlink r:id="rId111">
+      <w:hyperlink r:id="rId114">
         <w:r>
           <w:rPr>
             <w:rStyle w:val="Hyperlink"/>
@@ -34343,7 +34549,7 @@
         <w:t xml:space="preserve">.</w:t>
       </w:r>
     </w:p>
-    <w:bookmarkStart w:id="112" w:name="cor-mvn-mahalanobis"/>
+    <w:bookmarkStart w:id="115" w:name="cor-mvn-mahalanobis"/>
     <w:p>
       <w:pPr>
         <w:pStyle w:val="BodyText"/>
@@ -34881,7 +35087,7 @@
         <w:t xml:space="preserve">.</w:t>
       </w:r>
     </w:p>
-    <w:bookmarkEnd w:id="112"/>
+    <w:bookmarkEnd w:id="115"/>
     <w:p>
       <w:pPr>
         <w:pStyle w:val="BodyText"/>
@@ -35119,7 +35325,7 @@
         <w:t xml:space="preserve">.</w:t>
       </w:r>
     </w:p>
-    <w:bookmarkStart w:id="114" w:name="exm-mahalanobis-special"/>
+    <w:bookmarkStart w:id="117" w:name="exm-mahalanobis-special"/>
     <w:p>
       <w:pPr>
         <w:pStyle w:val="BodyText"/>
@@ -35157,7 +35363,7 @@
       <w:r>
         <w:t xml:space="preserve"> </w:t>
       </w:r>
-      <w:hyperlink r:id="rId113">
+      <w:hyperlink r:id="rId116">
         <w:r>
           <w:rPr>
             <w:rStyle w:val="Hyperlink"/>
@@ -35376,7 +35582,7 @@
       <w:r>
         <w:t xml:space="preserve"> </w:t>
       </w:r>
-      <w:hyperlink r:id="rId96">
+      <w:hyperlink r:id="rId98">
         <w:r>
           <w:rPr>
             <w:rStyle w:val="Hyperlink"/>
@@ -35562,7 +35768,7 @@
         <w:pStyle w:val="Compact"/>
         <w:numPr>
           <w:ilvl w:val="0"/>
-          <w:numId w:val="1007"/>
+          <w:numId w:val="1008"/>
         </w:numPr>
       </w:pPr>
       <w:r>
@@ -35752,7 +35958,7 @@
         <w:pStyle w:val="Compact"/>
         <w:numPr>
           <w:ilvl w:val="0"/>
-          <w:numId w:val="1007"/>
+          <w:numId w:val="1008"/>
         </w:numPr>
       </w:pPr>
       <w:r>
@@ -35876,8 +36082,8 @@
         <w:t xml:space="preserve">in units of that coordinate’s standard deviation.</w:t>
       </w:r>
     </w:p>
-    <w:bookmarkEnd w:id="114"/>
-    <w:bookmarkStart w:id="115" w:name="thm-mvn-diagonal-indpt"/>
+    <w:bookmarkEnd w:id="117"/>
+    <w:bookmarkStart w:id="118" w:name="thm-mvn-diagonal-indpt"/>
     <w:p>
       <w:pPr>
         <w:pStyle w:val="BodyText"/>
@@ -35887,7 +36093,7 @@
           <w:b/>
           <w:bCs/>
         </w:rPr>
-        <w:t xml:space="preserve">Theorem 12 (A multivariate normal vector with diagonal variance has independent normal components)</w:t>
+        <w:t xml:space="preserve">Theorem 15 (A multivariate normal vector with diagonal variance has independent normal components)</w:t>
       </w:r>
       <w:r>
         <w:t xml:space="preserve"> </w:t>
@@ -36064,7 +36270,7 @@
         <w:pStyle w:val="Compact"/>
         <w:numPr>
           <w:ilvl w:val="0"/>
-          <w:numId w:val="1008"/>
+          <w:numId w:val="1009"/>
         </w:numPr>
       </w:pPr>
       <w:r>
@@ -36214,7 +36420,7 @@
         <w:pStyle w:val="Compact"/>
         <w:numPr>
           <w:ilvl w:val="0"/>
-          <w:numId w:val="1008"/>
+          <w:numId w:val="1009"/>
         </w:numPr>
       </w:pPr>
       <w:r>
@@ -36309,7 +36515,7 @@
         <w:pStyle w:val="Compact"/>
         <w:numPr>
           <w:ilvl w:val="0"/>
-          <w:numId w:val="1008"/>
+          <w:numId w:val="1009"/>
         </w:numPr>
       </w:pPr>
       <m:oMath>
@@ -36365,7 +36571,7 @@
       <w:r>
         <w:t xml:space="preserve"> </w:t>
       </w:r>
-      <w:hyperlink r:id="rId59">
+      <w:hyperlink r:id="rId60">
         <w:r>
           <w:rPr>
             <w:rStyle w:val="Hyperlink"/>
@@ -36377,7 +36583,7 @@
         <w:t xml:space="preserve">.</w:t>
       </w:r>
     </w:p>
-    <w:bookmarkEnd w:id="115"/>
+    <w:bookmarkEnd w:id="118"/>
     <w:p>
       <w:pPr>
         <w:pStyle w:val="FirstParagraph"/>
@@ -36398,7 +36604,7 @@
       <w:r>
         <w:t xml:space="preserve"> </w:t>
       </w:r>
-      <w:hyperlink r:id="rId116">
+      <w:hyperlink r:id="rId119">
         <w:r>
           <w:rPr>
             <w:rStyle w:val="Hyperlink"/>
@@ -37304,7 +37510,7 @@
       <w:r>
         <w:t xml:space="preserve">(</w:t>
       </w:r>
-      <w:hyperlink r:id="rId105">
+      <w:hyperlink r:id="rId120">
         <w:r>
           <w:rPr>
             <w:rStyle w:val="Hyperlink"/>
@@ -37412,7 +37618,7 @@
       <w:r>
         <w:t xml:space="preserve">(</w:t>
       </w:r>
-      <w:hyperlink r:id="rId117">
+      <w:hyperlink r:id="rId121">
         <w:r>
           <w:rPr>
             <w:rStyle w:val="Hyperlink"/>
@@ -37458,7 +37664,7 @@
       <w:r>
         <w:t xml:space="preserve"> </w:t>
       </w:r>
-      <w:hyperlink r:id="rId118">
+      <w:hyperlink r:id="rId122">
         <w:r>
           <w:rPr>
             <w:rStyle w:val="Hyperlink"/>
@@ -37490,7 +37696,7 @@
         <w:t xml:space="preserve">variables as its remark describes.</w:t>
       </w:r>
     </w:p>
-    <w:bookmarkStart w:id="119" w:name="cor-mvn-uncorrelated-indpt"/>
+    <w:bookmarkStart w:id="123" w:name="cor-mvn-uncorrelated-indpt"/>
     <w:p>
       <w:pPr>
         <w:pStyle w:val="BodyText"/>
@@ -37766,7 +37972,7 @@
         <w:t xml:space="preserve">.</w:t>
       </w:r>
     </w:p>
-    <w:bookmarkEnd w:id="119"/>
+    <w:bookmarkEnd w:id="123"/>
     <w:p>
       <w:pPr>
         <w:pStyle w:val="BodyText"/>
@@ -37792,7 +37998,7 @@
           <w:rPr>
             <w:rStyle w:val="Hyperlink"/>
           </w:rPr>
-          <w:t xml:space="preserve">Theorem 11</w:t>
+          <w:t xml:space="preserve">Theorem 14</w:t>
         </w:r>
       </w:hyperlink>
       <w:r>
@@ -37951,7 +38157,7 @@
       <w:r>
         <w:t xml:space="preserve">(</w:t>
       </w:r>
-      <w:hyperlink r:id="rId120">
+      <w:hyperlink r:id="rId124">
         <w:r>
           <w:rPr>
             <w:rStyle w:val="Hyperlink"/>
@@ -37999,7 +38205,7 @@
           <w:rPr>
             <w:rStyle w:val="Hyperlink"/>
           </w:rPr>
-          <w:t xml:space="preserve">Theorem 12</w:t>
+          <w:t xml:space="preserve">Theorem 15</w:t>
         </w:r>
       </w:hyperlink>
       <w:r>
@@ -38017,7 +38223,7 @@
         <w:pStyle w:val="Compact"/>
         <w:numPr>
           <w:ilvl w:val="0"/>
-          <w:numId w:val="1009"/>
+          <w:numId w:val="1010"/>
         </w:numPr>
       </w:pPr>
       <w:r>
@@ -38093,7 +38299,7 @@
         <w:pStyle w:val="Compact"/>
         <w:numPr>
           <w:ilvl w:val="0"/>
-          <w:numId w:val="1009"/>
+          <w:numId w:val="1010"/>
         </w:numPr>
       </w:pPr>
       <w:r>
@@ -38134,7 +38340,7 @@
       <w:r>
         <w:t xml:space="preserve">(</w:t>
       </w:r>
-      <w:hyperlink r:id="rId117">
+      <w:hyperlink r:id="rId121">
         <w:r>
           <w:rPr>
             <w:rStyle w:val="Hyperlink"/>
@@ -38171,7 +38377,7 @@
         <w:pStyle w:val="Compact"/>
         <w:numPr>
           <w:ilvl w:val="0"/>
-          <w:numId w:val="1009"/>
+          <w:numId w:val="1010"/>
         </w:numPr>
       </w:pPr>
       <m:oMath>
@@ -38333,7 +38539,7 @@
       <w:r>
         <w:t xml:space="preserve"> </w:t>
       </w:r>
-      <w:hyperlink r:id="rId121">
+      <w:hyperlink r:id="rId125">
         <w:r>
           <w:rPr>
             <w:rStyle w:val="Hyperlink"/>
@@ -38440,7 +38646,7 @@
       <w:r>
         <w:t xml:space="preserve"> </w:t>
       </w:r>
-      <w:hyperlink r:id="rId122">
+      <w:hyperlink r:id="rId126">
         <w:r>
           <w:rPr>
             <w:rStyle w:val="Hyperlink"/>
@@ -38475,7 +38681,7 @@
       <w:r>
         <w:t xml:space="preserve">(</w:t>
       </w:r>
-      <w:hyperlink r:id="rId123">
+      <w:hyperlink r:id="rId127">
         <w:r>
           <w:rPr>
             <w:rStyle w:val="Hyperlink"/>
@@ -38521,7 +38727,7 @@
       <w:r>
         <w:t xml:space="preserve">(</w:t>
       </w:r>
-      <w:hyperlink r:id="rId124">
+      <w:hyperlink r:id="rId128">
         <w:r>
           <w:rPr>
             <w:rStyle w:val="Hyperlink"/>
@@ -38533,7 +38739,7 @@
         <w:t xml:space="preserve">).</w:t>
       </w:r>
     </w:p>
-    <w:bookmarkStart w:id="126" w:name="thm-mahalanobis-eigen"/>
+    <w:bookmarkStart w:id="130" w:name="thm-mahalanobis-eigen"/>
     <w:p>
       <w:pPr>
         <w:pStyle w:val="BodyText"/>
@@ -38543,7 +38749,7 @@
           <w:b/>
           <w:bCs/>
         </w:rPr>
-        <w:t xml:space="preserve">Theorem 13 (Mahalanobis distance in eigenvector coordinates)</w:t>
+        <w:t xml:space="preserve">Theorem 16 (Mahalanobis distance in eigenvector coordinates)</w:t>
       </w:r>
       <w:r>
         <w:t xml:space="preserve"> </w:t>
@@ -38571,7 +38777,7 @@
       <w:r>
         <w:t xml:space="preserve"> </w:t>
       </w:r>
-      <w:hyperlink r:id="rId125">
+      <w:hyperlink r:id="rId129">
         <w:r>
           <w:rPr>
             <w:rStyle w:val="Hyperlink"/>
@@ -38992,7 +39198,7 @@
         </m:oMath>
       </m:oMathPara>
     </w:p>
-    <w:bookmarkEnd w:id="126"/>
+    <w:bookmarkEnd w:id="130"/>
     <w:p>
       <w:pPr>
         <w:pStyle w:val="FirstParagraph"/>
@@ -39211,7 +39417,7 @@
       <w:r>
         <w:t xml:space="preserve"> </w:t>
       </w:r>
-      <w:hyperlink r:id="rId99">
+      <w:hyperlink r:id="rId101">
         <w:r>
           <w:rPr>
             <w:rStyle w:val="Hyperlink"/>
@@ -40146,7 +40352,7 @@
         <w:t xml:space="preserve">.</w:t>
       </w:r>
     </w:p>
-    <w:bookmarkStart w:id="128" w:name="exm-mahalanobis-eigen"/>
+    <w:bookmarkStart w:id="132" w:name="exm-mahalanobis-eigen"/>
     <w:p>
       <w:pPr>
         <w:pStyle w:val="BodyText"/>
@@ -40508,7 +40714,7 @@
       <w:r>
         <w:t xml:space="preserve">(</w:t>
       </w:r>
-      <w:hyperlink r:id="rId127">
+      <w:hyperlink r:id="rId131">
         <w:r>
           <w:rPr>
             <w:rStyle w:val="Hyperlink"/>
@@ -40533,7 +40739,7 @@
           <w:rPr>
             <w:rStyle w:val="Hyperlink"/>
           </w:rPr>
-          <w:t xml:space="preserve">Theorem 13</w:t>
+          <w:t xml:space="preserve">Theorem 16</w:t>
         </w:r>
       </w:hyperlink>
       <w:r>
@@ -41653,9 +41859,9 @@
         <w:t xml:space="preserve">are positively correlated.</w:t>
       </w:r>
     </w:p>
-    <w:bookmarkEnd w:id="128"/>
-    <w:bookmarkEnd w:id="129"/>
-    <w:bookmarkStart w:id="142" w:name="sec-mixture"/>
+    <w:bookmarkEnd w:id="132"/>
+    <w:bookmarkEnd w:id="133"/>
+    <w:bookmarkStart w:id="148" w:name="sec-mixture"/>
     <w:p>
       <w:pPr>
         <w:pStyle w:val="Heading2"/>
@@ -41664,7 +41870,7 @@
         <w:t xml:space="preserve">7 Mixture distributions</w:t>
       </w:r>
     </w:p>
-    <w:bookmarkStart w:id="130" w:name="def-mixture"/>
+    <w:bookmarkStart w:id="134" w:name="def-mixture"/>
     <w:p>
       <w:pPr>
         <w:pStyle w:val="FirstParagraph"/>
@@ -41821,7 +42027,7 @@
         <w:pStyle w:val="Compact"/>
         <w:numPr>
           <w:ilvl w:val="0"/>
-          <w:numId w:val="1010"/>
+          <w:numId w:val="1011"/>
         </w:numPr>
       </w:pPr>
       <m:oMath>
@@ -41870,7 +42076,7 @@
         <w:pStyle w:val="Compact"/>
         <w:numPr>
           <w:ilvl w:val="0"/>
-          <w:numId w:val="1010"/>
+          <w:numId w:val="1011"/>
         </w:numPr>
       </w:pPr>
       <m:oMath>
@@ -42239,11 +42445,23 @@
         </m:oMath>
       </m:oMathPara>
     </w:p>
+    <w:bookmarkEnd w:id="134"/>
+    <w:bookmarkStart w:id="135" w:name="def-mixture-component"/>
     <w:p>
       <w:pPr>
         <w:pStyle w:val="FirstParagraph"/>
       </w:pPr>
       <w:r>
+        <w:rPr>
+          <w:b/>
+          <w:bCs/>
+        </w:rPr>
+        <w:t xml:space="preserve">Definition 11 (Mixture component)</w:t>
+      </w:r>
+      <w:r>
+        <w:t xml:space="preserve"> </w:t>
+      </w:r>
+      <w:r>
         <w:t xml:space="preserve">The densities</w:t>
       </w:r>
       <w:r>
@@ -42303,7 +42521,18 @@
         <w:t xml:space="preserve"> </w:t>
       </w:r>
       <w:r>
-        <w:t xml:space="preserve">are the mixture’s</w:t>
+        <w:t xml:space="preserve">in a mixture (</w:t>
+      </w:r>
+      <w:hyperlink w:anchor="def-mixture">
+        <w:r>
+          <w:rPr>
+            <w:rStyle w:val="Hyperlink"/>
+          </w:rPr>
+          <w:t xml:space="preserve">Definition 10</w:t>
+        </w:r>
+      </w:hyperlink>
+      <w:r>
+        <w:t xml:space="preserve">) are its</w:t>
       </w:r>
       <w:r>
         <w:t xml:space="preserve"> </w:t>
@@ -42319,8 +42548,8 @@
         <w:t xml:space="preserve">.</w:t>
       </w:r>
     </w:p>
-    <w:bookmarkEnd w:id="130"/>
-    <w:bookmarkStart w:id="133" w:name="thm-mixture-two-stage"/>
+    <w:bookmarkEnd w:id="135"/>
+    <w:bookmarkStart w:id="138" w:name="thm-mixture-two-stage"/>
     <w:p>
       <w:pPr>
         <w:pStyle w:val="BodyText"/>
@@ -42330,7 +42559,7 @@
           <w:b/>
           <w:bCs/>
         </w:rPr>
-        <w:t xml:space="preserve">Theorem 14 (A mixture is the density of a two-stage random variable)</w:t>
+        <w:t xml:space="preserve">Theorem 17 (A mixture is the density of a two-stage random variable)</w:t>
       </w:r>
       <w:r>
         <w:t xml:space="preserve"> </w:t>
@@ -42381,7 +42610,7 @@
       <w:r>
         <w:t xml:space="preserve"> </w:t>
       </w:r>
-      <w:hyperlink r:id="rId131">
+      <w:hyperlink r:id="rId136">
         <w:r>
           <w:rPr>
             <w:rStyle w:val="Hyperlink"/>
@@ -42650,7 +42879,7 @@
         <w:pStyle w:val="Compact"/>
         <w:numPr>
           <w:ilvl w:val="0"/>
-          <w:numId w:val="1011"/>
+          <w:numId w:val="1012"/>
         </w:numPr>
       </w:pPr>
       <m:oMath>
@@ -42712,7 +42941,7 @@
         <w:pStyle w:val="Compact"/>
         <w:numPr>
           <w:ilvl w:val="0"/>
-          <w:numId w:val="1011"/>
+          <w:numId w:val="1012"/>
         </w:numPr>
       </w:pPr>
       <w:r>
@@ -42770,7 +42999,7 @@
       <w:r>
         <w:t xml:space="preserve"> </w:t>
       </w:r>
-      <w:hyperlink r:id="rId132">
+      <w:hyperlink r:id="rId137">
         <w:r>
           <w:rPr>
             <w:rStyle w:val="Hyperlink"/>
@@ -42850,7 +43079,7 @@
         <w:pStyle w:val="Compact"/>
         <w:numPr>
           <w:ilvl w:val="0"/>
-          <w:numId w:val="1011"/>
+          <w:numId w:val="1012"/>
         </w:numPr>
       </w:pPr>
       <w:r>
@@ -42898,7 +43127,7 @@
         <w:t xml:space="preserve">.</w:t>
       </w:r>
     </w:p>
-    <w:bookmarkEnd w:id="133"/>
+    <w:bookmarkEnd w:id="138"/>
     <w:p>
       <w:pPr>
         <w:pStyle w:val="FirstParagraph"/>
@@ -42919,7 +43148,7 @@
       <w:r>
         <w:t xml:space="preserve"> </w:t>
       </w:r>
-      <w:hyperlink r:id="rId134">
+      <w:hyperlink r:id="rId139">
         <w:r>
           <w:rPr>
             <w:rStyle w:val="Hyperlink"/>
@@ -43143,7 +43372,7 @@
       <w:r>
         <w:t xml:space="preserve"> </w:t>
       </w:r>
-      <w:hyperlink r:id="rId132">
+      <w:hyperlink r:id="rId137">
         <w:r>
           <w:rPr>
             <w:rStyle w:val="Hyperlink"/>
@@ -44054,7 +44283,7 @@
       <w:r>
         <w:t xml:space="preserve"> </w:t>
       </w:r>
-      <w:hyperlink r:id="rId71">
+      <w:hyperlink r:id="rId72">
         <w:r>
           <w:rPr>
             <w:rStyle w:val="Hyperlink"/>
@@ -44099,7 +44328,7 @@
           <w:rPr>
             <w:rStyle w:val="Hyperlink"/>
           </w:rPr>
-          <w:t xml:space="preserve">Theorem 14</w:t>
+          <w:t xml:space="preserve">Theorem 17</w:t>
         </w:r>
       </w:hyperlink>
       <w:r>
@@ -44315,7 +44544,7 @@
         <w:t xml:space="preserve">.</w:t>
       </w:r>
     </w:p>
-    <w:bookmarkStart w:id="135" w:name="thm-mixture-mean"/>
+    <w:bookmarkStart w:id="140" w:name="thm-mixture-mean"/>
     <w:p>
       <w:pPr>
         <w:pStyle w:val="BodyText"/>
@@ -44325,7 +44554,7 @@
           <w:b/>
           <w:bCs/>
         </w:rPr>
-        <w:t xml:space="preserve">Theorem 15 (The mean of a mixture is the weighted mean of the component means)</w:t>
+        <w:t xml:space="preserve">Theorem 18 (The mean of a mixture is the weighted mean of the component means)</w:t>
       </w:r>
       <w:r>
         <w:t xml:space="preserve"> </w:t>
@@ -44629,7 +44858,7 @@
         </m:oMath>
       </m:oMathPara>
     </w:p>
-    <w:bookmarkEnd w:id="135"/>
+    <w:bookmarkEnd w:id="140"/>
     <w:p>
       <w:pPr>
         <w:pStyle w:val="FirstParagraph"/>
@@ -45478,7 +45707,7 @@
       <w:r>
         <w:t xml:space="preserve"> </w:t>
       </w:r>
-      <w:hyperlink r:id="rId136">
+      <w:hyperlink r:id="rId141">
         <w:r>
           <w:rPr>
             <w:rStyle w:val="Hyperlink"/>
@@ -45490,7 +45719,7 @@
         <w:t xml:space="preserve">.</w:t>
       </w:r>
     </w:p>
-    <w:bookmarkStart w:id="137" w:name="thm-mixture-posterior"/>
+    <w:bookmarkStart w:id="142" w:name="thm-mixture-posterior"/>
     <w:p>
       <w:pPr>
         <w:pStyle w:val="BodyText"/>
@@ -45500,7 +45729,7 @@
           <w:b/>
           <w:bCs/>
         </w:rPr>
-        <w:t xml:space="preserve">Theorem 16 (Which component did an observation come from?)</w:t>
+        <w:t xml:space="preserve">Theorem 19 (Which component did an observation come from?)</w:t>
       </w:r>
       <w:r>
         <w:t xml:space="preserve"> </w:t>
@@ -45516,7 +45745,7 @@
           <w:rPr>
             <w:rStyle w:val="Hyperlink"/>
           </w:rPr>
-          <w:t xml:space="preserve">Theorem 14</w:t>
+          <w:t xml:space="preserve">Theorem 17</w:t>
         </w:r>
       </w:hyperlink>
       <w:r>
@@ -45788,7 +46017,7 @@
         </m:oMath>
       </m:oMathPara>
     </w:p>
-    <w:bookmarkEnd w:id="137"/>
+    <w:bookmarkEnd w:id="142"/>
     <w:p>
       <w:pPr>
         <w:pStyle w:val="FirstParagraph"/>
@@ -45814,7 +46043,7 @@
           <w:rPr>
             <w:rStyle w:val="Hyperlink"/>
           </w:rPr>
-          <w:t xml:space="preserve">Theorem 14</w:t>
+          <w:t xml:space="preserve">Theorem 17</w:t>
         </w:r>
       </w:hyperlink>
       <w:r>
@@ -45870,7 +46099,7 @@
       <w:r>
         <w:t xml:space="preserve"> </w:t>
       </w:r>
-      <w:hyperlink r:id="rId132">
+      <w:hyperlink r:id="rId137">
         <w:r>
           <w:rPr>
             <w:rStyle w:val="Hyperlink"/>
@@ -46286,7 +46515,7 @@
           <w:rPr>
             <w:rStyle w:val="Hyperlink"/>
           </w:rPr>
-          <w:t xml:space="preserve">Theorem 16</w:t>
+          <w:t xml:space="preserve">Theorem 19</w:t>
         </w:r>
       </w:hyperlink>
       <w:r>
@@ -46298,7 +46527,7 @@
       <w:r>
         <w:t xml:space="preserve"> </w:t>
       </w:r>
-      <w:hyperlink r:id="rId138">
+      <w:hyperlink r:id="rId143">
         <w:r>
           <w:rPr>
             <w:rStyle w:val="Hyperlink"/>
@@ -46456,7 +46685,7 @@
       <w:r>
         <w:t xml:space="preserve"> </w:t>
       </w:r>
-      <w:hyperlink r:id="rId139">
+      <w:hyperlink r:id="rId144">
         <w:r>
           <w:rPr>
             <w:rStyle w:val="Hyperlink"/>
@@ -46467,79 +46696,124 @@
       <w:r>
         <w:t xml:space="preserve">.</w:t>
       </w:r>
-      <w:r>
-        <w:t xml:space="preserve"> </w:t>
-      </w:r>
-      <w:r>
-        <w:t xml:space="preserve">In machine learning,</w:t>
-      </w:r>
-      <w:r>
-        <w:t xml:space="preserve"> </w:t>
-      </w:r>
-      <m:oMath>
-        <m:r>
-          <m:rPr>
-            <m:sty m:val="p"/>
-          </m:rPr>
-          <m:t>P</m:t>
-        </m:r>
-        <m:r>
-          <m:rPr>
-            <m:sty m:val="p"/>
-          </m:rPr>
-          <m:t>(</m:t>
-        </m:r>
-        <m:r>
-          <m:t>C</m:t>
-        </m:r>
-        <m:r>
-          <m:rPr>
-            <m:sty m:val="p"/>
-          </m:rPr>
-          <m:t>=</m:t>
-        </m:r>
-        <m:r>
-          <m:t>c</m:t>
-        </m:r>
-        <m:r>
-          <m:rPr>
-            <m:sty m:val="p"/>
-          </m:rPr>
-          <m:t>∣</m:t>
-        </m:r>
-        <m:r>
-          <m:t>X</m:t>
-        </m:r>
-        <m:r>
-          <m:rPr>
-            <m:sty m:val="p"/>
-          </m:rPr>
-          <m:t>=</m:t>
-        </m:r>
-        <m:r>
-          <m:t>x</m:t>
-        </m:r>
-        <m:r>
-          <m:rPr>
-            <m:sty m:val="p"/>
-          </m:rPr>
-          <m:t>)</m:t>
-        </m:r>
-      </m:oMath>
-      <w:r>
-        <w:t xml:space="preserve"> </w:t>
-      </w:r>
-      <w:r>
-        <w:t xml:space="preserve">is called the</w:t>
-      </w:r>
-      <w:r>
-        <w:t xml:space="preserve"> </w:t>
-      </w:r>
+    </w:p>
+    <w:bookmarkStart w:id="145" w:name="def-responsibility"/>
+    <w:p>
+      <w:pPr>
+        <w:pStyle w:val="BodyText"/>
+      </w:pPr>
       <w:r>
         <w:rPr>
           <w:b/>
           <w:bCs/>
         </w:rPr>
+        <w:t xml:space="preserve">Definition 12 (Responsibility of a mixture component)</w:t>
+      </w:r>
+      <w:r>
+        <w:t xml:space="preserve"> </w:t>
+      </w:r>
+      <w:r>
+        <w:t xml:space="preserve">In the setting of</w:t>
+      </w:r>
+      <w:r>
+        <w:t xml:space="preserve"> </w:t>
+      </w:r>
+      <w:hyperlink w:anchor="thm-mixture-posterior">
+        <w:r>
+          <w:rPr>
+            <w:rStyle w:val="Hyperlink"/>
+          </w:rPr>
+          <w:t xml:space="preserve">Theorem 19</w:t>
+        </w:r>
+      </w:hyperlink>
+      <w:r>
+        <w:t xml:space="preserve">,</w:t>
+      </w:r>
+      <w:r>
+        <w:t xml:space="preserve"> </w:t>
+      </w:r>
+      <w:r>
+        <w:t xml:space="preserve">the conditional probability</w:t>
+      </w:r>
+      <w:r>
+        <w:t xml:space="preserve"> </w:t>
+      </w:r>
+      <m:oMath>
+        <m:r>
+          <m:rPr>
+            <m:sty m:val="p"/>
+          </m:rPr>
+          <m:t>P</m:t>
+        </m:r>
+        <m:r>
+          <m:rPr>
+            <m:sty m:val="p"/>
+          </m:rPr>
+          <m:t>(</m:t>
+        </m:r>
+        <m:r>
+          <m:t>C</m:t>
+        </m:r>
+        <m:r>
+          <m:rPr>
+            <m:sty m:val="p"/>
+          </m:rPr>
+          <m:t>=</m:t>
+        </m:r>
+        <m:r>
+          <m:t>c</m:t>
+        </m:r>
+        <m:r>
+          <m:rPr>
+            <m:sty m:val="p"/>
+          </m:rPr>
+          <m:t>∣</m:t>
+        </m:r>
+        <m:r>
+          <m:t>X</m:t>
+        </m:r>
+        <m:r>
+          <m:rPr>
+            <m:sty m:val="p"/>
+          </m:rPr>
+          <m:t>=</m:t>
+        </m:r>
+        <m:r>
+          <m:t>x</m:t>
+        </m:r>
+        <m:r>
+          <m:rPr>
+            <m:sty m:val="p"/>
+          </m:rPr>
+          <m:t>)</m:t>
+        </m:r>
+      </m:oMath>
+      <w:r>
+        <w:t xml:space="preserve"> </w:t>
+      </w:r>
+      <w:r>
+        <w:t xml:space="preserve">is called,</w:t>
+      </w:r>
+      <w:r>
+        <w:t xml:space="preserve"> </w:t>
+      </w:r>
+      <w:r>
+        <w:t xml:space="preserve">in machine learning,</w:t>
+      </w:r>
+      <w:r>
+        <w:t xml:space="preserve"> </w:t>
+      </w:r>
+      <w:r>
+        <w:t xml:space="preserve">the</w:t>
+      </w:r>
+      <w:r>
+        <w:t xml:space="preserve"> </w:t>
+      </w:r>
+      <w:r>
+        <w:rPr>
+          <w:b/>
+          <w:bCs/>
+        </w:rPr>
         <w:t xml:space="preserve">responsibility</w:t>
       </w:r>
       <w:r>
@@ -46574,7 +46848,8 @@
         <w:t xml:space="preserve">.</w:t>
       </w:r>
     </w:p>
-    <w:bookmarkStart w:id="140" w:name="exm-mixture-gaussian"/>
+    <w:bookmarkEnd w:id="145"/>
+    <w:bookmarkStart w:id="146" w:name="exm-mixture-gaussian"/>
     <w:p>
       <w:pPr>
         <w:pStyle w:val="BodyText"/>
@@ -46907,7 +47182,7 @@
       <w:pPr>
         <w:numPr>
           <w:ilvl w:val="0"/>
-          <w:numId w:val="1012"/>
+          <w:numId w:val="1013"/>
         </w:numPr>
       </w:pPr>
       <w:r>
@@ -46931,7 +47206,7 @@
           <w:rPr>
             <w:rStyle w:val="Hyperlink"/>
           </w:rPr>
-          <w:t xml:space="preserve">Theorem 15</w:t>
+          <w:t xml:space="preserve">Theorem 18</w:t>
         </w:r>
       </w:hyperlink>
       <w:r>
@@ -46943,7 +47218,7 @@
       <w:r>
         <w:t xml:space="preserve"> </w:t>
       </w:r>
-      <w:hyperlink r:id="rId105">
+      <w:hyperlink r:id="rId108">
         <w:r>
           <w:rPr>
             <w:rStyle w:val="Hyperlink"/>
@@ -47059,7 +47334,7 @@
       <w:pPr>
         <w:numPr>
           <w:ilvl w:val="0"/>
-          <w:numId w:val="1012"/>
+          <w:numId w:val="1013"/>
         </w:numPr>
       </w:pPr>
       <w:r>
@@ -47329,7 +47604,7 @@
       <w:pPr>
         <w:numPr>
           <w:ilvl w:val="0"/>
-          <w:numId w:val="1012"/>
+          <w:numId w:val="1013"/>
         </w:numPr>
       </w:pPr>
       <w:r>
@@ -47353,7 +47628,7 @@
           <w:rPr>
             <w:rStyle w:val="Hyperlink"/>
           </w:rPr>
-          <w:t xml:space="preserve">Theorem 16</w:t>
+          <w:t xml:space="preserve">Theorem 19</w:t>
         </w:r>
       </w:hyperlink>
       <w:r>
@@ -47822,7 +48097,7 @@
         <w:t xml:space="preserve">.</w:t>
       </w:r>
     </w:p>
-    <w:bookmarkEnd w:id="140"/>
+    <w:bookmarkEnd w:id="146"/>
     <w:p>
       <w:pPr>
         <w:pStyle w:val="FirstParagraph"/>
@@ -47870,7 +48145,7 @@
         <w:t xml:space="preserve">would describe them poorly.</w:t>
       </w:r>
     </w:p>
-    <w:bookmarkStart w:id="141" w:name="exm-nb-mixture"/>
+    <w:bookmarkStart w:id="147" w:name="exm-nb-mixture"/>
     <w:p>
       <w:pPr>
         <w:pStyle w:val="BodyText"/>
@@ -48133,16 +48408,16 @@
           <w:rPr>
             <w:rStyle w:val="Hyperlink"/>
           </w:rPr>
-          <w:t xml:space="preserve">Theorem 8</w:t>
+          <w:t xml:space="preserve">Theorem 9</w:t>
         </w:r>
       </w:hyperlink>
       <w:r>
         <w:t xml:space="preserve">).</w:t>
       </w:r>
     </w:p>
-    <w:bookmarkEnd w:id="141"/>
-    <w:bookmarkEnd w:id="142"/>
-    <w:bookmarkStart w:id="146" w:name="references"/>
+    <w:bookmarkEnd w:id="147"/>
+    <w:bookmarkEnd w:id="148"/>
+    <w:bookmarkStart w:id="152" w:name="references"/>
     <w:p>
       <w:pPr>
         <w:pStyle w:val="Heading2"/>
@@ -48151,8 +48426,8 @@
         <w:t xml:space="preserve">References</w:t>
       </w:r>
     </w:p>
-    <w:bookmarkStart w:id="145" w:name="refs"/>
-    <w:bookmarkStart w:id="144" w:name="ref-CaseBerg01"/>
+    <w:bookmarkStart w:id="151" w:name="refs"/>
+    <w:bookmarkStart w:id="150" w:name="ref-CaseBerg01"/>
     <w:p>
       <w:pPr>
         <w:pStyle w:val="Bibliography"/>
@@ -48176,7 +48451,7 @@
       <w:r>
         <w:t xml:space="preserve"> </w:t>
       </w:r>
-      <w:hyperlink r:id="rId143">
+      <w:hyperlink r:id="rId149">
         <w:r>
           <w:rPr>
             <w:rStyle w:val="Hyperlink"/>
@@ -48188,9 +48463,9 @@
         <w:t xml:space="preserve">.</w:t>
       </w:r>
     </w:p>
-    <w:bookmarkEnd w:id="144"/>
-    <w:bookmarkEnd w:id="145"/>
-    <w:bookmarkEnd w:id="146"/>
+    <w:bookmarkEnd w:id="150"/>
+    <w:bookmarkEnd w:id="151"/>
+    <w:bookmarkEnd w:id="152"/>
     <w:sectPr>
       <w:footnotePr>
         <w:numRestart w:val="eachSect"/>
@@ -48441,6 +48716,9 @@
     <w:abstractNumId w:val="991"/>
   </w:num>
   <w:num w:numId="1012">
+    <w:abstractNumId w:val="991"/>
+  </w:num>
+  <w:num w:numId="1013">
     <w:abstractNumId w:val="991"/>
   </w:num>
 </w:numbering>

</xml_diff>

<commit_message>
Deploying to gh-pages from @ Morrison-Lab/pds@6d5eb898ec0d82ee6b27157edb91f8348f742185 🚀
</commit_message>
<xml_diff>
--- a/distributions.docx
+++ b/distributions.docx
@@ -15,7 +15,7 @@
         <w:pStyle w:val="Date"/>
       </w:pPr>
       <w:r>
-        <w:t xml:space="preserve">Last modified: 2026-10-15 02:44:50 (PDT)</w:t>
+        <w:t xml:space="preserve">Last modified: 2026-10-15 02:50:42 (PDT)</w:t>
       </w:r>
     </w:p>
     <w:p>
@@ -36716,7 +36716,7 @@
           <w:b/>
           <w:bCs/>
         </w:rPr>
-        <w:t xml:space="preserve">Definition 9 (Multivariate normal distribution)</w:t>
+        <w:t xml:space="preserve">Definition 9 (Multivariate normal distribution (multivariate Gaussian distribution))</w:t>
       </w:r>
       <w:r>
         <w:t xml:space="preserve"> </w:t>

</xml_diff>

<commit_message>
Deploying to gh-pages from @ Morrison-Lab/pds@3f937ce6e517a7ce13ab0bed3739b898cc81edff 🚀
</commit_message>
<xml_diff>
--- a/distributions.docx
+++ b/distributions.docx
@@ -15,7 +15,7 @@
         <w:pStyle w:val="Date"/>
       </w:pPr>
       <w:r>
-        <w:t xml:space="preserve">Last modified: 2026-10-15 04:02:56 (PDT)</w:t>
+        <w:t xml:space="preserve">Last modified: 2026-10-15 05:08:19 (PDT)</w:t>
       </w:r>
     </w:p>
     <w:p>
@@ -12789,11 +12789,11 @@
                 </m:rPr>
                 <m:t>−</m:t>
               </m:r>
-              <m:r>
-                <m:t>​</m:t>
-              </m:r>
               <m:sSup>
                 <m:e>
+                  <m:r>
+                    <m:t>​</m:t>
+                  </m:r>
                   <m:d>
                     <m:dPr>
                       <m:begChr m:val="("/>
@@ -12829,6 +12829,9 @@
                       </m:r>
                     </m:e>
                   </m:d>
+                  <m:r>
+                    <m:t>​</m:t>
+                  </m:r>
                 </m:e>
                 <m:sup>
                   <m:r>
@@ -12836,9 +12839,6 @@
                   </m:r>
                 </m:sup>
               </m:sSup>
-              <m:r>
-                <m:t>​</m:t>
-              </m:r>
               <m:r>
                 <m:t>&amp;</m:t>
               </m:r>
@@ -12961,11 +12961,11 @@
                 </m:rPr>
                 <m:t>−</m:t>
               </m:r>
-              <m:r>
-                <m:t>​</m:t>
-              </m:r>
               <m:sSup>
                 <m:e>
+                  <m:r>
+                    <m:t>​</m:t>
+                  </m:r>
                   <m:d>
                     <m:dPr>
                       <m:begChr m:val="("/>
@@ -13001,6 +13001,9 @@
                       </m:r>
                     </m:e>
                   </m:d>
+                  <m:r>
+                    <m:t>​</m:t>
+                  </m:r>
                 </m:e>
                 <m:sup>
                   <m:r>
@@ -13008,9 +13011,6 @@
                   </m:r>
                 </m:sup>
               </m:sSup>
-              <m:r>
-                <m:t>​</m:t>
-              </m:r>
               <m:r>
                 <m:t>&amp;</m:t>
               </m:r>

</xml_diff>

<commit_message>
Deploying to gh-pages from @ Morrison-Lab/pds@2ceae30a39fdfb08b0bd87dc8847f92ba728261e 🚀
</commit_message>
<xml_diff>
--- a/distributions.docx
+++ b/distributions.docx
@@ -15,7 +15,7 @@
         <w:pStyle w:val="Date"/>
       </w:pPr>
       <w:r>
-        <w:t xml:space="preserve">Last modified: 2026-10-16 02:00:06 (PDT)</w:t>
+        <w:t xml:space="preserve">Last modified: 2026-10-16 02:15:38 (PDT)</w:t>
       </w:r>
     </w:p>
     <w:p>
@@ -36751,16 +36751,21 @@
         <w:t xml:space="preserve"> </w:t>
       </w:r>
       <m:oMath>
-        <m:acc>
-          <m:accPr>
-            <m:chr m:val="̃"/>
-          </m:accPr>
+        <m:limLow>
           <m:e>
             <m:r>
               <m:t>X</m:t>
             </m:r>
           </m:e>
-        </m:acc>
+          <m:lim>
+            <m:r>
+              <m:rPr>
+                <m:sty m:val="p"/>
+              </m:rPr>
+              <m:t>∼</m:t>
+            </m:r>
+          </m:lim>
+        </m:limLow>
         <m:r>
           <m:rPr>
             <m:sty m:val="p"/>
@@ -36879,16 +36884,21 @@
         <w:t xml:space="preserve"> </w:t>
       </w:r>
       <m:oMath>
-        <m:acc>
-          <m:accPr>
-            <m:chr m:val="̃"/>
-          </m:accPr>
+        <m:limLow>
           <m:e>
             <m:r>
               <m:t>μ</m:t>
             </m:r>
           </m:e>
-        </m:acc>
+          <m:lim>
+            <m:r>
+              <m:rPr>
+                <m:sty m:val="p"/>
+              </m:rPr>
+              <m:t>∼</m:t>
+            </m:r>
+          </m:lim>
+        </m:limLow>
         <m:r>
           <m:rPr>
             <m:sty m:val="p"/>
@@ -36982,16 +36992,21 @@
         <w:t xml:space="preserve"> </w:t>
       </w:r>
       <m:oMath>
-        <m:acc>
-          <m:accPr>
-            <m:chr m:val="̃"/>
-          </m:accPr>
+        <m:limLow>
           <m:e>
             <m:r>
               <m:t>X</m:t>
             </m:r>
           </m:e>
-        </m:acc>
+          <m:lim>
+            <m:r>
+              <m:rPr>
+                <m:sty m:val="p"/>
+              </m:rPr>
+              <m:t>∼</m:t>
+            </m:r>
+          </m:lim>
+        </m:limLow>
         <m:r>
           <m:rPr>
             <m:sty m:val="p"/>
@@ -37024,16 +37039,21 @@
             <m:grow/>
           </m:dPr>
           <m:e>
-            <m:acc>
-              <m:accPr>
-                <m:chr m:val="̃"/>
-              </m:accPr>
+            <m:limLow>
               <m:e>
                 <m:r>
                   <m:t>μ</m:t>
                 </m:r>
               </m:e>
-            </m:acc>
+              <m:lim>
+                <m:r>
+                  <m:rPr>
+                    <m:sty m:val="p"/>
+                  </m:rPr>
+                  <m:t>∼</m:t>
+                </m:r>
+              </m:lim>
+            </m:limLow>
             <m:r>
               <m:rPr>
                 <m:sty m:val="p"/>
@@ -37065,16 +37085,21 @@
         <w:t xml:space="preserve"> </w:t>
       </w:r>
       <m:oMath>
-        <m:acc>
-          <m:accPr>
-            <m:chr m:val="̃"/>
-          </m:accPr>
+        <m:limLow>
           <m:e>
             <m:r>
               <m:t>X</m:t>
             </m:r>
           </m:e>
-        </m:acc>
+          <m:lim>
+            <m:r>
+              <m:rPr>
+                <m:sty m:val="p"/>
+              </m:rPr>
+              <m:t>∼</m:t>
+            </m:r>
+          </m:lim>
+        </m:limLow>
       </m:oMath>
       <w:r>
         <w:t xml:space="preserve"> </w:t>
@@ -37104,32 +37129,42 @@
             </m:rPr>
             <m:t>(</m:t>
           </m:r>
-          <m:acc>
-            <m:accPr>
-              <m:chr m:val="̃"/>
-            </m:accPr>
+          <m:limLow>
             <m:e>
               <m:r>
                 <m:t>X</m:t>
               </m:r>
             </m:e>
-          </m:acc>
+            <m:lim>
+              <m:r>
+                <m:rPr>
+                  <m:sty m:val="p"/>
+                </m:rPr>
+                <m:t>∼</m:t>
+              </m:r>
+            </m:lim>
+          </m:limLow>
           <m:r>
             <m:rPr>
               <m:sty m:val="p"/>
             </m:rPr>
             <m:t>=</m:t>
           </m:r>
-          <m:acc>
-            <m:accPr>
-              <m:chr m:val="̃"/>
-            </m:accPr>
+          <m:limLow>
             <m:e>
               <m:r>
                 <m:t>x</m:t>
               </m:r>
             </m:e>
-          </m:acc>
+            <m:lim>
+              <m:r>
+                <m:rPr>
+                  <m:sty m:val="p"/>
+                </m:rPr>
+                <m:t>∼</m:t>
+              </m:r>
+            </m:lim>
+          </m:limLow>
           <m:r>
             <m:rPr>
               <m:sty m:val="p"/>
@@ -37285,32 +37320,42 @@
                     </m:rPr>
                     <m:t>(</m:t>
                   </m:r>
-                  <m:acc>
-                    <m:accPr>
-                      <m:chr m:val="̃"/>
-                    </m:accPr>
+                  <m:limLow>
                     <m:e>
                       <m:r>
                         <m:t>x</m:t>
                       </m:r>
                     </m:e>
-                  </m:acc>
+                    <m:lim>
+                      <m:r>
+                        <m:rPr>
+                          <m:sty m:val="p"/>
+                        </m:rPr>
+                        <m:t>∼</m:t>
+                      </m:r>
+                    </m:lim>
+                  </m:limLow>
                   <m:r>
                     <m:rPr>
                       <m:sty m:val="p"/>
                     </m:rPr>
                     <m:t>−</m:t>
                   </m:r>
-                  <m:acc>
-                    <m:accPr>
-                      <m:chr m:val="̃"/>
-                    </m:accPr>
+                  <m:limLow>
                     <m:e>
                       <m:r>
                         <m:t>μ</m:t>
                       </m:r>
                     </m:e>
-                  </m:acc>
+                    <m:lim>
+                      <m:r>
+                        <m:rPr>
+                          <m:sty m:val="p"/>
+                        </m:rPr>
+                        <m:t>∼</m:t>
+                      </m:r>
+                    </m:lim>
+                  </m:limLow>
                   <m:r>
                     <m:rPr>
                       <m:sty m:val="p"/>
@@ -37354,32 +37399,42 @@
                 </m:rPr>
                 <m:t>(</m:t>
               </m:r>
-              <m:acc>
-                <m:accPr>
-                  <m:chr m:val="̃"/>
-                </m:accPr>
+              <m:limLow>
                 <m:e>
                   <m:r>
                     <m:t>x</m:t>
                   </m:r>
                 </m:e>
-              </m:acc>
+                <m:lim>
+                  <m:r>
+                    <m:rPr>
+                      <m:sty m:val="p"/>
+                    </m:rPr>
+                    <m:t>∼</m:t>
+                  </m:r>
+                </m:lim>
+              </m:limLow>
               <m:r>
                 <m:rPr>
                   <m:sty m:val="p"/>
                 </m:rPr>
                 <m:t>−</m:t>
               </m:r>
-              <m:acc>
-                <m:accPr>
-                  <m:chr m:val="̃"/>
-                </m:accPr>
+              <m:limLow>
                 <m:e>
                   <m:r>
                     <m:t>μ</m:t>
                   </m:r>
                 </m:e>
-              </m:acc>
+                <m:lim>
+                  <m:r>
+                    <m:rPr>
+                      <m:sty m:val="p"/>
+                    </m:rPr>
+                    <m:t>∼</m:t>
+                  </m:r>
+                </m:lim>
+              </m:limLow>
               <m:r>
                 <m:rPr>
                   <m:sty m:val="p"/>
@@ -37397,16 +37452,21 @@
           <m:r>
             <m:t> </m:t>
           </m:r>
-          <m:acc>
-            <m:accPr>
-              <m:chr m:val="̃"/>
-            </m:accPr>
+          <m:limLow>
             <m:e>
               <m:r>
                 <m:t>x</m:t>
               </m:r>
             </m:e>
-          </m:acc>
+            <m:lim>
+              <m:r>
+                <m:rPr>
+                  <m:sty m:val="p"/>
+                </m:rPr>
+                <m:t>∼</m:t>
+              </m:r>
+            </m:lim>
+          </m:limLow>
           <m:r>
             <m:rPr>
               <m:sty m:val="p"/>
@@ -37700,16 +37760,21 @@
           </m:rPr>
           <m:t>(</m:t>
         </m:r>
-        <m:acc>
-          <m:accPr>
-            <m:chr m:val="̃"/>
-          </m:accPr>
+        <m:limLow>
           <m:e>
             <m:r>
               <m:t>X</m:t>
             </m:r>
           </m:e>
-        </m:acc>
+          <m:lim>
+            <m:r>
+              <m:rPr>
+                <m:sty m:val="p"/>
+              </m:rPr>
+              <m:t>∼</m:t>
+            </m:r>
+          </m:lim>
+        </m:limLow>
         <m:r>
           <m:rPr>
             <m:sty m:val="p"/>
@@ -37899,16 +37964,21 @@
         <w:t xml:space="preserve"> </w:t>
       </w:r>
       <m:oMath>
-        <m:acc>
-          <m:accPr>
-            <m:chr m:val="̃"/>
-          </m:accPr>
+        <m:limLow>
           <m:e>
             <m:r>
               <m:t>X</m:t>
             </m:r>
           </m:e>
-        </m:acc>
+          <m:lim>
+            <m:r>
+              <m:rPr>
+                <m:sty m:val="p"/>
+              </m:rPr>
+              <m:t>∼</m:t>
+            </m:r>
+          </m:lim>
+        </m:limLow>
         <m:r>
           <m:rPr>
             <m:sty m:val="p"/>
@@ -37941,16 +38011,21 @@
             <m:grow/>
           </m:dPr>
           <m:e>
-            <m:acc>
-              <m:accPr>
-                <m:chr m:val="̃"/>
-              </m:accPr>
+            <m:limLow>
               <m:e>
                 <m:r>
                   <m:t>μ</m:t>
                 </m:r>
               </m:e>
-            </m:acc>
+              <m:lim>
+                <m:r>
+                  <m:rPr>
+                    <m:sty m:val="p"/>
+                  </m:rPr>
+                  <m:t>∼</m:t>
+                </m:r>
+              </m:lim>
+            </m:limLow>
             <m:r>
               <m:rPr>
                 <m:sty m:val="p"/>
@@ -38057,16 +38132,21 @@
         <w:t xml:space="preserve"> </w:t>
       </w:r>
       <m:oMath>
-        <m:acc>
-          <m:accPr>
-            <m:chr m:val="̃"/>
-          </m:accPr>
+        <m:limLow>
           <m:e>
             <m:r>
               <m:t>X</m:t>
             </m:r>
           </m:e>
-        </m:acc>
+          <m:lim>
+            <m:r>
+              <m:rPr>
+                <m:sty m:val="p"/>
+              </m:rPr>
+              <m:t>∼</m:t>
+            </m:r>
+          </m:lim>
+        </m:limLow>
         <m:r>
           <m:rPr>
             <m:sty m:val="p"/>
@@ -38099,16 +38179,21 @@
             <m:grow/>
           </m:dPr>
           <m:e>
-            <m:acc>
-              <m:accPr>
-                <m:chr m:val="̃"/>
-              </m:accPr>
+            <m:limLow>
               <m:e>
                 <m:r>
                   <m:t>μ</m:t>
                 </m:r>
               </m:e>
-            </m:acc>
+              <m:lim>
+                <m:r>
+                  <m:rPr>
+                    <m:sty m:val="p"/>
+                  </m:rPr>
+                  <m:t>∼</m:t>
+                </m:r>
+              </m:lim>
+            </m:limLow>
             <m:r>
               <m:rPr>
                 <m:sty m:val="p"/>
@@ -38160,32 +38245,42 @@
           </m:rPr>
           <m:t>E</m:t>
         </m:r>
-        <m:acc>
-          <m:accPr>
-            <m:chr m:val="̃"/>
-          </m:accPr>
+        <m:limLow>
           <m:e>
             <m:r>
               <m:t>X</m:t>
             </m:r>
           </m:e>
-        </m:acc>
+          <m:lim>
+            <m:r>
+              <m:rPr>
+                <m:sty m:val="p"/>
+              </m:rPr>
+              <m:t>∼</m:t>
+            </m:r>
+          </m:lim>
+        </m:limLow>
         <m:r>
           <m:rPr>
             <m:sty m:val="p"/>
           </m:rPr>
           <m:t>=</m:t>
         </m:r>
-        <m:acc>
-          <m:accPr>
-            <m:chr m:val="̃"/>
-          </m:accPr>
+        <m:limLow>
           <m:e>
             <m:r>
               <m:t>μ</m:t>
             </m:r>
           </m:e>
-        </m:acc>
+          <m:lim>
+            <m:r>
+              <m:rPr>
+                <m:sty m:val="p"/>
+              </m:rPr>
+              <m:t>∼</m:t>
+            </m:r>
+          </m:lim>
+        </m:limLow>
       </m:oMath>
       <w:r>
         <w:t xml:space="preserve"> </w:t>
@@ -38234,16 +38329,21 @@
             <m:grow/>
           </m:dPr>
           <m:e>
-            <m:acc>
-              <m:accPr>
-                <m:chr m:val="̃"/>
-              </m:accPr>
+            <m:limLow>
               <m:e>
                 <m:r>
                   <m:t>X</m:t>
                 </m:r>
               </m:e>
-            </m:acc>
+              <m:lim>
+                <m:r>
+                  <m:rPr>
+                    <m:sty m:val="p"/>
+                  </m:rPr>
+                  <m:t>∼</m:t>
+                </m:r>
+              </m:lim>
+            </m:limLow>
           </m:e>
         </m:d>
         <m:r>
@@ -38498,16 +38598,21 @@
         <w:t xml:space="preserve"> </w:t>
       </w:r>
       <m:oMath>
-        <m:acc>
-          <m:accPr>
-            <m:chr m:val="̃"/>
-          </m:accPr>
+        <m:limLow>
           <m:e>
             <m:r>
               <m:t>μ</m:t>
             </m:r>
           </m:e>
-        </m:acc>
+          <m:lim>
+            <m:r>
+              <m:rPr>
+                <m:sty m:val="p"/>
+              </m:rPr>
+              <m:t>∼</m:t>
+            </m:r>
+          </m:lim>
+        </m:limLow>
         <m:r>
           <m:rPr>
             <m:sty m:val="p"/>
@@ -38791,32 +38896,42 @@
                 </m:rPr>
                 <m:t>(</m:t>
               </m:r>
-              <m:acc>
-                <m:accPr>
-                  <m:chr m:val="̃"/>
-                </m:accPr>
+              <m:limLow>
                 <m:e>
                   <m:r>
                     <m:t>X</m:t>
                   </m:r>
                 </m:e>
-              </m:acc>
+                <m:lim>
+                  <m:r>
+                    <m:rPr>
+                      <m:sty m:val="p"/>
+                    </m:rPr>
+                    <m:t>∼</m:t>
+                  </m:r>
+                </m:lim>
+              </m:limLow>
               <m:r>
                 <m:rPr>
                   <m:sty m:val="p"/>
                 </m:rPr>
                 <m:t>=</m:t>
               </m:r>
-              <m:acc>
-                <m:accPr>
-                  <m:chr m:val="̃"/>
-                </m:accPr>
+              <m:limLow>
                 <m:e>
                   <m:r>
                     <m:t>x</m:t>
                   </m:r>
                 </m:e>
-              </m:acc>
+                <m:lim>
+                  <m:r>
+                    <m:rPr>
+                      <m:sty m:val="p"/>
+                    </m:rPr>
+                    <m:t>∼</m:t>
+                  </m:r>
+                </m:lim>
+              </m:limLow>
               <m:r>
                 <m:rPr>
                   <m:sty m:val="p"/>
@@ -39314,32 +39429,42 @@
         <w:t xml:space="preserve"> </w:t>
       </w:r>
       <m:oMath>
-        <m:acc>
-          <m:accPr>
-            <m:chr m:val="̃"/>
-          </m:accPr>
+        <m:limLow>
           <m:e>
             <m:r>
               <m:t>x</m:t>
             </m:r>
           </m:e>
-        </m:acc>
+          <m:lim>
+            <m:r>
+              <m:rPr>
+                <m:sty m:val="p"/>
+              </m:rPr>
+              <m:t>∼</m:t>
+            </m:r>
+          </m:lim>
+        </m:limLow>
         <m:r>
           <m:rPr>
             <m:sty m:val="p"/>
           </m:rPr>
           <m:t>,</m:t>
         </m:r>
-        <m:acc>
-          <m:accPr>
-            <m:chr m:val="̃"/>
-          </m:accPr>
+        <m:limLow>
           <m:e>
             <m:r>
               <m:t>μ</m:t>
             </m:r>
           </m:e>
-        </m:acc>
+          <m:lim>
+            <m:r>
+              <m:rPr>
+                <m:sty m:val="p"/>
+              </m:rPr>
+              <m:t>∼</m:t>
+            </m:r>
+          </m:lim>
+        </m:limLow>
         <m:r>
           <m:rPr>
             <m:sty m:val="p"/>
@@ -39384,32 +39509,42 @@
                 </m:rPr>
                 <m:t>(</m:t>
               </m:r>
-              <m:acc>
-                <m:accPr>
-                  <m:chr m:val="̃"/>
-                </m:accPr>
+              <m:limLow>
                 <m:e>
                   <m:r>
                     <m:t>x</m:t>
                   </m:r>
                 </m:e>
-              </m:acc>
+                <m:lim>
+                  <m:r>
+                    <m:rPr>
+                      <m:sty m:val="p"/>
+                    </m:rPr>
+                    <m:t>∼</m:t>
+                  </m:r>
+                </m:lim>
+              </m:limLow>
               <m:r>
                 <m:rPr>
                   <m:sty m:val="p"/>
                 </m:rPr>
                 <m:t>−</m:t>
               </m:r>
-              <m:acc>
-                <m:accPr>
-                  <m:chr m:val="̃"/>
-                </m:accPr>
+              <m:limLow>
                 <m:e>
                   <m:r>
                     <m:t>μ</m:t>
                   </m:r>
                 </m:e>
-              </m:acc>
+                <m:lim>
+                  <m:r>
+                    <m:rPr>
+                      <m:sty m:val="p"/>
+                    </m:rPr>
+                    <m:t>∼</m:t>
+                  </m:r>
+                </m:lim>
+              </m:limLow>
               <m:r>
                 <m:rPr>
                   <m:sty m:val="p"/>
@@ -39453,32 +39588,42 @@
             </m:rPr>
             <m:t>(</m:t>
           </m:r>
-          <m:acc>
-            <m:accPr>
-              <m:chr m:val="̃"/>
-            </m:accPr>
+          <m:limLow>
             <m:e>
               <m:r>
                 <m:t>x</m:t>
               </m:r>
             </m:e>
-          </m:acc>
+            <m:lim>
+              <m:r>
+                <m:rPr>
+                  <m:sty m:val="p"/>
+                </m:rPr>
+                <m:t>∼</m:t>
+              </m:r>
+            </m:lim>
+          </m:limLow>
           <m:r>
             <m:rPr>
               <m:sty m:val="p"/>
             </m:rPr>
             <m:t>−</m:t>
           </m:r>
-          <m:acc>
-            <m:accPr>
-              <m:chr m:val="̃"/>
-            </m:accPr>
+          <m:limLow>
             <m:e>
               <m:r>
                 <m:t>μ</m:t>
               </m:r>
             </m:e>
-          </m:acc>
+            <m:lim>
+              <m:r>
+                <m:rPr>
+                  <m:sty m:val="p"/>
+                </m:rPr>
+                <m:t>∼</m:t>
+              </m:r>
+            </m:lim>
+          </m:limLow>
           <m:r>
             <m:rPr>
               <m:sty m:val="p"/>
@@ -39514,32 +39659,42 @@
         <w:t xml:space="preserve"> </w:t>
       </w:r>
       <m:oMath>
-        <m:acc>
-          <m:accPr>
-            <m:chr m:val="̃"/>
-          </m:accPr>
+        <m:limLow>
           <m:e>
             <m:r>
               <m:t>x</m:t>
             </m:r>
           </m:e>
-        </m:acc>
+          <m:lim>
+            <m:r>
+              <m:rPr>
+                <m:sty m:val="p"/>
+              </m:rPr>
+              <m:t>∼</m:t>
+            </m:r>
+          </m:lim>
+        </m:limLow>
         <m:r>
           <m:rPr>
             <m:sty m:val="p"/>
           </m:rPr>
           <m:t>=</m:t>
         </m:r>
-        <m:acc>
-          <m:accPr>
-            <m:chr m:val="̃"/>
-          </m:accPr>
+        <m:limLow>
           <m:e>
             <m:r>
               <m:t>μ</m:t>
             </m:r>
           </m:e>
-        </m:acc>
+          <m:lim>
+            <m:r>
+              <m:rPr>
+                <m:sty m:val="p"/>
+              </m:rPr>
+              <m:t>∼</m:t>
+            </m:r>
+          </m:lim>
+        </m:limLow>
       </m:oMath>
       <w:r>
         <w:t xml:space="preserve">.</w:t>
@@ -39616,32 +39771,42 @@
         <w:t xml:space="preserve"> </w:t>
       </w:r>
       <m:oMath>
-        <m:acc>
-          <m:accPr>
-            <m:chr m:val="̃"/>
-          </m:accPr>
+        <m:limLow>
           <m:e>
             <m:r>
               <m:t>x</m:t>
             </m:r>
           </m:e>
-        </m:acc>
+          <m:lim>
+            <m:r>
+              <m:rPr>
+                <m:sty m:val="p"/>
+              </m:rPr>
+              <m:t>∼</m:t>
+            </m:r>
+          </m:lim>
+        </m:limLow>
         <m:r>
           <m:rPr>
             <m:sty m:val="p"/>
           </m:rPr>
           <m:t>≠</m:t>
         </m:r>
-        <m:acc>
-          <m:accPr>
-            <m:chr m:val="̃"/>
-          </m:accPr>
+        <m:limLow>
           <m:e>
             <m:r>
               <m:t>μ</m:t>
             </m:r>
           </m:e>
-        </m:acc>
+          <m:lim>
+            <m:r>
+              <m:rPr>
+                <m:sty m:val="p"/>
+              </m:rPr>
+              <m:t>∼</m:t>
+            </m:r>
+          </m:lim>
+        </m:limLow>
       </m:oMath>
       <w:r>
         <w:t xml:space="preserve">, then</w:t>
@@ -39650,48 +39815,63 @@
         <w:t xml:space="preserve"> </w:t>
       </w:r>
       <m:oMath>
-        <m:acc>
-          <m:accPr>
-            <m:chr m:val="̃"/>
-          </m:accPr>
+        <m:limLow>
           <m:e>
             <m:r>
               <m:t>x</m:t>
             </m:r>
           </m:e>
-        </m:acc>
+          <m:lim>
+            <m:r>
+              <m:rPr>
+                <m:sty m:val="p"/>
+              </m:rPr>
+              <m:t>∼</m:t>
+            </m:r>
+          </m:lim>
+        </m:limLow>
         <m:r>
           <m:rPr>
             <m:sty m:val="p"/>
           </m:rPr>
           <m:t>−</m:t>
         </m:r>
-        <m:acc>
-          <m:accPr>
-            <m:chr m:val="̃"/>
-          </m:accPr>
+        <m:limLow>
           <m:e>
             <m:r>
               <m:t>μ</m:t>
             </m:r>
           </m:e>
-        </m:acc>
+          <m:lim>
+            <m:r>
+              <m:rPr>
+                <m:sty m:val="p"/>
+              </m:rPr>
+              <m:t>∼</m:t>
+            </m:r>
+          </m:lim>
+        </m:limLow>
         <m:r>
           <m:rPr>
             <m:sty m:val="p"/>
           </m:rPr>
           <m:t>≠</m:t>
         </m:r>
-        <m:acc>
-          <m:accPr>
-            <m:chr m:val="̃"/>
-          </m:accPr>
+        <m:limLow>
           <m:e>
             <m:r>
               <m:t>0</m:t>
             </m:r>
           </m:e>
-        </m:acc>
+          <m:lim>
+            <m:r>
+              <m:rPr>
+                <m:sty m:val="p"/>
+              </m:rPr>
+              <m:t>∼</m:t>
+            </m:r>
+          </m:lim>
+        </m:limLow>
       </m:oMath>
       <w:r>
         <w:t xml:space="preserve">,</w:t>
@@ -39726,32 +39906,42 @@
         <w:t xml:space="preserve"> </w:t>
       </w:r>
       <m:oMath>
-        <m:acc>
-          <m:accPr>
-            <m:chr m:val="̃"/>
-          </m:accPr>
+        <m:limLow>
           <m:e>
             <m:r>
               <m:t>x</m:t>
             </m:r>
           </m:e>
-        </m:acc>
+          <m:lim>
+            <m:r>
+              <m:rPr>
+                <m:sty m:val="p"/>
+              </m:rPr>
+              <m:t>∼</m:t>
+            </m:r>
+          </m:lim>
+        </m:limLow>
         <m:r>
           <m:rPr>
             <m:sty m:val="p"/>
           </m:rPr>
           <m:t>=</m:t>
         </m:r>
-        <m:acc>
-          <m:accPr>
-            <m:chr m:val="̃"/>
-          </m:accPr>
+        <m:limLow>
           <m:e>
             <m:r>
               <m:t>μ</m:t>
             </m:r>
           </m:e>
-        </m:acc>
+          <m:lim>
+            <m:r>
+              <m:rPr>
+                <m:sty m:val="p"/>
+              </m:rPr>
+              <m:t>∼</m:t>
+            </m:r>
+          </m:lim>
+        </m:limLow>
       </m:oMath>
       <w:r>
         <w:t xml:space="preserve">, then</w:t>
@@ -39760,48 +39950,63 @@
         <w:t xml:space="preserve"> </w:t>
       </w:r>
       <m:oMath>
-        <m:acc>
-          <m:accPr>
-            <m:chr m:val="̃"/>
-          </m:accPr>
+        <m:limLow>
           <m:e>
             <m:r>
               <m:t>x</m:t>
             </m:r>
           </m:e>
-        </m:acc>
+          <m:lim>
+            <m:r>
+              <m:rPr>
+                <m:sty m:val="p"/>
+              </m:rPr>
+              <m:t>∼</m:t>
+            </m:r>
+          </m:lim>
+        </m:limLow>
         <m:r>
           <m:rPr>
             <m:sty m:val="p"/>
           </m:rPr>
           <m:t>−</m:t>
         </m:r>
-        <m:acc>
-          <m:accPr>
-            <m:chr m:val="̃"/>
-          </m:accPr>
+        <m:limLow>
           <m:e>
             <m:r>
               <m:t>μ</m:t>
             </m:r>
           </m:e>
-        </m:acc>
+          <m:lim>
+            <m:r>
+              <m:rPr>
+                <m:sty m:val="p"/>
+              </m:rPr>
+              <m:t>∼</m:t>
+            </m:r>
+          </m:lim>
+        </m:limLow>
         <m:r>
           <m:rPr>
             <m:sty m:val="p"/>
           </m:rPr>
           <m:t>=</m:t>
         </m:r>
-        <m:acc>
-          <m:accPr>
-            <m:chr m:val="̃"/>
-          </m:accPr>
+        <m:limLow>
           <m:e>
             <m:r>
               <m:t>0</m:t>
             </m:r>
           </m:e>
-        </m:acc>
+          <m:lim>
+            <m:r>
+              <m:rPr>
+                <m:sty m:val="p"/>
+              </m:rPr>
+              <m:t>∼</m:t>
+            </m:r>
+          </m:lim>
+        </m:limLow>
       </m:oMath>
       <w:r>
         <w:t xml:space="preserve">,</w:t>
@@ -39886,32 +40091,42 @@
         <w:t xml:space="preserve"> </w:t>
       </w:r>
       <m:oMath>
-        <m:acc>
-          <m:accPr>
-            <m:chr m:val="̃"/>
-          </m:accPr>
+        <m:limLow>
           <m:e>
             <m:r>
               <m:t>x</m:t>
             </m:r>
           </m:e>
-        </m:acc>
+          <m:lim>
+            <m:r>
+              <m:rPr>
+                <m:sty m:val="p"/>
+              </m:rPr>
+              <m:t>∼</m:t>
+            </m:r>
+          </m:lim>
+        </m:limLow>
         <m:r>
           <m:rPr>
             <m:sty m:val="p"/>
           </m:rPr>
           <m:t>,</m:t>
         </m:r>
-        <m:acc>
-          <m:accPr>
-            <m:chr m:val="̃"/>
-          </m:accPr>
+        <m:limLow>
           <m:e>
             <m:r>
               <m:t>μ</m:t>
             </m:r>
           </m:e>
-        </m:acc>
+          <m:lim>
+            <m:r>
+              <m:rPr>
+                <m:sty m:val="p"/>
+              </m:rPr>
+              <m:t>∼</m:t>
+            </m:r>
+          </m:lim>
+        </m:limLow>
         <m:r>
           <m:rPr>
             <m:sty m:val="p"/>
@@ -39964,16 +40179,21 @@
         <w:t xml:space="preserve"> </w:t>
       </w:r>
       <m:oMath>
-        <m:acc>
-          <m:accPr>
-            <m:chr m:val="̃"/>
-          </m:accPr>
+        <m:limLow>
           <m:e>
             <m:r>
               <m:t>x</m:t>
             </m:r>
           </m:e>
-        </m:acc>
+          <m:lim>
+            <m:r>
+              <m:rPr>
+                <m:sty m:val="p"/>
+              </m:rPr>
+              <m:t>∼</m:t>
+            </m:r>
+          </m:lim>
+        </m:limLow>
       </m:oMath>
       <w:r>
         <w:t xml:space="preserve"> </w:t>
@@ -39985,16 +40205,21 @@
         <w:t xml:space="preserve"> </w:t>
       </w:r>
       <m:oMath>
-        <m:acc>
-          <m:accPr>
-            <m:chr m:val="̃"/>
-          </m:accPr>
+        <m:limLow>
           <m:e>
             <m:r>
               <m:t>μ</m:t>
             </m:r>
           </m:e>
-        </m:acc>
+          <m:lim>
+            <m:r>
+              <m:rPr>
+                <m:sty m:val="p"/>
+              </m:rPr>
+              <m:t>∼</m:t>
+            </m:r>
+          </m:lim>
+        </m:limLow>
       </m:oMath>
       <w:r>
         <w:t xml:space="preserve"> </w:t>
@@ -40041,16 +40266,21 @@
             </m:rPr>
             <m:t>(</m:t>
           </m:r>
-          <m:acc>
-            <m:accPr>
-              <m:chr m:val="̃"/>
-            </m:accPr>
+          <m:limLow>
             <m:e>
               <m:r>
                 <m:t>x</m:t>
               </m:r>
             </m:e>
-          </m:acc>
+            <m:lim>
+              <m:r>
+                <m:rPr>
+                  <m:sty m:val="p"/>
+                </m:rPr>
+                <m:t>∼</m:t>
+              </m:r>
+            </m:lim>
+          </m:limLow>
           <m:r>
             <m:rPr>
               <m:sty m:val="p"/>
@@ -40090,32 +40320,42 @@
                     </m:rPr>
                     <m:t>(</m:t>
                   </m:r>
-                  <m:acc>
-                    <m:accPr>
-                      <m:chr m:val="̃"/>
-                    </m:accPr>
+                  <m:limLow>
                     <m:e>
                       <m:r>
                         <m:t>x</m:t>
                       </m:r>
                     </m:e>
-                  </m:acc>
+                    <m:lim>
+                      <m:r>
+                        <m:rPr>
+                          <m:sty m:val="p"/>
+                        </m:rPr>
+                        <m:t>∼</m:t>
+                      </m:r>
+                    </m:lim>
+                  </m:limLow>
                   <m:r>
                     <m:rPr>
                       <m:sty m:val="p"/>
                     </m:rPr>
                     <m:t>−</m:t>
                   </m:r>
-                  <m:acc>
-                    <m:accPr>
-                      <m:chr m:val="̃"/>
-                    </m:accPr>
+                  <m:limLow>
                     <m:e>
                       <m:r>
                         <m:t>μ</m:t>
                       </m:r>
                     </m:e>
-                  </m:acc>
+                    <m:lim>
+                      <m:r>
+                        <m:rPr>
+                          <m:sty m:val="p"/>
+                        </m:rPr>
+                        <m:t>∼</m:t>
+                      </m:r>
+                    </m:lim>
+                  </m:limLow>
                   <m:r>
                     <m:rPr>
                       <m:sty m:val="p"/>
@@ -40159,32 +40399,42 @@
                 </m:rPr>
                 <m:t>(</m:t>
               </m:r>
-              <m:acc>
-                <m:accPr>
-                  <m:chr m:val="̃"/>
-                </m:accPr>
+              <m:limLow>
                 <m:e>
                   <m:r>
                     <m:t>x</m:t>
                   </m:r>
                 </m:e>
-              </m:acc>
+                <m:lim>
+                  <m:r>
+                    <m:rPr>
+                      <m:sty m:val="p"/>
+                    </m:rPr>
+                    <m:t>∼</m:t>
+                  </m:r>
+                </m:lim>
+              </m:limLow>
               <m:r>
                 <m:rPr>
                   <m:sty m:val="p"/>
                 </m:rPr>
                 <m:t>−</m:t>
               </m:r>
-              <m:acc>
-                <m:accPr>
-                  <m:chr m:val="̃"/>
-                </m:accPr>
+              <m:limLow>
                 <m:e>
                   <m:r>
                     <m:t>μ</m:t>
                   </m:r>
                 </m:e>
-              </m:acc>
+                <m:lim>
+                  <m:r>
+                    <m:rPr>
+                      <m:sty m:val="p"/>
+                    </m:rPr>
+                    <m:t>∼</m:t>
+                  </m:r>
+                </m:lim>
+              </m:limLow>
               <m:r>
                 <m:rPr>
                   <m:sty m:val="p"/>
@@ -40271,16 +40521,21 @@
         <w:t xml:space="preserve"> </w:t>
       </w:r>
       <m:oMath>
-        <m:acc>
-          <m:accPr>
-            <m:chr m:val="̃"/>
-          </m:accPr>
+        <m:limLow>
           <m:e>
             <m:r>
               <m:t>X</m:t>
             </m:r>
           </m:e>
-        </m:acc>
+          <m:lim>
+            <m:r>
+              <m:rPr>
+                <m:sty m:val="p"/>
+              </m:rPr>
+              <m:t>∼</m:t>
+            </m:r>
+          </m:lim>
+        </m:limLow>
         <m:r>
           <m:rPr>
             <m:sty m:val="p"/>
@@ -40313,16 +40568,21 @@
             <m:grow/>
           </m:dPr>
           <m:e>
-            <m:acc>
-              <m:accPr>
-                <m:chr m:val="̃"/>
-              </m:accPr>
+            <m:limLow>
               <m:e>
                 <m:r>
                   <m:t>μ</m:t>
                 </m:r>
               </m:e>
-            </m:acc>
+              <m:lim>
+                <m:r>
+                  <m:rPr>
+                    <m:sty m:val="p"/>
+                  </m:rPr>
+                  <m:t>∼</m:t>
+                </m:r>
+              </m:lim>
+            </m:limLow>
             <m:r>
               <m:rPr>
                 <m:sty m:val="p"/>
@@ -40366,32 +40626,42 @@
             </m:rPr>
             <m:t>(</m:t>
           </m:r>
-          <m:acc>
-            <m:accPr>
-              <m:chr m:val="̃"/>
-            </m:accPr>
+          <m:limLow>
             <m:e>
               <m:r>
                 <m:t>X</m:t>
               </m:r>
             </m:e>
-          </m:acc>
+            <m:lim>
+              <m:r>
+                <m:rPr>
+                  <m:sty m:val="p"/>
+                </m:rPr>
+                <m:t>∼</m:t>
+              </m:r>
+            </m:lim>
+          </m:limLow>
           <m:r>
             <m:rPr>
               <m:sty m:val="p"/>
             </m:rPr>
             <m:t>=</m:t>
           </m:r>
-          <m:acc>
-            <m:accPr>
-              <m:chr m:val="̃"/>
-            </m:accPr>
+          <m:limLow>
             <m:e>
               <m:r>
                 <m:t>x</m:t>
               </m:r>
             </m:e>
-          </m:acc>
+            <m:lim>
+              <m:r>
+                <m:rPr>
+                  <m:sty m:val="p"/>
+                </m:rPr>
+                <m:t>∼</m:t>
+              </m:r>
+            </m:lim>
+          </m:limLow>
           <m:r>
             <m:rPr>
               <m:sty m:val="p"/>
@@ -40528,16 +40798,21 @@
                     </m:rPr>
                     <m:t>(</m:t>
                   </m:r>
-                  <m:acc>
-                    <m:accPr>
-                      <m:chr m:val="̃"/>
-                    </m:accPr>
+                  <m:limLow>
                     <m:e>
                       <m:r>
                         <m:t>x</m:t>
                       </m:r>
                     </m:e>
-                  </m:acc>
+                    <m:lim>
+                      <m:r>
+                        <m:rPr>
+                          <m:sty m:val="p"/>
+                        </m:rPr>
+                        <m:t>∼</m:t>
+                      </m:r>
+                    </m:lim>
+                  </m:limLow>
                   <m:sSup>
                     <m:e>
                       <m:r>
@@ -40593,16 +40868,21 @@
         <w:t xml:space="preserve"> </w:t>
       </w:r>
       <m:oMath>
-        <m:acc>
-          <m:accPr>
-            <m:chr m:val="̃"/>
-          </m:accPr>
+        <m:limLow>
           <m:e>
             <m:r>
               <m:t>μ</m:t>
             </m:r>
           </m:e>
-        </m:acc>
+          <m:lim>
+            <m:r>
+              <m:rPr>
+                <m:sty m:val="p"/>
+              </m:rPr>
+              <m:t>∼</m:t>
+            </m:r>
+          </m:lim>
+        </m:limLow>
       </m:oMath>
       <w:r>
         <w:t xml:space="preserve"> </w:t>
@@ -40648,32 +40928,42 @@
         <w:t xml:space="preserve"> </w:t>
       </w:r>
       <m:oMath>
-        <m:acc>
-          <m:accPr>
-            <m:chr m:val="̃"/>
-          </m:accPr>
+        <m:limLow>
           <m:e>
             <m:r>
               <m:t>x</m:t>
             </m:r>
           </m:e>
-        </m:acc>
+          <m:lim>
+            <m:r>
+              <m:rPr>
+                <m:sty m:val="p"/>
+              </m:rPr>
+              <m:t>∼</m:t>
+            </m:r>
+          </m:lim>
+        </m:limLow>
         <m:r>
           <m:rPr>
             <m:sty m:val="p"/>
           </m:rPr>
           <m:t>=</m:t>
         </m:r>
-        <m:acc>
-          <m:accPr>
-            <m:chr m:val="̃"/>
-          </m:accPr>
+        <m:limLow>
           <m:e>
             <m:r>
               <m:t>μ</m:t>
             </m:r>
           </m:e>
-        </m:acc>
+          <m:lim>
+            <m:r>
+              <m:rPr>
+                <m:sty m:val="p"/>
+              </m:rPr>
+              <m:t>∼</m:t>
+            </m:r>
+          </m:lim>
+        </m:limLow>
       </m:oMath>
       <w:r>
         <w:t xml:space="preserve">,</w:t>
@@ -40700,16 +40990,21 @@
           </m:rPr>
           <m:t>(</m:t>
         </m:r>
-        <m:acc>
-          <m:accPr>
-            <m:chr m:val="̃"/>
-          </m:accPr>
+        <m:limLow>
           <m:e>
             <m:r>
               <m:t>x</m:t>
             </m:r>
           </m:e>
-        </m:acc>
+          <m:lim>
+            <m:r>
+              <m:rPr>
+                <m:sty m:val="p"/>
+              </m:rPr>
+              <m:t>∼</m:t>
+            </m:r>
+          </m:lim>
+        </m:limLow>
         <m:r>
           <m:rPr>
             <m:sty m:val="p"/>
@@ -40733,16 +41028,21 @@
         <w:t xml:space="preserve"> </w:t>
       </w:r>
       <m:oMath>
-        <m:acc>
-          <m:accPr>
-            <m:chr m:val="̃"/>
-          </m:accPr>
+        <m:limLow>
           <m:e>
             <m:r>
               <m:t>x</m:t>
             </m:r>
           </m:e>
-        </m:acc>
+          <m:lim>
+            <m:r>
+              <m:rPr>
+                <m:sty m:val="p"/>
+              </m:rPr>
+              <m:t>∼</m:t>
+            </m:r>
+          </m:lim>
+        </m:limLow>
       </m:oMath>
       <w:r>
         <w:t xml:space="preserve"> </w:t>
@@ -40766,16 +41066,21 @@
           </m:rPr>
           <m:t>(</m:t>
         </m:r>
-        <m:acc>
-          <m:accPr>
-            <m:chr m:val="̃"/>
-          </m:accPr>
+        <m:limLow>
           <m:e>
             <m:r>
               <m:t>x</m:t>
             </m:r>
           </m:e>
-        </m:acc>
+          <m:lim>
+            <m:r>
+              <m:rPr>
+                <m:sty m:val="p"/>
+              </m:rPr>
+              <m:t>∼</m:t>
+            </m:r>
+          </m:lim>
+        </m:limLow>
         <m:r>
           <m:rPr>
             <m:sty m:val="p"/>
@@ -40958,16 +41263,21 @@
           </m:rPr>
           <m:t>(</m:t>
         </m:r>
-        <m:acc>
-          <m:accPr>
-            <m:chr m:val="̃"/>
-          </m:accPr>
+        <m:limLow>
           <m:e>
             <m:r>
               <m:t>x</m:t>
             </m:r>
           </m:e>
-        </m:acc>
+          <m:lim>
+            <m:r>
+              <m:rPr>
+                <m:sty m:val="p"/>
+              </m:rPr>
+              <m:t>∼</m:t>
+            </m:r>
+          </m:lim>
+        </m:limLow>
         <m:r>
           <m:rPr>
             <m:sty m:val="p"/>
@@ -40994,32 +41304,42 @@
         <w:t xml:space="preserve"> </w:t>
       </w:r>
       <m:oMath>
-        <m:acc>
-          <m:accPr>
-            <m:chr m:val="̃"/>
-          </m:accPr>
+        <m:limLow>
           <m:e>
             <m:r>
               <m:t>x</m:t>
             </m:r>
           </m:e>
-        </m:acc>
+          <m:lim>
+            <m:r>
+              <m:rPr>
+                <m:sty m:val="p"/>
+              </m:rPr>
+              <m:t>∼</m:t>
+            </m:r>
+          </m:lim>
+        </m:limLow>
         <m:r>
           <m:rPr>
             <m:sty m:val="p"/>
           </m:rPr>
           <m:t>=</m:t>
         </m:r>
-        <m:acc>
-          <m:accPr>
-            <m:chr m:val="̃"/>
-          </m:accPr>
+        <m:limLow>
           <m:e>
             <m:r>
               <m:t>μ</m:t>
             </m:r>
           </m:e>
-        </m:acc>
+          <m:lim>
+            <m:r>
+              <m:rPr>
+                <m:sty m:val="p"/>
+              </m:rPr>
+              <m:t>∼</m:t>
+            </m:r>
+          </m:lim>
+        </m:limLow>
       </m:oMath>
       <w:r>
         <w:t xml:space="preserve">.</w:t>
@@ -41315,16 +41635,21 @@
             </m:rPr>
             <m:t>(</m:t>
           </m:r>
-          <m:acc>
-            <m:accPr>
-              <m:chr m:val="̃"/>
-            </m:accPr>
+          <m:limLow>
             <m:e>
               <m:r>
                 <m:t>x</m:t>
               </m:r>
             </m:e>
-          </m:acc>
+            <m:lim>
+              <m:r>
+                <m:rPr>
+                  <m:sty m:val="p"/>
+                </m:rPr>
+                <m:t>∼</m:t>
+              </m:r>
+            </m:lim>
+          </m:limLow>
           <m:sSup>
             <m:e>
               <m:r>
@@ -41531,16 +41856,21 @@
           </m:rPr>
           <m:t>(</m:t>
         </m:r>
-        <m:acc>
-          <m:accPr>
-            <m:chr m:val="̃"/>
-          </m:accPr>
+        <m:limLow>
           <m:e>
             <m:r>
               <m:t>x</m:t>
             </m:r>
           </m:e>
-        </m:acc>
+          <m:lim>
+            <m:r>
+              <m:rPr>
+                <m:sty m:val="p"/>
+              </m:rPr>
+              <m:t>∼</m:t>
+            </m:r>
+          </m:lim>
+        </m:limLow>
         <m:sSup>
           <m:e>
             <m:r>
@@ -41733,16 +42063,21 @@
           </m:rPr>
           <m:t>(</m:t>
         </m:r>
-        <m:acc>
-          <m:accPr>
-            <m:chr m:val="̃"/>
-          </m:accPr>
+        <m:limLow>
           <m:e>
             <m:r>
               <m:t>x</m:t>
             </m:r>
           </m:e>
-        </m:acc>
+          <m:lim>
+            <m:r>
+              <m:rPr>
+                <m:sty m:val="p"/>
+              </m:rPr>
+              <m:t>∼</m:t>
+            </m:r>
+          </m:lim>
+        </m:limLow>
         <m:r>
           <m:rPr>
             <m:sty m:val="p"/>
@@ -41805,16 +42140,21 @@
         <w:t xml:space="preserve"> </w:t>
       </w:r>
       <m:oMath>
-        <m:acc>
-          <m:accPr>
-            <m:chr m:val="̃"/>
-          </m:accPr>
+        <m:limLow>
           <m:e>
             <m:r>
               <m:t>X</m:t>
             </m:r>
           </m:e>
-        </m:acc>
+          <m:lim>
+            <m:r>
+              <m:rPr>
+                <m:sty m:val="p"/>
+              </m:rPr>
+              <m:t>∼</m:t>
+            </m:r>
+          </m:lim>
+        </m:limLow>
         <m:r>
           <m:rPr>
             <m:sty m:val="p"/>
@@ -41847,16 +42187,21 @@
             <m:grow/>
           </m:dPr>
           <m:e>
-            <m:acc>
-              <m:accPr>
-                <m:chr m:val="̃"/>
-              </m:accPr>
+            <m:limLow>
               <m:e>
                 <m:r>
                   <m:t>μ</m:t>
                 </m:r>
               </m:e>
-            </m:acc>
+              <m:lim>
+                <m:r>
+                  <m:rPr>
+                    <m:sty m:val="p"/>
+                  </m:rPr>
+                  <m:t>∼</m:t>
+                </m:r>
+              </m:lim>
+            </m:limLow>
             <m:r>
               <m:rPr>
                 <m:sty m:val="p"/>
@@ -41980,16 +42325,21 @@
         <w:t xml:space="preserve"> </w:t>
       </w:r>
       <m:oMath>
-        <m:acc>
-          <m:accPr>
-            <m:chr m:val="̃"/>
-          </m:accPr>
+        <m:limLow>
           <m:e>
             <m:r>
               <m:t>X</m:t>
             </m:r>
           </m:e>
-        </m:acc>
+          <m:lim>
+            <m:r>
+              <m:rPr>
+                <m:sty m:val="p"/>
+              </m:rPr>
+              <m:t>∼</m:t>
+            </m:r>
+          </m:lim>
+        </m:limLow>
       </m:oMath>
       <w:r>
         <w:t xml:space="preserve"> </w:t>
@@ -42549,32 +42899,42 @@
                 </m:rPr>
                 <m:t>(</m:t>
               </m:r>
-              <m:acc>
-                <m:accPr>
-                  <m:chr m:val="̃"/>
-                </m:accPr>
+              <m:limLow>
                 <m:e>
                   <m:r>
                     <m:t>X</m:t>
                   </m:r>
                 </m:e>
-              </m:acc>
+                <m:lim>
+                  <m:r>
+                    <m:rPr>
+                      <m:sty m:val="p"/>
+                    </m:rPr>
+                    <m:t>∼</m:t>
+                  </m:r>
+                </m:lim>
+              </m:limLow>
               <m:r>
                 <m:rPr>
                   <m:sty m:val="p"/>
                 </m:rPr>
                 <m:t>=</m:t>
               </m:r>
-              <m:acc>
-                <m:accPr>
-                  <m:chr m:val="̃"/>
-                </m:accPr>
+              <m:limLow>
                 <m:e>
                   <m:r>
                     <m:t>x</m:t>
                   </m:r>
                 </m:e>
-              </m:acc>
+                <m:lim>
+                  <m:r>
+                    <m:rPr>
+                      <m:sty m:val="p"/>
+                    </m:rPr>
+                    <m:t>∼</m:t>
+                  </m:r>
+                </m:lim>
+              </m:limLow>
               <m:r>
                 <m:rPr>
                   <m:sty m:val="p"/>
@@ -43418,16 +43778,21 @@
         <w:t xml:space="preserve"> </w:t>
       </w:r>
       <m:oMath>
-        <m:acc>
-          <m:accPr>
-            <m:chr m:val="̃"/>
-          </m:accPr>
+        <m:limLow>
           <m:e>
             <m:r>
               <m:t>X</m:t>
             </m:r>
           </m:e>
-        </m:acc>
+          <m:lim>
+            <m:r>
+              <m:rPr>
+                <m:sty m:val="p"/>
+              </m:rPr>
+              <m:t>∼</m:t>
+            </m:r>
+          </m:lim>
+        </m:limLow>
         <m:r>
           <m:rPr>
             <m:sty m:val="p"/>
@@ -43460,16 +43825,21 @@
             <m:grow/>
           </m:dPr>
           <m:e>
-            <m:acc>
-              <m:accPr>
-                <m:chr m:val="̃"/>
-              </m:accPr>
+            <m:limLow>
               <m:e>
                 <m:r>
                   <m:t>μ</m:t>
                 </m:r>
               </m:e>
-            </m:acc>
+              <m:lim>
+                <m:r>
+                  <m:rPr>
+                    <m:sty m:val="p"/>
+                  </m:rPr>
+                  <m:t>∼</m:t>
+                </m:r>
+              </m:lim>
+            </m:limLow>
             <m:r>
               <m:rPr>
                 <m:sty m:val="p"/>
@@ -43725,16 +44095,21 @@
             <m:grow/>
           </m:dPr>
           <m:e>
-            <m:acc>
-              <m:accPr>
-                <m:chr m:val="̃"/>
-              </m:accPr>
+            <m:limLow>
               <m:e>
                 <m:r>
                   <m:t>X</m:t>
                 </m:r>
               </m:e>
-            </m:acc>
+              <m:lim>
+                <m:r>
+                  <m:rPr>
+                    <m:sty m:val="p"/>
+                  </m:rPr>
+                  <m:t>∼</m:t>
+                </m:r>
+              </m:lim>
+            </m:limLow>
           </m:e>
         </m:d>
         <m:r>
@@ -44564,16 +44939,21 @@
       <m:oMath>
         <m:sSub>
           <m:e>
-            <m:acc>
-              <m:accPr>
-                <m:chr m:val="̃"/>
-              </m:accPr>
+            <m:limLow>
               <m:e>
                 <m:r>
                   <m:t>q</m:t>
                 </m:r>
               </m:e>
-            </m:acc>
+              <m:lim>
+                <m:r>
+                  <m:rPr>
+                    <m:sty m:val="p"/>
+                  </m:rPr>
+                  <m:t>∼</m:t>
+                </m:r>
+              </m:lim>
+            </m:limLow>
           </m:e>
           <m:sub>
             <m:r>
@@ -44601,16 +44981,21 @@
         </m:r>
         <m:sSub>
           <m:e>
-            <m:acc>
-              <m:accPr>
-                <m:chr m:val="̃"/>
-              </m:accPr>
+            <m:limLow>
               <m:e>
                 <m:r>
                   <m:t>q</m:t>
                 </m:r>
               </m:e>
-            </m:acc>
+              <m:lim>
+                <m:r>
+                  <m:rPr>
+                    <m:sty m:val="p"/>
+                  </m:rPr>
+                  <m:t>∼</m:t>
+                </m:r>
+              </m:lim>
+            </m:limLow>
           </m:e>
           <m:sub>
             <m:r>
@@ -44720,16 +45105,21 @@
             </m:rPr>
             <m:t>(</m:t>
           </m:r>
-          <m:acc>
-            <m:accPr>
-              <m:chr m:val="̃"/>
-            </m:accPr>
+          <m:limLow>
             <m:e>
               <m:r>
                 <m:t>x</m:t>
               </m:r>
             </m:e>
-          </m:acc>
+            <m:lim>
+              <m:r>
+                <m:rPr>
+                  <m:sty m:val="p"/>
+                </m:rPr>
+                <m:t>∼</m:t>
+              </m:r>
+            </m:lim>
+          </m:limLow>
           <m:sSup>
             <m:e>
               <m:r>
@@ -44798,16 +45188,21 @@
                         <m:e>
                           <m:sSub>
                             <m:e>
-                              <m:acc>
-                                <m:accPr>
-                                  <m:chr m:val="̃"/>
-                                </m:accPr>
+                              <m:limLow>
                                 <m:e>
                                   <m:r>
                                     <m:t>q</m:t>
                                   </m:r>
                                 </m:e>
-                              </m:acc>
+                                <m:lim>
+                                  <m:r>
+                                    <m:rPr>
+                                      <m:sty m:val="p"/>
+                                    </m:rPr>
+                                    <m:t>∼</m:t>
+                                  </m:r>
+                                </m:lim>
+                              </m:limLow>
                             </m:e>
                             <m:sub>
                               <m:r>
@@ -44831,32 +45226,42 @@
                         </m:rPr>
                         <m:t>(</m:t>
                       </m:r>
-                      <m:acc>
-                        <m:accPr>
-                          <m:chr m:val="̃"/>
-                        </m:accPr>
+                      <m:limLow>
                         <m:e>
                           <m:r>
                             <m:t>x</m:t>
                           </m:r>
                         </m:e>
-                      </m:acc>
+                        <m:lim>
+                          <m:r>
+                            <m:rPr>
+                              <m:sty m:val="p"/>
+                            </m:rPr>
+                            <m:t>∼</m:t>
+                          </m:r>
+                        </m:lim>
+                      </m:limLow>
                       <m:r>
                         <m:rPr>
                           <m:sty m:val="p"/>
                         </m:rPr>
                         <m:t>−</m:t>
                       </m:r>
-                      <m:acc>
-                        <m:accPr>
-                          <m:chr m:val="̃"/>
-                        </m:accPr>
+                      <m:limLow>
                         <m:e>
                           <m:r>
                             <m:t>μ</m:t>
                           </m:r>
                         </m:e>
-                      </m:acc>
+                        <m:lim>
+                          <m:r>
+                            <m:rPr>
+                              <m:sty m:val="p"/>
+                            </m:rPr>
+                            <m:t>∼</m:t>
+                          </m:r>
+                        </m:lim>
+                      </m:limLow>
                       <m:r>
                         <m:rPr>
                           <m:sty m:val="p"/>
@@ -44920,16 +45325,21 @@
         <w:t xml:space="preserve"> </w:t>
       </w:r>
       <m:oMath>
-        <m:acc>
-          <m:accPr>
-            <m:chr m:val="̃"/>
-          </m:accPr>
+        <m:limLow>
           <m:e>
             <m:r>
               <m:t>y</m:t>
             </m:r>
           </m:e>
-        </m:acc>
+          <m:lim>
+            <m:r>
+              <m:rPr>
+                <m:sty m:val="p"/>
+              </m:rPr>
+              <m:t>∼</m:t>
+            </m:r>
+          </m:lim>
+        </m:limLow>
         <m:r>
           <m:rPr>
             <m:sty m:val="p"/>
@@ -44960,32 +45370,42 @@
           </m:rPr>
           <m:t>(</m:t>
         </m:r>
-        <m:acc>
-          <m:accPr>
-            <m:chr m:val="̃"/>
-          </m:accPr>
+        <m:limLow>
           <m:e>
             <m:r>
               <m:t>x</m:t>
             </m:r>
           </m:e>
-        </m:acc>
+          <m:lim>
+            <m:r>
+              <m:rPr>
+                <m:sty m:val="p"/>
+              </m:rPr>
+              <m:t>∼</m:t>
+            </m:r>
+          </m:lim>
+        </m:limLow>
         <m:r>
           <m:rPr>
             <m:sty m:val="p"/>
           </m:rPr>
           <m:t>−</m:t>
         </m:r>
-        <m:acc>
-          <m:accPr>
-            <m:chr m:val="̃"/>
-          </m:accPr>
+        <m:limLow>
           <m:e>
             <m:r>
               <m:t>μ</m:t>
             </m:r>
           </m:e>
-        </m:acc>
+          <m:lim>
+            <m:r>
+              <m:rPr>
+                <m:sty m:val="p"/>
+              </m:rPr>
+              <m:t>∼</m:t>
+            </m:r>
+          </m:lim>
+        </m:limLow>
         <m:r>
           <m:rPr>
             <m:sty m:val="p"/>
@@ -45039,16 +45459,21 @@
           <m:e>
             <m:sSub>
               <m:e>
-                <m:acc>
-                  <m:accPr>
-                    <m:chr m:val="̃"/>
-                  </m:accPr>
+                <m:limLow>
                   <m:e>
                     <m:r>
                       <m:t>q</m:t>
                     </m:r>
                   </m:e>
-                </m:acc>
+                  <m:lim>
+                    <m:r>
+                      <m:rPr>
+                        <m:sty m:val="p"/>
+                      </m:rPr>
+                      <m:t>∼</m:t>
+                    </m:r>
+                  </m:lim>
+                </m:limLow>
               </m:e>
               <m:sub>
                 <m:r>
@@ -45072,32 +45497,42 @@
           </m:rPr>
           <m:t>(</m:t>
         </m:r>
-        <m:acc>
-          <m:accPr>
-            <m:chr m:val="̃"/>
-          </m:accPr>
+        <m:limLow>
           <m:e>
             <m:r>
               <m:t>x</m:t>
             </m:r>
           </m:e>
-        </m:acc>
+          <m:lim>
+            <m:r>
+              <m:rPr>
+                <m:sty m:val="p"/>
+              </m:rPr>
+              <m:t>∼</m:t>
+            </m:r>
+          </m:lim>
+        </m:limLow>
         <m:r>
           <m:rPr>
             <m:sty m:val="p"/>
           </m:rPr>
           <m:t>−</m:t>
         </m:r>
-        <m:acc>
-          <m:accPr>
-            <m:chr m:val="̃"/>
-          </m:accPr>
+        <m:limLow>
           <m:e>
             <m:r>
               <m:t>μ</m:t>
             </m:r>
           </m:e>
-        </m:acc>
+          <m:lim>
+            <m:r>
+              <m:rPr>
+                <m:sty m:val="p"/>
+              </m:rPr>
+              <m:t>∼</m:t>
+            </m:r>
+          </m:lim>
+        </m:limLow>
         <m:r>
           <m:rPr>
             <m:sty m:val="p"/>
@@ -45267,16 +45702,21 @@
                 </m:rPr>
                 <m:t>(</m:t>
               </m:r>
-              <m:acc>
-                <m:accPr>
-                  <m:chr m:val="̃"/>
-                </m:accPr>
+              <m:limLow>
                 <m:e>
                   <m:r>
                     <m:t>x</m:t>
                   </m:r>
                 </m:e>
-              </m:acc>
+                <m:lim>
+                  <m:r>
+                    <m:rPr>
+                      <m:sty m:val="p"/>
+                    </m:rPr>
+                    <m:t>∼</m:t>
+                  </m:r>
+                </m:lim>
+              </m:limLow>
               <m:sSup>
                 <m:e>
                   <m:r>
@@ -45309,32 +45749,42 @@
                     </m:rPr>
                     <m:t>(</m:t>
                   </m:r>
-                  <m:acc>
-                    <m:accPr>
-                      <m:chr m:val="̃"/>
-                    </m:accPr>
+                  <m:limLow>
                     <m:e>
                       <m:r>
                         <m:t>x</m:t>
                       </m:r>
                     </m:e>
-                  </m:acc>
+                    <m:lim>
+                      <m:r>
+                        <m:rPr>
+                          <m:sty m:val="p"/>
+                        </m:rPr>
+                        <m:t>∼</m:t>
+                      </m:r>
+                    </m:lim>
+                  </m:limLow>
                   <m:r>
                     <m:rPr>
                       <m:sty m:val="p"/>
                     </m:rPr>
                     <m:t>−</m:t>
                   </m:r>
-                  <m:acc>
-                    <m:accPr>
-                      <m:chr m:val="̃"/>
-                    </m:accPr>
+                  <m:limLow>
                     <m:e>
                       <m:r>
                         <m:t>μ</m:t>
                       </m:r>
                     </m:e>
-                  </m:acc>
+                    <m:lim>
+                      <m:r>
+                        <m:rPr>
+                          <m:sty m:val="p"/>
+                        </m:rPr>
+                        <m:t>∼</m:t>
+                      </m:r>
+                    </m:lim>
+                  </m:limLow>
                   <m:r>
                     <m:rPr>
                       <m:sty m:val="p"/>
@@ -45402,32 +45852,42 @@
                 </m:rPr>
                 <m:t>(</m:t>
               </m:r>
-              <m:acc>
-                <m:accPr>
-                  <m:chr m:val="̃"/>
-                </m:accPr>
+              <m:limLow>
                 <m:e>
                   <m:r>
                     <m:t>x</m:t>
                   </m:r>
                 </m:e>
-              </m:acc>
+                <m:lim>
+                  <m:r>
+                    <m:rPr>
+                      <m:sty m:val="p"/>
+                    </m:rPr>
+                    <m:t>∼</m:t>
+                  </m:r>
+                </m:lim>
+              </m:limLow>
               <m:r>
                 <m:rPr>
                   <m:sty m:val="p"/>
                 </m:rPr>
                 <m:t>−</m:t>
               </m:r>
-              <m:acc>
-                <m:accPr>
-                  <m:chr m:val="̃"/>
-                </m:accPr>
+              <m:limLow>
                 <m:e>
                   <m:r>
                     <m:t>μ</m:t>
                   </m:r>
                 </m:e>
-              </m:acc>
+                <m:lim>
+                  <m:r>
+                    <m:rPr>
+                      <m:sty m:val="p"/>
+                    </m:rPr>
+                    <m:t>∼</m:t>
+                  </m:r>
+                </m:lim>
+              </m:limLow>
               <m:r>
                 <m:rPr>
                   <m:sty m:val="p"/>
@@ -45488,16 +45948,21 @@
               </m:r>
               <m:sSup>
                 <m:e>
-                  <m:acc>
-                    <m:accPr>
-                      <m:chr m:val="̃"/>
-                    </m:accPr>
+                  <m:limLow>
                     <m:e>
                       <m:r>
                         <m:t>y</m:t>
                       </m:r>
                     </m:e>
-                  </m:acc>
+                    <m:lim>
+                      <m:r>
+                        <m:rPr>
+                          <m:sty m:val="p"/>
+                        </m:rPr>
+                        <m:t>∼</m:t>
+                      </m:r>
+                    </m:lim>
+                  </m:limLow>
                 </m:e>
                 <m:sup>
                   <m:r>
@@ -45529,16 +45994,21 @@
                   </m:r>
                 </m:sup>
               </m:sSup>
-              <m:acc>
-                <m:accPr>
-                  <m:chr m:val="̃"/>
-                </m:accPr>
+              <m:limLow>
                 <m:e>
                   <m:r>
                     <m:t>y</m:t>
                   </m:r>
                 </m:e>
-              </m:acc>
+                <m:lim>
+                  <m:r>
+                    <m:rPr>
+                      <m:sty m:val="p"/>
+                    </m:rPr>
+                    <m:t>∼</m:t>
+                  </m:r>
+                </m:lim>
+              </m:limLow>
               <m:r>
                 <m:t>&amp;</m:t>
               </m:r>
@@ -45560,32 +46030,42 @@
                     </m:rPr>
                     <m:t>(</m:t>
                   </m:r>
-                  <m:acc>
-                    <m:accPr>
-                      <m:chr m:val="̃"/>
-                    </m:accPr>
+                  <m:limLow>
                     <m:e>
                       <m:r>
                         <m:t>x</m:t>
                       </m:r>
                     </m:e>
-                  </m:acc>
+                    <m:lim>
+                      <m:r>
+                        <m:rPr>
+                          <m:sty m:val="p"/>
+                        </m:rPr>
+                        <m:t>∼</m:t>
+                      </m:r>
+                    </m:lim>
+                  </m:limLow>
                   <m:r>
                     <m:rPr>
                       <m:sty m:val="p"/>
                     </m:rPr>
                     <m:t>−</m:t>
                   </m:r>
-                  <m:acc>
-                    <m:accPr>
-                      <m:chr m:val="̃"/>
-                    </m:accPr>
+                  <m:limLow>
                     <m:e>
                       <m:r>
                         <m:t>μ</m:t>
                       </m:r>
                     </m:e>
-                  </m:acc>
+                    <m:lim>
+                      <m:r>
+                        <m:rPr>
+                          <m:sty m:val="p"/>
+                        </m:rPr>
+                        <m:t>∼</m:t>
+                      </m:r>
+                    </m:lim>
+                  </m:limLow>
                   <m:r>
                     <m:rPr>
                       <m:sty m:val="p"/>
@@ -45616,16 +46096,21 @@
               </m:r>
               <m:sSup>
                 <m:e>
-                  <m:acc>
-                    <m:accPr>
-                      <m:chr m:val="̃"/>
-                    </m:accPr>
+                  <m:limLow>
                     <m:e>
                       <m:r>
                         <m:t>y</m:t>
                       </m:r>
                     </m:e>
-                  </m:acc>
+                    <m:lim>
+                      <m:r>
+                        <m:rPr>
+                          <m:sty m:val="p"/>
+                        </m:rPr>
+                        <m:t>∼</m:t>
+                      </m:r>
+                    </m:lim>
+                  </m:limLow>
                 </m:e>
                 <m:sup>
                   <m:r>
@@ -45805,32 +46290,42 @@
         <w:t xml:space="preserve"> </w:t>
       </w:r>
       <m:oMath>
-        <m:acc>
-          <m:accPr>
-            <m:chr m:val="̃"/>
-          </m:accPr>
+        <m:limLow>
           <m:e>
             <m:r>
               <m:t>x</m:t>
             </m:r>
           </m:e>
-        </m:acc>
+          <m:lim>
+            <m:r>
+              <m:rPr>
+                <m:sty m:val="p"/>
+              </m:rPr>
+              <m:t>∼</m:t>
+            </m:r>
+          </m:lim>
+        </m:limLow>
         <m:r>
           <m:rPr>
             <m:sty m:val="p"/>
           </m:rPr>
           <m:t>−</m:t>
         </m:r>
-        <m:acc>
-          <m:accPr>
-            <m:chr m:val="̃"/>
-          </m:accPr>
+        <m:limLow>
           <m:e>
             <m:r>
               <m:t>μ</m:t>
             </m:r>
           </m:e>
-        </m:acc>
+          <m:lim>
+            <m:r>
+              <m:rPr>
+                <m:sty m:val="p"/>
+              </m:rPr>
+              <m:t>∼</m:t>
+            </m:r>
+          </m:lim>
+        </m:limLow>
       </m:oMath>
       <w:r>
         <w:t xml:space="preserve"> </w:t>
@@ -45844,16 +46339,21 @@
       <m:oMath>
         <m:sSub>
           <m:e>
-            <m:acc>
-              <m:accPr>
-                <m:chr m:val="̃"/>
-              </m:accPr>
+            <m:limLow>
               <m:e>
                 <m:r>
                   <m:t>q</m:t>
                 </m:r>
               </m:e>
-            </m:acc>
+              <m:lim>
+                <m:r>
+                  <m:rPr>
+                    <m:sty m:val="p"/>
+                  </m:rPr>
+                  <m:t>∼</m:t>
+                </m:r>
+              </m:lim>
+            </m:limLow>
           </m:e>
           <m:sub>
             <m:r>
@@ -45889,16 +46389,21 @@
         <w:t xml:space="preserve"> </w:t>
       </w:r>
       <m:oMath>
-        <m:acc>
-          <m:accPr>
-            <m:chr m:val="̃"/>
-          </m:accPr>
+        <m:limLow>
           <m:e>
             <m:r>
               <m:t>μ</m:t>
             </m:r>
           </m:e>
-        </m:acc>
+          <m:lim>
+            <m:r>
+              <m:rPr>
+                <m:sty m:val="p"/>
+              </m:rPr>
+              <m:t>∼</m:t>
+            </m:r>
+          </m:lim>
+        </m:limLow>
       </m:oMath>
       <w:r>
         <w:t xml:space="preserve">,</w:t>
@@ -45953,16 +46458,21 @@
         <w:t xml:space="preserve"> </w:t>
       </w:r>
       <m:oMath>
-        <m:acc>
-          <m:accPr>
-            <m:chr m:val="̃"/>
-          </m:accPr>
+        <m:limLow>
           <m:e>
             <m:r>
               <m:t>μ</m:t>
             </m:r>
           </m:e>
-        </m:acc>
+          <m:lim>
+            <m:r>
+              <m:rPr>
+                <m:sty m:val="p"/>
+              </m:rPr>
+              <m:t>∼</m:t>
+            </m:r>
+          </m:lim>
+        </m:limLow>
       </m:oMath>
       <w:r>
         <w:t xml:space="preserve">,</w:t>
@@ -46030,16 +46540,21 @@
       <m:oMath>
         <m:sSub>
           <m:e>
-            <m:acc>
-              <m:accPr>
-                <m:chr m:val="̃"/>
-              </m:accPr>
+            <m:limLow>
               <m:e>
                 <m:r>
                   <m:t>q</m:t>
                 </m:r>
               </m:e>
-            </m:acc>
+              <m:lim>
+                <m:r>
+                  <m:rPr>
+                    <m:sty m:val="p"/>
+                  </m:rPr>
+                  <m:t>∼</m:t>
+                </m:r>
+              </m:lim>
+            </m:limLow>
           </m:e>
           <m:sub>
             <m:r>
@@ -46074,32 +46589,42 @@
         <w:t xml:space="preserve"> </w:t>
       </w:r>
       <m:oMath>
-        <m:acc>
-          <m:accPr>
-            <m:chr m:val="̃"/>
-          </m:accPr>
+        <m:limLow>
           <m:e>
             <m:r>
               <m:t>μ</m:t>
             </m:r>
           </m:e>
-        </m:acc>
+          <m:lim>
+            <m:r>
+              <m:rPr>
+                <m:sty m:val="p"/>
+              </m:rPr>
+              <m:t>∼</m:t>
+            </m:r>
+          </m:lim>
+        </m:limLow>
         <m:r>
           <m:rPr>
             <m:sty m:val="p"/>
           </m:rPr>
           <m:t>=</m:t>
         </m:r>
-        <m:acc>
-          <m:accPr>
-            <m:chr m:val="̃"/>
-          </m:accPr>
+        <m:limLow>
           <m:e>
             <m:r>
               <m:t>0</m:t>
             </m:r>
           </m:e>
-        </m:acc>
+          <m:lim>
+            <m:r>
+              <m:rPr>
+                <m:sty m:val="p"/>
+              </m:rPr>
+              <m:t>∼</m:t>
+            </m:r>
+          </m:lim>
+        </m:limLow>
       </m:oMath>
       <w:r>
         <w:t xml:space="preserve"> </w:t>
@@ -46224,16 +46749,21 @@
       <m:oMath>
         <m:sSub>
           <m:e>
-            <m:acc>
-              <m:accPr>
-                <m:chr m:val="̃"/>
-              </m:accPr>
+            <m:limLow>
               <m:e>
                 <m:r>
                   <m:t>q</m:t>
                 </m:r>
               </m:e>
-            </m:acc>
+              <m:lim>
+                <m:r>
+                  <m:rPr>
+                    <m:sty m:val="p"/>
+                  </m:rPr>
+                  <m:t>∼</m:t>
+                </m:r>
+              </m:lim>
+            </m:limLow>
           </m:e>
           <m:sub>
             <m:r>
@@ -46319,16 +46849,21 @@
       <m:oMath>
         <m:sSub>
           <m:e>
-            <m:acc>
-              <m:accPr>
-                <m:chr m:val="̃"/>
-              </m:accPr>
+            <m:limLow>
               <m:e>
                 <m:r>
                   <m:t>q</m:t>
                 </m:r>
               </m:e>
-            </m:acc>
+              <m:lim>
+                <m:r>
+                  <m:rPr>
+                    <m:sty m:val="p"/>
+                  </m:rPr>
+                  <m:t>∼</m:t>
+                </m:r>
+              </m:lim>
+            </m:limLow>
           </m:e>
           <m:sub>
             <m:r>
@@ -46467,16 +47002,21 @@
             </m:rPr>
             <m:t>(</m:t>
           </m:r>
-          <m:acc>
-            <m:accPr>
-              <m:chr m:val="̃"/>
-            </m:accPr>
+          <m:limLow>
             <m:e>
               <m:r>
                 <m:t>x</m:t>
               </m:r>
             </m:e>
-          </m:acc>
+            <m:lim>
+              <m:r>
+                <m:rPr>
+                  <m:sty m:val="p"/>
+                </m:rPr>
+                <m:t>∼</m:t>
+              </m:r>
+            </m:lim>
+          </m:limLow>
           <m:sSup>
             <m:e>
               <m:r>
@@ -46670,16 +47210,21 @@
         <m:oMath>
           <m:eqArr>
             <m:e>
-              <m:acc>
-                <m:accPr>
-                  <m:chr m:val="̃"/>
-                </m:accPr>
+              <m:limLow>
                 <m:e>
                   <m:r>
                     <m:t>x</m:t>
                   </m:r>
                 </m:e>
-              </m:acc>
+                <m:lim>
+                  <m:r>
+                    <m:rPr>
+                      <m:sty m:val="p"/>
+                    </m:rPr>
+                    <m:t>∼</m:t>
+                  </m:r>
+                </m:lim>
+              </m:limLow>
               <m:r>
                 <m:t>&amp;</m:t>
               </m:r>
@@ -46705,16 +47250,21 @@
               </m:r>
               <m:sSub>
                 <m:e>
-                  <m:acc>
-                    <m:accPr>
-                      <m:chr m:val="̃"/>
-                    </m:accPr>
+                  <m:limLow>
                     <m:e>
                       <m:r>
                         <m:t>q</m:t>
                       </m:r>
                     </m:e>
-                  </m:acc>
+                    <m:lim>
+                      <m:r>
+                        <m:rPr>
+                          <m:sty m:val="p"/>
+                        </m:rPr>
+                        <m:t>∼</m:t>
+                      </m:r>
+                    </m:lim>
+                  </m:limLow>
                 </m:e>
                 <m:sub>
                   <m:r>
@@ -46933,16 +47483,21 @@
                 </m:rPr>
                 <m:t>(</m:t>
               </m:r>
-              <m:acc>
-                <m:accPr>
-                  <m:chr m:val="̃"/>
-                </m:accPr>
+              <m:limLow>
                 <m:e>
                   <m:r>
                     <m:t>x</m:t>
                   </m:r>
                 </m:e>
-              </m:acc>
+                <m:lim>
+                  <m:r>
+                    <m:rPr>
+                      <m:sty m:val="p"/>
+                    </m:rPr>
+                    <m:t>∼</m:t>
+                  </m:r>
+                </m:lim>
+              </m:limLow>
               <m:sSup>
                 <m:e>
                   <m:r>
@@ -47015,16 +47570,21 @@
         <w:t xml:space="preserve"> </w:t>
       </w:r>
       <m:oMath>
-        <m:acc>
-          <m:accPr>
-            <m:chr m:val="̃"/>
-          </m:accPr>
+        <m:limLow>
           <m:e>
             <m:r>
               <m:t>x</m:t>
             </m:r>
           </m:e>
-        </m:acc>
+          <m:lim>
+            <m:r>
+              <m:rPr>
+                <m:sty m:val="p"/>
+              </m:rPr>
+              <m:t>∼</m:t>
+            </m:r>
+          </m:lim>
+        </m:limLow>
         <m:r>
           <m:rPr>
             <m:sty m:val="p"/>
@@ -47033,16 +47593,21 @@
         </m:r>
         <m:sSub>
           <m:e>
-            <m:acc>
-              <m:accPr>
-                <m:chr m:val="̃"/>
-              </m:accPr>
+            <m:limLow>
               <m:e>
                 <m:r>
                   <m:t>q</m:t>
                 </m:r>
               </m:e>
-            </m:acc>
+              <m:lim>
+                <m:r>
+                  <m:rPr>
+                    <m:sty m:val="p"/>
+                  </m:rPr>
+                  <m:t>∼</m:t>
+                </m:r>
+              </m:lim>
+            </m:limLow>
           </m:e>
           <m:sub>
             <m:r>
@@ -47186,16 +47751,21 @@
                 </m:rPr>
                 <m:t>(</m:t>
               </m:r>
-              <m:acc>
-                <m:accPr>
-                  <m:chr m:val="̃"/>
-                </m:accPr>
+              <m:limLow>
                 <m:e>
                   <m:r>
                     <m:t>x</m:t>
                   </m:r>
                 </m:e>
-              </m:acc>
+                <m:lim>
+                  <m:r>
+                    <m:rPr>
+                      <m:sty m:val="p"/>
+                    </m:rPr>
+                    <m:t>∼</m:t>
+                  </m:r>
+                </m:lim>
+              </m:limLow>
               <m:sSup>
                 <m:e>
                   <m:r>
@@ -47280,16 +47850,21 @@
           </m:rPr>
           <m:t>(</m:t>
         </m:r>
-        <m:acc>
-          <m:accPr>
-            <m:chr m:val="̃"/>
-          </m:accPr>
+        <m:limLow>
           <m:e>
             <m:r>
               <m:t>x</m:t>
             </m:r>
           </m:e>
-        </m:acc>
+          <m:lim>
+            <m:r>
+              <m:rPr>
+                <m:sty m:val="p"/>
+              </m:rPr>
+              <m:t>∼</m:t>
+            </m:r>
+          </m:lim>
+        </m:limLow>
         <m:r>
           <m:rPr>
             <m:sty m:val="p"/>
@@ -47342,16 +47917,21 @@
             <m:grow/>
           </m:dPr>
           <m:e>
-            <m:acc>
-              <m:accPr>
-                <m:chr m:val="̃"/>
-              </m:accPr>
+            <m:limLow>
               <m:e>
                 <m:r>
                   <m:t>0</m:t>
                 </m:r>
               </m:e>
-            </m:acc>
+              <m:lim>
+                <m:r>
+                  <m:rPr>
+                    <m:sty m:val="p"/>
+                  </m:rPr>
+                  <m:t>∼</m:t>
+                </m:r>
+              </m:lim>
+            </m:limLow>
             <m:r>
               <m:rPr>
                 <m:sty m:val="p"/>

</xml_diff>

<commit_message>
Deploying to gh-pages from @ Morrison-Lab/pds@83ab386050ea7b2feddb9a63d0439b3d0a8e9255 🚀
</commit_message>
<xml_diff>
--- a/distributions.docx
+++ b/distributions.docx
@@ -15,7 +15,7 @@
         <w:pStyle w:val="Date"/>
       </w:pPr>
       <w:r>
-        <w:t xml:space="preserve">Last modified: 2026-10-17 13:34:44 (PDT)</w:t>
+        <w:t xml:space="preserve">Last modified: 2026-10-17 13:43:25 (PDT)</w:t>
       </w:r>
     </w:p>
     <w:p>
@@ -1153,7 +1153,19 @@
         </m:r>
       </m:oMath>
       <w:r>
-        <w:t xml:space="preserve">, if:</w:t>
+        <w:t xml:space="preserve"> </w:t>
+      </w:r>
+      <w:r>
+        <w:t xml:space="preserve">(Wikipedia contributors 2026a)</w:t>
+      </w:r>
+      <w:r>
+        <w:t xml:space="preserve">,</w:t>
+      </w:r>
+      <w:r>
+        <w:t xml:space="preserve"> </w:t>
+      </w:r>
+      <w:r>
+        <w:t xml:space="preserve">if:</w:t>
       </w:r>
     </w:p>
     <w:p>
@@ -6737,7 +6749,19 @@
         </m:r>
       </m:oMath>
       <w:r>
-        <w:t xml:space="preserve">, if:</w:t>
+        <w:t xml:space="preserve"> </w:t>
+      </w:r>
+      <w:r>
+        <w:t xml:space="preserve">(Wikipedia contributors 2026g)</w:t>
+      </w:r>
+      <w:r>
+        <w:t xml:space="preserve">,</w:t>
+      </w:r>
+      <w:r>
+        <w:t xml:space="preserve"> </w:t>
+      </w:r>
+      <w:r>
+        <w:t xml:space="preserve">if:</w:t>
       </w:r>
     </w:p>
     <w:p>
@@ -21444,7 +21468,19 @@
         </m:r>
       </m:oMath>
       <w:r>
-        <w:t xml:space="preserve">, if, for</w:t>
+        <w:t xml:space="preserve"> </w:t>
+      </w:r>
+      <w:r>
+        <w:t xml:space="preserve">(Wikipedia contributors 2026f)</w:t>
+      </w:r>
+      <w:r>
+        <w:t xml:space="preserve">,</w:t>
+      </w:r>
+      <w:r>
+        <w:t xml:space="preserve"> </w:t>
+      </w:r>
+      <w:r>
+        <w:t xml:space="preserve">if, for</w:t>
       </w:r>
       <w:r>
         <w:t xml:space="preserve"> </w:t>
@@ -28012,6 +28048,12 @@
           <m:t>​</m:t>
         </m:r>
       </m:oMath>
+      <w:r>
+        <w:t xml:space="preserve"> </w:t>
+      </w:r>
+      <w:r>
+        <w:t xml:space="preserve">(Wikipedia contributors 2026b)</w:t>
+      </w:r>
       <w:r>
         <w:t xml:space="preserve">,</w:t>
       </w:r>
@@ -32223,6 +32265,12 @@
           <m:t>0</m:t>
         </m:r>
       </m:oMath>
+      <w:r>
+        <w:t xml:space="preserve"> </w:t>
+      </w:r>
+      <w:r>
+        <w:t xml:space="preserve">(Wikipedia contributors 2026h)</w:t>
+      </w:r>
       <w:r>
         <w:t xml:space="preserve"> </w:t>
       </w:r>
@@ -36697,7 +36745,7 @@
     </w:p>
     <w:bookmarkEnd w:id="107"/>
     <w:bookmarkEnd w:id="108"/>
-    <w:bookmarkStart w:id="145" w:name="sec-mvn"/>
+    <w:bookmarkStart w:id="143" w:name="sec-mvn"/>
     <w:p>
       <w:pPr>
         <w:pStyle w:val="Heading2"/>
@@ -38427,27 +38475,22 @@
       <w:r>
         <w:t xml:space="preserve"> </w:t>
       </w:r>
+      <w:r>
+        <w:t xml:space="preserve">(Wikipedia contributors 2026e)</w:t>
+      </w:r>
+      <w:r>
+        <w:t xml:space="preserve">.</w:t>
+      </w:r>
+      <w:r>
+        <w:t xml:space="preserve"> </w:t>
+      </w:r>
+      <w:r>
+        <w:t xml:space="preserve">As with the univariate</w:t>
+      </w:r>
+      <w:r>
+        <w:t xml:space="preserve"> </w:t>
+      </w:r>
       <w:hyperlink r:id="rId120">
-        <w:r>
-          <w:rPr>
-            <w:rStyle w:val="Hyperlink"/>
-          </w:rPr>
-          <w:t xml:space="preserve">https://en.wikipedia.org/wiki/Multivariate_normal_distribution</w:t>
-        </w:r>
-      </w:hyperlink>
-      <w:r>
-        <w:t xml:space="preserve">.</w:t>
-      </w:r>
-      <w:r>
-        <w:t xml:space="preserve"> </w:t>
-      </w:r>
-      <w:r>
-        <w:t xml:space="preserve">As with the univariate</w:t>
-      </w:r>
-      <w:r>
-        <w:t xml:space="preserve"> </w:t>
-      </w:r>
-      <w:hyperlink r:id="rId121">
         <w:r>
           <w:rPr>
             <w:rStyle w:val="Hyperlink"/>
@@ -38490,7 +38533,7 @@
       <w:r>
         <w:t xml:space="preserve"> </w:t>
       </w:r>
-      <w:hyperlink r:id="rId122">
+      <w:hyperlink r:id="rId121">
         <w:r>
           <w:rPr>
             <w:rStyle w:val="Hyperlink"/>
@@ -38510,7 +38553,7 @@
       <w:r>
         <w:t xml:space="preserve"> </w:t>
       </w:r>
-      <w:hyperlink r:id="rId123">
+      <w:hyperlink r:id="rId122">
         <w:r>
           <w:rPr>
             <w:rStyle w:val="Hyperlink"/>
@@ -38528,7 +38571,7 @@
         <w:t xml:space="preserve">which has no joint density.</w:t>
       </w:r>
     </w:p>
-    <w:bookmarkStart w:id="124" w:name="exm-mvn-univariate"/>
+    <w:bookmarkStart w:id="123" w:name="exm-mvn-univariate"/>
     <w:p>
       <w:pPr>
         <w:pStyle w:val="BodyText"/>
@@ -39360,8 +39403,8 @@
         <w:t xml:space="preserve">.</w:t>
       </w:r>
     </w:p>
-    <w:bookmarkEnd w:id="124"/>
-    <w:bookmarkStart w:id="125" w:name="lem-mahalanobis-nonneg"/>
+    <w:bookmarkEnd w:id="123"/>
+    <w:bookmarkStart w:id="124" w:name="lem-mahalanobis-nonneg"/>
     <w:p>
       <w:pPr>
         <w:pStyle w:val="BodyText"/>
@@ -39700,7 +39743,7 @@
         <w:t xml:space="preserve">.</w:t>
       </w:r>
     </w:p>
-    <w:bookmarkEnd w:id="125"/>
+    <w:bookmarkEnd w:id="124"/>
     <w:p>
       <w:pPr>
         <w:pStyle w:val="BodyText"/>
@@ -40029,7 +40072,7 @@
         <w:t xml:space="preserve">.</w:t>
       </w:r>
     </w:p>
-    <w:bookmarkStart w:id="126" w:name="def-mahalanobis"/>
+    <w:bookmarkStart w:id="125" w:name="def-mahalanobis"/>
     <w:p>
       <w:pPr>
         <w:pStyle w:val="BodyText"/>
@@ -40446,7 +40489,7 @@
         </m:oMath>
       </m:oMathPara>
     </w:p>
-    <w:bookmarkEnd w:id="126"/>
+    <w:bookmarkEnd w:id="125"/>
     <w:p>
       <w:pPr>
         <w:pStyle w:val="FirstParagraph"/>
@@ -40487,19 +40530,14 @@
       <w:r>
         <w:t xml:space="preserve"> </w:t>
       </w:r>
-      <w:hyperlink r:id="rId127">
-        <w:r>
-          <w:rPr>
-            <w:rStyle w:val="Hyperlink"/>
-          </w:rPr>
-          <w:t xml:space="preserve">https://en.wikipedia.org/wiki/Mahalanobis_distance</w:t>
-        </w:r>
-      </w:hyperlink>
+      <w:r>
+        <w:t xml:space="preserve">(Wikipedia contributors 2026c)</w:t>
+      </w:r>
       <w:r>
         <w:t xml:space="preserve">.</w:t>
       </w:r>
     </w:p>
-    <w:bookmarkStart w:id="128" w:name="cor-mvn-mahalanobis"/>
+    <w:bookmarkStart w:id="126" w:name="cor-mvn-mahalanobis"/>
     <w:p>
       <w:pPr>
         <w:pStyle w:val="BodyText"/>
@@ -41092,7 +41130,7 @@
         <w:t xml:space="preserve">.</w:t>
       </w:r>
     </w:p>
-    <w:bookmarkEnd w:id="128"/>
+    <w:bookmarkEnd w:id="126"/>
     <w:p>
       <w:pPr>
         <w:pStyle w:val="BodyText"/>
@@ -41345,7 +41383,7 @@
         <w:t xml:space="preserve">.</w:t>
       </w:r>
     </w:p>
-    <w:bookmarkStart w:id="130" w:name="exm-mahalanobis-special"/>
+    <w:bookmarkStart w:id="128" w:name="exm-mahalanobis-special"/>
     <w:p>
       <w:pPr>
         <w:pStyle w:val="BodyText"/>
@@ -41383,7 +41421,7 @@
       <w:r>
         <w:t xml:space="preserve"> </w:t>
       </w:r>
-      <w:hyperlink r:id="rId129">
+      <w:hyperlink r:id="rId127">
         <w:r>
           <w:rPr>
             <w:rStyle w:val="Hyperlink"/>
@@ -42117,8 +42155,8 @@
         <w:t xml:space="preserve">in units of that coordinate’s standard deviation.</w:t>
       </w:r>
     </w:p>
-    <w:bookmarkEnd w:id="130"/>
-    <w:bookmarkStart w:id="131" w:name="thm-mvn-diagonal-indpt"/>
+    <w:bookmarkEnd w:id="128"/>
+    <w:bookmarkStart w:id="129" w:name="thm-mvn-diagonal-indpt"/>
     <w:p>
       <w:pPr>
         <w:pStyle w:val="BodyText"/>
@@ -42633,7 +42671,7 @@
         <w:t xml:space="preserve">.</w:t>
       </w:r>
     </w:p>
-    <w:bookmarkEnd w:id="131"/>
+    <w:bookmarkEnd w:id="129"/>
     <w:p>
       <w:pPr>
         <w:pStyle w:val="FirstParagraph"/>
@@ -42654,7 +42692,7 @@
       <w:r>
         <w:t xml:space="preserve"> </w:t>
       </w:r>
-      <w:hyperlink r:id="rId132">
+      <w:hyperlink r:id="rId130">
         <w:r>
           <w:rPr>
             <w:rStyle w:val="Hyperlink"/>
@@ -43570,7 +43608,7 @@
       <w:r>
         <w:t xml:space="preserve">(</w:t>
       </w:r>
-      <w:hyperlink r:id="rId133">
+      <w:hyperlink r:id="rId131">
         <w:r>
           <w:rPr>
             <w:rStyle w:val="Hyperlink"/>
@@ -43678,7 +43716,7 @@
       <w:r>
         <w:t xml:space="preserve">(</w:t>
       </w:r>
-      <w:hyperlink r:id="rId134">
+      <w:hyperlink r:id="rId132">
         <w:r>
           <w:rPr>
             <w:rStyle w:val="Hyperlink"/>
@@ -43724,7 +43762,7 @@
       <w:r>
         <w:t xml:space="preserve"> </w:t>
       </w:r>
-      <w:hyperlink r:id="rId135">
+      <w:hyperlink r:id="rId133">
         <w:r>
           <w:rPr>
             <w:rStyle w:val="Hyperlink"/>
@@ -43756,7 +43794,7 @@
         <w:t xml:space="preserve">variables as its remark describes.</w:t>
       </w:r>
     </w:p>
-    <w:bookmarkStart w:id="136" w:name="cor-mvn-uncorrelated-indpt"/>
+    <w:bookmarkStart w:id="134" w:name="cor-mvn-uncorrelated-indpt"/>
     <w:p>
       <w:pPr>
         <w:pStyle w:val="BodyText"/>
@@ -44042,7 +44080,7 @@
         <w:t xml:space="preserve">.</w:t>
       </w:r>
     </w:p>
-    <w:bookmarkEnd w:id="136"/>
+    <w:bookmarkEnd w:id="134"/>
     <w:p>
       <w:pPr>
         <w:pStyle w:val="BodyText"/>
@@ -44232,7 +44270,7 @@
       <w:r>
         <w:t xml:space="preserve">(</w:t>
       </w:r>
-      <w:hyperlink r:id="rId137">
+      <w:hyperlink r:id="rId135">
         <w:r>
           <w:rPr>
             <w:rStyle w:val="Hyperlink"/>
@@ -44415,7 +44453,7 @@
       <w:r>
         <w:t xml:space="preserve">(</w:t>
       </w:r>
-      <w:hyperlink r:id="rId134">
+      <w:hyperlink r:id="rId132">
         <w:r>
           <w:rPr>
             <w:rStyle w:val="Hyperlink"/>
@@ -44614,7 +44652,7 @@
       <w:r>
         <w:t xml:space="preserve"> </w:t>
       </w:r>
-      <w:hyperlink r:id="rId138">
+      <w:hyperlink r:id="rId136">
         <w:r>
           <w:rPr>
             <w:rStyle w:val="Hyperlink"/>
@@ -44756,7 +44794,7 @@
       <w:r>
         <w:t xml:space="preserve">(</w:t>
       </w:r>
-      <w:hyperlink r:id="rId139">
+      <w:hyperlink r:id="rId137">
         <w:r>
           <w:rPr>
             <w:rStyle w:val="Hyperlink"/>
@@ -44802,7 +44840,7 @@
       <w:r>
         <w:t xml:space="preserve">(</w:t>
       </w:r>
-      <w:hyperlink r:id="rId140">
+      <w:hyperlink r:id="rId138">
         <w:r>
           <w:rPr>
             <w:rStyle w:val="Hyperlink"/>
@@ -44814,7 +44852,7 @@
         <w:t xml:space="preserve">).</w:t>
       </w:r>
     </w:p>
-    <w:bookmarkStart w:id="142" w:name="thm-mahalanobis-eigen"/>
+    <w:bookmarkStart w:id="140" w:name="thm-mahalanobis-eigen"/>
     <w:p>
       <w:pPr>
         <w:pStyle w:val="BodyText"/>
@@ -44852,7 +44890,7 @@
       <w:r>
         <w:t xml:space="preserve"> </w:t>
       </w:r>
-      <w:hyperlink r:id="rId141">
+      <w:hyperlink r:id="rId139">
         <w:r>
           <w:rPr>
             <w:rStyle w:val="Hyperlink"/>
@@ -45303,7 +45341,7 @@
         </m:oMath>
       </m:oMathPara>
     </w:p>
-    <w:bookmarkEnd w:id="142"/>
+    <w:bookmarkEnd w:id="140"/>
     <w:p>
       <w:pPr>
         <w:pStyle w:val="FirstParagraph"/>
@@ -46567,7 +46605,7 @@
         <w:t xml:space="preserve">.</w:t>
       </w:r>
     </w:p>
-    <w:bookmarkStart w:id="144" w:name="exm-mahalanobis-eigen"/>
+    <w:bookmarkStart w:id="142" w:name="exm-mahalanobis-eigen"/>
     <w:p>
       <w:pPr>
         <w:pStyle w:val="BodyText"/>
@@ -46949,7 +46987,7 @@
       <w:r>
         <w:t xml:space="preserve">(</w:t>
       </w:r>
-      <w:hyperlink r:id="rId143">
+      <w:hyperlink r:id="rId141">
         <w:r>
           <w:rPr>
             <w:rStyle w:val="Hyperlink"/>
@@ -48139,9 +48177,9 @@
         <w:t xml:space="preserve">are positively correlated.</w:t>
       </w:r>
     </w:p>
-    <w:bookmarkEnd w:id="144"/>
-    <w:bookmarkEnd w:id="145"/>
-    <w:bookmarkStart w:id="160" w:name="sec-mixture"/>
+    <w:bookmarkEnd w:id="142"/>
+    <w:bookmarkEnd w:id="143"/>
+    <w:bookmarkStart w:id="158" w:name="sec-mixture"/>
     <w:p>
       <w:pPr>
         <w:pStyle w:val="Heading2"/>
@@ -48150,7 +48188,7 @@
         <w:t xml:space="preserve">8 Mixture distributions</w:t>
       </w:r>
     </w:p>
-    <w:bookmarkStart w:id="146" w:name="def-mixture"/>
+    <w:bookmarkStart w:id="144" w:name="def-mixture"/>
     <w:p>
       <w:pPr>
         <w:pStyle w:val="FirstParagraph"/>
@@ -48725,8 +48763,8 @@
         </m:oMath>
       </m:oMathPara>
     </w:p>
-    <w:bookmarkEnd w:id="146"/>
-    <w:bookmarkStart w:id="147" w:name="def-mixture-component"/>
+    <w:bookmarkEnd w:id="144"/>
+    <w:bookmarkStart w:id="145" w:name="def-mixture-component"/>
     <w:p>
       <w:pPr>
         <w:pStyle w:val="FirstParagraph"/>
@@ -48828,8 +48866,8 @@
         <w:t xml:space="preserve">.</w:t>
       </w:r>
     </w:p>
-    <w:bookmarkEnd w:id="147"/>
-    <w:bookmarkStart w:id="150" w:name="thm-mixture-two-stage"/>
+    <w:bookmarkEnd w:id="145"/>
+    <w:bookmarkStart w:id="148" w:name="thm-mixture-two-stage"/>
     <w:p>
       <w:pPr>
         <w:pStyle w:val="BodyText"/>
@@ -48890,7 +48928,7 @@
       <w:r>
         <w:t xml:space="preserve"> </w:t>
       </w:r>
-      <w:hyperlink r:id="rId148">
+      <w:hyperlink r:id="rId146">
         <w:r>
           <w:rPr>
             <w:rStyle w:val="Hyperlink"/>
@@ -49279,7 +49317,7 @@
       <w:r>
         <w:t xml:space="preserve"> </w:t>
       </w:r>
-      <w:hyperlink r:id="rId149">
+      <w:hyperlink r:id="rId147">
         <w:r>
           <w:rPr>
             <w:rStyle w:val="Hyperlink"/>
@@ -49407,7 +49445,7 @@
         <w:t xml:space="preserve">.</w:t>
       </w:r>
     </w:p>
-    <w:bookmarkEnd w:id="150"/>
+    <w:bookmarkEnd w:id="148"/>
     <w:p>
       <w:pPr>
         <w:pStyle w:val="FirstParagraph"/>
@@ -49428,7 +49466,7 @@
       <w:r>
         <w:t xml:space="preserve"> </w:t>
       </w:r>
-      <w:hyperlink r:id="rId151">
+      <w:hyperlink r:id="rId149">
         <w:r>
           <w:rPr>
             <w:rStyle w:val="Hyperlink"/>
@@ -49652,7 +49690,7 @@
       <w:r>
         <w:t xml:space="preserve"> </w:t>
       </w:r>
-      <w:hyperlink r:id="rId149">
+      <w:hyperlink r:id="rId147">
         <w:r>
           <w:rPr>
             <w:rStyle w:val="Hyperlink"/>
@@ -50824,7 +50862,7 @@
         <w:t xml:space="preserve">.</w:t>
       </w:r>
     </w:p>
-    <w:bookmarkStart w:id="152" w:name="thm-mixture-mean"/>
+    <w:bookmarkStart w:id="150" w:name="thm-mixture-mean"/>
     <w:p>
       <w:pPr>
         <w:pStyle w:val="BodyText"/>
@@ -51138,7 +51176,7 @@
         </m:oMath>
       </m:oMathPara>
     </w:p>
-    <w:bookmarkEnd w:id="152"/>
+    <w:bookmarkEnd w:id="150"/>
     <w:p>
       <w:pPr>
         <w:pStyle w:val="FirstParagraph"/>
@@ -51987,7 +52025,7 @@
       <w:r>
         <w:t xml:space="preserve"> </w:t>
       </w:r>
-      <w:hyperlink r:id="rId153">
+      <w:hyperlink r:id="rId151">
         <w:r>
           <w:rPr>
             <w:rStyle w:val="Hyperlink"/>
@@ -51999,7 +52037,7 @@
         <w:t xml:space="preserve">.</w:t>
       </w:r>
     </w:p>
-    <w:bookmarkStart w:id="154" w:name="thm-mixture-posterior"/>
+    <w:bookmarkStart w:id="152" w:name="thm-mixture-posterior"/>
     <w:p>
       <w:pPr>
         <w:pStyle w:val="BodyText"/>
@@ -52297,7 +52335,7 @@
         </m:oMath>
       </m:oMathPara>
     </w:p>
-    <w:bookmarkEnd w:id="154"/>
+    <w:bookmarkEnd w:id="152"/>
     <w:p>
       <w:pPr>
         <w:pStyle w:val="FirstParagraph"/>
@@ -52379,7 +52417,7 @@
       <w:r>
         <w:t xml:space="preserve"> </w:t>
       </w:r>
-      <w:hyperlink r:id="rId149">
+      <w:hyperlink r:id="rId147">
         <w:r>
           <w:rPr>
             <w:rStyle w:val="Hyperlink"/>
@@ -52807,7 +52845,7 @@
       <w:r>
         <w:t xml:space="preserve"> </w:t>
       </w:r>
-      <w:hyperlink r:id="rId155">
+      <w:hyperlink r:id="rId153">
         <w:r>
           <w:rPr>
             <w:rStyle w:val="Hyperlink"/>
@@ -52965,7 +53003,7 @@
       <w:r>
         <w:t xml:space="preserve"> </w:t>
       </w:r>
-      <w:hyperlink r:id="rId156">
+      <w:hyperlink r:id="rId154">
         <w:r>
           <w:rPr>
             <w:rStyle w:val="Hyperlink"/>
@@ -52977,7 +53015,7 @@
         <w:t xml:space="preserve">.</w:t>
       </w:r>
     </w:p>
-    <w:bookmarkStart w:id="157" w:name="def-responsibility"/>
+    <w:bookmarkStart w:id="155" w:name="def-responsibility"/>
     <w:p>
       <w:pPr>
         <w:pStyle w:val="BodyText"/>
@@ -53128,8 +53166,8 @@
         <w:t xml:space="preserve">.</w:t>
       </w:r>
     </w:p>
-    <w:bookmarkEnd w:id="157"/>
-    <w:bookmarkStart w:id="158" w:name="exm-mixture-gaussian"/>
+    <w:bookmarkEnd w:id="155"/>
+    <w:bookmarkStart w:id="156" w:name="exm-mixture-gaussian"/>
     <w:p>
       <w:pPr>
         <w:pStyle w:val="BodyText"/>
@@ -53498,7 +53536,7 @@
       <w:r>
         <w:t xml:space="preserve"> </w:t>
       </w:r>
-      <w:hyperlink r:id="rId121">
+      <w:hyperlink r:id="rId120">
         <w:r>
           <w:rPr>
             <w:rStyle w:val="Hyperlink"/>
@@ -54377,7 +54415,7 @@
         <w:t xml:space="preserve">.</w:t>
       </w:r>
     </w:p>
-    <w:bookmarkEnd w:id="158"/>
+    <w:bookmarkEnd w:id="156"/>
     <w:p>
       <w:pPr>
         <w:pStyle w:val="FirstParagraph"/>
@@ -54425,7 +54463,7 @@
         <w:t xml:space="preserve">would describe them poorly.</w:t>
       </w:r>
     </w:p>
-    <w:bookmarkStart w:id="159" w:name="exm-nb-mixture"/>
+    <w:bookmarkStart w:id="157" w:name="exm-nb-mixture"/>
     <w:p>
       <w:pPr>
         <w:pStyle w:val="BodyText"/>
@@ -54695,19 +54733,165 @@
         <w:t xml:space="preserve">).</w:t>
       </w:r>
     </w:p>
-    <w:bookmarkEnd w:id="159"/>
-    <w:bookmarkEnd w:id="160"/>
-    <w:bookmarkStart w:id="164" w:name="references"/>
+    <w:bookmarkEnd w:id="157"/>
+    <w:bookmarkEnd w:id="158"/>
+    <w:bookmarkStart w:id="159" w:name="further-reading"/>
     <w:p>
       <w:pPr>
         <w:pStyle w:val="Heading2"/>
       </w:pPr>
       <w:r>
+        <w:t xml:space="preserve">Further reading</w:t>
+      </w:r>
+    </w:p>
+    <w:p>
+      <w:pPr>
+        <w:numPr>
+          <w:ilvl w:val="0"/>
+          <w:numId w:val="1015"/>
+        </w:numPr>
+      </w:pPr>
+      <w:r>
+        <w:t xml:space="preserve">Wikipedia contributors (2026a)</w:t>
+      </w:r>
+      <w:r>
+        <w:t xml:space="preserve"> </w:t>
+      </w:r>
+      <w:r>
+        <w:t xml:space="preserve">— the binomial distribution and its approximations</w:t>
+      </w:r>
+    </w:p>
+    <w:p>
+      <w:pPr>
+        <w:numPr>
+          <w:ilvl w:val="0"/>
+          <w:numId w:val="1015"/>
+        </w:numPr>
+      </w:pPr>
+      <w:r>
+        <w:t xml:space="preserve">Wikipedia contributors (2026g)</w:t>
+      </w:r>
+      <w:r>
+        <w:t xml:space="preserve"> </w:t>
+      </w:r>
+      <w:r>
+        <w:t xml:space="preserve">— the Poisson distribution, with examples</w:t>
+      </w:r>
+    </w:p>
+    <w:p>
+      <w:pPr>
+        <w:numPr>
+          <w:ilvl w:val="0"/>
+          <w:numId w:val="1015"/>
+        </w:numPr>
+      </w:pPr>
+      <w:r>
+        <w:t xml:space="preserve">Wikipedia contributors (2026f)</w:t>
+      </w:r>
+      <w:r>
+        <w:t xml:space="preserve"> </w:t>
+      </w:r>
+      <w:r>
+        <w:t xml:space="preserve">— the negative binomial distribution and its parametrizations</w:t>
+      </w:r>
+    </w:p>
+    <w:p>
+      <w:pPr>
+        <w:numPr>
+          <w:ilvl w:val="0"/>
+          <w:numId w:val="1015"/>
+        </w:numPr>
+      </w:pPr>
+      <w:r>
+        <w:t xml:space="preserve">Wikipedia contributors (2026h)</w:t>
+      </w:r>
+      <w:r>
+        <w:t xml:space="preserve"> </w:t>
+      </w:r>
+      <w:r>
+        <w:t xml:space="preserve">— the Weibull distribution and its hazard</w:t>
+      </w:r>
+    </w:p>
+    <w:p>
+      <w:pPr>
+        <w:numPr>
+          <w:ilvl w:val="0"/>
+          <w:numId w:val="1015"/>
+        </w:numPr>
+      </w:pPr>
+      <w:r>
+        <w:t xml:space="preserve">Wikipedia contributors (2026b)</w:t>
+      </w:r>
+      <w:r>
+        <w:t xml:space="preserve"> </w:t>
+      </w:r>
+      <w:r>
+        <w:t xml:space="preserve">— the Laplace distribution</w:t>
+      </w:r>
+    </w:p>
+    <w:p>
+      <w:pPr>
+        <w:numPr>
+          <w:ilvl w:val="0"/>
+          <w:numId w:val="1015"/>
+        </w:numPr>
+      </w:pPr>
+      <w:r>
+        <w:t xml:space="preserve">Wikipedia contributors (2026e)</w:t>
+      </w:r>
+      <w:r>
+        <w:t xml:space="preserve"> </w:t>
+      </w:r>
+      <w:r>
+        <w:t xml:space="preserve">— the multivariate normal distribution and its properties</w:t>
+      </w:r>
+    </w:p>
+    <w:p>
+      <w:pPr>
+        <w:numPr>
+          <w:ilvl w:val="0"/>
+          <w:numId w:val="1015"/>
+        </w:numPr>
+      </w:pPr>
+      <w:r>
+        <w:t xml:space="preserve">Wikipedia contributors (2026c)</w:t>
+      </w:r>
+      <w:r>
+        <w:t xml:space="preserve"> </w:t>
+      </w:r>
+      <w:r>
+        <w:t xml:space="preserve">— the Mahalanobis distance</w:t>
+      </w:r>
+    </w:p>
+    <w:p>
+      <w:pPr>
+        <w:numPr>
+          <w:ilvl w:val="0"/>
+          <w:numId w:val="1015"/>
+        </w:numPr>
+      </w:pPr>
+      <w:r>
+        <w:t xml:space="preserve">Wikipedia contributors (2026d)</w:t>
+      </w:r>
+      <w:r>
+        <w:t xml:space="preserve"> </w:t>
+      </w:r>
+      <w:r>
+        <w:t xml:space="preserve">— mixture distributions</w:t>
+      </w:r>
+    </w:p>
+    <w:bookmarkEnd w:id="159"/>
+    <w:bookmarkStart w:id="179" w:name="references"/>
+    <w:p>
+      <w:pPr>
+        <w:pStyle w:val="Heading2"/>
+      </w:pPr>
+      <w:r>
         <w:t xml:space="preserve">References</w:t>
       </w:r>
     </w:p>
-    <w:bookmarkStart w:id="163" w:name="refs"/>
-    <w:bookmarkStart w:id="162" w:name="ref-CaseBerg01"/>
+    <w:bookmarkStart w:id="178" w:name="refs"/>
+    <w:bookmarkStart w:id="161" w:name="ref-CaseBerg01"/>
     <w:p>
       <w:pPr>
         <w:pStyle w:val="Bibliography"/>
@@ -54731,7 +54915,7 @@
       <w:r>
         <w:t xml:space="preserve"> </w:t>
       </w:r>
-      <w:hyperlink r:id="rId161">
+      <w:hyperlink r:id="rId160">
         <w:r>
           <w:rPr>
             <w:rStyle w:val="Hyperlink"/>
@@ -54743,9 +54927,585 @@
         <w:t xml:space="preserve">.</w:t>
       </w:r>
     </w:p>
-    <w:bookmarkEnd w:id="162"/>
+    <w:bookmarkEnd w:id="161"/>
+    <w:bookmarkStart w:id="163" w:name="ref-wikipedia_binomial_distribution"/>
+    <w:p>
+      <w:pPr>
+        <w:pStyle w:val="Bibliography"/>
+      </w:pPr>
+      <w:r>
+        <w:t xml:space="preserve">Wikipedia contributors. 2026a.</w:t>
+      </w:r>
+      <w:r>
+        <w:t xml:space="preserve"> </w:t>
+      </w:r>
+      <w:r>
+        <w:rPr>
+          <w:i/>
+          <w:iCs/>
+        </w:rPr>
+        <w:t xml:space="preserve">Binomial Distribution —</w:t>
+      </w:r>
+      <w:r>
+        <w:rPr>
+          <w:i/>
+          <w:iCs/>
+        </w:rPr>
+        <w:t xml:space="preserve"> </w:t>
+      </w:r>
+      <w:r>
+        <w:rPr>
+          <w:i/>
+          <w:iCs/>
+        </w:rPr>
+        <w:t xml:space="preserve">Wikipedia</w:t>
+      </w:r>
+      <w:r>
+        <w:rPr>
+          <w:i/>
+          <w:iCs/>
+        </w:rPr>
+        <w:t xml:space="preserve">,</w:t>
+      </w:r>
+      <w:r>
+        <w:rPr>
+          <w:i/>
+          <w:iCs/>
+        </w:rPr>
+        <w:t xml:space="preserve"> </w:t>
+      </w:r>
+      <w:r>
+        <w:rPr>
+          <w:i/>
+          <w:iCs/>
+        </w:rPr>
+        <w:t xml:space="preserve">the Free Encyclopedia</w:t>
+      </w:r>
+      <w:r>
+        <w:t xml:space="preserve">.</w:t>
+      </w:r>
+      <w:r>
+        <w:t xml:space="preserve"> </w:t>
+      </w:r>
+      <w:hyperlink r:id="rId162">
+        <w:r>
+          <w:rPr>
+            <w:rStyle w:val="Hyperlink"/>
+          </w:rPr>
+          <w:t xml:space="preserve">https://en.wikipedia.org/wiki/Binomial_distribution</w:t>
+        </w:r>
+      </w:hyperlink>
+      <w:r>
+        <w:t xml:space="preserve">.</w:t>
+      </w:r>
+    </w:p>
     <w:bookmarkEnd w:id="163"/>
-    <w:bookmarkEnd w:id="164"/>
+    <w:bookmarkStart w:id="165" w:name="ref-wikipedia_laplace_distribution"/>
+    <w:p>
+      <w:pPr>
+        <w:pStyle w:val="Bibliography"/>
+      </w:pPr>
+      <w:r>
+        <w:t xml:space="preserve">Wikipedia contributors. 2026b.</w:t>
+      </w:r>
+      <w:r>
+        <w:t xml:space="preserve"> </w:t>
+      </w:r>
+      <w:r>
+        <w:rPr>
+          <w:i/>
+          <w:iCs/>
+        </w:rPr>
+        <w:t xml:space="preserve">Laplace Distribution —</w:t>
+      </w:r>
+      <w:r>
+        <w:rPr>
+          <w:i/>
+          <w:iCs/>
+        </w:rPr>
+        <w:t xml:space="preserve"> </w:t>
+      </w:r>
+      <w:r>
+        <w:rPr>
+          <w:i/>
+          <w:iCs/>
+        </w:rPr>
+        <w:t xml:space="preserve">Wikipedia</w:t>
+      </w:r>
+      <w:r>
+        <w:rPr>
+          <w:i/>
+          <w:iCs/>
+        </w:rPr>
+        <w:t xml:space="preserve">,</w:t>
+      </w:r>
+      <w:r>
+        <w:rPr>
+          <w:i/>
+          <w:iCs/>
+        </w:rPr>
+        <w:t xml:space="preserve"> </w:t>
+      </w:r>
+      <w:r>
+        <w:rPr>
+          <w:i/>
+          <w:iCs/>
+        </w:rPr>
+        <w:t xml:space="preserve">the Free Encyclopedia</w:t>
+      </w:r>
+      <w:r>
+        <w:t xml:space="preserve">.</w:t>
+      </w:r>
+      <w:r>
+        <w:t xml:space="preserve"> </w:t>
+      </w:r>
+      <w:hyperlink r:id="rId164">
+        <w:r>
+          <w:rPr>
+            <w:rStyle w:val="Hyperlink"/>
+          </w:rPr>
+          <w:t xml:space="preserve">https://en.wikipedia.org/wiki/Laplace_distribution</w:t>
+        </w:r>
+      </w:hyperlink>
+      <w:r>
+        <w:t xml:space="preserve">.</w:t>
+      </w:r>
+    </w:p>
+    <w:bookmarkEnd w:id="165"/>
+    <w:bookmarkStart w:id="167" w:name="ref-wikipedia_mahalanobis_distance"/>
+    <w:p>
+      <w:pPr>
+        <w:pStyle w:val="Bibliography"/>
+      </w:pPr>
+      <w:r>
+        <w:t xml:space="preserve">Wikipedia contributors. 2026c.</w:t>
+      </w:r>
+      <w:r>
+        <w:t xml:space="preserve"> </w:t>
+      </w:r>
+      <w:r>
+        <w:rPr>
+          <w:i/>
+          <w:iCs/>
+        </w:rPr>
+        <w:t xml:space="preserve">Mahalanobis Distance —</w:t>
+      </w:r>
+      <w:r>
+        <w:rPr>
+          <w:i/>
+          <w:iCs/>
+        </w:rPr>
+        <w:t xml:space="preserve"> </w:t>
+      </w:r>
+      <w:r>
+        <w:rPr>
+          <w:i/>
+          <w:iCs/>
+        </w:rPr>
+        <w:t xml:space="preserve">Wikipedia</w:t>
+      </w:r>
+      <w:r>
+        <w:rPr>
+          <w:i/>
+          <w:iCs/>
+        </w:rPr>
+        <w:t xml:space="preserve">,</w:t>
+      </w:r>
+      <w:r>
+        <w:rPr>
+          <w:i/>
+          <w:iCs/>
+        </w:rPr>
+        <w:t xml:space="preserve"> </w:t>
+      </w:r>
+      <w:r>
+        <w:rPr>
+          <w:i/>
+          <w:iCs/>
+        </w:rPr>
+        <w:t xml:space="preserve">the Free Encyclopedia</w:t>
+      </w:r>
+      <w:r>
+        <w:t xml:space="preserve">.</w:t>
+      </w:r>
+      <w:r>
+        <w:t xml:space="preserve"> </w:t>
+      </w:r>
+      <w:hyperlink r:id="rId166">
+        <w:r>
+          <w:rPr>
+            <w:rStyle w:val="Hyperlink"/>
+          </w:rPr>
+          <w:t xml:space="preserve">https://en.wikipedia.org/wiki/Mahalanobis_distance</w:t>
+        </w:r>
+      </w:hyperlink>
+      <w:r>
+        <w:t xml:space="preserve">.</w:t>
+      </w:r>
+    </w:p>
+    <w:bookmarkEnd w:id="167"/>
+    <w:bookmarkStart w:id="169" w:name="ref-wikipedia_mixture_distribution"/>
+    <w:p>
+      <w:pPr>
+        <w:pStyle w:val="Bibliography"/>
+      </w:pPr>
+      <w:r>
+        <w:t xml:space="preserve">Wikipedia contributors. 2026d.</w:t>
+      </w:r>
+      <w:r>
+        <w:t xml:space="preserve"> </w:t>
+      </w:r>
+      <w:r>
+        <w:rPr>
+          <w:i/>
+          <w:iCs/>
+        </w:rPr>
+        <w:t xml:space="preserve">Mixture Distribution —</w:t>
+      </w:r>
+      <w:r>
+        <w:rPr>
+          <w:i/>
+          <w:iCs/>
+        </w:rPr>
+        <w:t xml:space="preserve"> </w:t>
+      </w:r>
+      <w:r>
+        <w:rPr>
+          <w:i/>
+          <w:iCs/>
+        </w:rPr>
+        <w:t xml:space="preserve">Wikipedia</w:t>
+      </w:r>
+      <w:r>
+        <w:rPr>
+          <w:i/>
+          <w:iCs/>
+        </w:rPr>
+        <w:t xml:space="preserve">,</w:t>
+      </w:r>
+      <w:r>
+        <w:rPr>
+          <w:i/>
+          <w:iCs/>
+        </w:rPr>
+        <w:t xml:space="preserve"> </w:t>
+      </w:r>
+      <w:r>
+        <w:rPr>
+          <w:i/>
+          <w:iCs/>
+        </w:rPr>
+        <w:t xml:space="preserve">the Free Encyclopedia</w:t>
+      </w:r>
+      <w:r>
+        <w:t xml:space="preserve">.</w:t>
+      </w:r>
+      <w:r>
+        <w:t xml:space="preserve"> </w:t>
+      </w:r>
+      <w:hyperlink r:id="rId168">
+        <w:r>
+          <w:rPr>
+            <w:rStyle w:val="Hyperlink"/>
+          </w:rPr>
+          <w:t xml:space="preserve">https://en.wikipedia.org/wiki/Mixture_distribution</w:t>
+        </w:r>
+      </w:hyperlink>
+      <w:r>
+        <w:t xml:space="preserve">.</w:t>
+      </w:r>
+    </w:p>
+    <w:bookmarkEnd w:id="169"/>
+    <w:bookmarkStart w:id="171" w:name="X20af3894792cc1bee172a179f9b17a254a15f4d"/>
+    <w:p>
+      <w:pPr>
+        <w:pStyle w:val="Bibliography"/>
+      </w:pPr>
+      <w:r>
+        <w:t xml:space="preserve">Wikipedia contributors. 2026e.</w:t>
+      </w:r>
+      <w:r>
+        <w:t xml:space="preserve"> </w:t>
+      </w:r>
+      <w:r>
+        <w:rPr>
+          <w:i/>
+          <w:iCs/>
+        </w:rPr>
+        <w:t xml:space="preserve">Multivariate Normal Distribution —</w:t>
+      </w:r>
+      <w:r>
+        <w:rPr>
+          <w:i/>
+          <w:iCs/>
+        </w:rPr>
+        <w:t xml:space="preserve"> </w:t>
+      </w:r>
+      <w:r>
+        <w:rPr>
+          <w:i/>
+          <w:iCs/>
+        </w:rPr>
+        <w:t xml:space="preserve">Wikipedia</w:t>
+      </w:r>
+      <w:r>
+        <w:rPr>
+          <w:i/>
+          <w:iCs/>
+        </w:rPr>
+        <w:t xml:space="preserve">,</w:t>
+      </w:r>
+      <w:r>
+        <w:rPr>
+          <w:i/>
+          <w:iCs/>
+        </w:rPr>
+        <w:t xml:space="preserve"> </w:t>
+      </w:r>
+      <w:r>
+        <w:rPr>
+          <w:i/>
+          <w:iCs/>
+        </w:rPr>
+        <w:t xml:space="preserve">the Free Encyclopedia</w:t>
+      </w:r>
+      <w:r>
+        <w:t xml:space="preserve">.</w:t>
+      </w:r>
+      <w:r>
+        <w:t xml:space="preserve"> </w:t>
+      </w:r>
+      <w:hyperlink r:id="rId170">
+        <w:r>
+          <w:rPr>
+            <w:rStyle w:val="Hyperlink"/>
+          </w:rPr>
+          <w:t xml:space="preserve">https://en.wikipedia.org/wiki/Multivariate_normal_distribution</w:t>
+        </w:r>
+      </w:hyperlink>
+      <w:r>
+        <w:t xml:space="preserve">.</w:t>
+      </w:r>
+    </w:p>
+    <w:bookmarkEnd w:id="171"/>
+    <w:bookmarkStart w:id="173" w:name="Xba2ad42a4727c7a31602505192d479957632062"/>
+    <w:p>
+      <w:pPr>
+        <w:pStyle w:val="Bibliography"/>
+      </w:pPr>
+      <w:r>
+        <w:t xml:space="preserve">Wikipedia contributors. 2026f.</w:t>
+      </w:r>
+      <w:r>
+        <w:t xml:space="preserve"> </w:t>
+      </w:r>
+      <w:r>
+        <w:rPr>
+          <w:i/>
+          <w:iCs/>
+        </w:rPr>
+        <w:t xml:space="preserve">Negative Binomial Distribution —</w:t>
+      </w:r>
+      <w:r>
+        <w:rPr>
+          <w:i/>
+          <w:iCs/>
+        </w:rPr>
+        <w:t xml:space="preserve"> </w:t>
+      </w:r>
+      <w:r>
+        <w:rPr>
+          <w:i/>
+          <w:iCs/>
+        </w:rPr>
+        <w:t xml:space="preserve">Wikipedia</w:t>
+      </w:r>
+      <w:r>
+        <w:rPr>
+          <w:i/>
+          <w:iCs/>
+        </w:rPr>
+        <w:t xml:space="preserve">,</w:t>
+      </w:r>
+      <w:r>
+        <w:rPr>
+          <w:i/>
+          <w:iCs/>
+        </w:rPr>
+        <w:t xml:space="preserve"> </w:t>
+      </w:r>
+      <w:r>
+        <w:rPr>
+          <w:i/>
+          <w:iCs/>
+        </w:rPr>
+        <w:t xml:space="preserve">the Free Encyclopedia</w:t>
+      </w:r>
+      <w:r>
+        <w:t xml:space="preserve">.</w:t>
+      </w:r>
+      <w:r>
+        <w:t xml:space="preserve"> </w:t>
+      </w:r>
+      <w:hyperlink r:id="rId172">
+        <w:r>
+          <w:rPr>
+            <w:rStyle w:val="Hyperlink"/>
+          </w:rPr>
+          <w:t xml:space="preserve">https://en.wikipedia.org/wiki/Negative_binomial_distribution</w:t>
+        </w:r>
+      </w:hyperlink>
+      <w:r>
+        <w:t xml:space="preserve">.</w:t>
+      </w:r>
+    </w:p>
+    <w:bookmarkEnd w:id="173"/>
+    <w:bookmarkStart w:id="175" w:name="ref-wikipedia_poisson_distribution"/>
+    <w:p>
+      <w:pPr>
+        <w:pStyle w:val="Bibliography"/>
+      </w:pPr>
+      <w:r>
+        <w:t xml:space="preserve">Wikipedia contributors. 2026g.</w:t>
+      </w:r>
+      <w:r>
+        <w:t xml:space="preserve"> </w:t>
+      </w:r>
+      <w:r>
+        <w:rPr>
+          <w:i/>
+          <w:iCs/>
+        </w:rPr>
+        <w:t xml:space="preserve">Poisson Distribution —</w:t>
+      </w:r>
+      <w:r>
+        <w:rPr>
+          <w:i/>
+          <w:iCs/>
+        </w:rPr>
+        <w:t xml:space="preserve"> </w:t>
+      </w:r>
+      <w:r>
+        <w:rPr>
+          <w:i/>
+          <w:iCs/>
+        </w:rPr>
+        <w:t xml:space="preserve">Wikipedia</w:t>
+      </w:r>
+      <w:r>
+        <w:rPr>
+          <w:i/>
+          <w:iCs/>
+        </w:rPr>
+        <w:t xml:space="preserve">,</w:t>
+      </w:r>
+      <w:r>
+        <w:rPr>
+          <w:i/>
+          <w:iCs/>
+        </w:rPr>
+        <w:t xml:space="preserve"> </w:t>
+      </w:r>
+      <w:r>
+        <w:rPr>
+          <w:i/>
+          <w:iCs/>
+        </w:rPr>
+        <w:t xml:space="preserve">the Free Encyclopedia</w:t>
+      </w:r>
+      <w:r>
+        <w:t xml:space="preserve">.</w:t>
+      </w:r>
+      <w:r>
+        <w:t xml:space="preserve"> </w:t>
+      </w:r>
+      <w:hyperlink r:id="rId174">
+        <w:r>
+          <w:rPr>
+            <w:rStyle w:val="Hyperlink"/>
+          </w:rPr>
+          <w:t xml:space="preserve">https://en.wikipedia.org/wiki/Poisson_distribution</w:t>
+        </w:r>
+      </w:hyperlink>
+      <w:r>
+        <w:t xml:space="preserve">.</w:t>
+      </w:r>
+    </w:p>
+    <w:bookmarkEnd w:id="175"/>
+    <w:bookmarkStart w:id="177" w:name="ref-wikipedia_weibull_distribution"/>
+    <w:p>
+      <w:pPr>
+        <w:pStyle w:val="Bibliography"/>
+      </w:pPr>
+      <w:r>
+        <w:t xml:space="preserve">Wikipedia contributors. 2026h.</w:t>
+      </w:r>
+      <w:r>
+        <w:t xml:space="preserve"> </w:t>
+      </w:r>
+      <w:r>
+        <w:rPr>
+          <w:i/>
+          <w:iCs/>
+        </w:rPr>
+        <w:t xml:space="preserve">Weibull Distribution —</w:t>
+      </w:r>
+      <w:r>
+        <w:rPr>
+          <w:i/>
+          <w:iCs/>
+        </w:rPr>
+        <w:t xml:space="preserve"> </w:t>
+      </w:r>
+      <w:r>
+        <w:rPr>
+          <w:i/>
+          <w:iCs/>
+        </w:rPr>
+        <w:t xml:space="preserve">Wikipedia</w:t>
+      </w:r>
+      <w:r>
+        <w:rPr>
+          <w:i/>
+          <w:iCs/>
+        </w:rPr>
+        <w:t xml:space="preserve">,</w:t>
+      </w:r>
+      <w:r>
+        <w:rPr>
+          <w:i/>
+          <w:iCs/>
+        </w:rPr>
+        <w:t xml:space="preserve"> </w:t>
+      </w:r>
+      <w:r>
+        <w:rPr>
+          <w:i/>
+          <w:iCs/>
+        </w:rPr>
+        <w:t xml:space="preserve">the Free Encyclopedia</w:t>
+      </w:r>
+      <w:r>
+        <w:t xml:space="preserve">.</w:t>
+      </w:r>
+      <w:r>
+        <w:t xml:space="preserve"> </w:t>
+      </w:r>
+      <w:hyperlink r:id="rId176">
+        <w:r>
+          <w:rPr>
+            <w:rStyle w:val="Hyperlink"/>
+          </w:rPr>
+          <w:t xml:space="preserve">https://en.wikipedia.org/wiki/Weibull_distribution</w:t>
+        </w:r>
+      </w:hyperlink>
+      <w:r>
+        <w:t xml:space="preserve">.</w:t>
+      </w:r>
+    </w:p>
+    <w:bookmarkEnd w:id="177"/>
+    <w:bookmarkEnd w:id="178"/>
+    <w:bookmarkEnd w:id="179"/>
     <w:sectPr>
       <w:footnotePr>
         <w:numRestart w:val="eachSect"/>
@@ -55002,6 +55762,9 @@
     <w:abstractNumId w:val="991"/>
   </w:num>
   <w:num w:numId="1014">
+    <w:abstractNumId w:val="991"/>
+  </w:num>
+  <w:num w:numId="1015">
     <w:abstractNumId w:val="991"/>
   </w:num>
 </w:numbering>

</xml_diff>

<commit_message>
Deploying to gh-pages from @ Morrison-Lab/pds@262c8bdf7d7e6a94d6c1d991b54d924f85477184 🚀
</commit_message>
<xml_diff>
--- a/distributions.docx
+++ b/distributions.docx
@@ -15,7 +15,7 @@
         <w:pStyle w:val="Date"/>
       </w:pPr>
       <w:r>
-        <w:t xml:space="preserve">Last modified: 2026-10-18 11:35:41 (PDT)</w:t>
+        <w:t xml:space="preserve">Last modified: 2026-10-18 11:42:28 (PDT)</w:t>
       </w:r>
     </w:p>
     <w:p>
@@ -1156,7 +1156,7 @@
         <w:t xml:space="preserve"> </w:t>
       </w:r>
       <w:r>
-        <w:t xml:space="preserve">(Wikipedia contributors 2026a)</w:t>
+        <w:t xml:space="preserve">[1]</w:t>
       </w:r>
       <w:r>
         <w:t xml:space="preserve">,</w:t>
@@ -1549,7 +1549,7 @@
         <w:t xml:space="preserve">. </w:t>
       </w:r>
       <w:r>
-        <w:t xml:space="preserve">Casella and Berger (2002, sec. 3.2)</w:t>
+        <w:t xml:space="preserve">Casella and Berger [2, Sec. 3.2]</w:t>
       </w:r>
       <w:r>
         <w:t xml:space="preserve"> </w:t>
@@ -6752,7 +6752,7 @@
         <w:t xml:space="preserve"> </w:t>
       </w:r>
       <w:r>
-        <w:t xml:space="preserve">(Wikipedia contributors 2026g)</w:t>
+        <w:t xml:space="preserve">[3]</w:t>
       </w:r>
       <w:r>
         <w:t xml:space="preserve">,</w:t>
@@ -18764,7 +18764,7 @@
           <w:rPr>
             <w:rStyle w:val="Hyperlink"/>
           </w:rPr>
-          <w:t xml:space="preserve">Theorem 8</w:t>
+          <w:t xml:space="preserve">8</w:t>
         </w:r>
       </w:hyperlink>
       <w:r>
@@ -21471,7 +21471,7 @@
         <w:t xml:space="preserve"> </w:t>
       </w:r>
       <w:r>
-        <w:t xml:space="preserve">(Wikipedia contributors 2026f)</w:t>
+        <w:t xml:space="preserve">[4]</w:t>
       </w:r>
       <w:r>
         <w:t xml:space="preserve">,</w:t>
@@ -25010,7 +25010,7 @@
         <w:t xml:space="preserve"> </w:t>
       </w:r>
       <w:r>
-        <w:t xml:space="preserve">(Casella and Berger 2002)</w:t>
+        <w:t xml:space="preserve">[2]</w:t>
       </w:r>
       <w:r>
         <w:t xml:space="preserve">,</w:t>
@@ -28052,7 +28052,7 @@
         <w:t xml:space="preserve"> </w:t>
       </w:r>
       <w:r>
-        <w:t xml:space="preserve">(Wikipedia contributors 2026b)</w:t>
+        <w:t xml:space="preserve">[5]</w:t>
       </w:r>
       <w:r>
         <w:t xml:space="preserve">,</w:t>
@@ -32269,7 +32269,7 @@
         <w:t xml:space="preserve"> </w:t>
       </w:r>
       <w:r>
-        <w:t xml:space="preserve">(Wikipedia contributors 2026h)</w:t>
+        <w:t xml:space="preserve">[6]</w:t>
       </w:r>
       <w:r>
         <w:t xml:space="preserve"> </w:t>
@@ -37605,7 +37605,7 @@
         <w:t xml:space="preserve"> </w:t>
       </w:r>
       <w:r>
-        <w:t xml:space="preserve">(Wikipedia contributors 2026e)</w:t>
+        <w:t xml:space="preserve">[7]</w:t>
       </w:r>
       <w:r>
         <w:t xml:space="preserve">.</w:t>
@@ -38527,7 +38527,7 @@
         <w:t xml:space="preserve"> </w:t>
       </w:r>
       <w:r>
-        <w:t xml:space="preserve">(Wikipedia contributors 2026c)</w:t>
+        <w:t xml:space="preserve">[8]</w:t>
       </w:r>
       <w:r>
         <w:t xml:space="preserve">.</w:t>
@@ -49155,7 +49155,7 @@
         </w:numPr>
       </w:pPr>
       <w:r>
-        <w:t xml:space="preserve">Wikipedia contributors (2026a)</w:t>
+        <w:t xml:space="preserve">Wikipedia contributors [1]</w:t>
       </w:r>
       <w:r>
         <w:t xml:space="preserve"> </w:t>
@@ -49172,7 +49172,7 @@
         </w:numPr>
       </w:pPr>
       <w:r>
-        <w:t xml:space="preserve">Wikipedia contributors (2026g)</w:t>
+        <w:t xml:space="preserve">Wikipedia contributors [3]</w:t>
       </w:r>
       <w:r>
         <w:t xml:space="preserve"> </w:t>
@@ -49189,7 +49189,7 @@
         </w:numPr>
       </w:pPr>
       <w:r>
-        <w:t xml:space="preserve">Wikipedia contributors (2026f)</w:t>
+        <w:t xml:space="preserve">Wikipedia contributors [4]</w:t>
       </w:r>
       <w:r>
         <w:t xml:space="preserve"> </w:t>
@@ -49206,7 +49206,7 @@
         </w:numPr>
       </w:pPr>
       <w:r>
-        <w:t xml:space="preserve">Wikipedia contributors (2026h)</w:t>
+        <w:t xml:space="preserve">Wikipedia contributors [6]</w:t>
       </w:r>
       <w:r>
         <w:t xml:space="preserve"> </w:t>
@@ -49223,7 +49223,7 @@
         </w:numPr>
       </w:pPr>
       <w:r>
-        <w:t xml:space="preserve">Wikipedia contributors (2026b)</w:t>
+        <w:t xml:space="preserve">Wikipedia contributors [5]</w:t>
       </w:r>
       <w:r>
         <w:t xml:space="preserve"> </w:t>
@@ -49240,7 +49240,7 @@
         </w:numPr>
       </w:pPr>
       <w:r>
-        <w:t xml:space="preserve">Wikipedia contributors (2026e)</w:t>
+        <w:t xml:space="preserve">Wikipedia contributors [7]</w:t>
       </w:r>
       <w:r>
         <w:t xml:space="preserve"> </w:t>
@@ -49257,7 +49257,7 @@
         </w:numPr>
       </w:pPr>
       <w:r>
-        <w:t xml:space="preserve">Wikipedia contributors (2026c)</w:t>
+        <w:t xml:space="preserve">Wikipedia contributors [8]</w:t>
       </w:r>
       <w:r>
         <w:t xml:space="preserve"> </w:t>
@@ -49274,7 +49274,7 @@
         </w:numPr>
       </w:pPr>
       <w:r>
-        <w:t xml:space="preserve">Wikipedia contributors (2026d)</w:t>
+        <w:t xml:space="preserve">Wikipedia contributors [9]</w:t>
       </w:r>
       <w:r>
         <w:t xml:space="preserve"> </w:t>
@@ -49294,13 +49294,79 @@
       </w:r>
     </w:p>
     <w:bookmarkStart w:id="178" w:name="refs"/>
-    <w:bookmarkStart w:id="161" w:name="ref-CaseBerg01"/>
+    <w:bookmarkStart w:id="161" w:name="ref-wikipedia_binomial_distribution"/>
     <w:p>
       <w:pPr>
         <w:pStyle w:val="Bibliography"/>
       </w:pPr>
       <w:r>
-        <w:t xml:space="preserve">Casella, George, and Roger Berger. 2002.</w:t>
+        <w:t xml:space="preserve">[1]</w:t>
+      </w:r>
+      <w:r>
+        <w:t xml:space="preserve"> </w:t>
+      </w:r>
+      <w:r>
+        <w:t xml:space="preserve">	</w:t>
+      </w:r>
+      <w:r>
+        <w:t xml:space="preserve">Wikipedia contributors,</w:t>
+      </w:r>
+      <w:r>
+        <w:t xml:space="preserve"> </w:t>
+      </w:r>
+      <w:r>
+        <w:t xml:space="preserve">“Binomial distribution —</w:t>
+      </w:r>
+      <w:r>
+        <w:t xml:space="preserve"> </w:t>
+      </w:r>
+      <w:r>
+        <w:t xml:space="preserve">Wikipedia</w:t>
+      </w:r>
+      <w:r>
+        <w:t xml:space="preserve">,</w:t>
+      </w:r>
+      <w:r>
+        <w:t xml:space="preserve"> </w:t>
+      </w:r>
+      <w:r>
+        <w:t xml:space="preserve">the free encyclopedia.”</w:t>
+      </w:r>
+      <w:r>
+        <w:t xml:space="preserve"> </w:t>
+      </w:r>
+      <w:r>
+        <w:t xml:space="preserve">2026. Available:</w:t>
+      </w:r>
+      <w:r>
+        <w:t xml:space="preserve"> </w:t>
+      </w:r>
+      <w:hyperlink r:id="rId160">
+        <w:r>
+          <w:rPr>
+            <w:rStyle w:val="Hyperlink"/>
+          </w:rPr>
+          <w:t xml:space="preserve">https://en.wikipedia.org/wiki/Binomial_distribution</w:t>
+        </w:r>
+      </w:hyperlink>
+    </w:p>
+    <w:bookmarkEnd w:id="161"/>
+    <w:bookmarkStart w:id="163" w:name="ref-CaseBerg01"/>
+    <w:p>
+      <w:pPr>
+        <w:pStyle w:val="Bibliography"/>
+      </w:pPr>
+      <w:r>
+        <w:t xml:space="preserve">[2]</w:t>
+      </w:r>
+      <w:r>
+        <w:t xml:space="preserve"> </w:t>
+      </w:r>
+      <w:r>
+        <w:t xml:space="preserve">	</w:t>
+      </w:r>
+      <w:r>
+        <w:t xml:space="preserve">G. Casella and R. Berger,</w:t>
       </w:r>
       <w:r>
         <w:t xml:space="preserve"> </w:t>
@@ -49310,15 +49376,15 @@
           <w:i/>
           <w:iCs/>
         </w:rPr>
-        <w:t xml:space="preserve">Statistical Inference</w:t>
-      </w:r>
-      <w:r>
-        <w:t xml:space="preserve">. 2nd ed. Cengage Learning.</w:t>
-      </w:r>
-      <w:r>
-        <w:t xml:space="preserve"> </w:t>
-      </w:r>
-      <w:hyperlink r:id="rId160">
+        <w:t xml:space="preserve">Statistical inference</w:t>
+      </w:r>
+      <w:r>
+        <w:t xml:space="preserve">, 2nd ed. Cengage Learning, 2002. Available:</w:t>
+      </w:r>
+      <w:r>
+        <w:t xml:space="preserve"> </w:t>
+      </w:r>
+      <w:hyperlink r:id="rId162">
         <w:r>
           <w:rPr>
             <w:rStyle w:val="Hyperlink"/>
@@ -49326,143 +49392,170 @@
           <w:t xml:space="preserve">https://www.cengage.com/c/statistical-inference-2e-casella-berger/9780534243128/</w:t>
         </w:r>
       </w:hyperlink>
-      <w:r>
-        <w:t xml:space="preserve">.</w:t>
-      </w:r>
     </w:p>
-    <w:bookmarkEnd w:id="161"/>
-    <w:bookmarkStart w:id="163" w:name="ref-wikipedia_binomial_distribution"/>
+    <w:bookmarkEnd w:id="163"/>
+    <w:bookmarkStart w:id="165" w:name="ref-wikipedia_poisson_distribution"/>
     <w:p>
       <w:pPr>
         <w:pStyle w:val="Bibliography"/>
       </w:pPr>
       <w:r>
-        <w:t xml:space="preserve">Wikipedia contributors. 2026a.</w:t>
-      </w:r>
-      <w:r>
-        <w:t xml:space="preserve"> </w:t>
-      </w:r>
-      <w:r>
-        <w:rPr>
-          <w:i/>
-          <w:iCs/>
-        </w:rPr>
-        <w:t xml:space="preserve">Binomial Distribution —</w:t>
-      </w:r>
-      <w:r>
-        <w:rPr>
-          <w:i/>
-          <w:iCs/>
-        </w:rPr>
-        <w:t xml:space="preserve"> </w:t>
-      </w:r>
-      <w:r>
-        <w:rPr>
-          <w:i/>
-          <w:iCs/>
-        </w:rPr>
+        <w:t xml:space="preserve">[3]</w:t>
+      </w:r>
+      <w:r>
+        <w:t xml:space="preserve"> </w:t>
+      </w:r>
+      <w:r>
+        <w:t xml:space="preserve">	</w:t>
+      </w:r>
+      <w:r>
+        <w:t xml:space="preserve">Wikipedia contributors,</w:t>
+      </w:r>
+      <w:r>
+        <w:t xml:space="preserve"> </w:t>
+      </w:r>
+      <w:r>
+        <w:t xml:space="preserve">“Poisson distribution —</w:t>
+      </w:r>
+      <w:r>
+        <w:t xml:space="preserve"> </w:t>
+      </w:r>
+      <w:r>
         <w:t xml:space="preserve">Wikipedia</w:t>
       </w:r>
       <w:r>
-        <w:rPr>
-          <w:i/>
-          <w:iCs/>
-        </w:rPr>
         <w:t xml:space="preserve">,</w:t>
       </w:r>
       <w:r>
-        <w:rPr>
-          <w:i/>
-          <w:iCs/>
-        </w:rPr>
-        <w:t xml:space="preserve"> </w:t>
-      </w:r>
-      <w:r>
-        <w:rPr>
-          <w:i/>
-          <w:iCs/>
-        </w:rPr>
-        <w:t xml:space="preserve">the Free Encyclopedia</w:t>
-      </w:r>
-      <w:r>
-        <w:t xml:space="preserve">.</w:t>
-      </w:r>
-      <w:r>
-        <w:t xml:space="preserve"> </w:t>
-      </w:r>
-      <w:hyperlink r:id="rId162">
+        <w:t xml:space="preserve"> </w:t>
+      </w:r>
+      <w:r>
+        <w:t xml:space="preserve">the free encyclopedia.”</w:t>
+      </w:r>
+      <w:r>
+        <w:t xml:space="preserve"> </w:t>
+      </w:r>
+      <w:r>
+        <w:t xml:space="preserve">2026. Available:</w:t>
+      </w:r>
+      <w:r>
+        <w:t xml:space="preserve"> </w:t>
+      </w:r>
+      <w:hyperlink r:id="rId164">
         <w:r>
           <w:rPr>
             <w:rStyle w:val="Hyperlink"/>
           </w:rPr>
-          <w:t xml:space="preserve">https://en.wikipedia.org/wiki/Binomial_distribution</w:t>
+          <w:t xml:space="preserve">https://en.wikipedia.org/wiki/Poisson_distribution</w:t>
         </w:r>
       </w:hyperlink>
-      <w:r>
-        <w:t xml:space="preserve">.</w:t>
-      </w:r>
     </w:p>
-    <w:bookmarkEnd w:id="163"/>
-    <w:bookmarkStart w:id="165" w:name="ref-wikipedia_laplace_distribution"/>
+    <w:bookmarkEnd w:id="165"/>
+    <w:bookmarkStart w:id="167" w:name="Xba2ad42a4727c7a31602505192d479957632062"/>
     <w:p>
       <w:pPr>
         <w:pStyle w:val="Bibliography"/>
       </w:pPr>
       <w:r>
-        <w:t xml:space="preserve">Wikipedia contributors. 2026b.</w:t>
-      </w:r>
-      <w:r>
-        <w:t xml:space="preserve"> </w:t>
-      </w:r>
-      <w:r>
-        <w:rPr>
-          <w:i/>
-          <w:iCs/>
-        </w:rPr>
-        <w:t xml:space="preserve">Laplace Distribution —</w:t>
-      </w:r>
-      <w:r>
-        <w:rPr>
-          <w:i/>
-          <w:iCs/>
-        </w:rPr>
-        <w:t xml:space="preserve"> </w:t>
-      </w:r>
-      <w:r>
-        <w:rPr>
-          <w:i/>
-          <w:iCs/>
-        </w:rPr>
+        <w:t xml:space="preserve">[4]</w:t>
+      </w:r>
+      <w:r>
+        <w:t xml:space="preserve"> </w:t>
+      </w:r>
+      <w:r>
+        <w:t xml:space="preserve">	</w:t>
+      </w:r>
+      <w:r>
+        <w:t xml:space="preserve">Wikipedia contributors,</w:t>
+      </w:r>
+      <w:r>
+        <w:t xml:space="preserve"> </w:t>
+      </w:r>
+      <w:r>
+        <w:t xml:space="preserve">“Negative binomial distribution —</w:t>
+      </w:r>
+      <w:r>
+        <w:t xml:space="preserve"> </w:t>
+      </w:r>
+      <w:r>
         <w:t xml:space="preserve">Wikipedia</w:t>
       </w:r>
       <w:r>
-        <w:rPr>
-          <w:i/>
-          <w:iCs/>
-        </w:rPr>
         <w:t xml:space="preserve">,</w:t>
       </w:r>
       <w:r>
-        <w:rPr>
-          <w:i/>
-          <w:iCs/>
-        </w:rPr>
-        <w:t xml:space="preserve"> </w:t>
-      </w:r>
-      <w:r>
-        <w:rPr>
-          <w:i/>
-          <w:iCs/>
-        </w:rPr>
-        <w:t xml:space="preserve">the Free Encyclopedia</w:t>
-      </w:r>
-      <w:r>
-        <w:t xml:space="preserve">.</w:t>
-      </w:r>
-      <w:r>
-        <w:t xml:space="preserve"> </w:t>
-      </w:r>
-      <w:hyperlink r:id="rId164">
+        <w:t xml:space="preserve"> </w:t>
+      </w:r>
+      <w:r>
+        <w:t xml:space="preserve">the free encyclopedia.”</w:t>
+      </w:r>
+      <w:r>
+        <w:t xml:space="preserve"> </w:t>
+      </w:r>
+      <w:r>
+        <w:t xml:space="preserve">2026. Available:</w:t>
+      </w:r>
+      <w:r>
+        <w:t xml:space="preserve"> </w:t>
+      </w:r>
+      <w:hyperlink r:id="rId166">
+        <w:r>
+          <w:rPr>
+            <w:rStyle w:val="Hyperlink"/>
+          </w:rPr>
+          <w:t xml:space="preserve">https://en.wikipedia.org/wiki/Negative_binomial_distribution</w:t>
+        </w:r>
+      </w:hyperlink>
+    </w:p>
+    <w:bookmarkEnd w:id="167"/>
+    <w:bookmarkStart w:id="169" w:name="ref-wikipedia_laplace_distribution"/>
+    <w:p>
+      <w:pPr>
+        <w:pStyle w:val="Bibliography"/>
+      </w:pPr>
+      <w:r>
+        <w:t xml:space="preserve">[5]</w:t>
+      </w:r>
+      <w:r>
+        <w:t xml:space="preserve"> </w:t>
+      </w:r>
+      <w:r>
+        <w:t xml:space="preserve">	</w:t>
+      </w:r>
+      <w:r>
+        <w:t xml:space="preserve">Wikipedia contributors,</w:t>
+      </w:r>
+      <w:r>
+        <w:t xml:space="preserve"> </w:t>
+      </w:r>
+      <w:r>
+        <w:t xml:space="preserve">“Laplace distribution —</w:t>
+      </w:r>
+      <w:r>
+        <w:t xml:space="preserve"> </w:t>
+      </w:r>
+      <w:r>
+        <w:t xml:space="preserve">Wikipedia</w:t>
+      </w:r>
+      <w:r>
+        <w:t xml:space="preserve">,</w:t>
+      </w:r>
+      <w:r>
+        <w:t xml:space="preserve"> </w:t>
+      </w:r>
+      <w:r>
+        <w:t xml:space="preserve">the free encyclopedia.”</w:t>
+      </w:r>
+      <w:r>
+        <w:t xml:space="preserve"> </w:t>
+      </w:r>
+      <w:r>
+        <w:t xml:space="preserve">2026. Available:</w:t>
+      </w:r>
+      <w:r>
+        <w:t xml:space="preserve"> </w:t>
+      </w:r>
+      <w:hyperlink r:id="rId168">
         <w:r>
           <w:rPr>
             <w:rStyle w:val="Hyperlink"/>
@@ -49470,71 +49563,170 @@
           <w:t xml:space="preserve">https://en.wikipedia.org/wiki/Laplace_distribution</w:t>
         </w:r>
       </w:hyperlink>
-      <w:r>
-        <w:t xml:space="preserve">.</w:t>
-      </w:r>
     </w:p>
-    <w:bookmarkEnd w:id="165"/>
-    <w:bookmarkStart w:id="167" w:name="ref-wikipedia_mahalanobis_distance"/>
+    <w:bookmarkEnd w:id="169"/>
+    <w:bookmarkStart w:id="171" w:name="ref-wikipedia_weibull_distribution"/>
     <w:p>
       <w:pPr>
         <w:pStyle w:val="Bibliography"/>
       </w:pPr>
       <w:r>
-        <w:t xml:space="preserve">Wikipedia contributors. 2026c.</w:t>
-      </w:r>
-      <w:r>
-        <w:t xml:space="preserve"> </w:t>
-      </w:r>
-      <w:r>
-        <w:rPr>
-          <w:i/>
-          <w:iCs/>
-        </w:rPr>
-        <w:t xml:space="preserve">Mahalanobis Distance —</w:t>
-      </w:r>
-      <w:r>
-        <w:rPr>
-          <w:i/>
-          <w:iCs/>
-        </w:rPr>
-        <w:t xml:space="preserve"> </w:t>
-      </w:r>
-      <w:r>
-        <w:rPr>
-          <w:i/>
-          <w:iCs/>
-        </w:rPr>
+        <w:t xml:space="preserve">[6]</w:t>
+      </w:r>
+      <w:r>
+        <w:t xml:space="preserve"> </w:t>
+      </w:r>
+      <w:r>
+        <w:t xml:space="preserve">	</w:t>
+      </w:r>
+      <w:r>
+        <w:t xml:space="preserve">Wikipedia contributors,</w:t>
+      </w:r>
+      <w:r>
+        <w:t xml:space="preserve"> </w:t>
+      </w:r>
+      <w:r>
+        <w:t xml:space="preserve">“Weibull distribution —</w:t>
+      </w:r>
+      <w:r>
+        <w:t xml:space="preserve"> </w:t>
+      </w:r>
+      <w:r>
         <w:t xml:space="preserve">Wikipedia</w:t>
       </w:r>
       <w:r>
-        <w:rPr>
-          <w:i/>
-          <w:iCs/>
-        </w:rPr>
         <w:t xml:space="preserve">,</w:t>
       </w:r>
       <w:r>
-        <w:rPr>
-          <w:i/>
-          <w:iCs/>
-        </w:rPr>
-        <w:t xml:space="preserve"> </w:t>
-      </w:r>
-      <w:r>
-        <w:rPr>
-          <w:i/>
-          <w:iCs/>
-        </w:rPr>
-        <w:t xml:space="preserve">the Free Encyclopedia</w:t>
-      </w:r>
-      <w:r>
-        <w:t xml:space="preserve">.</w:t>
-      </w:r>
-      <w:r>
-        <w:t xml:space="preserve"> </w:t>
-      </w:r>
-      <w:hyperlink r:id="rId166">
+        <w:t xml:space="preserve"> </w:t>
+      </w:r>
+      <w:r>
+        <w:t xml:space="preserve">the free encyclopedia.”</w:t>
+      </w:r>
+      <w:r>
+        <w:t xml:space="preserve"> </w:t>
+      </w:r>
+      <w:r>
+        <w:t xml:space="preserve">2026. Available:</w:t>
+      </w:r>
+      <w:r>
+        <w:t xml:space="preserve"> </w:t>
+      </w:r>
+      <w:hyperlink r:id="rId170">
+        <w:r>
+          <w:rPr>
+            <w:rStyle w:val="Hyperlink"/>
+          </w:rPr>
+          <w:t xml:space="preserve">https://en.wikipedia.org/wiki/Weibull_distribution</w:t>
+        </w:r>
+      </w:hyperlink>
+    </w:p>
+    <w:bookmarkEnd w:id="171"/>
+    <w:bookmarkStart w:id="173" w:name="X20af3894792cc1bee172a179f9b17a254a15f4d"/>
+    <w:p>
+      <w:pPr>
+        <w:pStyle w:val="Bibliography"/>
+      </w:pPr>
+      <w:r>
+        <w:t xml:space="preserve">[7]</w:t>
+      </w:r>
+      <w:r>
+        <w:t xml:space="preserve"> </w:t>
+      </w:r>
+      <w:r>
+        <w:t xml:space="preserve">	</w:t>
+      </w:r>
+      <w:r>
+        <w:t xml:space="preserve">Wikipedia contributors,</w:t>
+      </w:r>
+      <w:r>
+        <w:t xml:space="preserve"> </w:t>
+      </w:r>
+      <w:r>
+        <w:t xml:space="preserve">“Multivariate normal distribution —</w:t>
+      </w:r>
+      <w:r>
+        <w:t xml:space="preserve"> </w:t>
+      </w:r>
+      <w:r>
+        <w:t xml:space="preserve">Wikipedia</w:t>
+      </w:r>
+      <w:r>
+        <w:t xml:space="preserve">,</w:t>
+      </w:r>
+      <w:r>
+        <w:t xml:space="preserve"> </w:t>
+      </w:r>
+      <w:r>
+        <w:t xml:space="preserve">the free encyclopedia.”</w:t>
+      </w:r>
+      <w:r>
+        <w:t xml:space="preserve"> </w:t>
+      </w:r>
+      <w:r>
+        <w:t xml:space="preserve">2026. Available:</w:t>
+      </w:r>
+      <w:r>
+        <w:t xml:space="preserve"> </w:t>
+      </w:r>
+      <w:hyperlink r:id="rId172">
+        <w:r>
+          <w:rPr>
+            <w:rStyle w:val="Hyperlink"/>
+          </w:rPr>
+          <w:t xml:space="preserve">https://en.wikipedia.org/wiki/Multivariate_normal_distribution</w:t>
+        </w:r>
+      </w:hyperlink>
+    </w:p>
+    <w:bookmarkEnd w:id="173"/>
+    <w:bookmarkStart w:id="175" w:name="ref-wikipedia_mahalanobis_distance"/>
+    <w:p>
+      <w:pPr>
+        <w:pStyle w:val="Bibliography"/>
+      </w:pPr>
+      <w:r>
+        <w:t xml:space="preserve">[8]</w:t>
+      </w:r>
+      <w:r>
+        <w:t xml:space="preserve"> </w:t>
+      </w:r>
+      <w:r>
+        <w:t xml:space="preserve">	</w:t>
+      </w:r>
+      <w:r>
+        <w:t xml:space="preserve">Wikipedia contributors,</w:t>
+      </w:r>
+      <w:r>
+        <w:t xml:space="preserve"> </w:t>
+      </w:r>
+      <w:r>
+        <w:t xml:space="preserve">“Mahalanobis distance —</w:t>
+      </w:r>
+      <w:r>
+        <w:t xml:space="preserve"> </w:t>
+      </w:r>
+      <w:r>
+        <w:t xml:space="preserve">Wikipedia</w:t>
+      </w:r>
+      <w:r>
+        <w:t xml:space="preserve">,</w:t>
+      </w:r>
+      <w:r>
+        <w:t xml:space="preserve"> </w:t>
+      </w:r>
+      <w:r>
+        <w:t xml:space="preserve">the free encyclopedia.”</w:t>
+      </w:r>
+      <w:r>
+        <w:t xml:space="preserve"> </w:t>
+      </w:r>
+      <w:r>
+        <w:t xml:space="preserve">2026. Available:</w:t>
+      </w:r>
+      <w:r>
+        <w:t xml:space="preserve"> </w:t>
+      </w:r>
+      <w:hyperlink r:id="rId174">
         <w:r>
           <w:rPr>
             <w:rStyle w:val="Hyperlink"/>
@@ -49542,71 +49734,56 @@
           <w:t xml:space="preserve">https://en.wikipedia.org/wiki/Mahalanobis_distance</w:t>
         </w:r>
       </w:hyperlink>
-      <w:r>
-        <w:t xml:space="preserve">.</w:t>
-      </w:r>
     </w:p>
-    <w:bookmarkEnd w:id="167"/>
-    <w:bookmarkStart w:id="169" w:name="ref-wikipedia_mixture_distribution"/>
+    <w:bookmarkEnd w:id="175"/>
+    <w:bookmarkStart w:id="177" w:name="ref-wikipedia_mixture_distribution"/>
     <w:p>
       <w:pPr>
         <w:pStyle w:val="Bibliography"/>
       </w:pPr>
       <w:r>
-        <w:t xml:space="preserve">Wikipedia contributors. 2026d.</w:t>
-      </w:r>
-      <w:r>
-        <w:t xml:space="preserve"> </w:t>
-      </w:r>
-      <w:r>
-        <w:rPr>
-          <w:i/>
-          <w:iCs/>
-        </w:rPr>
-        <w:t xml:space="preserve">Mixture Distribution —</w:t>
-      </w:r>
-      <w:r>
-        <w:rPr>
-          <w:i/>
-          <w:iCs/>
-        </w:rPr>
-        <w:t xml:space="preserve"> </w:t>
-      </w:r>
-      <w:r>
-        <w:rPr>
-          <w:i/>
-          <w:iCs/>
-        </w:rPr>
+        <w:t xml:space="preserve">[9]</w:t>
+      </w:r>
+      <w:r>
+        <w:t xml:space="preserve"> </w:t>
+      </w:r>
+      <w:r>
+        <w:t xml:space="preserve">	</w:t>
+      </w:r>
+      <w:r>
+        <w:t xml:space="preserve">Wikipedia contributors,</w:t>
+      </w:r>
+      <w:r>
+        <w:t xml:space="preserve"> </w:t>
+      </w:r>
+      <w:r>
+        <w:t xml:space="preserve">“Mixture distribution —</w:t>
+      </w:r>
+      <w:r>
+        <w:t xml:space="preserve"> </w:t>
+      </w:r>
+      <w:r>
         <w:t xml:space="preserve">Wikipedia</w:t>
       </w:r>
       <w:r>
-        <w:rPr>
-          <w:i/>
-          <w:iCs/>
-        </w:rPr>
         <w:t xml:space="preserve">,</w:t>
       </w:r>
       <w:r>
-        <w:rPr>
-          <w:i/>
-          <w:iCs/>
-        </w:rPr>
-        <w:t xml:space="preserve"> </w:t>
-      </w:r>
-      <w:r>
-        <w:rPr>
-          <w:i/>
-          <w:iCs/>
-        </w:rPr>
-        <w:t xml:space="preserve">the Free Encyclopedia</w:t>
-      </w:r>
-      <w:r>
-        <w:t xml:space="preserve">.</w:t>
-      </w:r>
-      <w:r>
-        <w:t xml:space="preserve"> </w:t>
-      </w:r>
-      <w:hyperlink r:id="rId168">
+        <w:t xml:space="preserve"> </w:t>
+      </w:r>
+      <w:r>
+        <w:t xml:space="preserve">the free encyclopedia.”</w:t>
+      </w:r>
+      <w:r>
+        <w:t xml:space="preserve"> </w:t>
+      </w:r>
+      <w:r>
+        <w:t xml:space="preserve">2026. Available:</w:t>
+      </w:r>
+      <w:r>
+        <w:t xml:space="preserve"> </w:t>
+      </w:r>
+      <w:hyperlink r:id="rId176">
         <w:r>
           <w:rPr>
             <w:rStyle w:val="Hyperlink"/>
@@ -49614,297 +49791,6 @@
           <w:t xml:space="preserve">https://en.wikipedia.org/wiki/Mixture_distribution</w:t>
         </w:r>
       </w:hyperlink>
-      <w:r>
-        <w:t xml:space="preserve">.</w:t>
-      </w:r>
-    </w:p>
-    <w:bookmarkEnd w:id="169"/>
-    <w:bookmarkStart w:id="171" w:name="X20af3894792cc1bee172a179f9b17a254a15f4d"/>
-    <w:p>
-      <w:pPr>
-        <w:pStyle w:val="Bibliography"/>
-      </w:pPr>
-      <w:r>
-        <w:t xml:space="preserve">Wikipedia contributors. 2026e.</w:t>
-      </w:r>
-      <w:r>
-        <w:t xml:space="preserve"> </w:t>
-      </w:r>
-      <w:r>
-        <w:rPr>
-          <w:i/>
-          <w:iCs/>
-        </w:rPr>
-        <w:t xml:space="preserve">Multivariate Normal Distribution —</w:t>
-      </w:r>
-      <w:r>
-        <w:rPr>
-          <w:i/>
-          <w:iCs/>
-        </w:rPr>
-        <w:t xml:space="preserve"> </w:t>
-      </w:r>
-      <w:r>
-        <w:rPr>
-          <w:i/>
-          <w:iCs/>
-        </w:rPr>
-        <w:t xml:space="preserve">Wikipedia</w:t>
-      </w:r>
-      <w:r>
-        <w:rPr>
-          <w:i/>
-          <w:iCs/>
-        </w:rPr>
-        <w:t xml:space="preserve">,</w:t>
-      </w:r>
-      <w:r>
-        <w:rPr>
-          <w:i/>
-          <w:iCs/>
-        </w:rPr>
-        <w:t xml:space="preserve"> </w:t>
-      </w:r>
-      <w:r>
-        <w:rPr>
-          <w:i/>
-          <w:iCs/>
-        </w:rPr>
-        <w:t xml:space="preserve">the Free Encyclopedia</w:t>
-      </w:r>
-      <w:r>
-        <w:t xml:space="preserve">.</w:t>
-      </w:r>
-      <w:r>
-        <w:t xml:space="preserve"> </w:t>
-      </w:r>
-      <w:hyperlink r:id="rId170">
-        <w:r>
-          <w:rPr>
-            <w:rStyle w:val="Hyperlink"/>
-          </w:rPr>
-          <w:t xml:space="preserve">https://en.wikipedia.org/wiki/Multivariate_normal_distribution</w:t>
-        </w:r>
-      </w:hyperlink>
-      <w:r>
-        <w:t xml:space="preserve">.</w:t>
-      </w:r>
-    </w:p>
-    <w:bookmarkEnd w:id="171"/>
-    <w:bookmarkStart w:id="173" w:name="Xba2ad42a4727c7a31602505192d479957632062"/>
-    <w:p>
-      <w:pPr>
-        <w:pStyle w:val="Bibliography"/>
-      </w:pPr>
-      <w:r>
-        <w:t xml:space="preserve">Wikipedia contributors. 2026f.</w:t>
-      </w:r>
-      <w:r>
-        <w:t xml:space="preserve"> </w:t>
-      </w:r>
-      <w:r>
-        <w:rPr>
-          <w:i/>
-          <w:iCs/>
-        </w:rPr>
-        <w:t xml:space="preserve">Negative Binomial Distribution —</w:t>
-      </w:r>
-      <w:r>
-        <w:rPr>
-          <w:i/>
-          <w:iCs/>
-        </w:rPr>
-        <w:t xml:space="preserve"> </w:t>
-      </w:r>
-      <w:r>
-        <w:rPr>
-          <w:i/>
-          <w:iCs/>
-        </w:rPr>
-        <w:t xml:space="preserve">Wikipedia</w:t>
-      </w:r>
-      <w:r>
-        <w:rPr>
-          <w:i/>
-          <w:iCs/>
-        </w:rPr>
-        <w:t xml:space="preserve">,</w:t>
-      </w:r>
-      <w:r>
-        <w:rPr>
-          <w:i/>
-          <w:iCs/>
-        </w:rPr>
-        <w:t xml:space="preserve"> </w:t>
-      </w:r>
-      <w:r>
-        <w:rPr>
-          <w:i/>
-          <w:iCs/>
-        </w:rPr>
-        <w:t xml:space="preserve">the Free Encyclopedia</w:t>
-      </w:r>
-      <w:r>
-        <w:t xml:space="preserve">.</w:t>
-      </w:r>
-      <w:r>
-        <w:t xml:space="preserve"> </w:t>
-      </w:r>
-      <w:hyperlink r:id="rId172">
-        <w:r>
-          <w:rPr>
-            <w:rStyle w:val="Hyperlink"/>
-          </w:rPr>
-          <w:t xml:space="preserve">https://en.wikipedia.org/wiki/Negative_binomial_distribution</w:t>
-        </w:r>
-      </w:hyperlink>
-      <w:r>
-        <w:t xml:space="preserve">.</w:t>
-      </w:r>
-    </w:p>
-    <w:bookmarkEnd w:id="173"/>
-    <w:bookmarkStart w:id="175" w:name="ref-wikipedia_poisson_distribution"/>
-    <w:p>
-      <w:pPr>
-        <w:pStyle w:val="Bibliography"/>
-      </w:pPr>
-      <w:r>
-        <w:t xml:space="preserve">Wikipedia contributors. 2026g.</w:t>
-      </w:r>
-      <w:r>
-        <w:t xml:space="preserve"> </w:t>
-      </w:r>
-      <w:r>
-        <w:rPr>
-          <w:i/>
-          <w:iCs/>
-        </w:rPr>
-        <w:t xml:space="preserve">Poisson Distribution —</w:t>
-      </w:r>
-      <w:r>
-        <w:rPr>
-          <w:i/>
-          <w:iCs/>
-        </w:rPr>
-        <w:t xml:space="preserve"> </w:t>
-      </w:r>
-      <w:r>
-        <w:rPr>
-          <w:i/>
-          <w:iCs/>
-        </w:rPr>
-        <w:t xml:space="preserve">Wikipedia</w:t>
-      </w:r>
-      <w:r>
-        <w:rPr>
-          <w:i/>
-          <w:iCs/>
-        </w:rPr>
-        <w:t xml:space="preserve">,</w:t>
-      </w:r>
-      <w:r>
-        <w:rPr>
-          <w:i/>
-          <w:iCs/>
-        </w:rPr>
-        <w:t xml:space="preserve"> </w:t>
-      </w:r>
-      <w:r>
-        <w:rPr>
-          <w:i/>
-          <w:iCs/>
-        </w:rPr>
-        <w:t xml:space="preserve">the Free Encyclopedia</w:t>
-      </w:r>
-      <w:r>
-        <w:t xml:space="preserve">.</w:t>
-      </w:r>
-      <w:r>
-        <w:t xml:space="preserve"> </w:t>
-      </w:r>
-      <w:hyperlink r:id="rId174">
-        <w:r>
-          <w:rPr>
-            <w:rStyle w:val="Hyperlink"/>
-          </w:rPr>
-          <w:t xml:space="preserve">https://en.wikipedia.org/wiki/Poisson_distribution</w:t>
-        </w:r>
-      </w:hyperlink>
-      <w:r>
-        <w:t xml:space="preserve">.</w:t>
-      </w:r>
-    </w:p>
-    <w:bookmarkEnd w:id="175"/>
-    <w:bookmarkStart w:id="177" w:name="ref-wikipedia_weibull_distribution"/>
-    <w:p>
-      <w:pPr>
-        <w:pStyle w:val="Bibliography"/>
-      </w:pPr>
-      <w:r>
-        <w:t xml:space="preserve">Wikipedia contributors. 2026h.</w:t>
-      </w:r>
-      <w:r>
-        <w:t xml:space="preserve"> </w:t>
-      </w:r>
-      <w:r>
-        <w:rPr>
-          <w:i/>
-          <w:iCs/>
-        </w:rPr>
-        <w:t xml:space="preserve">Weibull Distribution —</w:t>
-      </w:r>
-      <w:r>
-        <w:rPr>
-          <w:i/>
-          <w:iCs/>
-        </w:rPr>
-        <w:t xml:space="preserve"> </w:t>
-      </w:r>
-      <w:r>
-        <w:rPr>
-          <w:i/>
-          <w:iCs/>
-        </w:rPr>
-        <w:t xml:space="preserve">Wikipedia</w:t>
-      </w:r>
-      <w:r>
-        <w:rPr>
-          <w:i/>
-          <w:iCs/>
-        </w:rPr>
-        <w:t xml:space="preserve">,</w:t>
-      </w:r>
-      <w:r>
-        <w:rPr>
-          <w:i/>
-          <w:iCs/>
-        </w:rPr>
-        <w:t xml:space="preserve"> </w:t>
-      </w:r>
-      <w:r>
-        <w:rPr>
-          <w:i/>
-          <w:iCs/>
-        </w:rPr>
-        <w:t xml:space="preserve">the Free Encyclopedia</w:t>
-      </w:r>
-      <w:r>
-        <w:t xml:space="preserve">.</w:t>
-      </w:r>
-      <w:r>
-        <w:t xml:space="preserve"> </w:t>
-      </w:r>
-      <w:hyperlink r:id="rId176">
-        <w:r>
-          <w:rPr>
-            <w:rStyle w:val="Hyperlink"/>
-          </w:rPr>
-          <w:t xml:space="preserve">https://en.wikipedia.org/wiki/Weibull_distribution</w:t>
-        </w:r>
-      </w:hyperlink>
-      <w:r>
-        <w:t xml:space="preserve">.</w:t>
-      </w:r>
     </w:p>
     <w:bookmarkEnd w:id="177"/>
     <w:bookmarkEnd w:id="178"/>

</xml_diff>

<commit_message>
Deploying to gh-pages from @ Morrison-Lab/pds@3fc2c485f6e513576b88b20bf21d4f344ea78d0b 🚀
</commit_message>
<xml_diff>
--- a/distributions.docx
+++ b/distributions.docx
@@ -15,7 +15,7 @@
         <w:pStyle w:val="Date"/>
       </w:pPr>
       <w:r>
-        <w:t xml:space="preserve">Last modified: 2026-10-18 11:42:28 (PDT)</w:t>
+        <w:t xml:space="preserve">Last modified: 2026-10-18 13:21:58 (PDT)</w:t>
       </w:r>
     </w:p>
     <w:p>
@@ -42999,7 +42999,16 @@
         <w:t xml:space="preserve"> </w:t>
       </w:r>
       <w:r>
-        <w:t xml:space="preserve">is the function:</w:t>
+        <w:t xml:space="preserve">is the function</w:t>
+      </w:r>
+      <w:r>
+        <w:t xml:space="preserve"> </w:t>
+      </w:r>
+      <w:r>
+        <w:t xml:space="preserve">[9]</w:t>
+      </w:r>
+      <w:r>
+        <w:t xml:space="preserve">:</w:t>
       </w:r>
     </w:p>
     <w:p>
@@ -49138,163 +49147,17 @@
     </w:p>
     <w:bookmarkEnd w:id="157"/>
     <w:bookmarkEnd w:id="158"/>
-    <w:bookmarkStart w:id="159" w:name="further-reading"/>
+    <w:bookmarkStart w:id="178" w:name="references"/>
     <w:p>
       <w:pPr>
         <w:pStyle w:val="Heading2"/>
       </w:pPr>
       <w:r>
-        <w:t xml:space="preserve">Further reading</w:t>
+        <w:t xml:space="preserve">References</w:t>
       </w:r>
     </w:p>
-    <w:p>
-      <w:pPr>
-        <w:numPr>
-          <w:ilvl w:val="0"/>
-          <w:numId w:val="1015"/>
-        </w:numPr>
-      </w:pPr>
-      <w:r>
-        <w:t xml:space="preserve">Wikipedia contributors [1]</w:t>
-      </w:r>
-      <w:r>
-        <w:t xml:space="preserve"> </w:t>
-      </w:r>
-      <w:r>
-        <w:t xml:space="preserve">— the binomial distribution and its approximations</w:t>
-      </w:r>
-    </w:p>
-    <w:p>
-      <w:pPr>
-        <w:numPr>
-          <w:ilvl w:val="0"/>
-          <w:numId w:val="1015"/>
-        </w:numPr>
-      </w:pPr>
-      <w:r>
-        <w:t xml:space="preserve">Wikipedia contributors [3]</w:t>
-      </w:r>
-      <w:r>
-        <w:t xml:space="preserve"> </w:t>
-      </w:r>
-      <w:r>
-        <w:t xml:space="preserve">— the Poisson distribution, with examples</w:t>
-      </w:r>
-    </w:p>
-    <w:p>
-      <w:pPr>
-        <w:numPr>
-          <w:ilvl w:val="0"/>
-          <w:numId w:val="1015"/>
-        </w:numPr>
-      </w:pPr>
-      <w:r>
-        <w:t xml:space="preserve">Wikipedia contributors [4]</w:t>
-      </w:r>
-      <w:r>
-        <w:t xml:space="preserve"> </w:t>
-      </w:r>
-      <w:r>
-        <w:t xml:space="preserve">— the negative binomial distribution and its parametrizations</w:t>
-      </w:r>
-    </w:p>
-    <w:p>
-      <w:pPr>
-        <w:numPr>
-          <w:ilvl w:val="0"/>
-          <w:numId w:val="1015"/>
-        </w:numPr>
-      </w:pPr>
-      <w:r>
-        <w:t xml:space="preserve">Wikipedia contributors [6]</w:t>
-      </w:r>
-      <w:r>
-        <w:t xml:space="preserve"> </w:t>
-      </w:r>
-      <w:r>
-        <w:t xml:space="preserve">— the Weibull distribution and its hazard</w:t>
-      </w:r>
-    </w:p>
-    <w:p>
-      <w:pPr>
-        <w:numPr>
-          <w:ilvl w:val="0"/>
-          <w:numId w:val="1015"/>
-        </w:numPr>
-      </w:pPr>
-      <w:r>
-        <w:t xml:space="preserve">Wikipedia contributors [5]</w:t>
-      </w:r>
-      <w:r>
-        <w:t xml:space="preserve"> </w:t>
-      </w:r>
-      <w:r>
-        <w:t xml:space="preserve">— the Laplace distribution</w:t>
-      </w:r>
-    </w:p>
-    <w:p>
-      <w:pPr>
-        <w:numPr>
-          <w:ilvl w:val="0"/>
-          <w:numId w:val="1015"/>
-        </w:numPr>
-      </w:pPr>
-      <w:r>
-        <w:t xml:space="preserve">Wikipedia contributors [7]</w:t>
-      </w:r>
-      <w:r>
-        <w:t xml:space="preserve"> </w:t>
-      </w:r>
-      <w:r>
-        <w:t xml:space="preserve">— the multivariate normal distribution and its properties</w:t>
-      </w:r>
-    </w:p>
-    <w:p>
-      <w:pPr>
-        <w:numPr>
-          <w:ilvl w:val="0"/>
-          <w:numId w:val="1015"/>
-        </w:numPr>
-      </w:pPr>
-      <w:r>
-        <w:t xml:space="preserve">Wikipedia contributors [8]</w:t>
-      </w:r>
-      <w:r>
-        <w:t xml:space="preserve"> </w:t>
-      </w:r>
-      <w:r>
-        <w:t xml:space="preserve">— the Mahalanobis distance</w:t>
-      </w:r>
-    </w:p>
-    <w:p>
-      <w:pPr>
-        <w:numPr>
-          <w:ilvl w:val="0"/>
-          <w:numId w:val="1015"/>
-        </w:numPr>
-      </w:pPr>
-      <w:r>
-        <w:t xml:space="preserve">Wikipedia contributors [9]</w:t>
-      </w:r>
-      <w:r>
-        <w:t xml:space="preserve"> </w:t>
-      </w:r>
-      <w:r>
-        <w:t xml:space="preserve">— mixture distributions</w:t>
-      </w:r>
-    </w:p>
-    <w:bookmarkEnd w:id="159"/>
-    <w:bookmarkStart w:id="179" w:name="references"/>
-    <w:p>
-      <w:pPr>
-        <w:pStyle w:val="Heading2"/>
-      </w:pPr>
-      <w:r>
-        <w:t xml:space="preserve">References</w:t>
-      </w:r>
-    </w:p>
-    <w:bookmarkStart w:id="178" w:name="refs"/>
-    <w:bookmarkStart w:id="161" w:name="ref-wikipedia_binomial_distribution"/>
+    <w:bookmarkStart w:id="177" w:name="refs"/>
+    <w:bookmarkStart w:id="160" w:name="ref-wikipedia_binomial_distribution"/>
     <w:p>
       <w:pPr>
         <w:pStyle w:val="Bibliography"/>
@@ -49341,7 +49204,7 @@
       <w:r>
         <w:t xml:space="preserve"> </w:t>
       </w:r>
-      <w:hyperlink r:id="rId160">
+      <w:hyperlink r:id="rId159">
         <w:r>
           <w:rPr>
             <w:rStyle w:val="Hyperlink"/>
@@ -49350,8 +49213,8 @@
         </w:r>
       </w:hyperlink>
     </w:p>
-    <w:bookmarkEnd w:id="161"/>
-    <w:bookmarkStart w:id="163" w:name="ref-CaseBerg01"/>
+    <w:bookmarkEnd w:id="160"/>
+    <w:bookmarkStart w:id="162" w:name="ref-CaseBerg01"/>
     <w:p>
       <w:pPr>
         <w:pStyle w:val="Bibliography"/>
@@ -49384,7 +49247,7 @@
       <w:r>
         <w:t xml:space="preserve"> </w:t>
       </w:r>
-      <w:hyperlink r:id="rId162">
+      <w:hyperlink r:id="rId161">
         <w:r>
           <w:rPr>
             <w:rStyle w:val="Hyperlink"/>
@@ -49393,8 +49256,8 @@
         </w:r>
       </w:hyperlink>
     </w:p>
-    <w:bookmarkEnd w:id="163"/>
-    <w:bookmarkStart w:id="165" w:name="ref-wikipedia_poisson_distribution"/>
+    <w:bookmarkEnd w:id="162"/>
+    <w:bookmarkStart w:id="164" w:name="ref-wikipedia_poisson_distribution"/>
     <w:p>
       <w:pPr>
         <w:pStyle w:val="Bibliography"/>
@@ -49441,7 +49304,7 @@
       <w:r>
         <w:t xml:space="preserve"> </w:t>
       </w:r>
-      <w:hyperlink r:id="rId164">
+      <w:hyperlink r:id="rId163">
         <w:r>
           <w:rPr>
             <w:rStyle w:val="Hyperlink"/>
@@ -49450,8 +49313,8 @@
         </w:r>
       </w:hyperlink>
     </w:p>
-    <w:bookmarkEnd w:id="165"/>
-    <w:bookmarkStart w:id="167" w:name="Xba2ad42a4727c7a31602505192d479957632062"/>
+    <w:bookmarkEnd w:id="164"/>
+    <w:bookmarkStart w:id="166" w:name="Xba2ad42a4727c7a31602505192d479957632062"/>
     <w:p>
       <w:pPr>
         <w:pStyle w:val="Bibliography"/>
@@ -49498,7 +49361,7 @@
       <w:r>
         <w:t xml:space="preserve"> </w:t>
       </w:r>
-      <w:hyperlink r:id="rId166">
+      <w:hyperlink r:id="rId165">
         <w:r>
           <w:rPr>
             <w:rStyle w:val="Hyperlink"/>
@@ -49507,8 +49370,8 @@
         </w:r>
       </w:hyperlink>
     </w:p>
-    <w:bookmarkEnd w:id="167"/>
-    <w:bookmarkStart w:id="169" w:name="ref-wikipedia_laplace_distribution"/>
+    <w:bookmarkEnd w:id="166"/>
+    <w:bookmarkStart w:id="168" w:name="ref-wikipedia_laplace_distribution"/>
     <w:p>
       <w:pPr>
         <w:pStyle w:val="Bibliography"/>
@@ -49555,7 +49418,7 @@
       <w:r>
         <w:t xml:space="preserve"> </w:t>
       </w:r>
-      <w:hyperlink r:id="rId168">
+      <w:hyperlink r:id="rId167">
         <w:r>
           <w:rPr>
             <w:rStyle w:val="Hyperlink"/>
@@ -49564,8 +49427,8 @@
         </w:r>
       </w:hyperlink>
     </w:p>
-    <w:bookmarkEnd w:id="169"/>
-    <w:bookmarkStart w:id="171" w:name="ref-wikipedia_weibull_distribution"/>
+    <w:bookmarkEnd w:id="168"/>
+    <w:bookmarkStart w:id="170" w:name="ref-wikipedia_weibull_distribution"/>
     <w:p>
       <w:pPr>
         <w:pStyle w:val="Bibliography"/>
@@ -49612,7 +49475,7 @@
       <w:r>
         <w:t xml:space="preserve"> </w:t>
       </w:r>
-      <w:hyperlink r:id="rId170">
+      <w:hyperlink r:id="rId169">
         <w:r>
           <w:rPr>
             <w:rStyle w:val="Hyperlink"/>
@@ -49621,8 +49484,8 @@
         </w:r>
       </w:hyperlink>
     </w:p>
-    <w:bookmarkEnd w:id="171"/>
-    <w:bookmarkStart w:id="173" w:name="X20af3894792cc1bee172a179f9b17a254a15f4d"/>
+    <w:bookmarkEnd w:id="170"/>
+    <w:bookmarkStart w:id="172" w:name="X20af3894792cc1bee172a179f9b17a254a15f4d"/>
     <w:p>
       <w:pPr>
         <w:pStyle w:val="Bibliography"/>
@@ -49669,7 +49532,7 @@
       <w:r>
         <w:t xml:space="preserve"> </w:t>
       </w:r>
-      <w:hyperlink r:id="rId172">
+      <w:hyperlink r:id="rId171">
         <w:r>
           <w:rPr>
             <w:rStyle w:val="Hyperlink"/>
@@ -49678,8 +49541,8 @@
         </w:r>
       </w:hyperlink>
     </w:p>
-    <w:bookmarkEnd w:id="173"/>
-    <w:bookmarkStart w:id="175" w:name="ref-wikipedia_mahalanobis_distance"/>
+    <w:bookmarkEnd w:id="172"/>
+    <w:bookmarkStart w:id="174" w:name="ref-wikipedia_mahalanobis_distance"/>
     <w:p>
       <w:pPr>
         <w:pStyle w:val="Bibliography"/>
@@ -49726,7 +49589,7 @@
       <w:r>
         <w:t xml:space="preserve"> </w:t>
       </w:r>
-      <w:hyperlink r:id="rId174">
+      <w:hyperlink r:id="rId173">
         <w:r>
           <w:rPr>
             <w:rStyle w:val="Hyperlink"/>
@@ -49735,8 +49598,8 @@
         </w:r>
       </w:hyperlink>
     </w:p>
-    <w:bookmarkEnd w:id="175"/>
-    <w:bookmarkStart w:id="177" w:name="ref-wikipedia_mixture_distribution"/>
+    <w:bookmarkEnd w:id="174"/>
+    <w:bookmarkStart w:id="176" w:name="ref-wikipedia_mixture_distribution"/>
     <w:p>
       <w:pPr>
         <w:pStyle w:val="Bibliography"/>
@@ -49783,7 +49646,7 @@
       <w:r>
         <w:t xml:space="preserve"> </w:t>
       </w:r>
-      <w:hyperlink r:id="rId176">
+      <w:hyperlink r:id="rId175">
         <w:r>
           <w:rPr>
             <w:rStyle w:val="Hyperlink"/>
@@ -49792,9 +49655,9 @@
         </w:r>
       </w:hyperlink>
     </w:p>
+    <w:bookmarkEnd w:id="176"/>
     <w:bookmarkEnd w:id="177"/>
     <w:bookmarkEnd w:id="178"/>
-    <w:bookmarkEnd w:id="179"/>
     <w:sectPr>
       <w:footnotePr>
         <w:numRestart w:val="eachSect"/>
@@ -50051,9 +49914,6 @@
     <w:abstractNumId w:val="991"/>
   </w:num>
   <w:num w:numId="1014">
-    <w:abstractNumId w:val="991"/>
-  </w:num>
-  <w:num w:numId="1015">
     <w:abstractNumId w:val="991"/>
   </w:num>
 </w:numbering>

</xml_diff>

<commit_message>
Deploying to gh-pages from @ Morrison-Lab/pds@f6a2067a5a94eb7d5fc5dcc79779f62c31090731 🚀
</commit_message>
<xml_diff>
--- a/distributions.docx
+++ b/distributions.docx
@@ -15,7 +15,7 @@
         <w:pStyle w:val="Date"/>
       </w:pPr>
       <w:r>
-        <w:t xml:space="preserve">Last modified: 2026-10-18 23:49:20 (PDT)</w:t>
+        <w:t xml:space="preserve">Last modified: 2026-10-19 00:13:33 (PDT)</w:t>
       </w:r>
     </w:p>
     <w:p>
@@ -3027,7 +3027,7 @@
         <w:t xml:space="preserve"> </w:t>
       </w:r>
       <w:r>
-        <w:t xml:space="preserve">Fix</w:t>
+        <w:t xml:space="preserve">Let</w:t>
       </w:r>
       <w:r>
         <w:t xml:space="preserve"> </w:t>
@@ -3090,6 +3090,20 @@
         </m:d>
         <m:r>
           <m:t>​</m:t>
+        </m:r>
+      </m:oMath>
+      <w:r>
+        <w:t xml:space="preserve"> </w:t>
+      </w:r>
+      <w:r>
+        <w:t xml:space="preserve">be a value of</w:t>
+      </w:r>
+      <w:r>
+        <w:t xml:space="preserve"> </w:t>
+      </w:r>
+      <m:oMath>
+        <m:r>
+          <m:t>S</m:t>
         </m:r>
       </m:oMath>
       <w:r>
@@ -21317,7 +21331,7 @@
     </w:p>
     <w:bookmarkEnd w:id="76"/>
     <w:bookmarkEnd w:id="77"/>
-    <w:bookmarkStart w:id="84" w:name="sec-nb-dist"/>
+    <w:bookmarkStart w:id="85" w:name="sec-nb-dist"/>
     <w:p>
       <w:pPr>
         <w:pStyle w:val="Heading2"/>
@@ -21917,7 +21931,7 @@
       </w:r>
     </w:p>
     <w:bookmarkEnd w:id="78"/>
-    <w:bookmarkStart w:id="79" w:name="thm-nb-poisson-limit"/>
+    <w:bookmarkStart w:id="80" w:name="thm-nb-poisson-limit"/>
     <w:p>
       <w:pPr>
         <w:pStyle w:val="BodyText"/>
@@ -21933,7 +21947,24 @@
         <w:t xml:space="preserve"> </w:t>
       </w:r>
       <w:r>
-        <w:t xml:space="preserve">Fix</w:t>
+        <w:t xml:space="preserve">Let the population</w:t>
+      </w:r>
+      <w:r>
+        <w:t xml:space="preserve"> </w:t>
+      </w:r>
+      <w:hyperlink r:id="rId79">
+        <w:r>
+          <w:rPr>
+            <w:rStyle w:val="Hyperlink"/>
+          </w:rPr>
+          <w:t xml:space="preserve">mean</w:t>
+        </w:r>
+      </w:hyperlink>
+      <w:r>
+        <w:t xml:space="preserve"> </w:t>
+      </w:r>
+      <w:r>
+        <w:t xml:space="preserve">be</w:t>
       </w:r>
       <w:r>
         <w:t xml:space="preserve"> </w:t>
@@ -22279,7 +22310,7 @@
         </m:oMath>
       </m:oMathPara>
     </w:p>
-    <w:bookmarkEnd w:id="79"/>
+    <w:bookmarkEnd w:id="80"/>
     <w:p>
       <w:pPr>
         <w:pStyle w:val="FirstParagraph"/>
@@ -22295,7 +22326,7 @@
         <w:t xml:space="preserve">. </w:t>
       </w:r>
       <w:r>
-        <w:t xml:space="preserve">Fix</w:t>
+        <w:t xml:space="preserve">Choose a value</w:t>
       </w:r>
       <w:r>
         <w:t xml:space="preserve"> </w:t>
@@ -22304,6 +22335,29 @@
         <m:r>
           <m:t>y</m:t>
         </m:r>
+      </m:oMath>
+      <w:r>
+        <w:t xml:space="preserve"> </w:t>
+      </w:r>
+      <w:r>
+        <w:t xml:space="preserve">of</w:t>
+      </w:r>
+      <w:r>
+        <w:t xml:space="preserve"> </w:t>
+      </w:r>
+      <m:oMath>
+        <m:sSub>
+          <m:e>
+            <m:r>
+              <m:t>Y</m:t>
+            </m:r>
+          </m:e>
+          <m:sub>
+            <m:r>
+              <m:t>ρ</m:t>
+            </m:r>
+          </m:sub>
+        </m:sSub>
       </m:oMath>
       <w:r>
         <w:t xml:space="preserve">.</w:t>
@@ -24553,7 +24607,7 @@
         <w:t xml:space="preserve">PMF.</w:t>
       </w:r>
     </w:p>
-    <w:bookmarkStart w:id="80" w:name="thm-nb"/>
+    <w:bookmarkStart w:id="81" w:name="thm-nb"/>
     <w:p>
       <w:pPr>
         <w:pStyle w:val="BodyText"/>
@@ -24750,7 +24804,7 @@
         <w:t xml:space="preserve">​</w:t>
       </w:r>
     </w:p>
-    <w:bookmarkEnd w:id="80"/>
+    <w:bookmarkEnd w:id="81"/>
     <w:p>
       <w:pPr>
         <w:pStyle w:val="FirstParagraph"/>
@@ -26713,7 +26767,7 @@
       <w:r>
         <w:t xml:space="preserve"> </w:t>
       </w:r>
-      <w:hyperlink r:id="rId81">
+      <w:hyperlink r:id="rId82">
         <w:r>
           <w:rPr>
             <w:rStyle w:val="Hyperlink"/>
@@ -26730,7 +26784,7 @@
       <w:r>
         <w:t xml:space="preserve"> </w:t>
       </w:r>
-      <w:hyperlink r:id="rId82">
+      <w:hyperlink r:id="rId83">
         <w:r>
           <w:rPr>
             <w:rStyle w:val="Hyperlink"/>
@@ -27695,7 +27749,7 @@
         <w:t xml:space="preserve">.</w:t>
       </w:r>
     </w:p>
-    <w:bookmarkStart w:id="83" w:name="exm-nb"/>
+    <w:bookmarkStart w:id="84" w:name="exm-nb"/>
     <w:p>
       <w:pPr>
         <w:pStyle w:val="BodyText"/>
@@ -27888,9 +27942,9 @@
         <w:t xml:space="preserve">count with the same mean.</w:t>
       </w:r>
     </w:p>
-    <w:bookmarkEnd w:id="83"/>
     <w:bookmarkEnd w:id="84"/>
-    <w:bookmarkStart w:id="96" w:name="sec-laplace"/>
+    <w:bookmarkEnd w:id="85"/>
+    <w:bookmarkStart w:id="97" w:name="sec-laplace"/>
     <w:p>
       <w:pPr>
         <w:pStyle w:val="Heading2"/>
@@ -27899,7 +27953,7 @@
         <w:t xml:space="preserve">5 The Laplace distribution</w:t>
       </w:r>
     </w:p>
-    <w:bookmarkStart w:id="87" w:name="def-laplace"/>
+    <w:bookmarkStart w:id="88" w:name="def-laplace"/>
     <w:p>
       <w:pPr>
         <w:pStyle w:val="FirstParagraph"/>
@@ -28080,7 +28134,7 @@
       <w:r>
         <w:t xml:space="preserve"> </w:t>
       </w:r>
-      <w:hyperlink r:id="rId85">
+      <w:hyperlink r:id="rId86">
         <w:r>
           <w:rPr>
             <w:rStyle w:val="Hyperlink"/>
@@ -28096,7 +28150,7 @@
       <w:pPr>
         <w:pStyle w:val="BodyText"/>
       </w:pPr>
-      <w:bookmarkStart w:id="86" w:name="eq-laplace-pdf"/>
+      <w:bookmarkStart w:id="87" w:name="eq-laplace-pdf"/>
       <m:oMathPara>
         <m:oMathParaPr>
           <m:jc m:val="center"/>
@@ -28273,9 +28327,9 @@
           </m:r>
         </m:oMath>
       </m:oMathPara>
-      <w:bookmarkEnd w:id="86"/>
+      <w:bookmarkEnd w:id="87"/>
     </w:p>
-    <w:bookmarkEnd w:id="87"/>
+    <w:bookmarkEnd w:id="88"/>
     <w:p>
       <w:pPr>
         <w:pStyle w:val="FirstParagraph"/>
@@ -28437,7 +28491,7 @@
         <w:t xml:space="preserve">and decays more slowly in the tails.</w:t>
       </w:r>
     </w:p>
-    <w:bookmarkStart w:id="88" w:name="exm-laplace-density"/>
+    <w:bookmarkStart w:id="89" w:name="exm-laplace-density"/>
     <w:p>
       <w:pPr>
         <w:pStyle w:val="BodyText"/>
@@ -29183,8 +29237,8 @@
         <w:t xml:space="preserve">.</w:t>
       </w:r>
     </w:p>
-    <w:bookmarkEnd w:id="88"/>
-    <w:bookmarkStart w:id="90" w:name="thm-laplace-moments"/>
+    <w:bookmarkEnd w:id="89"/>
+    <w:bookmarkStart w:id="91" w:name="thm-laplace-moments"/>
     <w:p>
       <w:pPr>
         <w:pStyle w:val="BodyText"/>
@@ -29272,7 +29326,7 @@
       <w:pPr>
         <w:pStyle w:val="BodyText"/>
       </w:pPr>
-      <w:bookmarkStart w:id="89" w:name="eq-laplace-moments"/>
+      <w:bookmarkStart w:id="90" w:name="eq-laplace-moments"/>
       <m:oMathPara>
         <m:oMathParaPr>
           <m:jc m:val="center"/>
@@ -29397,9 +29451,9 @@
           </m:r>
         </m:oMath>
       </m:oMathPara>
-      <w:bookmarkEnd w:id="89"/>
+      <w:bookmarkEnd w:id="90"/>
     </w:p>
-    <w:bookmarkEnd w:id="90"/>
+    <w:bookmarkEnd w:id="91"/>
     <w:p>
       <w:pPr>
         <w:pStyle w:val="FirstParagraph"/>
@@ -30688,7 +30742,7 @@
         </m:oMath>
       </m:oMathPara>
     </w:p>
-    <w:bookmarkStart w:id="95" w:name="exm-laplace-vs-normal"/>
+    <w:bookmarkStart w:id="96" w:name="exm-laplace-vs-normal"/>
     <w:p>
       <w:pPr>
         <w:pStyle w:val="FirstParagraph"/>
@@ -31685,7 +31739,7 @@
       <w:tr>
         <w:tc>
           <w:tcPr/>
-          <w:bookmarkStart w:id="94" w:name="fig-laplace-vs-normal"/>
+          <w:bookmarkStart w:id="95" w:name="fig-laplace-vs-normal"/>
           <w:p>
             <w:pPr>
               <w:pStyle w:val="Compact"/>
@@ -31696,18 +31750,18 @@
                 <wp:inline>
                   <wp:extent cx="4620126" cy="3696101"/>
                   <wp:effectExtent b="0" l="0" r="0" t="0"/>
-                  <wp:docPr descr="" title="" id="92" name="Picture"/>
+                  <wp:docPr descr="" title="" id="93" name="Picture"/>
                   <a:graphic>
                     <a:graphicData uri="http://schemas.openxmlformats.org/drawingml/2006/picture">
                       <pic:pic>
                         <pic:nvPicPr>
-                          <pic:cNvPr descr="distributions_files/figure-docx/fig-laplace-vs-normal-1.png" id="93" name="Picture"/>
+                          <pic:cNvPr descr="distributions_files/figure-docx/fig-laplace-vs-normal-1.png" id="94" name="Picture"/>
                           <pic:cNvPicPr>
                             <a:picLocks noChangeArrowheads="1" noChangeAspect="1"/>
                           </pic:cNvPicPr>
                         </pic:nvPicPr>
                         <pic:blipFill>
-                          <a:blip r:embed="rId91"/>
+                          <a:blip r:embed="rId92"/>
                           <a:stretch>
                             <a:fillRect/>
                           </a:stretch>
@@ -31747,7 +31801,7 @@
               <w:t xml:space="preserve">Figure 3: Laplace and standard normal densities with the same mean (0) and variance (1)</w:t>
             </w:r>
           </w:p>
-          <w:bookmarkEnd w:id="94"/>
+          <w:bookmarkEnd w:id="95"/>
         </w:tc>
       </w:tr>
     </w:tbl>
@@ -32166,9 +32220,9 @@
         <w:t xml:space="preserve">standard deviations as the normal distribution does.</w:t>
       </w:r>
     </w:p>
-    <w:bookmarkEnd w:id="95"/>
     <w:bookmarkEnd w:id="96"/>
-    <w:bookmarkStart w:id="108" w:name="sec-weibull"/>
+    <w:bookmarkEnd w:id="97"/>
+    <w:bookmarkStart w:id="109" w:name="sec-weibull"/>
     <w:p>
       <w:pPr>
         <w:pStyle w:val="Heading2"/>
@@ -32177,7 +32231,7 @@
         <w:t xml:space="preserve">6 Weibull distribution</w:t>
       </w:r>
     </w:p>
-    <w:bookmarkStart w:id="98" w:name="def-weibull"/>
+    <w:bookmarkStart w:id="99" w:name="def-weibull"/>
     <w:p>
       <w:pPr>
         <w:pStyle w:val="FirstParagraph"/>
@@ -32280,7 +32334,7 @@
       <w:r>
         <w:t xml:space="preserve"> </w:t>
       </w:r>
-      <w:hyperlink r:id="rId97">
+      <w:hyperlink r:id="rId98">
         <w:r>
           <w:rPr>
             <w:rStyle w:val="Hyperlink"/>
@@ -32402,8 +32456,8 @@
         </m:oMath>
       </m:oMathPara>
     </w:p>
-    <w:bookmarkEnd w:id="98"/>
-    <w:bookmarkStart w:id="99" w:name="thm-weibull"/>
+    <w:bookmarkEnd w:id="99"/>
+    <w:bookmarkStart w:id="100" w:name="thm-weibull"/>
     <w:p>
       <w:pPr>
         <w:pStyle w:val="FirstParagraph"/>
@@ -32644,7 +32698,7 @@
         </m:oMath>
       </m:oMathPara>
     </w:p>
-    <w:bookmarkEnd w:id="99"/>
+    <w:bookmarkEnd w:id="100"/>
     <w:p>
       <w:pPr>
         <w:pStyle w:val="FirstParagraph"/>
@@ -32741,7 +32795,7 @@
       <w:r>
         <w:t xml:space="preserve">(</w:t>
       </w:r>
-      <w:hyperlink r:id="rId100">
+      <w:hyperlink r:id="rId101">
         <w:r>
           <w:rPr>
             <w:rStyle w:val="Hyperlink"/>
@@ -33021,7 +33075,7 @@
       <w:r>
         <w:t xml:space="preserve">(</w:t>
       </w:r>
-      <w:hyperlink r:id="rId101">
+      <w:hyperlink r:id="rId102">
         <w:r>
           <w:rPr>
             <w:rStyle w:val="Hyperlink"/>
@@ -33120,7 +33174,7 @@
       <w:r>
         <w:t xml:space="preserve">(</w:t>
       </w:r>
-      <w:hyperlink r:id="rId102">
+      <w:hyperlink r:id="rId103">
         <w:r>
           <w:rPr>
             <w:rStyle w:val="Hyperlink"/>
@@ -33698,7 +33752,7 @@
         <w:t xml:space="preserve">.</w:t>
       </w:r>
     </w:p>
-    <w:bookmarkStart w:id="103" w:name="thm-weibull-mean"/>
+    <w:bookmarkStart w:id="104" w:name="thm-weibull-mean"/>
     <w:p>
       <w:pPr>
         <w:pStyle w:val="BodyText"/>
@@ -33871,7 +33925,7 @@
         </m:oMath>
       </m:oMathPara>
     </w:p>
-    <w:bookmarkEnd w:id="103"/>
+    <w:bookmarkEnd w:id="104"/>
     <w:p>
       <w:pPr>
         <w:pStyle w:val="FirstParagraph"/>
@@ -33892,7 +33946,7 @@
       <w:r>
         <w:t xml:space="preserve"> </w:t>
       </w:r>
-      <w:hyperlink r:id="rId104">
+      <w:hyperlink r:id="rId105">
         <w:r>
           <w:rPr>
             <w:rStyle w:val="Hyperlink"/>
@@ -34707,7 +34761,7 @@
         </m:oMath>
       </m:oMathPara>
     </w:p>
-    <w:bookmarkStart w:id="105" w:name="cor-weibull-exponential"/>
+    <w:bookmarkStart w:id="106" w:name="cor-weibull-exponential"/>
     <w:p>
       <w:pPr>
         <w:pStyle w:val="FirstParagraph"/>
@@ -34839,7 +34893,7 @@
         <w:t xml:space="preserve">.</w:t>
       </w:r>
     </w:p>
-    <w:bookmarkEnd w:id="105"/>
+    <w:bookmarkEnd w:id="106"/>
     <w:p>
       <w:pPr>
         <w:pStyle w:val="BodyText"/>
@@ -35422,7 +35476,7 @@
         <w:t xml:space="preserve">.</w:t>
       </w:r>
     </w:p>
-    <w:bookmarkStart w:id="106" w:name="cor-weibull-hazard-monotone"/>
+    <w:bookmarkStart w:id="107" w:name="cor-weibull-hazard-monotone"/>
     <w:p>
       <w:pPr>
         <w:pStyle w:val="BodyText"/>
@@ -35645,7 +35699,7 @@
         </m:r>
       </m:oMath>
     </w:p>
-    <w:bookmarkEnd w:id="106"/>
+    <w:bookmarkEnd w:id="107"/>
     <w:p>
       <w:pPr>
         <w:pStyle w:val="FirstParagraph"/>
@@ -36273,7 +36327,7 @@
         <w:t xml:space="preserve">provides more flexibility than the exponential.</w:t>
       </w:r>
     </w:p>
-    <w:bookmarkStart w:id="107" w:name="exm-weibull"/>
+    <w:bookmarkStart w:id="108" w:name="exm-weibull"/>
     <w:p>
       <w:pPr>
         <w:pStyle w:val="BodyText"/>
@@ -36743,9 +36797,9 @@
         </m:oMath>
       </m:oMathPara>
     </w:p>
-    <w:bookmarkEnd w:id="107"/>
     <w:bookmarkEnd w:id="108"/>
-    <w:bookmarkStart w:id="143" w:name="sec-mvn"/>
+    <w:bookmarkEnd w:id="109"/>
+    <w:bookmarkStart w:id="144" w:name="sec-mvn"/>
     <w:p>
       <w:pPr>
         <w:pStyle w:val="Heading2"/>
@@ -36754,7 +36808,7 @@
         <w:t xml:space="preserve">7 The multivariate normal distribution</w:t>
       </w:r>
     </w:p>
-    <w:bookmarkStart w:id="112" w:name="def-mvn"/>
+    <w:bookmarkStart w:id="113" w:name="def-mvn"/>
     <w:p>
       <w:pPr>
         <w:pStyle w:val="FirstParagraph"/>
@@ -36894,7 +36948,7 @@
       <w:r>
         <w:t xml:space="preserve"> </w:t>
       </w:r>
-      <w:hyperlink r:id="rId109">
+      <w:hyperlink r:id="rId110">
         <w:r>
           <w:rPr>
             <w:rStyle w:val="Hyperlink"/>
@@ -37000,7 +37054,7 @@
       <w:r>
         <w:t xml:space="preserve"> </w:t>
       </w:r>
-      <w:hyperlink r:id="rId110">
+      <w:hyperlink r:id="rId111">
         <w:r>
           <w:rPr>
             <w:rStyle w:val="Hyperlink"/>
@@ -37066,7 +37120,7 @@
       <w:r>
         <w:t xml:space="preserve"> </w:t>
       </w:r>
-      <w:hyperlink r:id="rId111">
+      <w:hyperlink r:id="rId112">
         <w:r>
           <w:rPr>
             <w:rStyle w:val="Hyperlink"/>
@@ -37078,7 +37132,7 @@
         <w:t xml:space="preserve">.</w:t>
       </w:r>
     </w:p>
-    <w:bookmarkEnd w:id="112"/>
+    <w:bookmarkEnd w:id="113"/>
     <w:p>
       <w:pPr>
         <w:pStyle w:val="BodyText"/>
@@ -37124,7 +37178,7 @@
       <w:r>
         <w:t xml:space="preserve"> </w:t>
       </w:r>
-      <w:hyperlink r:id="rId113">
+      <w:hyperlink r:id="rId114">
         <w:r>
           <w:rPr>
             <w:rStyle w:val="Hyperlink"/>
@@ -37285,7 +37339,7 @@
       <w:r>
         <w:t xml:space="preserve">(</w:t>
       </w:r>
-      <w:hyperlink r:id="rId114">
+      <w:hyperlink r:id="rId115">
         <w:r>
           <w:rPr>
             <w:rStyle w:val="Hyperlink"/>
@@ -37346,7 +37400,7 @@
       <w:r>
         <w:t xml:space="preserve">(</w:t>
       </w:r>
-      <w:hyperlink r:id="rId115">
+      <w:hyperlink r:id="rId116">
         <w:r>
           <w:rPr>
             <w:rStyle w:val="Hyperlink"/>
@@ -37364,7 +37418,7 @@
         <w:t xml:space="preserve">so its square root is a positive number.</w:t>
       </w:r>
     </w:p>
-    <w:bookmarkStart w:id="116" w:name="thm-mvn-density-integral"/>
+    <w:bookmarkStart w:id="117" w:name="thm-mvn-density-integral"/>
     <w:p>
       <w:pPr>
         <w:pStyle w:val="FirstParagraph"/>
@@ -37453,8 +37507,8 @@
         <w:t xml:space="preserve">.</w:t>
       </w:r>
     </w:p>
-    <w:bookmarkEnd w:id="116"/>
-    <w:bookmarkStart w:id="119" w:name="thm-mvn-moments"/>
+    <w:bookmarkEnd w:id="117"/>
+    <w:bookmarkStart w:id="120" w:name="thm-mvn-moments"/>
     <w:p>
       <w:pPr>
         <w:pStyle w:val="BodyText"/>
@@ -37516,7 +37570,7 @@
       <w:r>
         <w:t xml:space="preserve"> </w:t>
       </w:r>
-      <w:hyperlink r:id="rId117">
+      <w:hyperlink r:id="rId118">
         <w:r>
           <w:rPr>
             <w:rStyle w:val="Hyperlink"/>
@@ -37548,7 +37602,7 @@
       <w:r>
         <w:t xml:space="preserve"> </w:t>
       </w:r>
-      <w:hyperlink r:id="rId118">
+      <w:hyperlink r:id="rId119">
         <w:r>
           <w:rPr>
             <w:rStyle w:val="Hyperlink"/>
@@ -37560,7 +37614,7 @@
         <w:t xml:space="preserve">).</w:t>
       </w:r>
     </w:p>
-    <w:bookmarkEnd w:id="119"/>
+    <w:bookmarkEnd w:id="120"/>
     <w:p>
       <w:pPr>
         <w:pStyle w:val="BodyText"/>
@@ -37619,7 +37673,7 @@
       <w:r>
         <w:t xml:space="preserve"> </w:t>
       </w:r>
-      <w:hyperlink r:id="rId120">
+      <w:hyperlink r:id="rId121">
         <w:r>
           <w:rPr>
             <w:rStyle w:val="Hyperlink"/>
@@ -37662,7 +37716,7 @@
       <w:r>
         <w:t xml:space="preserve"> </w:t>
       </w:r>
-      <w:hyperlink r:id="rId121">
+      <w:hyperlink r:id="rId122">
         <w:r>
           <w:rPr>
             <w:rStyle w:val="Hyperlink"/>
@@ -37682,7 +37736,7 @@
       <w:r>
         <w:t xml:space="preserve"> </w:t>
       </w:r>
-      <w:hyperlink r:id="rId122">
+      <w:hyperlink r:id="rId123">
         <w:r>
           <w:rPr>
             <w:rStyle w:val="Hyperlink"/>
@@ -37700,7 +37754,7 @@
         <w:t xml:space="preserve">which has no joint density.</w:t>
       </w:r>
     </w:p>
-    <w:bookmarkStart w:id="123" w:name="exm-mvn-univariate"/>
+    <w:bookmarkStart w:id="124" w:name="exm-mvn-univariate"/>
     <w:p>
       <w:pPr>
         <w:pStyle w:val="BodyText"/>
@@ -37904,7 +37958,7 @@
       <w:r>
         <w:t xml:space="preserve">(</w:t>
       </w:r>
-      <w:hyperlink r:id="rId110">
+      <w:hyperlink r:id="rId111">
         <w:r>
           <w:rPr>
             <w:rStyle w:val="Hyperlink"/>
@@ -38097,8 +38151,8 @@
         <w:t xml:space="preserve">.</w:t>
       </w:r>
     </w:p>
-    <w:bookmarkEnd w:id="123"/>
-    <w:bookmarkStart w:id="124" w:name="lem-mahalanobis-nonneg"/>
+    <w:bookmarkEnd w:id="124"/>
+    <w:bookmarkStart w:id="125" w:name="lem-mahalanobis-nonneg"/>
     <w:p>
       <w:pPr>
         <w:pStyle w:val="BodyText"/>
@@ -38197,7 +38251,7 @@
         <w:t xml:space="preserve">.</w:t>
       </w:r>
     </w:p>
-    <w:bookmarkEnd w:id="124"/>
+    <w:bookmarkEnd w:id="125"/>
     <w:p>
       <w:pPr>
         <w:pStyle w:val="BodyText"/>
@@ -38247,7 +38301,7 @@
       <w:r>
         <w:t xml:space="preserve">(</w:t>
       </w:r>
-      <w:hyperlink r:id="rId114">
+      <w:hyperlink r:id="rId115">
         <w:r>
           <w:rPr>
             <w:rStyle w:val="Hyperlink"/>
@@ -38291,7 +38345,7 @@
       <w:r>
         <w:t xml:space="preserve"> </w:t>
       </w:r>
-      <w:hyperlink r:id="rId109">
+      <w:hyperlink r:id="rId110">
         <w:r>
           <w:rPr>
             <w:rStyle w:val="Hyperlink"/>
@@ -38344,7 +38398,7 @@
         <w:t xml:space="preserve">.</w:t>
       </w:r>
     </w:p>
-    <w:bookmarkStart w:id="125" w:name="def-mahalanobis"/>
+    <w:bookmarkStart w:id="126" w:name="def-mahalanobis"/>
     <w:p>
       <w:pPr>
         <w:pStyle w:val="BodyText"/>
@@ -38485,7 +38539,7 @@
     $$</w:t>
       </w:r>
     </w:p>
-    <w:bookmarkEnd w:id="125"/>
+    <w:bookmarkEnd w:id="126"/>
     <w:p>
       <w:pPr>
         <w:pStyle w:val="FirstParagraph"/>
@@ -38533,7 +38587,7 @@
         <w:t xml:space="preserve">.</w:t>
       </w:r>
     </w:p>
-    <w:bookmarkStart w:id="126" w:name="cor-mvn-mahalanobis"/>
+    <w:bookmarkStart w:id="127" w:name="cor-mvn-mahalanobis"/>
     <w:p>
       <w:pPr>
         <w:pStyle w:val="BodyText"/>
@@ -38696,7 +38750,7 @@
         <w:t xml:space="preserve">.</w:t>
       </w:r>
     </w:p>
-    <w:bookmarkEnd w:id="126"/>
+    <w:bookmarkEnd w:id="127"/>
     <w:p>
       <w:pPr>
         <w:pStyle w:val="BodyText"/>
@@ -38873,7 +38927,7 @@
         <w:t xml:space="preserve">.</w:t>
       </w:r>
     </w:p>
-    <w:bookmarkStart w:id="128" w:name="exm-mahalanobis-special"/>
+    <w:bookmarkStart w:id="129" w:name="exm-mahalanobis-special"/>
     <w:p>
       <w:pPr>
         <w:pStyle w:val="BodyText"/>
@@ -38911,7 +38965,7 @@
       <w:r>
         <w:t xml:space="preserve"> </w:t>
       </w:r>
-      <w:hyperlink r:id="rId127">
+      <w:hyperlink r:id="rId128">
         <w:r>
           <w:rPr>
             <w:rStyle w:val="Hyperlink"/>
@@ -39130,7 +39184,7 @@
       <w:r>
         <w:t xml:space="preserve"> </w:t>
       </w:r>
-      <w:hyperlink r:id="rId111">
+      <w:hyperlink r:id="rId112">
         <w:r>
           <w:rPr>
             <w:rStyle w:val="Hyperlink"/>
@@ -39330,8 +39384,8 @@
         <w:t xml:space="preserve">in units of that coordinate’s standard deviation.</w:t>
       </w:r>
     </w:p>
-    <w:bookmarkEnd w:id="128"/>
-    <w:bookmarkStart w:id="129" w:name="thm-mvn-diagonal-indpt"/>
+    <w:bookmarkEnd w:id="129"/>
+    <w:bookmarkStart w:id="130" w:name="thm-mvn-diagonal-indpt"/>
     <w:p>
       <w:pPr>
         <w:pStyle w:val="BodyText"/>
@@ -39754,7 +39808,7 @@
         <w:t xml:space="preserve">.</w:t>
       </w:r>
     </w:p>
-    <w:bookmarkEnd w:id="129"/>
+    <w:bookmarkEnd w:id="130"/>
     <w:p>
       <w:pPr>
         <w:pStyle w:val="FirstParagraph"/>
@@ -39775,7 +39829,7 @@
       <w:r>
         <w:t xml:space="preserve"> </w:t>
       </w:r>
-      <w:hyperlink r:id="rId130">
+      <w:hyperlink r:id="rId131">
         <w:r>
           <w:rPr>
             <w:rStyle w:val="Hyperlink"/>
@@ -40128,7 +40182,7 @@
       <w:r>
         <w:t xml:space="preserve">(</w:t>
       </w:r>
-      <w:hyperlink r:id="rId131">
+      <w:hyperlink r:id="rId132">
         <w:r>
           <w:rPr>
             <w:rStyle w:val="Hyperlink"/>
@@ -40236,7 +40290,7 @@
       <w:r>
         <w:t xml:space="preserve">(</w:t>
       </w:r>
-      <w:hyperlink r:id="rId132">
+      <w:hyperlink r:id="rId133">
         <w:r>
           <w:rPr>
             <w:rStyle w:val="Hyperlink"/>
@@ -40282,7 +40336,7 @@
       <w:r>
         <w:t xml:space="preserve"> </w:t>
       </w:r>
-      <w:hyperlink r:id="rId133">
+      <w:hyperlink r:id="rId134">
         <w:r>
           <w:rPr>
             <w:rStyle w:val="Hyperlink"/>
@@ -40314,7 +40368,7 @@
         <w:t xml:space="preserve">variables as its remark describes.</w:t>
       </w:r>
     </w:p>
-    <w:bookmarkStart w:id="134" w:name="cor-mvn-uncorrelated-indpt"/>
+    <w:bookmarkStart w:id="135" w:name="cor-mvn-uncorrelated-indpt"/>
     <w:p>
       <w:pPr>
         <w:pStyle w:val="BodyText"/>
@@ -40522,7 +40576,7 @@
         <w:t xml:space="preserve">.</w:t>
       </w:r>
     </w:p>
-    <w:bookmarkEnd w:id="134"/>
+    <w:bookmarkEnd w:id="135"/>
     <w:p>
       <w:pPr>
         <w:pStyle w:val="BodyText"/>
@@ -40664,7 +40718,7 @@
       <w:r>
         <w:t xml:space="preserve">(</w:t>
       </w:r>
-      <w:hyperlink r:id="rId135">
+      <w:hyperlink r:id="rId136">
         <w:r>
           <w:rPr>
             <w:rStyle w:val="Hyperlink"/>
@@ -40847,7 +40901,7 @@
       <w:r>
         <w:t xml:space="preserve">(</w:t>
       </w:r>
-      <w:hyperlink r:id="rId132">
+      <w:hyperlink r:id="rId133">
         <w:r>
           <w:rPr>
             <w:rStyle w:val="Hyperlink"/>
@@ -41046,7 +41100,7 @@
       <w:r>
         <w:t xml:space="preserve"> </w:t>
       </w:r>
-      <w:hyperlink r:id="rId136">
+      <w:hyperlink r:id="rId137">
         <w:r>
           <w:rPr>
             <w:rStyle w:val="Hyperlink"/>
@@ -41188,7 +41242,7 @@
       <w:r>
         <w:t xml:space="preserve">(</w:t>
       </w:r>
-      <w:hyperlink r:id="rId137">
+      <w:hyperlink r:id="rId138">
         <w:r>
           <w:rPr>
             <w:rStyle w:val="Hyperlink"/>
@@ -41234,7 +41288,7 @@
       <w:r>
         <w:t xml:space="preserve">(</w:t>
       </w:r>
-      <w:hyperlink r:id="rId138">
+      <w:hyperlink r:id="rId139">
         <w:r>
           <w:rPr>
             <w:rStyle w:val="Hyperlink"/>
@@ -41246,7 +41300,7 @@
         <w:t xml:space="preserve">).</w:t>
       </w:r>
     </w:p>
-    <w:bookmarkStart w:id="140" w:name="thm-mahalanobis-eigen"/>
+    <w:bookmarkStart w:id="141" w:name="thm-mahalanobis-eigen"/>
     <w:p>
       <w:pPr>
         <w:pStyle w:val="BodyText"/>
@@ -41284,7 +41338,7 @@
       <w:r>
         <w:t xml:space="preserve"> </w:t>
       </w:r>
-      <w:hyperlink r:id="rId139">
+      <w:hyperlink r:id="rId140">
         <w:r>
           <w:rPr>
             <w:rStyle w:val="Hyperlink"/>
@@ -41461,7 +41515,7 @@
     $$</w:t>
       </w:r>
     </w:p>
-    <w:bookmarkEnd w:id="140"/>
+    <w:bookmarkEnd w:id="141"/>
     <w:p>
       <w:pPr>
         <w:pStyle w:val="FirstParagraph"/>
@@ -41523,7 +41577,7 @@
       <w:r>
         <w:t xml:space="preserve"> </w:t>
       </w:r>
-      <w:hyperlink r:id="rId114">
+      <w:hyperlink r:id="rId115">
         <w:r>
           <w:rPr>
             <w:rStyle w:val="Hyperlink"/>
@@ -41874,7 +41928,7 @@
         <w:t xml:space="preserve">.</w:t>
       </w:r>
     </w:p>
-    <w:bookmarkStart w:id="142" w:name="exm-mahalanobis-eigen"/>
+    <w:bookmarkStart w:id="143" w:name="exm-mahalanobis-eigen"/>
     <w:p>
       <w:pPr>
         <w:pStyle w:val="BodyText"/>
@@ -42039,7 +42093,7 @@
       <w:r>
         <w:t xml:space="preserve">(</w:t>
       </w:r>
-      <w:hyperlink r:id="rId141">
+      <w:hyperlink r:id="rId142">
         <w:r>
           <w:rPr>
             <w:rStyle w:val="Hyperlink"/>
@@ -42580,8 +42634,8 @@
         <w:t xml:space="preserve">are positively correlated.</w:t>
       </w:r>
     </w:p>
-    <w:bookmarkEnd w:id="142"/>
     <w:bookmarkEnd w:id="143"/>
+    <w:bookmarkEnd w:id="144"/>
     <w:bookmarkStart w:id="158" w:name="sec-mixture"/>
     <w:p>
       <w:pPr>
@@ -42591,7 +42645,7 @@
         <w:t xml:space="preserve">8 Mixture distributions</w:t>
       </w:r>
     </w:p>
-    <w:bookmarkStart w:id="144" w:name="def-mixture"/>
+    <w:bookmarkStart w:id="145" w:name="def-mixture"/>
     <w:p>
       <w:pPr>
         <w:pStyle w:val="FirstParagraph"/>
@@ -43175,8 +43229,8 @@
         </m:oMath>
       </m:oMathPara>
     </w:p>
-    <w:bookmarkEnd w:id="144"/>
-    <w:bookmarkStart w:id="145" w:name="def-mixture-component"/>
+    <w:bookmarkEnd w:id="145"/>
+    <w:bookmarkStart w:id="146" w:name="def-mixture-component"/>
     <w:p>
       <w:pPr>
         <w:pStyle w:val="FirstParagraph"/>
@@ -43278,8 +43332,8 @@
         <w:t xml:space="preserve">.</w:t>
       </w:r>
     </w:p>
-    <w:bookmarkEnd w:id="145"/>
-    <w:bookmarkStart w:id="148" w:name="thm-mixture-two-stage"/>
+    <w:bookmarkEnd w:id="146"/>
+    <w:bookmarkStart w:id="149" w:name="thm-mixture-two-stage"/>
     <w:p>
       <w:pPr>
         <w:pStyle w:val="BodyText"/>
@@ -43340,7 +43394,7 @@
       <w:r>
         <w:t xml:space="preserve"> </w:t>
       </w:r>
-      <w:hyperlink r:id="rId146">
+      <w:hyperlink r:id="rId147">
         <w:r>
           <w:rPr>
             <w:rStyle w:val="Hyperlink"/>
@@ -43729,7 +43783,7 @@
       <w:r>
         <w:t xml:space="preserve"> </w:t>
       </w:r>
-      <w:hyperlink r:id="rId147">
+      <w:hyperlink r:id="rId148">
         <w:r>
           <w:rPr>
             <w:rStyle w:val="Hyperlink"/>
@@ -43857,7 +43911,7 @@
         <w:t xml:space="preserve">.</w:t>
       </w:r>
     </w:p>
-    <w:bookmarkEnd w:id="148"/>
+    <w:bookmarkEnd w:id="149"/>
     <w:p>
       <w:pPr>
         <w:pStyle w:val="FirstParagraph"/>
@@ -43878,7 +43932,7 @@
       <w:r>
         <w:t xml:space="preserve"> </w:t>
       </w:r>
-      <w:hyperlink r:id="rId149">
+      <w:hyperlink r:id="rId150">
         <w:r>
           <w:rPr>
             <w:rStyle w:val="Hyperlink"/>
@@ -44102,7 +44156,7 @@
       <w:r>
         <w:t xml:space="preserve"> </w:t>
       </w:r>
-      <w:hyperlink r:id="rId147">
+      <w:hyperlink r:id="rId148">
         <w:r>
           <w:rPr>
             <w:rStyle w:val="Hyperlink"/>
@@ -45013,7 +45067,7 @@
       <w:r>
         <w:t xml:space="preserve"> </w:t>
       </w:r>
-      <w:hyperlink r:id="rId85">
+      <w:hyperlink r:id="rId86">
         <w:r>
           <w:rPr>
             <w:rStyle w:val="Hyperlink"/>
@@ -45274,7 +45328,7 @@
         <w:t xml:space="preserve">.</w:t>
       </w:r>
     </w:p>
-    <w:bookmarkStart w:id="150" w:name="thm-mixture-mean"/>
+    <w:bookmarkStart w:id="151" w:name="thm-mixture-mean"/>
     <w:p>
       <w:pPr>
         <w:pStyle w:val="BodyText"/>
@@ -45588,7 +45642,7 @@
         </m:oMath>
       </m:oMathPara>
     </w:p>
-    <w:bookmarkEnd w:id="150"/>
+    <w:bookmarkEnd w:id="151"/>
     <w:p>
       <w:pPr>
         <w:pStyle w:val="FirstParagraph"/>
@@ -46437,7 +46491,7 @@
       <w:r>
         <w:t xml:space="preserve"> </w:t>
       </w:r>
-      <w:hyperlink r:id="rId151">
+      <w:hyperlink r:id="rId79">
         <w:r>
           <w:rPr>
             <w:rStyle w:val="Hyperlink"/>
@@ -46829,7 +46883,7 @@
       <w:r>
         <w:t xml:space="preserve"> </w:t>
       </w:r>
-      <w:hyperlink r:id="rId147">
+      <w:hyperlink r:id="rId148">
         <w:r>
           <w:rPr>
             <w:rStyle w:val="Hyperlink"/>
@@ -47948,7 +48002,7 @@
       <w:r>
         <w:t xml:space="preserve"> </w:t>
       </w:r>
-      <w:hyperlink r:id="rId120">
+      <w:hyperlink r:id="rId121">
         <w:r>
           <w:rPr>
             <w:rStyle w:val="Hyperlink"/>

</xml_diff>

<commit_message>
Deploying to gh-pages from @ Morrison-Lab/pds@468b964f6340568cbe4c20fec90ff5d32333d17c 🚀
</commit_message>
<xml_diff>
--- a/distributions.docx
+++ b/distributions.docx
@@ -15,7 +15,7 @@
         <w:pStyle w:val="Date"/>
       </w:pPr>
       <w:r>
-        <w:t xml:space="preserve">Last modified: 2026-10-19 11:46:42 (PDT)</w:t>
+        <w:t xml:space="preserve">Last modified: 2026-10-19 14:30:48 (PDT)</w:t>
       </w:r>
     </w:p>
     <w:p>
@@ -6644,7 +6644,7 @@
     </w:p>
     <w:bookmarkEnd w:id="32"/>
     <w:bookmarkEnd w:id="33"/>
-    <w:bookmarkStart w:id="77" w:name="sec-poisson-dist"/>
+    <w:bookmarkStart w:id="78" w:name="sec-poisson-dist"/>
     <w:p>
       <w:pPr>
         <w:pStyle w:val="Heading2"/>
@@ -18712,7 +18712,7 @@
       </w:r>
     </w:p>
     <w:bookmarkEnd w:id="71"/>
-    <w:bookmarkStart w:id="72" w:name="def-offset"/>
+    <w:bookmarkStart w:id="73" w:name="def-offset"/>
     <w:p>
       <w:pPr>
         <w:pStyle w:val="BodyText"/>
@@ -18728,7 +18728,38 @@
         <w:t xml:space="preserve"> </w:t>
       </w:r>
       <w:r>
-        <w:t xml:space="preserve">For a count outcome with exposure magnitude</w:t>
+        <w:t xml:space="preserve">In a model whose linear component contains a term with no unknown coefficient,</w:t>
+      </w:r>
+      <w:r>
+        <w:t xml:space="preserve"> </w:t>
+      </w:r>
+      <w:r>
+        <w:t xml:space="preserve">that term is called an</w:t>
+      </w:r>
+      <w:r>
+        <w:t xml:space="preserve"> </w:t>
+      </w:r>
+      <w:r>
+        <w:rPr>
+          <w:b/>
+          <w:bCs/>
+        </w:rPr>
+        <w:t xml:space="preserve">offset</w:t>
+      </w:r>
+      <w:r>
+        <w:t xml:space="preserve">:</w:t>
+      </w:r>
+      <w:r>
+        <w:t xml:space="preserve"> </w:t>
+      </w:r>
+      <w:r>
+        <w:t xml:space="preserve">it shifts the linear component by a known amount.</w:t>
+      </w:r>
+      <w:r>
+        <w:t xml:space="preserve"> </w:t>
+      </w:r>
+      <w:r>
+        <w:t xml:space="preserve">In a count model with exposure magnitude</w:t>
       </w:r>
       <w:r>
         <w:t xml:space="preserve"> </w:t>
@@ -18745,7 +18776,7 @@
         <w:t xml:space="preserve"> </w:t>
       </w:r>
       <w:r>
-        <w:t xml:space="preserve">the known term</w:t>
+        <w:t xml:space="preserve">the offset is the known term</w:t>
       </w:r>
       <w:r>
         <w:t xml:space="preserve"> </w:t>
@@ -18765,8 +18796,19 @@
         <w:t xml:space="preserve"> </w:t>
       </w:r>
       <w:r>
-        <w:t xml:space="preserve">in the log-scale decomposition of the mean</w:t>
-      </w:r>
+        <w:t xml:space="preserve">in the log-scale decomposition of the</w:t>
+      </w:r>
+      <w:r>
+        <w:t xml:space="preserve"> </w:t>
+      </w:r>
+      <w:hyperlink r:id="rId72">
+        <w:r>
+          <w:rPr>
+            <w:rStyle w:val="Hyperlink"/>
+          </w:rPr>
+          <w:t xml:space="preserve">mean</w:t>
+        </w:r>
+      </w:hyperlink>
       <w:r>
         <w:t xml:space="preserve"> </w:t>
       </w:r>
@@ -18837,68 +18879,15 @@
             <m:rPr>
               <m:sty m:val="p"/>
             </m:rPr>
-            <m:t>,</m:t>
+            <m:t>.</m:t>
           </m:r>
         </m:oMath>
       </m:oMathPara>
     </w:p>
+    <w:bookmarkEnd w:id="73"/>
     <w:p>
       <w:pPr>
         <w:pStyle w:val="FirstParagraph"/>
-      </w:pPr>
-      <w:r>
-        <w:t xml:space="preserve">is called the</w:t>
-      </w:r>
-      <w:r>
-        <w:t xml:space="preserve"> </w:t>
-      </w:r>
-      <w:r>
-        <w:rPr>
-          <w:b/>
-          <w:bCs/>
-        </w:rPr>
-        <w:t xml:space="preserve">offset</w:t>
-      </w:r>
-      <w:r>
-        <w:t xml:space="preserve">:</w:t>
-      </w:r>
-      <w:r>
-        <w:t xml:space="preserve"> </w:t>
-      </w:r>
-      <w:r>
-        <w:t xml:space="preserve">it shifts</w:t>
-      </w:r>
-      <w:r>
-        <w:t xml:space="preserve"> </w:t>
-      </w:r>
-      <m:oMath>
-        <m:r>
-          <m:rPr>
-            <m:sty m:val="p"/>
-          </m:rPr>
-          <m:t>log</m:t>
-        </m:r>
-        <m:r>
-          <m:t>μ</m:t>
-        </m:r>
-      </m:oMath>
-      <w:r>
-        <w:t xml:space="preserve"> </w:t>
-      </w:r>
-      <w:r>
-        <w:t xml:space="preserve">by a known amount,</w:t>
-      </w:r>
-      <w:r>
-        <w:t xml:space="preserve"> </w:t>
-      </w:r>
-      <w:r>
-        <w:t xml:space="preserve">with no unknown coefficient to estimate.</w:t>
-      </w:r>
-    </w:p>
-    <w:bookmarkEnd w:id="72"/>
-    <w:p>
-      <w:pPr>
-        <w:pStyle w:val="BodyText"/>
       </w:pPr>
       <w:r>
         <w:rPr>
@@ -18997,7 +18986,7 @@
         <w:t xml:space="preserve">).</w:t>
       </w:r>
     </w:p>
-    <w:bookmarkStart w:id="73" w:name="exm-offset"/>
+    <w:bookmarkStart w:id="74" w:name="exm-offset"/>
     <w:p>
       <w:pPr>
         <w:pStyle w:val="BodyText"/>
@@ -19233,8 +19222,8 @@
         <w:t xml:space="preserve">at the same event rate.</w:t>
       </w:r>
     </w:p>
-    <w:bookmarkEnd w:id="73"/>
-    <w:bookmarkStart w:id="74" w:name="thm-sum-pois"/>
+    <w:bookmarkEnd w:id="74"/>
+    <w:bookmarkStart w:id="75" w:name="thm-sum-pois"/>
     <w:p>
       <w:pPr>
         <w:pStyle w:val="BodyText"/>
@@ -19426,7 +19415,7 @@
         <w:t xml:space="preserve">.</w:t>
       </w:r>
     </w:p>
-    <w:bookmarkEnd w:id="74"/>
+    <w:bookmarkEnd w:id="75"/>
     <w:p>
       <w:pPr>
         <w:pStyle w:val="BodyText"/>
@@ -20898,7 +20887,7 @@
       <w:r>
         <w:t xml:space="preserve"> </w:t>
       </w:r>
-      <w:hyperlink r:id="rId75">
+      <w:hyperlink r:id="rId76">
         <w:r>
           <w:rPr>
             <w:rStyle w:val="Hyperlink"/>
@@ -20910,7 +20899,7 @@
         <w:t xml:space="preserve">, Example 3).</w:t>
       </w:r>
     </w:p>
-    <w:bookmarkStart w:id="76" w:name="exm-sum-pois"/>
+    <w:bookmarkStart w:id="77" w:name="exm-sum-pois"/>
     <w:p>
       <w:pPr>
         <w:pStyle w:val="BodyText"/>
@@ -21329,8 +21318,8 @@
         </m:oMath>
       </m:oMathPara>
     </w:p>
-    <w:bookmarkEnd w:id="76"/>
     <w:bookmarkEnd w:id="77"/>
+    <w:bookmarkEnd w:id="78"/>
     <w:bookmarkStart w:id="85" w:name="sec-nb-dist"/>
     <w:p>
       <w:pPr>
@@ -21340,7 +21329,7 @@
         <w:t xml:space="preserve">4 The Negative-Binomial distribution</w:t>
       </w:r>
     </w:p>
-    <w:bookmarkStart w:id="78" w:name="def-nb"/>
+    <w:bookmarkStart w:id="79" w:name="def-nb"/>
     <w:p>
       <w:pPr>
         <w:pStyle w:val="FirstParagraph"/>
@@ -21930,7 +21919,7 @@
         <w:t xml:space="preserve">.</w:t>
       </w:r>
     </w:p>
-    <w:bookmarkEnd w:id="78"/>
+    <w:bookmarkEnd w:id="79"/>
     <w:bookmarkStart w:id="80" w:name="thm-nb-poisson-limit"/>
     <w:p>
       <w:pPr>
@@ -21952,7 +21941,7 @@
       <w:r>
         <w:t xml:space="preserve"> </w:t>
       </w:r>
-      <w:hyperlink r:id="rId79">
+      <w:hyperlink r:id="rId72">
         <w:r>
           <w:rPr>
             <w:rStyle w:val="Hyperlink"/>
@@ -46491,7 +46480,7 @@
       <w:r>
         <w:t xml:space="preserve"> </w:t>
       </w:r>
-      <w:hyperlink r:id="rId79">
+      <w:hyperlink r:id="rId72">
         <w:r>
           <w:rPr>
             <w:rStyle w:val="Hyperlink"/>

</xml_diff>

<commit_message>
Deploying to gh-pages from @ Morrison-Lab/pds@fc1f91311420b894fa3ae49ac731aacbd057427c 🚀
</commit_message>
<xml_diff>
--- a/distributions.docx
+++ b/distributions.docx
@@ -15,7 +15,7 @@
         <w:pStyle w:val="Date"/>
       </w:pPr>
       <w:r>
-        <w:t xml:space="preserve">Last modified: 2026-10-19 14:30:48 (PDT)</w:t>
+        <w:t xml:space="preserve">Last modified: 2026-10-20 14:23:12 (PDT)</w:t>
       </w:r>
     </w:p>
     <w:p>
@@ -3202,33 +3202,33 @@
           </m:rPr>
           <m:t>∈</m:t>
         </m:r>
-        <m:r>
-          <m:t>​</m:t>
-        </m:r>
-        <m:d>
-          <m:dPr>
-            <m:begChr m:val="{"/>
-            <m:sepChr m:val=""/>
-            <m:endChr m:val="}"/>
-            <m:grow/>
-          </m:dPr>
-          <m:e>
-            <m:r>
-              <m:t>0</m:t>
-            </m:r>
-            <m:r>
-              <m:rPr>
-                <m:sty m:val="p"/>
-              </m:rPr>
-              <m:t>,</m:t>
-            </m:r>
-            <m:r>
-              <m:t>1</m:t>
-            </m:r>
-          </m:e>
-        </m:d>
         <m:sSup>
           <m:e>
+            <m:r>
+              <m:t>​</m:t>
+            </m:r>
+            <m:d>
+              <m:dPr>
+                <m:begChr m:val="{"/>
+                <m:sepChr m:val=""/>
+                <m:endChr m:val="}"/>
+                <m:grow/>
+              </m:dPr>
+              <m:e>
+                <m:r>
+                  <m:t>0</m:t>
+                </m:r>
+                <m:r>
+                  <m:rPr>
+                    <m:sty m:val="p"/>
+                  </m:rPr>
+                  <m:t>,</m:t>
+                </m:r>
+                <m:r>
+                  <m:t>1</m:t>
+                </m:r>
+              </m:e>
+            </m:d>
             <m:r>
               <m:t>​</m:t>
             </m:r>
@@ -5219,36 +5219,36 @@
                     </m:rPr>
                     <m:t>E</m:t>
                   </m:r>
+                  <m:r>
+                    <m:t>​</m:t>
+                  </m:r>
+                  <m:d>
+                    <m:dPr>
+                      <m:begChr m:val="["/>
+                      <m:sepChr m:val=""/>
+                      <m:endChr m:val="]"/>
+                      <m:grow/>
+                    </m:dPr>
+                    <m:e>
+                      <m:sSub>
+                        <m:e>
+                          <m:r>
+                            <m:t>X</m:t>
+                          </m:r>
+                        </m:e>
+                        <m:sub>
+                          <m:r>
+                            <m:t>i</m:t>
+                          </m:r>
+                        </m:sub>
+                      </m:sSub>
+                    </m:e>
+                  </m:d>
+                  <m:r>
+                    <m:t>​</m:t>
+                  </m:r>
                 </m:e>
               </m:nary>
-              <m:r>
-                <m:t>​</m:t>
-              </m:r>
-              <m:d>
-                <m:dPr>
-                  <m:begChr m:val="["/>
-                  <m:sepChr m:val=""/>
-                  <m:endChr m:val="]"/>
-                  <m:grow/>
-                </m:dPr>
-                <m:e>
-                  <m:sSub>
-                    <m:e>
-                      <m:r>
-                        <m:t>X</m:t>
-                      </m:r>
-                    </m:e>
-                    <m:sub>
-                      <m:r>
-                        <m:t>i</m:t>
-                      </m:r>
-                    </m:sub>
-                  </m:sSub>
-                </m:e>
-              </m:d>
-              <m:r>
-                <m:t>​</m:t>
-              </m:r>
               <m:r>
                 <m:t>&amp;</m:t>
               </m:r>
@@ -5608,10 +5608,208 @@
                         </m:rPr>
                         <m:t>Cov</m:t>
                       </m:r>
+                      <m:r>
+                        <m:t>​</m:t>
+                      </m:r>
+                      <m:d>
+                        <m:dPr>
+                          <m:begChr m:val="("/>
+                          <m:sepChr m:val=""/>
+                          <m:endChr m:val=")"/>
+                          <m:grow/>
+                        </m:dPr>
+                        <m:e>
+                          <m:sSub>
+                            <m:e>
+                              <m:r>
+                                <m:t>X</m:t>
+                              </m:r>
+                            </m:e>
+                            <m:sub>
+                              <m:r>
+                                <m:t>i</m:t>
+                              </m:r>
+                            </m:sub>
+                          </m:sSub>
+                          <m:r>
+                            <m:rPr>
+                              <m:sty m:val="p"/>
+                            </m:rPr>
+                            <m:t>,</m:t>
+                          </m:r>
+                          <m:sSub>
+                            <m:e>
+                              <m:r>
+                                <m:t>X</m:t>
+                              </m:r>
+                            </m:e>
+                            <m:sub>
+                              <m:r>
+                                <m:t>j</m:t>
+                              </m:r>
+                            </m:sub>
+                          </m:sSub>
+                        </m:e>
+                      </m:d>
+                      <m:r>
+                        <m:t>​</m:t>
+                      </m:r>
                     </m:e>
                   </m:nary>
                 </m:e>
               </m:nary>
+              <m:r>
+                <m:t>&amp;</m:t>
+              </m:r>
+              <m:r>
+                <m:t>&amp;</m:t>
+              </m:r>
+              <m:r>
+                <m:rPr>
+                  <m:nor/>
+                  <m:sty m:val="p"/>
+                </m:rPr>
+                <m:t>(variance of a linear combination with </m:t>
+              </m:r>
+              <m:sSub>
+                <m:e>
+                  <m:r>
+                    <m:t>a</m:t>
+                  </m:r>
+                </m:e>
+                <m:sub>
+                  <m:r>
+                    <m:t>i</m:t>
+                  </m:r>
+                </m:sub>
+              </m:sSub>
+              <m:r>
+                <m:rPr>
+                  <m:sty m:val="p"/>
+                </m:rPr>
+                <m:t>=</m:t>
+              </m:r>
+              <m:r>
+                <m:t>1</m:t>
+              </m:r>
+              <m:r>
+                <m:rPr>
+                  <m:nor/>
+                  <m:sty m:val="p"/>
+                </m:rPr>
+                <m:t>)</m:t>
+              </m:r>
+            </m:e>
+            <m:e>
+              <m:r>
+                <m:t>&amp;</m:t>
+              </m:r>
+              <m:r>
+                <m:rPr>
+                  <m:sty m:val="p"/>
+                </m:rPr>
+                <m:t>=</m:t>
+              </m:r>
+              <m:nary>
+                <m:naryPr>
+                  <m:chr m:val="∑"/>
+                  <m:limLoc m:val="undOvr"/>
+                  <m:subHide m:val="off"/>
+                  <m:supHide m:val="off"/>
+                </m:naryPr>
+                <m:sub>
+                  <m:r>
+                    <m:t>i</m:t>
+                  </m:r>
+                  <m:r>
+                    <m:rPr>
+                      <m:sty m:val="p"/>
+                    </m:rPr>
+                    <m:t>=</m:t>
+                  </m:r>
+                  <m:r>
+                    <m:t>1</m:t>
+                  </m:r>
+                </m:sub>
+                <m:sup>
+                  <m:r>
+                    <m:t>n</m:t>
+                  </m:r>
+                </m:sup>
+                <m:e>
+                  <m:r>
+                    <m:rPr>
+                      <m:sty m:val="p"/>
+                    </m:rPr>
+                    <m:t>Cov</m:t>
+                  </m:r>
+                  <m:r>
+                    <m:t>​</m:t>
+                  </m:r>
+                  <m:d>
+                    <m:dPr>
+                      <m:begChr m:val="("/>
+                      <m:sepChr m:val=""/>
+                      <m:endChr m:val=")"/>
+                      <m:grow/>
+                    </m:dPr>
+                    <m:e>
+                      <m:sSub>
+                        <m:e>
+                          <m:r>
+                            <m:t>X</m:t>
+                          </m:r>
+                        </m:e>
+                        <m:sub>
+                          <m:r>
+                            <m:t>i</m:t>
+                          </m:r>
+                        </m:sub>
+                      </m:sSub>
+                      <m:r>
+                        <m:rPr>
+                          <m:sty m:val="p"/>
+                        </m:rPr>
+                        <m:t>,</m:t>
+                      </m:r>
+                      <m:sSub>
+                        <m:e>
+                          <m:r>
+                            <m:t>X</m:t>
+                          </m:r>
+                        </m:e>
+                        <m:sub>
+                          <m:r>
+                            <m:t>i</m:t>
+                          </m:r>
+                        </m:sub>
+                      </m:sSub>
+                    </m:e>
+                  </m:d>
+                  <m:r>
+                    <m:t>​</m:t>
+                  </m:r>
+                </m:e>
+              </m:nary>
+              <m:r>
+                <m:t>&amp;</m:t>
+              </m:r>
+              <m:r>
+                <m:t>&amp;</m:t>
+              </m:r>
+              <m:r>
+                <m:rPr>
+                  <m:nor/>
+                  <m:sty m:val="p"/>
+                </m:rPr>
+                <m:t>(</m:t>
+              </m:r>
+              <m:r>
+                <m:rPr>
+                  <m:sty m:val="p"/>
+                </m:rPr>
+                <m:t>Cov</m:t>
+              </m:r>
               <m:r>
                 <m:t>​</m:t>
               </m:r>
@@ -5659,45 +5857,39 @@
                 <m:t>​</m:t>
               </m:r>
               <m:r>
-                <m:t>&amp;</m:t>
-              </m:r>
-              <m:r>
-                <m:t>&amp;</m:t>
+                <m:rPr>
+                  <m:sty m:val="p"/>
+                </m:rPr>
+                <m:t>=</m:t>
+              </m:r>
+              <m:r>
+                <m:t>0</m:t>
               </m:r>
               <m:r>
                 <m:rPr>
                   <m:nor/>
                   <m:sty m:val="p"/>
                 </m:rPr>
-                <m:t>(variance of a linear combination with </m:t>
-              </m:r>
-              <m:sSub>
-                <m:e>
-                  <m:r>
-                    <m:t>a</m:t>
-                  </m:r>
-                </m:e>
-                <m:sub>
-                  <m:r>
-                    <m:t>i</m:t>
-                  </m:r>
-                </m:sub>
-              </m:sSub>
-              <m:r>
-                <m:rPr>
-                  <m:sty m:val="p"/>
-                </m:rPr>
-                <m:t>=</m:t>
-              </m:r>
-              <m:r>
-                <m:t>1</m:t>
+                <m:t> for </m:t>
+              </m:r>
+              <m:r>
+                <m:t>i</m:t>
+              </m:r>
+              <m:r>
+                <m:rPr>
+                  <m:sty m:val="p"/>
+                </m:rPr>
+                <m:t>≠</m:t>
+              </m:r>
+              <m:r>
+                <m:t>j</m:t>
               </m:r>
               <m:r>
                 <m:rPr>
                   <m:nor/>
                   <m:sty m:val="p"/>
                 </m:rPr>
-                <m:t>)</m:t>
+                <m:t>, by independence)</m:t>
               </m:r>
             </m:e>
             <m:e>
@@ -5741,230 +5933,38 @@
                     <m:rPr>
                       <m:sty m:val="p"/>
                     </m:rPr>
-                    <m:t>Cov</m:t>
+                    <m:t>Var</m:t>
+                  </m:r>
+                  <m:r>
+                    <m:t>​</m:t>
+                  </m:r>
+                  <m:d>
+                    <m:dPr>
+                      <m:begChr m:val="("/>
+                      <m:sepChr m:val=""/>
+                      <m:endChr m:val=")"/>
+                      <m:grow/>
+                    </m:dPr>
+                    <m:e>
+                      <m:sSub>
+                        <m:e>
+                          <m:r>
+                            <m:t>X</m:t>
+                          </m:r>
+                        </m:e>
+                        <m:sub>
+                          <m:r>
+                            <m:t>i</m:t>
+                          </m:r>
+                        </m:sub>
+                      </m:sSub>
+                    </m:e>
+                  </m:d>
+                  <m:r>
+                    <m:t>​</m:t>
                   </m:r>
                 </m:e>
               </m:nary>
-              <m:r>
-                <m:t>​</m:t>
-              </m:r>
-              <m:d>
-                <m:dPr>
-                  <m:begChr m:val="("/>
-                  <m:sepChr m:val=""/>
-                  <m:endChr m:val=")"/>
-                  <m:grow/>
-                </m:dPr>
-                <m:e>
-                  <m:sSub>
-                    <m:e>
-                      <m:r>
-                        <m:t>X</m:t>
-                      </m:r>
-                    </m:e>
-                    <m:sub>
-                      <m:r>
-                        <m:t>i</m:t>
-                      </m:r>
-                    </m:sub>
-                  </m:sSub>
-                  <m:r>
-                    <m:rPr>
-                      <m:sty m:val="p"/>
-                    </m:rPr>
-                    <m:t>,</m:t>
-                  </m:r>
-                  <m:sSub>
-                    <m:e>
-                      <m:r>
-                        <m:t>X</m:t>
-                      </m:r>
-                    </m:e>
-                    <m:sub>
-                      <m:r>
-                        <m:t>i</m:t>
-                      </m:r>
-                    </m:sub>
-                  </m:sSub>
-                </m:e>
-              </m:d>
-              <m:r>
-                <m:t>​</m:t>
-              </m:r>
-              <m:r>
-                <m:t>&amp;</m:t>
-              </m:r>
-              <m:r>
-                <m:t>&amp;</m:t>
-              </m:r>
-              <m:r>
-                <m:rPr>
-                  <m:nor/>
-                  <m:sty m:val="p"/>
-                </m:rPr>
-                <m:t>(</m:t>
-              </m:r>
-              <m:r>
-                <m:rPr>
-                  <m:sty m:val="p"/>
-                </m:rPr>
-                <m:t>Cov</m:t>
-              </m:r>
-              <m:r>
-                <m:t>​</m:t>
-              </m:r>
-              <m:d>
-                <m:dPr>
-                  <m:begChr m:val="("/>
-                  <m:sepChr m:val=""/>
-                  <m:endChr m:val=")"/>
-                  <m:grow/>
-                </m:dPr>
-                <m:e>
-                  <m:sSub>
-                    <m:e>
-                      <m:r>
-                        <m:t>X</m:t>
-                      </m:r>
-                    </m:e>
-                    <m:sub>
-                      <m:r>
-                        <m:t>i</m:t>
-                      </m:r>
-                    </m:sub>
-                  </m:sSub>
-                  <m:r>
-                    <m:rPr>
-                      <m:sty m:val="p"/>
-                    </m:rPr>
-                    <m:t>,</m:t>
-                  </m:r>
-                  <m:sSub>
-                    <m:e>
-                      <m:r>
-                        <m:t>X</m:t>
-                      </m:r>
-                    </m:e>
-                    <m:sub>
-                      <m:r>
-                        <m:t>j</m:t>
-                      </m:r>
-                    </m:sub>
-                  </m:sSub>
-                </m:e>
-              </m:d>
-              <m:r>
-                <m:t>​</m:t>
-              </m:r>
-              <m:r>
-                <m:rPr>
-                  <m:sty m:val="p"/>
-                </m:rPr>
-                <m:t>=</m:t>
-              </m:r>
-              <m:r>
-                <m:t>0</m:t>
-              </m:r>
-              <m:r>
-                <m:rPr>
-                  <m:nor/>
-                  <m:sty m:val="p"/>
-                </m:rPr>
-                <m:t> for </m:t>
-              </m:r>
-              <m:r>
-                <m:t>i</m:t>
-              </m:r>
-              <m:r>
-                <m:rPr>
-                  <m:sty m:val="p"/>
-                </m:rPr>
-                <m:t>≠</m:t>
-              </m:r>
-              <m:r>
-                <m:t>j</m:t>
-              </m:r>
-              <m:r>
-                <m:rPr>
-                  <m:nor/>
-                  <m:sty m:val="p"/>
-                </m:rPr>
-                <m:t>, by independence)</m:t>
-              </m:r>
-            </m:e>
-            <m:e>
-              <m:r>
-                <m:t>&amp;</m:t>
-              </m:r>
-              <m:r>
-                <m:rPr>
-                  <m:sty m:val="p"/>
-                </m:rPr>
-                <m:t>=</m:t>
-              </m:r>
-              <m:nary>
-                <m:naryPr>
-                  <m:chr m:val="∑"/>
-                  <m:limLoc m:val="undOvr"/>
-                  <m:subHide m:val="off"/>
-                  <m:supHide m:val="off"/>
-                </m:naryPr>
-                <m:sub>
-                  <m:r>
-                    <m:t>i</m:t>
-                  </m:r>
-                  <m:r>
-                    <m:rPr>
-                      <m:sty m:val="p"/>
-                    </m:rPr>
-                    <m:t>=</m:t>
-                  </m:r>
-                  <m:r>
-                    <m:t>1</m:t>
-                  </m:r>
-                </m:sub>
-                <m:sup>
-                  <m:r>
-                    <m:t>n</m:t>
-                  </m:r>
-                </m:sup>
-                <m:e>
-                  <m:r>
-                    <m:rPr>
-                      <m:sty m:val="p"/>
-                    </m:rPr>
-                    <m:t>Var</m:t>
-                  </m:r>
-                </m:e>
-              </m:nary>
-              <m:r>
-                <m:t>​</m:t>
-              </m:r>
-              <m:d>
-                <m:dPr>
-                  <m:begChr m:val="("/>
-                  <m:sepChr m:val=""/>
-                  <m:endChr m:val=")"/>
-                  <m:grow/>
-                </m:dPr>
-                <m:e>
-                  <m:sSub>
-                    <m:e>
-                      <m:r>
-                        <m:t>X</m:t>
-                      </m:r>
-                    </m:e>
-                    <m:sub>
-                      <m:r>
-                        <m:t>i</m:t>
-                      </m:r>
-                    </m:sub>
-                  </m:sSub>
-                </m:e>
-              </m:d>
-              <m:r>
-                <m:t>​</m:t>
-              </m:r>
               <m:r>
                 <m:t>&amp;</m:t>
               </m:r>
@@ -37580,7 +37580,7 @@
         <w:t xml:space="preserve"> </w:t>
       </w:r>
       <w:r>
-        <w:t xml:space="preserve">$\operatorname{Var}\mathopen{}\left(\mathord{\smash[b]{\underset{\raise.3ex\hbox{$\scriptstyle\sim$}}{X}}\vphantom{X}}\right)\mathclose{} = \mathbf{\Sigma}$</w:t>
+        <w:t xml:space="preserve">${\operatorname{Var}\mathopen{}\left(\mathord{\smash[b]{\underset{\raise.3ex\hbox{$\scriptstyle\sim$}}{X}}\vphantom{X}}\right)\mathclose{}} = \mathbf{\Sigma}$</w:t>
       </w:r>
       <w:r>
         <w:t xml:space="preserve"> </w:t>
@@ -40601,7 +40601,7 @@
         <w:t xml:space="preserve"> </w:t>
       </w:r>
       <w:r>
-        <w:t xml:space="preserve">$\operatorname{Var}\mathopen{}\left(\mathord{\smash[b]{\underset{\raise.3ex\hbox{$\scriptstyle\sim$}}{X}}\vphantom{X}}\right)\mathclose{} = \mathbf{\Sigma}$</w:t>
+        <w:t xml:space="preserve">${\operatorname{Var}\mathopen{}\left(\mathord{\smash[b]{\underset{\raise.3ex\hbox{$\scriptstyle\sim$}}{X}}\vphantom{X}}\right)\mathclose{}} = \mathbf{\Sigma}$</w:t>
       </w:r>
       <w:r>
         <w:t xml:space="preserve">,</w:t>

</xml_diff>

<commit_message>
Deploying to gh-pages from @ Morrison-Lab/pds@40115f7c320c11056bd34e1f060773be57de01eb 🚀
</commit_message>
<xml_diff>
--- a/distributions.docx
+++ b/distributions.docx
@@ -15,7 +15,7 @@
         <w:pStyle w:val="Date"/>
       </w:pPr>
       <w:r>
-        <w:t xml:space="preserve">Last modified: 2026-10-22 01:36:00 (PDT)</w:t>
+        <w:t xml:space="preserve">Last modified: 2026-10-22 13:40:45 (PDT)</w:t>
       </w:r>
     </w:p>
     <w:p>
@@ -1180,6 +1180,7 @@
         <m:oMath>
           <m:r>
             <m:rPr>
+              <m:scr m:val="double-struck"/>
               <m:sty m:val="p"/>
             </m:rPr>
             <m:t>P</m:t>
@@ -1801,7 +1802,7 @@
       <w:r>
         <w:t xml:space="preserve">$$
     \begin{aligned}
-    \operatorname{P}(X = 2)
+    \mathbb{P}(X = 2)
     &amp;= \binom{3}{2} \mathopen{}\left(\frac{1}{2}\right)\mathclose{}^2 \mathopen{}\left(1 - \frac{1}{2}\right)\mathclose{}^{3 - 2}
     &amp;&amp; \text{(binomial PMF with } n = 3,\ \pi= 1/2,\ x = 2 \text{)} \\
     &amp;= \frac{3!}{2!\,1!} \mathopen{}\left(\frac{1}{2}\right)\mathclose{}^2 \mathopen{}\left(\frac{1}{2}\right)\mathclose{}^1
@@ -2077,6 +2078,7 @@
             <m:e>
               <m:r>
                 <m:rPr>
+                  <m:scr m:val="double-struck"/>
                   <m:sty m:val="p"/>
                 </m:rPr>
                 <m:t>P</m:t>
@@ -2116,6 +2118,7 @@
               </m:r>
               <m:r>
                 <m:rPr>
+                  <m:scr m:val="double-struck"/>
                   <m:sty m:val="p"/>
                 </m:rPr>
                 <m:t>P</m:t>
@@ -2147,6 +2150,7 @@
               </m:r>
               <m:r>
                 <m:rPr>
+                  <m:scr m:val="double-struck"/>
                   <m:sty m:val="p"/>
                 </m:rPr>
                 <m:t>P</m:t>
@@ -2389,6 +2393,7 @@
             <m:e>
               <m:r>
                 <m:rPr>
+                  <m:scr m:val="double-struck"/>
                   <m:sty m:val="p"/>
                 </m:rPr>
                 <m:t>P</m:t>
@@ -3510,6 +3515,7 @@
             <m:e>
               <m:r>
                 <m:rPr>
+                  <m:scr m:val="double-struck"/>
                   <m:sty m:val="p"/>
                 </m:rPr>
                 <m:t>P</m:t>
@@ -3642,6 +3648,7 @@
                 <m:e>
                   <m:r>
                     <m:rPr>
+                      <m:scr m:val="double-struck"/>
                       <m:sty m:val="p"/>
                     </m:rPr>
                     <m:t>P</m:t>
@@ -4273,8 +4280,8 @@
       <w:r>
         <w:t xml:space="preserve">$$
     \begin{aligned}
-    \operatorname{P}(S = x)
-    &amp;= \sum_{(s_1, \ldots, s_n) \in A_x} \operatorname{P}(X_1 = s_1, \ldots, X_n = s_n)
+    \mathbb{P}(S = x)
+    &amp;= \sum_{(s_1, \ldots, s_n) \in A_x} \mathbb{P}(X_1 = s_1, \ldots, X_n = s_n)
     &amp;&amp; \text{(additivity over disjoint events)} \\
     &amp;= \sum_{(s_1, \ldots, s_n) \in A_x} \pi^x (1 - \pi)^{n - x}
     &amp;&amp; \text{(probability of one sequence)} \\
@@ -4568,7 +4575,7 @@
       <w:r>
         <w:t xml:space="preserve">$$
     \begin{aligned}
-    \operatorname{P}(S = 0)
+    \mathbb{P}(S = 0)
     &amp;= \binom{5}{0} (0.2)^0 (1 - 0.2)^{5 - 0}
     &amp;&amp; \text{(binomial PMF with } n = 5,\ \pi= 0.2,\ x = 0 \text{)} \\
     &amp;= 1 \cdot 1 \cdot(0.8)^5
@@ -4661,6 +4668,7 @@
       <m:oMath>
         <m:r>
           <m:rPr>
+            <m:scr m:val="double-struck"/>
             <m:sty m:val="p"/>
           </m:rPr>
           <m:t>E</m:t>
@@ -5057,6 +5065,7 @@
             <m:e>
               <m:r>
                 <m:rPr>
+                  <m:scr m:val="double-struck"/>
                   <m:sty m:val="p"/>
                 </m:rPr>
                 <m:t>E</m:t>
@@ -5091,6 +5100,7 @@
               </m:r>
               <m:r>
                 <m:rPr>
+                  <m:scr m:val="double-struck"/>
                   <m:sty m:val="p"/>
                 </m:rPr>
                 <m:t>E</m:t>
@@ -5215,6 +5225,7 @@
                 <m:e>
                   <m:r>
                     <m:rPr>
+                      <m:scr m:val="double-struck"/>
                       <m:sty m:val="p"/>
                     </m:rPr>
                     <m:t>E</m:t>
@@ -6377,6 +6388,7 @@
             <m:e>
               <m:r>
                 <m:rPr>
+                  <m:scr m:val="double-struck"/>
                   <m:sty m:val="p"/>
                 </m:rPr>
                 <m:t>E</m:t>
@@ -6790,6 +6802,7 @@
         <m:oMath>
           <m:r>
             <m:rPr>
+              <m:scr m:val="double-struck"/>
               <m:sty m:val="p"/>
             </m:rPr>
             <m:t>P</m:t>
@@ -7251,6 +7264,7 @@
         <m:oMath>
           <m:r>
             <m:rPr>
+              <m:scr m:val="double-struck"/>
               <m:sty m:val="p"/>
             </m:rPr>
             <m:t>P</m:t>
@@ -7647,6 +7661,7 @@
             <m:e>
               <m:r>
                 <m:rPr>
+                  <m:scr m:val="double-struck"/>
                   <m:sty m:val="p"/>
                 </m:rPr>
                 <m:t>P</m:t>
@@ -7729,6 +7744,7 @@
                 <m:e>
                   <m:r>
                     <m:rPr>
+                      <m:scr m:val="double-struck"/>
                       <m:sty m:val="p"/>
                     </m:rPr>
                     <m:t>P</m:t>
@@ -8172,6 +8188,7 @@
             <m:e>
               <m:r>
                 <m:rPr>
+                  <m:scr m:val="double-struck"/>
                   <m:sty m:val="p"/>
                 </m:rPr>
                 <m:t>P</m:t>
@@ -10364,6 +10381,7 @@
       <m:oMath>
         <m:r>
           <m:rPr>
+            <m:scr m:val="double-struck"/>
             <m:sty m:val="p"/>
           </m:rPr>
           <m:t>P</m:t>
@@ -10408,6 +10426,7 @@
       <m:oMath>
         <m:r>
           <m:rPr>
+            <m:scr m:val="double-struck"/>
             <m:sty m:val="p"/>
           </m:rPr>
           <m:t>P</m:t>
@@ -10452,6 +10471,7 @@
       <m:oMath>
         <m:r>
           <m:rPr>
+            <m:scr m:val="double-struck"/>
             <m:sty m:val="p"/>
           </m:rPr>
           <m:t>P</m:t>
@@ -10512,6 +10532,7 @@
       <m:oMath>
         <m:r>
           <m:rPr>
+            <m:scr m:val="double-struck"/>
             <m:sty m:val="p"/>
           </m:rPr>
           <m:t>P</m:t>
@@ -10565,6 +10586,7 @@
       <m:oMath>
         <m:r>
           <m:rPr>
+            <m:scr m:val="double-struck"/>
             <m:sty m:val="p"/>
           </m:rPr>
           <m:t>P</m:t>
@@ -10618,6 +10640,7 @@
       <m:oMath>
         <m:r>
           <m:rPr>
+            <m:scr m:val="double-struck"/>
             <m:sty m:val="p"/>
           </m:rPr>
           <m:t>P</m:t>
@@ -10728,6 +10751,7 @@
       <m:oMath>
         <m:r>
           <m:rPr>
+            <m:scr m:val="double-struck"/>
             <m:sty m:val="p"/>
           </m:rPr>
           <m:t>E</m:t>
@@ -10841,6 +10865,7 @@
             <m:e>
               <m:r>
                 <m:rPr>
+                  <m:scr m:val="double-struck"/>
                   <m:sty m:val="p"/>
                 </m:rPr>
                 <m:t>E</m:t>
@@ -10912,6 +10937,7 @@
               </m:r>
               <m:r>
                 <m:rPr>
+                  <m:scr m:val="double-struck"/>
                   <m:sty m:val="p"/>
                 </m:rPr>
                 <m:t>P</m:t>
@@ -10987,6 +11013,7 @@
               </m:r>
               <m:r>
                 <m:rPr>
+                  <m:scr m:val="double-struck"/>
                   <m:sty m:val="p"/>
                 </m:rPr>
                 <m:t>P</m:t>
@@ -11064,6 +11091,7 @@
               </m:r>
               <m:r>
                 <m:rPr>
+                  <m:scr m:val="double-struck"/>
                   <m:sty m:val="p"/>
                 </m:rPr>
                 <m:t>P</m:t>
@@ -11997,6 +12025,7 @@
       <m:oMath>
         <m:r>
           <m:rPr>
+            <m:scr m:val="double-struck"/>
             <m:sty m:val="p"/>
           </m:rPr>
           <m:t>E</m:t>
@@ -12062,6 +12091,7 @@
             <m:e>
               <m:r>
                 <m:rPr>
+                  <m:scr m:val="double-struck"/>
                   <m:sty m:val="p"/>
                 </m:rPr>
                 <m:t>E</m:t>
@@ -12789,6 +12819,7 @@
               </m:r>
               <m:r>
                 <m:rPr>
+                  <m:scr m:val="double-struck"/>
                   <m:sty m:val="p"/>
                 </m:rPr>
                 <m:t>E</m:t>
@@ -12842,6 +12873,7 @@
                     <m:e>
                       <m:r>
                         <m:rPr>
+                          <m:scr m:val="double-struck"/>
                           <m:sty m:val="p"/>
                         </m:rPr>
                         <m:t>E</m:t>
@@ -12915,6 +12947,7 @@
               </m:r>
               <m:r>
                 <m:rPr>
+                  <m:scr m:val="double-struck"/>
                   <m:sty m:val="p"/>
                 </m:rPr>
                 <m:t>E</m:t>
@@ -12970,6 +13003,7 @@
               </m:r>
               <m:r>
                 <m:rPr>
+                  <m:scr m:val="double-struck"/>
                   <m:sty m:val="p"/>
                 </m:rPr>
                 <m:t>E</m:t>
@@ -13014,6 +13048,7 @@
                     <m:e>
                       <m:r>
                         <m:rPr>
+                          <m:scr m:val="double-struck"/>
                           <m:sty m:val="p"/>
                         </m:rPr>
                         <m:t>E</m:t>
@@ -13354,6 +13389,7 @@
       <m:oMath>
         <m:r>
           <m:rPr>
+            <m:scr m:val="double-struck"/>
             <m:sty m:val="p"/>
           </m:rPr>
           <m:t>P</m:t>
@@ -13405,6 +13441,7 @@
         </m:f>
         <m:r>
           <m:rPr>
+            <m:scr m:val="double-struck"/>
             <m:sty m:val="p"/>
           </m:rPr>
           <m:t>P</m:t>
@@ -13601,6 +13638,7 @@
       <m:oMath>
         <m:r>
           <m:rPr>
+            <m:scr m:val="double-struck"/>
             <m:sty m:val="p"/>
           </m:rPr>
           <m:t>P</m:t>
@@ -13637,6 +13675,7 @@
         </m:r>
         <m:r>
           <m:rPr>
+            <m:scr m:val="double-struck"/>
             <m:sty m:val="p"/>
           </m:rPr>
           <m:t>P</m:t>
@@ -13730,6 +13769,7 @@
       <m:oMath>
         <m:r>
           <m:rPr>
+            <m:scr m:val="double-struck"/>
             <m:sty m:val="p"/>
           </m:rPr>
           <m:t>P</m:t>
@@ -13766,6 +13806,7 @@
         </m:r>
         <m:r>
           <m:rPr>
+            <m:scr m:val="double-struck"/>
             <m:sty m:val="p"/>
           </m:rPr>
           <m:t>P</m:t>
@@ -13902,6 +13943,7 @@
       <m:oMath>
         <m:r>
           <m:rPr>
+            <m:scr m:val="double-struck"/>
             <m:sty m:val="p"/>
           </m:rPr>
           <m:t>P</m:t>
@@ -13938,6 +13980,7 @@
         </m:r>
         <m:r>
           <m:rPr>
+            <m:scr m:val="double-struck"/>
             <m:sty m:val="p"/>
           </m:rPr>
           <m:t>P</m:t>
@@ -14029,6 +14072,7 @@
         </m:sSub>
         <m:r>
           <m:rPr>
+            <m:scr m:val="double-struck"/>
             <m:sty m:val="p"/>
           </m:rPr>
           <m:t>P</m:t>
@@ -14260,6 +14304,7 @@
                 <m:num>
                   <m:r>
                     <m:rPr>
+                      <m:scr m:val="double-struck"/>
                       <m:sty m:val="p"/>
                     </m:rPr>
                     <m:t>P</m:t>
@@ -14292,6 +14337,7 @@
                 <m:den>
                   <m:r>
                     <m:rPr>
+                      <m:scr m:val="double-struck"/>
                       <m:sty m:val="p"/>
                     </m:rPr>
                     <m:t>P</m:t>
@@ -14682,6 +14728,7 @@
       <m:oMath>
         <m:r>
           <m:rPr>
+            <m:scr m:val="double-struck"/>
             <m:sty m:val="p"/>
           </m:rPr>
           <m:t>P</m:t>
@@ -14848,6 +14895,7 @@
       <m:oMath>
         <m:r>
           <m:rPr>
+            <m:scr m:val="double-struck"/>
             <m:sty m:val="p"/>
           </m:rPr>
           <m:t>P</m:t>
@@ -14884,6 +14932,7 @@
         </m:r>
         <m:r>
           <m:rPr>
+            <m:scr m:val="double-struck"/>
             <m:sty m:val="p"/>
           </m:rPr>
           <m:t>P</m:t>
@@ -14994,6 +15043,7 @@
       <m:oMath>
         <m:r>
           <m:rPr>
+            <m:scr m:val="double-struck"/>
             <m:sty m:val="p"/>
           </m:rPr>
           <m:t>P</m:t>
@@ -15045,6 +15095,7 @@
         </m:f>
         <m:r>
           <m:rPr>
+            <m:scr m:val="double-struck"/>
             <m:sty m:val="p"/>
           </m:rPr>
           <m:t>P</m:t>
@@ -15081,6 +15132,7 @@
         </m:r>
         <m:r>
           <m:rPr>
+            <m:scr m:val="double-struck"/>
             <m:sty m:val="p"/>
           </m:rPr>
           <m:t>P</m:t>
@@ -15122,6 +15174,7 @@
       <m:oMath>
         <m:r>
           <m:rPr>
+            <m:scr m:val="double-struck"/>
             <m:sty m:val="p"/>
           </m:rPr>
           <m:t>P</m:t>
@@ -15173,6 +15226,7 @@
         </m:f>
         <m:r>
           <m:rPr>
+            <m:scr m:val="double-struck"/>
             <m:sty m:val="p"/>
           </m:rPr>
           <m:t>P</m:t>
@@ -15209,6 +15263,7 @@
         </m:r>
         <m:r>
           <m:rPr>
+            <m:scr m:val="double-struck"/>
             <m:sty m:val="p"/>
           </m:rPr>
           <m:t>P</m:t>
@@ -15333,6 +15388,7 @@
       <m:oMath>
         <m:r>
           <m:rPr>
+            <m:scr m:val="double-struck"/>
             <m:sty m:val="p"/>
           </m:rPr>
           <m:t>P</m:t>
@@ -15384,6 +15440,7 @@
         </m:f>
         <m:r>
           <m:rPr>
+            <m:scr m:val="double-struck"/>
             <m:sty m:val="p"/>
           </m:rPr>
           <m:t>P</m:t>
@@ -16021,6 +16078,7 @@
             <m:num>
               <m:r>
                 <m:rPr>
+                  <m:scr m:val="double-struck"/>
                   <m:sty m:val="p"/>
                 </m:rPr>
                 <m:t>E</m:t>
@@ -16236,6 +16294,7 @@
         </m:limUpp>
         <m:r>
           <m:rPr>
+            <m:scr m:val="double-struck"/>
             <m:sty m:val="p"/>
           </m:rPr>
           <m:t>E</m:t>
@@ -16396,6 +16455,7 @@
                 <m:num>
                   <m:r>
                     <m:rPr>
+                      <m:scr m:val="double-struck"/>
                       <m:sty m:val="p"/>
                     </m:rPr>
                     <m:t>E</m:t>
@@ -16455,6 +16515,7 @@
             <m:e>
               <m:r>
                 <m:rPr>
+                  <m:scr m:val="double-struck"/>
                   <m:sty m:val="p"/>
                 </m:rPr>
                 <m:t>E</m:t>
@@ -16598,6 +16659,7 @@
               </m:limUpp>
               <m:r>
                 <m:rPr>
+                  <m:scr m:val="double-struck"/>
                   <m:sty m:val="p"/>
                 </m:rPr>
                 <m:t>E</m:t>
@@ -17004,6 +17066,7 @@
       <m:oMath>
         <m:r>
           <m:rPr>
+            <m:scr m:val="double-struck"/>
             <m:sty m:val="p"/>
           </m:rPr>
           <m:t>E</m:t>
@@ -17113,6 +17176,7 @@
         <m:oMath>
           <m:r>
             <m:rPr>
+              <m:scr m:val="double-struck"/>
               <m:sty m:val="p"/>
             </m:rPr>
             <m:t>E</m:t>
@@ -17186,6 +17250,7 @@
             <m:e>
               <m:r>
                 <m:rPr>
+                  <m:scr m:val="double-struck"/>
                   <m:sty m:val="p"/>
                 </m:rPr>
                 <m:t>E</m:t>
@@ -17260,6 +17325,7 @@
               </m:r>
               <m:r>
                 <m:rPr>
+                  <m:scr m:val="double-struck"/>
                   <m:sty m:val="p"/>
                 </m:rPr>
                 <m:t>E</m:t>
@@ -17423,6 +17489,7 @@
       <m:oMath>
         <m:r>
           <m:rPr>
+            <m:scr m:val="double-struck"/>
             <m:sty m:val="p"/>
           </m:rPr>
           <m:t>E</m:t>
@@ -17489,6 +17556,7 @@
         </m:r>
         <m:r>
           <m:rPr>
+            <m:scr m:val="double-struck"/>
             <m:sty m:val="p"/>
           </m:rPr>
           <m:t>E</m:t>
@@ -17654,6 +17722,7 @@
       <m:oMath>
         <m:r>
           <m:rPr>
+            <m:scr m:val="double-struck"/>
             <m:sty m:val="p"/>
           </m:rPr>
           <m:t>E</m:t>
@@ -17818,6 +17887,7 @@
             <m:oMath>
               <m:r>
                 <m:rPr>
+                  <m:scr m:val="double-struck"/>
                   <m:sty m:val="p"/>
                 </m:rPr>
                 <m:t>E</m:t>
@@ -17910,6 +17980,7 @@
             <m:oMath>
               <m:r>
                 <m:rPr>
+                  <m:scr m:val="double-struck"/>
                   <m:sty m:val="p"/>
                 </m:rPr>
                 <m:t>E</m:t>
@@ -19625,6 +19696,7 @@
             <m:e>
               <m:r>
                 <m:rPr>
+                  <m:scr m:val="double-struck"/>
                   <m:sty m:val="p"/>
                 </m:rPr>
                 <m:t>P</m:t>
@@ -19691,6 +19763,7 @@
                 <m:e>
                   <m:r>
                     <m:rPr>
+                      <m:scr m:val="double-struck"/>
                       <m:sty m:val="p"/>
                     </m:rPr>
                     <m:t>P</m:t>
@@ -19816,6 +19889,7 @@
                 <m:e>
                   <m:r>
                     <m:rPr>
+                      <m:scr m:val="double-struck"/>
                       <m:sty m:val="p"/>
                     </m:rPr>
                     <m:t>P</m:t>
@@ -19848,6 +19922,7 @@
               </m:r>
               <m:r>
                 <m:rPr>
+                  <m:scr m:val="double-struck"/>
                   <m:sty m:val="p"/>
                 </m:rPr>
                 <m:t>P</m:t>
@@ -21563,6 +21638,7 @@
         <m:oMath>
           <m:r>
             <m:rPr>
+              <m:scr m:val="double-struck"/>
               <m:sty m:val="p"/>
             </m:rPr>
             <m:t>P</m:t>
@@ -22205,6 +22281,7 @@
           </m:limLow>
           <m:r>
             <m:rPr>
+              <m:scr m:val="double-struck"/>
               <m:sty m:val="p"/>
             </m:rPr>
             <m:t>P</m:t>
@@ -24320,6 +24397,7 @@
               </m:limLow>
               <m:r>
                 <m:rPr>
+                  <m:scr m:val="double-struck"/>
                   <m:sty m:val="p"/>
                 </m:rPr>
                 <m:t>P</m:t>
@@ -24673,6 +24751,7 @@
       <m:oMath>
         <m:r>
           <m:rPr>
+            <m:scr m:val="double-struck"/>
             <m:sty m:val="p"/>
           </m:rPr>
           <m:t>E</m:t>
@@ -25207,6 +25286,7 @@
             <m:e>
               <m:r>
                 <m:rPr>
+                  <m:scr m:val="double-struck"/>
                   <m:sty m:val="p"/>
                 </m:rPr>
                 <m:t>P</m:t>
@@ -26804,6 +26884,7 @@
             <m:e>
               <m:r>
                 <m:rPr>
+                  <m:scr m:val="double-struck"/>
                   <m:sty m:val="p"/>
                 </m:rPr>
                 <m:t>E</m:t>
@@ -26935,6 +27016,7 @@
             <m:e>
               <m:r>
                 <m:rPr>
+                  <m:scr m:val="double-struck"/>
                   <m:sty m:val="p"/>
                 </m:rPr>
                 <m:t>E</m:t>
@@ -26965,6 +27047,7 @@
               </m:r>
               <m:r>
                 <m:rPr>
+                  <m:scr m:val="double-struck"/>
                   <m:sty m:val="p"/>
                 </m:rPr>
                 <m:t>E</m:t>
@@ -26982,6 +27065,7 @@
                 <m:e>
                   <m:r>
                     <m:rPr>
+                      <m:scr m:val="double-struck"/>
                       <m:sty m:val="p"/>
                     </m:rPr>
                     <m:t>E</m:t>
@@ -27060,6 +27144,7 @@
               </m:r>
               <m:r>
                 <m:rPr>
+                  <m:scr m:val="double-struck"/>
                   <m:sty m:val="p"/>
                 </m:rPr>
                 <m:t>E</m:t>
@@ -27100,6 +27185,7 @@
               </m:r>
               <m:r>
                 <m:rPr>
+                  <m:scr m:val="double-struck"/>
                   <m:sty m:val="p"/>
                 </m:rPr>
                 <m:t>E</m:t>
@@ -27230,6 +27316,7 @@
               </m:r>
               <m:r>
                 <m:rPr>
+                  <m:scr m:val="double-struck"/>
                   <m:sty m:val="p"/>
                 </m:rPr>
                 <m:t>E</m:t>
@@ -27312,6 +27399,7 @@
                 <m:e>
                   <m:r>
                     <m:rPr>
+                      <m:scr m:val="double-struck"/>
                       <m:sty m:val="p"/>
                     </m:rPr>
                     <m:t>E</m:t>
@@ -27390,6 +27478,7 @@
               </m:r>
               <m:r>
                 <m:rPr>
+                  <m:scr m:val="double-struck"/>
                   <m:sty m:val="p"/>
                 </m:rPr>
                 <m:t>E</m:t>
@@ -27520,6 +27609,7 @@
               </m:r>
               <m:r>
                 <m:rPr>
+                  <m:scr m:val="double-struck"/>
                   <m:sty m:val="p"/>
                 </m:rPr>
                 <m:t>E</m:t>
@@ -29323,6 +29413,7 @@
         <m:oMath>
           <m:r>
             <m:rPr>
+              <m:scr m:val="double-struck"/>
               <m:sty m:val="p"/>
             </m:rPr>
             <m:t>E</m:t>
@@ -29753,6 +29844,7 @@
       <m:oMath>
         <m:r>
           <m:rPr>
+            <m:scr m:val="double-struck"/>
             <m:sty m:val="p"/>
           </m:rPr>
           <m:t>E</m:t>
@@ -29803,6 +29895,7 @@
             <m:e>
               <m:r>
                 <m:rPr>
+                  <m:scr m:val="double-struck"/>
                   <m:sty m:val="p"/>
                 </m:rPr>
                 <m:t>E</m:t>
@@ -29846,6 +29939,7 @@
               </m:r>
               <m:r>
                 <m:rPr>
+                  <m:scr m:val="double-struck"/>
                   <m:sty m:val="p"/>
                 </m:rPr>
                 <m:t>E</m:t>
@@ -29985,6 +30079,7 @@
               </m:r>
               <m:r>
                 <m:rPr>
+                  <m:scr m:val="double-struck"/>
                   <m:sty m:val="p"/>
                 </m:rPr>
                 <m:t>E</m:t>
@@ -30035,6 +30130,7 @@
       <m:oMath>
         <m:r>
           <m:rPr>
+            <m:scr m:val="double-struck"/>
             <m:sty m:val="p"/>
           </m:rPr>
           <m:t>E</m:t>
@@ -30191,6 +30287,7 @@
             <m:e>
               <m:r>
                 <m:rPr>
+                  <m:scr m:val="double-struck"/>
                   <m:sty m:val="p"/>
                 </m:rPr>
                 <m:t>E</m:t>
@@ -31827,6 +31924,7 @@
       <m:oMath>
         <m:r>
           <m:rPr>
+            <m:scr m:val="double-struck"/>
             <m:sty m:val="p"/>
           </m:rPr>
           <m:t>P</m:t>
@@ -33810,6 +33908,7 @@
         <m:oMath>
           <m:r>
             <m:rPr>
+              <m:scr m:val="double-struck"/>
               <m:sty m:val="p"/>
             </m:rPr>
             <m:t>E</m:t>
@@ -34164,6 +34263,7 @@
             <m:e>
               <m:r>
                 <m:rPr>
+                  <m:scr m:val="double-struck"/>
                   <m:sty m:val="p"/>
                 </m:rPr>
                 <m:t>E</m:t>
@@ -36426,6 +36526,7 @@
             <m:e>
               <m:r>
                 <m:rPr>
+                  <m:scr m:val="double-struck"/>
                   <m:sty m:val="p"/>
                 </m:rPr>
                 <m:t>E</m:t>
@@ -36668,6 +36769,7 @@
             <m:e>
               <m:r>
                 <m:rPr>
+                  <m:scr m:val="double-struck"/>
                   <m:sty m:val="p"/>
                 </m:rPr>
                 <m:t>E</m:t>
@@ -37548,7 +37650,7 @@
         <w:t xml:space="preserve"> </w:t>
       </w:r>
       <w:r>
-        <w:t xml:space="preserve">$\operatorname{E}\mathord{\smash[b]{\underset{\raise.3ex\hbox{$\scriptstyle\sim$}}{X}}\vphantom{X}}= \mathord{\smash[b]{\underset{\raise.3ex\hbox{$\scriptstyle\sim$}}{\mu}}\vphantom{\mu}}$</w:t>
+        <w:t xml:space="preserve">$\mathbb{E}\mathord{\smash[b]{\underset{\raise.3ex\hbox{$\scriptstyle\sim$}}{X}}\vphantom{X}}= \mathord{\smash[b]{\underset{\raise.3ex\hbox{$\scriptstyle\sim$}}{\mu}}\vphantom{\mu}}$</w:t>
       </w:r>
       <w:r>
         <w:t xml:space="preserve"> </w:t>
@@ -40933,6 +41035,7 @@
       <m:oMath>
         <m:r>
           <m:rPr>
+            <m:scr m:val="double-struck"/>
             <m:sty m:val="p"/>
           </m:rPr>
           <m:t>E</m:t>
@@ -41115,6 +41218,7 @@
       <m:oMath>
         <m:r>
           <m:rPr>
+            <m:scr m:val="double-struck"/>
             <m:sty m:val="p"/>
           </m:rPr>
           <m:t>E</m:t>
@@ -43658,6 +43762,7 @@
       <m:oMath>
         <m:r>
           <m:rPr>
+            <m:scr m:val="double-struck"/>
             <m:sty m:val="p"/>
           </m:rPr>
           <m:t>P</m:t>
@@ -43946,6 +44051,7 @@
             <m:e>
               <m:r>
                 <m:rPr>
+                  <m:scr m:val="double-struck"/>
                   <m:sty m:val="p"/>
                 </m:rPr>
                 <m:t>P</m:t>
@@ -45136,6 +45242,7 @@
       <m:oMath>
         <m:r>
           <m:rPr>
+            <m:scr m:val="double-struck"/>
             <m:sty m:val="p"/>
           </m:rPr>
           <m:t>P</m:t>
@@ -45543,6 +45650,7 @@
         <m:oMath>
           <m:r>
             <m:rPr>
+              <m:scr m:val="double-struck"/>
               <m:sty m:val="p"/>
             </m:rPr>
             <m:t>E</m:t>
@@ -45655,6 +45763,7 @@
       <m:oMath>
         <m:r>
           <m:rPr>
+            <m:scr m:val="double-struck"/>
             <m:sty m:val="p"/>
           </m:rPr>
           <m:t>E</m:t>
@@ -45956,6 +46065,7 @@
             <m:e>
               <m:r>
                 <m:rPr>
+                  <m:scr m:val="double-struck"/>
                   <m:sty m:val="p"/>
                 </m:rPr>
                 <m:t>E</m:t>
@@ -46607,6 +46717,7 @@
         <m:oMath>
           <m:r>
             <m:rPr>
+              <m:scr m:val="double-struck"/>
               <m:sty m:val="p"/>
             </m:rPr>
             <m:t>P</m:t>
@@ -46928,6 +47039,7 @@
             <m:e>
               <m:r>
                 <m:rPr>
+                  <m:scr m:val="double-struck"/>
                   <m:sty m:val="p"/>
                 </m:rPr>
                 <m:t>P</m:t>
@@ -47514,6 +47626,7 @@
       <m:oMath>
         <m:r>
           <m:rPr>
+            <m:scr m:val="double-struck"/>
             <m:sty m:val="p"/>
           </m:rPr>
           <m:t>P</m:t>
@@ -48016,6 +48129,7 @@
             <m:e>
               <m:r>
                 <m:rPr>
+                  <m:scr m:val="double-struck"/>
                   <m:sty m:val="p"/>
                 </m:rPr>
                 <m:t>E</m:t>
@@ -48524,6 +48638,7 @@
             <m:e>
               <m:r>
                 <m:rPr>
+                  <m:scr m:val="double-struck"/>
                   <m:sty m:val="p"/>
                 </m:rPr>
                 <m:t>P</m:t>
@@ -48810,6 +48925,7 @@
       <m:oMath>
         <m:r>
           <m:rPr>
+            <m:scr m:val="double-struck"/>
             <m:sty m:val="p"/>
           </m:rPr>
           <m:t>P</m:t>
@@ -48991,6 +49107,7 @@
       <m:oMath>
         <m:r>
           <m:rPr>
+            <m:scr m:val="double-struck"/>
             <m:sty m:val="p"/>
           </m:rPr>
           <m:t>P</m:t>

</xml_diff>

<commit_message>
Deploying to gh-pages from @ Morrison-Lab/pds@b7cde4376dd7f09d99570defebf5020868634b3f 🚀
</commit_message>
<xml_diff>
--- a/distributions.docx
+++ b/distributions.docx
@@ -15,7 +15,7 @@
         <w:pStyle w:val="Date"/>
       </w:pPr>
       <w:r>
-        <w:t xml:space="preserve">Last modified: 2026-10-26 13:14:30 (PDT)</w:t>
+        <w:t xml:space="preserve">Last modified: 2026-10-26 14:05:49 (PDT)</w:t>
       </w:r>
     </w:p>
     <w:p>
@@ -36890,7 +36890,7 @@
     </w:p>
     <w:bookmarkEnd w:id="108"/>
     <w:bookmarkEnd w:id="109"/>
-    <w:bookmarkStart w:id="144" w:name="sec-mvn"/>
+    <w:bookmarkStart w:id="148" w:name="sec-mvn"/>
     <w:p>
       <w:pPr>
         <w:pStyle w:val="Heading2"/>
@@ -42021,7 +42021,7 @@
         <w:t xml:space="preserve">.</w:t>
       </w:r>
     </w:p>
-    <w:bookmarkStart w:id="143" w:name="exm-mahalanobis-eigen"/>
+    <w:bookmarkStart w:id="147" w:name="exm-mahalanobis-eigen"/>
     <w:p>
       <w:pPr>
         <w:pStyle w:val="BodyText"/>
@@ -42724,12 +42724,159 @@
         <w:t xml:space="preserve"> </w:t>
       </w:r>
       <w:r>
-        <w:t xml:space="preserve">are positively correlated.</w:t>
+        <w:t xml:space="preserve">are positively correlated (</w:t>
+      </w:r>
+      <w:hyperlink w:anchor="fig-mahalanobis-eigen">
+        <w:r>
+          <w:rPr>
+            <w:rStyle w:val="Hyperlink"/>
+          </w:rPr>
+          <w:t xml:space="preserve">Figure 4</w:t>
+        </w:r>
+      </w:hyperlink>
+      <w:r>
+        <w:t xml:space="preserve">).</w:t>
       </w:r>
     </w:p>
-    <w:bookmarkEnd w:id="143"/>
-    <w:bookmarkEnd w:id="144"/>
-    <w:bookmarkStart w:id="158" w:name="sec-mixture"/>
+    <w:tbl>
+      <w:tblPr>
+        <w:tblStyle w:val="Table"/>
+        <w:tblW w:type="pct" w:w="5000"/>
+        <w:tblLayout w:type="fixed"/>
+        <w:tblLook w:firstRow="0" w:lastRow="0" w:firstColumn="0" w:lastColumn="0" w:noHBand="0" w:noVBand="0" w:val="0000"/>
+      </w:tblPr>
+      <w:tblGrid>
+        <w:gridCol w:w="7920"/>
+      </w:tblGrid>
+      <w:tr>
+        <w:tc>
+          <w:tcPr/>
+          <w:bookmarkStart w:id="146" w:name="fig-mahalanobis-eigen"/>
+          <w:p>
+            <w:pPr>
+              <w:jc w:val="center"/>
+            </w:pPr>
+            <w:r>
+              <w:drawing>
+                <wp:inline>
+                  <wp:extent cx="4620126" cy="4158113"/>
+                  <wp:effectExtent b="0" l="0" r="0" t="0"/>
+                  <wp:docPr descr="" title="" id="144" name="Picture"/>
+                  <a:graphic>
+                    <a:graphicData uri="http://schemas.openxmlformats.org/drawingml/2006/picture">
+                      <pic:pic>
+                        <pic:nvPicPr>
+                          <pic:cNvPr descr="distributions_files/figure-docx/mahalanobis-eigen-plot-1.png" id="145" name="Picture"/>
+                          <pic:cNvPicPr>
+                            <a:picLocks noChangeArrowheads="1" noChangeAspect="1"/>
+                          </pic:cNvPicPr>
+                        </pic:nvPicPr>
+                        <pic:blipFill>
+                          <a:blip r:embed="rId143"/>
+                          <a:stretch>
+                            <a:fillRect/>
+                          </a:stretch>
+                        </pic:blipFill>
+                        <pic:spPr bwMode="auto">
+                          <a:xfrm>
+                            <a:off x="0" y="0"/>
+                            <a:ext cx="4620126" cy="4158113"/>
+                          </a:xfrm>
+                          <a:prstGeom prst="rect">
+                            <a:avLst/>
+                          </a:prstGeom>
+                          <a:noFill/>
+                          <a:ln w="9525">
+                            <a:noFill/>
+                            <a:headEnd/>
+                            <a:tailEnd/>
+                          </a:ln>
+                        </pic:spPr>
+                      </pic:pic>
+                    </a:graphicData>
+                  </a:graphic>
+                </wp:inline>
+              </w:drawing>
+            </w:r>
+          </w:p>
+          <w:p>
+            <w:pPr>
+              <w:jc w:val="center"/>
+            </w:pPr>
+            <w:pPr>
+              <w:jc w:val="left"/>
+              <w:spacing w:before="200"/>
+              <w:pStyle w:val="ImageCaption"/>
+            </w:pPr>
+            <w:r>
+              <w:t xml:space="preserve">Figure 4: The contours of the Mahalanobis distance at</w:t>
+            </w:r>
+            <w:r>
+              <w:t xml:space="preserve"> </w:t>
+            </w:r>
+            <m:oMath>
+              <m:r>
+                <m:t>1</m:t>
+              </m:r>
+            </m:oMath>
+            <w:r>
+              <w:t xml:space="preserve"> </w:t>
+            </w:r>
+            <w:r>
+              <w:t xml:space="preserve">and</w:t>
+            </w:r>
+            <w:r>
+              <w:t xml:space="preserve"> </w:t>
+            </w:r>
+            <m:oMath>
+              <m:r>
+                <m:t>2</m:t>
+              </m:r>
+            </m:oMath>
+            <w:r>
+              <w:t xml:space="preserve"> </w:t>
+            </w:r>
+            <w:r>
+              <w:t xml:space="preserve">for the example.</w:t>
+            </w:r>
+            <w:r>
+              <w:t xml:space="preserve"> </w:t>
+            </w:r>
+            <w:r>
+              <w:t xml:space="preserve">The dots are the points</w:t>
+            </w:r>
+            <w:r>
+              <w:t xml:space="preserve"> </w:t>
+            </w:r>
+            <w:r>
+              <w:t xml:space="preserve">$\sqrt{3}\,\mathord{\smash[b]{\underset{\raise.3ex\hbox{$\scriptstyle\sim$}}{q}}\vphantom{q}}_1$</w:t>
+            </w:r>
+            <w:r>
+              <w:t xml:space="preserve"> </w:t>
+            </w:r>
+            <w:r>
+              <w:t xml:space="preserve">and</w:t>
+            </w:r>
+            <w:r>
+              <w:t xml:space="preserve"> </w:t>
+            </w:r>
+            <w:r>
+              <w:t xml:space="preserve">$\mathord{\smash[b]{\underset{\raise.3ex\hbox{$\scriptstyle\sim$}}{q}}\vphantom{q}}_2$</w:t>
+            </w:r>
+            <w:r>
+              <w:t xml:space="preserve"> </w:t>
+            </w:r>
+            <w:r>
+              <w:t xml:space="preserve">of the example on the inner ellipse.</w:t>
+            </w:r>
+          </w:p>
+          <w:bookmarkEnd w:id="146"/>
+        </w:tc>
+      </w:tr>
+    </w:tbl>
+    <w:bookmarkEnd w:id="147"/>
+    <w:bookmarkEnd w:id="148"/>
+    <w:bookmarkStart w:id="162" w:name="sec-mixture"/>
     <w:p>
       <w:pPr>
         <w:pStyle w:val="Heading2"/>
@@ -42738,7 +42885,7 @@
         <w:t xml:space="preserve">8 Mixture distributions</w:t>
       </w:r>
     </w:p>
-    <w:bookmarkStart w:id="145" w:name="def-mixture"/>
+    <w:bookmarkStart w:id="149" w:name="def-mixture"/>
     <w:p>
       <w:pPr>
         <w:pStyle w:val="FirstParagraph"/>
@@ -43322,8 +43469,8 @@
         </m:oMath>
       </m:oMathPara>
     </w:p>
-    <w:bookmarkEnd w:id="145"/>
-    <w:bookmarkStart w:id="146" w:name="def-mixture-component"/>
+    <w:bookmarkEnd w:id="149"/>
+    <w:bookmarkStart w:id="150" w:name="def-mixture-component"/>
     <w:p>
       <w:pPr>
         <w:pStyle w:val="FirstParagraph"/>
@@ -43425,8 +43572,8 @@
         <w:t xml:space="preserve">.</w:t>
       </w:r>
     </w:p>
-    <w:bookmarkEnd w:id="146"/>
-    <w:bookmarkStart w:id="149" w:name="thm-mixture-two-stage"/>
+    <w:bookmarkEnd w:id="150"/>
+    <w:bookmarkStart w:id="153" w:name="thm-mixture-two-stage"/>
     <w:p>
       <w:pPr>
         <w:pStyle w:val="BodyText"/>
@@ -43487,7 +43634,7 @@
       <w:r>
         <w:t xml:space="preserve"> </w:t>
       </w:r>
-      <w:hyperlink r:id="rId147">
+      <w:hyperlink r:id="rId151">
         <w:r>
           <w:rPr>
             <w:rStyle w:val="Hyperlink"/>
@@ -43877,7 +44024,7 @@
       <w:r>
         <w:t xml:space="preserve"> </w:t>
       </w:r>
-      <w:hyperlink r:id="rId148">
+      <w:hyperlink r:id="rId152">
         <w:r>
           <w:rPr>
             <w:rStyle w:val="Hyperlink"/>
@@ -44005,7 +44152,7 @@
         <w:t xml:space="preserve">.</w:t>
       </w:r>
     </w:p>
-    <w:bookmarkEnd w:id="149"/>
+    <w:bookmarkEnd w:id="153"/>
     <w:p>
       <w:pPr>
         <w:pStyle w:val="FirstParagraph"/>
@@ -44026,7 +44173,7 @@
       <w:r>
         <w:t xml:space="preserve"> </w:t>
       </w:r>
-      <w:hyperlink r:id="rId150">
+      <w:hyperlink r:id="rId154">
         <w:r>
           <w:rPr>
             <w:rStyle w:val="Hyperlink"/>
@@ -44251,7 +44398,7 @@
       <w:r>
         <w:t xml:space="preserve"> </w:t>
       </w:r>
-      <w:hyperlink r:id="rId148">
+      <w:hyperlink r:id="rId152">
         <w:r>
           <w:rPr>
             <w:rStyle w:val="Hyperlink"/>
@@ -45424,7 +45571,7 @@
         <w:t xml:space="preserve">.</w:t>
       </w:r>
     </w:p>
-    <w:bookmarkStart w:id="151" w:name="thm-mixture-mean"/>
+    <w:bookmarkStart w:id="155" w:name="thm-mixture-mean"/>
     <w:p>
       <w:pPr>
         <w:pStyle w:val="BodyText"/>
@@ -45739,7 +45886,7 @@
         </m:oMath>
       </m:oMathPara>
     </w:p>
-    <w:bookmarkEnd w:id="151"/>
+    <w:bookmarkEnd w:id="155"/>
     <w:p>
       <w:pPr>
         <w:pStyle w:val="FirstParagraph"/>
@@ -46602,7 +46749,7 @@
         <w:t xml:space="preserve">.</w:t>
       </w:r>
     </w:p>
-    <w:bookmarkStart w:id="152" w:name="thm-mixture-posterior"/>
+    <w:bookmarkStart w:id="156" w:name="thm-mixture-posterior"/>
     <w:p>
       <w:pPr>
         <w:pStyle w:val="BodyText"/>
@@ -46901,7 +47048,7 @@
         </m:oMath>
       </m:oMathPara>
     </w:p>
-    <w:bookmarkEnd w:id="152"/>
+    <w:bookmarkEnd w:id="156"/>
     <w:p>
       <w:pPr>
         <w:pStyle w:val="FirstParagraph"/>
@@ -46983,7 +47130,7 @@
       <w:r>
         <w:t xml:space="preserve"> </w:t>
       </w:r>
-      <w:hyperlink r:id="rId148">
+      <w:hyperlink r:id="rId152">
         <w:r>
           <w:rPr>
             <w:rStyle w:val="Hyperlink"/>
@@ -47412,7 +47559,7 @@
       <w:r>
         <w:t xml:space="preserve"> </w:t>
       </w:r>
-      <w:hyperlink r:id="rId153">
+      <w:hyperlink r:id="rId157">
         <w:r>
           <w:rPr>
             <w:rStyle w:val="Hyperlink"/>
@@ -47570,7 +47717,7 @@
       <w:r>
         <w:t xml:space="preserve"> </w:t>
       </w:r>
-      <w:hyperlink r:id="rId154">
+      <w:hyperlink r:id="rId158">
         <w:r>
           <w:rPr>
             <w:rStyle w:val="Hyperlink"/>
@@ -47582,7 +47729,7 @@
         <w:t xml:space="preserve">.</w:t>
       </w:r>
     </w:p>
-    <w:bookmarkStart w:id="155" w:name="def-responsibility"/>
+    <w:bookmarkStart w:id="159" w:name="def-responsibility"/>
     <w:p>
       <w:pPr>
         <w:pStyle w:val="BodyText"/>
@@ -47734,8 +47881,8 @@
         <w:t xml:space="preserve">.</w:t>
       </w:r>
     </w:p>
-    <w:bookmarkEnd w:id="155"/>
-    <w:bookmarkStart w:id="156" w:name="exm-mixture-gaussian"/>
+    <w:bookmarkEnd w:id="159"/>
+    <w:bookmarkStart w:id="160" w:name="exm-mixture-gaussian"/>
     <w:p>
       <w:pPr>
         <w:pStyle w:val="BodyText"/>
@@ -48986,7 +49133,7 @@
         <w:t xml:space="preserve">.</w:t>
       </w:r>
     </w:p>
-    <w:bookmarkEnd w:id="156"/>
+    <w:bookmarkEnd w:id="160"/>
     <w:p>
       <w:pPr>
         <w:pStyle w:val="FirstParagraph"/>
@@ -49034,7 +49181,7 @@
         <w:t xml:space="preserve">would describe them poorly.</w:t>
       </w:r>
     </w:p>
-    <w:bookmarkStart w:id="157" w:name="exm-nb-mixture"/>
+    <w:bookmarkStart w:id="161" w:name="exm-nb-mixture"/>
     <w:p>
       <w:pPr>
         <w:pStyle w:val="BodyText"/>
@@ -49305,9 +49452,9 @@
         <w:t xml:space="preserve">).</w:t>
       </w:r>
     </w:p>
-    <w:bookmarkEnd w:id="157"/>
-    <w:bookmarkEnd w:id="158"/>
-    <w:bookmarkStart w:id="178" w:name="references"/>
+    <w:bookmarkEnd w:id="161"/>
+    <w:bookmarkEnd w:id="162"/>
+    <w:bookmarkStart w:id="182" w:name="references"/>
     <w:p>
       <w:pPr>
         <w:pStyle w:val="Heading2"/>
@@ -49316,8 +49463,8 @@
         <w:t xml:space="preserve">References</w:t>
       </w:r>
     </w:p>
-    <w:bookmarkStart w:id="177" w:name="refs"/>
-    <w:bookmarkStart w:id="160" w:name="ref-wikipedia_binomial_distribution"/>
+    <w:bookmarkStart w:id="181" w:name="refs"/>
+    <w:bookmarkStart w:id="164" w:name="ref-wikipedia_binomial_distribution"/>
     <w:p>
       <w:pPr>
         <w:pStyle w:val="Bibliography"/>
@@ -49364,7 +49511,7 @@
       <w:r>
         <w:t xml:space="preserve"> </w:t>
       </w:r>
-      <w:hyperlink r:id="rId159">
+      <w:hyperlink r:id="rId163">
         <w:r>
           <w:rPr>
             <w:rStyle w:val="Hyperlink"/>
@@ -49373,8 +49520,8 @@
         </w:r>
       </w:hyperlink>
     </w:p>
-    <w:bookmarkEnd w:id="160"/>
-    <w:bookmarkStart w:id="162" w:name="ref-CaseBerg01"/>
+    <w:bookmarkEnd w:id="164"/>
+    <w:bookmarkStart w:id="166" w:name="ref-CaseBerg01"/>
     <w:p>
       <w:pPr>
         <w:pStyle w:val="Bibliography"/>
@@ -49407,7 +49554,7 @@
       <w:r>
         <w:t xml:space="preserve"> </w:t>
       </w:r>
-      <w:hyperlink r:id="rId161">
+      <w:hyperlink r:id="rId165">
         <w:r>
           <w:rPr>
             <w:rStyle w:val="Hyperlink"/>
@@ -49416,8 +49563,8 @@
         </w:r>
       </w:hyperlink>
     </w:p>
-    <w:bookmarkEnd w:id="162"/>
-    <w:bookmarkStart w:id="164" w:name="ref-wikipedia_poisson_distribution"/>
+    <w:bookmarkEnd w:id="166"/>
+    <w:bookmarkStart w:id="168" w:name="ref-wikipedia_poisson_distribution"/>
     <w:p>
       <w:pPr>
         <w:pStyle w:val="Bibliography"/>
@@ -49464,7 +49611,7 @@
       <w:r>
         <w:t xml:space="preserve"> </w:t>
       </w:r>
-      <w:hyperlink r:id="rId163">
+      <w:hyperlink r:id="rId167">
         <w:r>
           <w:rPr>
             <w:rStyle w:val="Hyperlink"/>
@@ -49473,8 +49620,8 @@
         </w:r>
       </w:hyperlink>
     </w:p>
-    <w:bookmarkEnd w:id="164"/>
-    <w:bookmarkStart w:id="166" w:name="Xba2ad42a4727c7a31602505192d479957632062"/>
+    <w:bookmarkEnd w:id="168"/>
+    <w:bookmarkStart w:id="170" w:name="Xba2ad42a4727c7a31602505192d479957632062"/>
     <w:p>
       <w:pPr>
         <w:pStyle w:val="Bibliography"/>
@@ -49521,7 +49668,7 @@
       <w:r>
         <w:t xml:space="preserve"> </w:t>
       </w:r>
-      <w:hyperlink r:id="rId165">
+      <w:hyperlink r:id="rId169">
         <w:r>
           <w:rPr>
             <w:rStyle w:val="Hyperlink"/>
@@ -49530,8 +49677,8 @@
         </w:r>
       </w:hyperlink>
     </w:p>
-    <w:bookmarkEnd w:id="166"/>
-    <w:bookmarkStart w:id="168" w:name="ref-wikipedia_laplace_distribution"/>
+    <w:bookmarkEnd w:id="170"/>
+    <w:bookmarkStart w:id="172" w:name="ref-wikipedia_laplace_distribution"/>
     <w:p>
       <w:pPr>
         <w:pStyle w:val="Bibliography"/>
@@ -49578,7 +49725,7 @@
       <w:r>
         <w:t xml:space="preserve"> </w:t>
       </w:r>
-      <w:hyperlink r:id="rId167">
+      <w:hyperlink r:id="rId171">
         <w:r>
           <w:rPr>
             <w:rStyle w:val="Hyperlink"/>
@@ -49587,8 +49734,8 @@
         </w:r>
       </w:hyperlink>
     </w:p>
-    <w:bookmarkEnd w:id="168"/>
-    <w:bookmarkStart w:id="170" w:name="ref-wikipedia_weibull_distribution"/>
+    <w:bookmarkEnd w:id="172"/>
+    <w:bookmarkStart w:id="174" w:name="ref-wikipedia_weibull_distribution"/>
     <w:p>
       <w:pPr>
         <w:pStyle w:val="Bibliography"/>
@@ -49635,7 +49782,7 @@
       <w:r>
         <w:t xml:space="preserve"> </w:t>
       </w:r>
-      <w:hyperlink r:id="rId169">
+      <w:hyperlink r:id="rId173">
         <w:r>
           <w:rPr>
             <w:rStyle w:val="Hyperlink"/>
@@ -49644,8 +49791,8 @@
         </w:r>
       </w:hyperlink>
     </w:p>
-    <w:bookmarkEnd w:id="170"/>
-    <w:bookmarkStart w:id="172" w:name="X20af3894792cc1bee172a179f9b17a254a15f4d"/>
+    <w:bookmarkEnd w:id="174"/>
+    <w:bookmarkStart w:id="176" w:name="X20af3894792cc1bee172a179f9b17a254a15f4d"/>
     <w:p>
       <w:pPr>
         <w:pStyle w:val="Bibliography"/>
@@ -49692,7 +49839,7 @@
       <w:r>
         <w:t xml:space="preserve"> </w:t>
       </w:r>
-      <w:hyperlink r:id="rId171">
+      <w:hyperlink r:id="rId175">
         <w:r>
           <w:rPr>
             <w:rStyle w:val="Hyperlink"/>
@@ -49701,8 +49848,8 @@
         </w:r>
       </w:hyperlink>
     </w:p>
-    <w:bookmarkEnd w:id="172"/>
-    <w:bookmarkStart w:id="174" w:name="ref-wikipedia_mahalanobis_distance"/>
+    <w:bookmarkEnd w:id="176"/>
+    <w:bookmarkStart w:id="178" w:name="ref-wikipedia_mahalanobis_distance"/>
     <w:p>
       <w:pPr>
         <w:pStyle w:val="Bibliography"/>
@@ -49749,7 +49896,7 @@
       <w:r>
         <w:t xml:space="preserve"> </w:t>
       </w:r>
-      <w:hyperlink r:id="rId173">
+      <w:hyperlink r:id="rId177">
         <w:r>
           <w:rPr>
             <w:rStyle w:val="Hyperlink"/>
@@ -49758,8 +49905,8 @@
         </w:r>
       </w:hyperlink>
     </w:p>
-    <w:bookmarkEnd w:id="174"/>
-    <w:bookmarkStart w:id="176" w:name="ref-wikipedia_mixture_distribution"/>
+    <w:bookmarkEnd w:id="178"/>
+    <w:bookmarkStart w:id="180" w:name="ref-wikipedia_mixture_distribution"/>
     <w:p>
       <w:pPr>
         <w:pStyle w:val="Bibliography"/>
@@ -49806,7 +49953,7 @@
       <w:r>
         <w:t xml:space="preserve"> </w:t>
       </w:r>
-      <w:hyperlink r:id="rId175">
+      <w:hyperlink r:id="rId179">
         <w:r>
           <w:rPr>
             <w:rStyle w:val="Hyperlink"/>
@@ -49815,9 +49962,9 @@
         </w:r>
       </w:hyperlink>
     </w:p>
-    <w:bookmarkEnd w:id="176"/>
-    <w:bookmarkEnd w:id="177"/>
-    <w:bookmarkEnd w:id="178"/>
+    <w:bookmarkEnd w:id="180"/>
+    <w:bookmarkEnd w:id="181"/>
+    <w:bookmarkEnd w:id="182"/>
     <w:sectPr>
       <w:footnotePr>
         <w:numRestart w:val="eachSect"/>

</xml_diff>